<commit_message>
Add index.html  page and update group details
</commit_message>
<xml_diff>
--- a/Assignment_04_Spring2026.docx
+++ b/Assignment_04_Spring2026.docx
@@ -1,6 +1,6 @@
 
 <file path=word/document.xml><?xml version="1.0" encoding="utf-8"?>
-<w:document xmlns:wpc="http://schemas.microsoft.com/office/word/2010/wordprocessingCanvas" xmlns:cx="http://schemas.microsoft.com/office/drawing/2014/chartex" xmlns:cx1="http://schemas.microsoft.com/office/drawing/2015/9/8/chartex" xmlns:cx2="http://schemas.microsoft.com/office/drawing/2015/10/21/chartex" xmlns:cx3="http://schemas.microsoft.com/office/drawing/2016/5/9/chartex" xmlns:cx4="http://schemas.microsoft.com/office/drawing/2016/5/10/chartex" xmlns:cx5="http://schemas.microsoft.com/office/drawing/2016/5/11/chartex" xmlns:cx6="http://schemas.microsoft.com/office/drawing/2016/5/12/chartex" xmlns:cx7="http://schemas.microsoft.com/office/drawing/2016/5/13/chartex" xmlns:cx8="http://schemas.microsoft.com/office/drawing/2016/5/14/chartex" xmlns:mc="http://schemas.openxmlformats.org/markup-compatibility/2006" xmlns:aink="http://schemas.microsoft.com/office/drawing/2016/ink" xmlns:am3d="http://schemas.microsoft.com/office/drawing/2017/model3d" xmlns:o="urn:schemas-microsoft-com:office:office" xmlns:oel="http://schemas.microsoft.com/office/2019/extlst" xmlns:r="http://schemas.openxmlformats.org/officeDocument/2006/relationships" xmlns:m="http://schemas.openxmlformats.org/officeDocument/2006/math" xmlns:v="urn:schemas-microsoft-com:vml" xmlns:wp14="http://schemas.microsoft.com/office/word/2010/wordprocessingDrawing" xmlns:wp="http://schemas.openxmlformats.org/drawingml/2006/wordprocessingDrawing" xmlns:w10="urn:schemas-microsoft-com:office:word" xmlns:w="http://schemas.openxmlformats.org/wordprocessingml/2006/main" xmlns:w14="http://schemas.microsoft.com/office/word/2010/wordml" xmlns:w15="http://schemas.microsoft.com/office/word/2012/wordml" xmlns:w16cex="http://schemas.microsoft.com/office/word/2018/wordml/cex" xmlns:w16cid="http://schemas.microsoft.com/office/word/2016/wordml/cid" xmlns:w16="http://schemas.microsoft.com/office/word/2018/wordml" xmlns:w16du="http://schemas.microsoft.com/office/word/2023/wordml/word16du" xmlns:w16sdtdh="http://schemas.microsoft.com/office/word/2020/wordml/sdtdatahash" xmlns:w16sdtfl="http://schemas.microsoft.com/office/word/2024/wordml/sdtformatlock" xmlns:w16se="http://schemas.microsoft.com/office/word/2015/wordml/symex" xmlns:wpg="http://schemas.microsoft.com/office/word/2010/wordprocessingGroup" xmlns:wpi="http://schemas.microsoft.com/office/word/2010/wordprocessingInk" xmlns:wne="http://schemas.microsoft.com/office/word/2006/wordml" xmlns:wps="http://schemas.microsoft.com/office/word/2010/wordprocessingShape" mc:Ignorable="w14 w15 w16se w16cid w16 w16cex w16sdtdh w16sdtfl w16du wp14">
+<w:document xmlns:wpc="http://schemas.microsoft.com/office/word/2010/wordprocessingCanvas" xmlns:cx="http://schemas.microsoft.com/office/drawing/2014/chartex" xmlns:cx1="http://schemas.microsoft.com/office/drawing/2015/9/8/chartex" xmlns:cx2="http://schemas.microsoft.com/office/drawing/2015/10/21/chartex" xmlns:cx3="http://schemas.microsoft.com/office/drawing/2016/5/9/chartex" xmlns:cx4="http://schemas.microsoft.com/office/drawing/2016/5/10/chartex" xmlns:cx5="http://schemas.microsoft.com/office/drawing/2016/5/11/chartex" xmlns:cx6="http://schemas.microsoft.com/office/drawing/2016/5/12/chartex" xmlns:cx7="http://schemas.microsoft.com/office/drawing/2016/5/13/chartex" xmlns:cx8="http://schemas.microsoft.com/office/drawing/2016/5/14/chartex" xmlns:mc="http://schemas.openxmlformats.org/markup-compatibility/2006" xmlns:aink="http://schemas.microsoft.com/office/drawing/2016/ink" xmlns:am3d="http://schemas.microsoft.com/office/drawing/2017/model3d" xmlns:o="urn:schemas-microsoft-com:office:office" xmlns:oel="http://schemas.microsoft.com/office/2019/extlst" xmlns:r="http://schemas.openxmlformats.org/officeDocument/2006/relationships" xmlns:m="http://schemas.openxmlformats.org/officeDocument/2006/math" xmlns:v="urn:schemas-microsoft-com:vml" xmlns:wp14="http://schemas.microsoft.com/office/word/2010/wordprocessingDrawing" xmlns:wp="http://schemas.openxmlformats.org/drawingml/2006/wordprocessingDrawing" xmlns:w10="urn:schemas-microsoft-com:office:word" xmlns:w="http://schemas.openxmlformats.org/wordprocessingml/2006/main" xmlns:w14="http://schemas.microsoft.com/office/word/2010/wordml" xmlns:w15="http://schemas.microsoft.com/office/word/2012/wordml" xmlns:w16cex="http://schemas.microsoft.com/office/word/2018/wordml/cex" xmlns:w16cid="http://schemas.microsoft.com/office/word/2016/wordml/cid" xmlns:w16="http://schemas.microsoft.com/office/word/2018/wordml" xmlns:w16sdtdh="http://schemas.microsoft.com/office/word/2020/wordml/sdtdatahash" xmlns:w16se="http://schemas.microsoft.com/office/word/2015/wordml/symex" xmlns:wpg="http://schemas.microsoft.com/office/word/2010/wordprocessingGroup" xmlns:wpi="http://schemas.microsoft.com/office/word/2010/wordprocessingInk" xmlns:wne="http://schemas.microsoft.com/office/word/2006/wordml" xmlns:wps="http://schemas.microsoft.com/office/word/2010/wordprocessingShape" mc:Ignorable="w14 w15 w16se w16cid w16 w16cex w16sdtdh wp14">
   <w:body>
     <w:p>
       <w:pPr>
@@ -619,7 +619,7 @@
     </w:p>
     <w:tbl>
       <w:tblPr>
-        <w:tblW w:w="9360" w:type="dxa"/>
+        <w:tblW w:w="10616" w:type="dxa"/>
         <w:tblBorders>
           <w:top w:val="single" w:sz="4" w:space="0" w:color="auto"/>
           <w:left w:val="single" w:sz="4" w:space="0" w:color="auto"/>
@@ -628,6 +628,7 @@
           <w:insideH w:val="single" w:sz="4" w:space="0" w:color="auto"/>
           <w:insideV w:val="single" w:sz="4" w:space="0" w:color="auto"/>
         </w:tblBorders>
+        <w:tblLayout w:type="fixed"/>
         <w:tblCellMar>
           <w:left w:w="10" w:type="dxa"/>
           <w:right w:w="10" w:type="dxa"/>
@@ -635,27 +636,22 @@
         <w:tblLook w:val="0000" w:firstRow="0" w:lastRow="0" w:firstColumn="0" w:lastColumn="0" w:noHBand="0" w:noVBand="0"/>
       </w:tblPr>
       <w:tblGrid>
-        <w:gridCol w:w="471"/>
-        <w:gridCol w:w="1424"/>
-        <w:gridCol w:w="1349"/>
-        <w:gridCol w:w="1561"/>
-        <w:gridCol w:w="1306"/>
-        <w:gridCol w:w="1596"/>
-        <w:gridCol w:w="1653"/>
+        <w:gridCol w:w="498"/>
+        <w:gridCol w:w="2026"/>
+        <w:gridCol w:w="1608"/>
+        <w:gridCol w:w="1104"/>
+        <w:gridCol w:w="1712"/>
+        <w:gridCol w:w="2089"/>
+        <w:gridCol w:w="1579"/>
       </w:tblGrid>
       <w:tr>
-        <w:tblPrEx>
-          <w:tblCellMar>
-            <w:top w:w="0" w:type="dxa"/>
-            <w:bottom w:w="0" w:type="dxa"/>
-          </w:tblCellMar>
-        </w:tblPrEx>
         <w:trPr>
+          <w:trHeight w:val="448"/>
           <w:tblHeader/>
         </w:trPr>
         <w:tc>
           <w:tcPr>
-            <w:tcW w:w="440" w:type="dxa"/>
+            <w:tcW w:w="498" w:type="dxa"/>
             <w:tcBorders>
               <w:top w:val="single" w:sz="6" w:space="0" w:color="ADB9CA"/>
               <w:left w:val="single" w:sz="6" w:space="0" w:color="ADB9CA"/>
@@ -687,7 +683,7 @@
         </w:tc>
         <w:tc>
           <w:tcPr>
-            <w:tcW w:w="1500" w:type="dxa"/>
+            <w:tcW w:w="2026" w:type="dxa"/>
             <w:tcBorders>
               <w:top w:val="single" w:sz="6" w:space="0" w:color="ADB9CA"/>
               <w:left w:val="single" w:sz="6" w:space="0" w:color="ADB9CA"/>
@@ -719,7 +715,7 @@
         </w:tc>
         <w:tc>
           <w:tcPr>
-            <w:tcW w:w="1380" w:type="dxa"/>
+            <w:tcW w:w="1608" w:type="dxa"/>
             <w:tcBorders>
               <w:top w:val="single" w:sz="6" w:space="0" w:color="ADB9CA"/>
               <w:left w:val="single" w:sz="6" w:space="0" w:color="ADB9CA"/>
@@ -751,7 +747,7 @@
         </w:tc>
         <w:tc>
           <w:tcPr>
-            <w:tcW w:w="1300" w:type="dxa"/>
+            <w:tcW w:w="1104" w:type="dxa"/>
             <w:tcBorders>
               <w:top w:val="single" w:sz="6" w:space="0" w:color="ADB9CA"/>
               <w:left w:val="single" w:sz="6" w:space="0" w:color="ADB9CA"/>
@@ -783,7 +779,7 @@
         </w:tc>
         <w:tc>
           <w:tcPr>
-            <w:tcW w:w="1340" w:type="dxa"/>
+            <w:tcW w:w="1712" w:type="dxa"/>
             <w:tcBorders>
               <w:top w:val="single" w:sz="6" w:space="0" w:color="ADB9CA"/>
               <w:left w:val="single" w:sz="6" w:space="0" w:color="ADB9CA"/>
@@ -815,7 +811,7 @@
         </w:tc>
         <w:tc>
           <w:tcPr>
-            <w:tcW w:w="1700" w:type="dxa"/>
+            <w:tcW w:w="2089" w:type="dxa"/>
             <w:tcBorders>
               <w:top w:val="single" w:sz="6" w:space="0" w:color="ADB9CA"/>
               <w:left w:val="single" w:sz="6" w:space="0" w:color="ADB9CA"/>
@@ -847,7 +843,7 @@
         </w:tc>
         <w:tc>
           <w:tcPr>
-            <w:tcW w:w="1700" w:type="dxa"/>
+            <w:tcW w:w="1579" w:type="dxa"/>
             <w:tcBorders>
               <w:top w:val="single" w:sz="6" w:space="0" w:color="ADB9CA"/>
               <w:left w:val="single" w:sz="6" w:space="0" w:color="ADB9CA"/>
@@ -879,15 +875,12 @@
         </w:tc>
       </w:tr>
       <w:tr>
-        <w:tblPrEx>
-          <w:tblCellMar>
-            <w:top w:w="0" w:type="dxa"/>
-            <w:bottom w:w="0" w:type="dxa"/>
-          </w:tblCellMar>
-        </w:tblPrEx>
-        <w:tc>
-          <w:tcPr>
-            <w:tcW w:w="440" w:type="dxa"/>
+        <w:trPr>
+          <w:trHeight w:val="512"/>
+        </w:trPr>
+        <w:tc>
+          <w:tcPr>
+            <w:tcW w:w="498" w:type="dxa"/>
             <w:tcBorders>
               <w:top w:val="single" w:sz="6" w:space="0" w:color="ADB9CA"/>
               <w:left w:val="single" w:sz="6" w:space="0" w:color="ADB9CA"/>
@@ -917,7 +910,7 @@
         </w:tc>
         <w:tc>
           <w:tcPr>
-            <w:tcW w:w="1500" w:type="dxa"/>
+            <w:tcW w:w="2026" w:type="dxa"/>
             <w:tcBorders>
               <w:top w:val="single" w:sz="6" w:space="0" w:color="ADB9CA"/>
               <w:left w:val="single" w:sz="6" w:space="0" w:color="ADB9CA"/>
@@ -933,11 +926,18 @@
             </w:tcMar>
             <w:vAlign w:val="center"/>
           </w:tcPr>
-          <w:p/>
-        </w:tc>
-        <w:tc>
-          <w:tcPr>
-            <w:tcW w:w="1380" w:type="dxa"/>
+          <w:p>
+            <w:r>
+              <w:t>ADNAN</w:t>
+            </w:r>
+            <w:r>
+              <w:t xml:space="preserve"> ALAM</w:t>
+            </w:r>
+          </w:p>
+        </w:tc>
+        <w:tc>
+          <w:tcPr>
+            <w:tcW w:w="1608" w:type="dxa"/>
             <w:tcBorders>
               <w:top w:val="single" w:sz="6" w:space="0" w:color="ADB9CA"/>
               <w:left w:val="single" w:sz="6" w:space="0" w:color="ADB9CA"/>
@@ -953,11 +953,15 @@
             </w:tcMar>
             <w:vAlign w:val="center"/>
           </w:tcPr>
-          <w:p/>
-        </w:tc>
-        <w:tc>
-          <w:tcPr>
-            <w:tcW w:w="1300" w:type="dxa"/>
+          <w:p>
+            <w:r>
+              <w:t>A-D-H-I-56</w:t>
+            </w:r>
+          </w:p>
+        </w:tc>
+        <w:tc>
+          <w:tcPr>
+            <w:tcW w:w="1104" w:type="dxa"/>
             <w:tcBorders>
               <w:top w:val="single" w:sz="6" w:space="0" w:color="ADB9CA"/>
               <w:left w:val="single" w:sz="6" w:space="0" w:color="ADB9CA"/>
@@ -973,11 +977,15 @@
             </w:tcMar>
             <w:vAlign w:val="center"/>
           </w:tcPr>
-          <w:p/>
-        </w:tc>
-        <w:tc>
-          <w:tcPr>
-            <w:tcW w:w="1340" w:type="dxa"/>
+          <w:p>
+            <w:r>
+              <w:t>Lead</w:t>
+            </w:r>
+          </w:p>
+        </w:tc>
+        <w:tc>
+          <w:tcPr>
+            <w:tcW w:w="1712" w:type="dxa"/>
             <w:tcBorders>
               <w:top w:val="single" w:sz="6" w:space="0" w:color="ADB9CA"/>
               <w:left w:val="single" w:sz="6" w:space="0" w:color="ADB9CA"/>
@@ -993,11 +1001,15 @@
             </w:tcMar>
             <w:vAlign w:val="center"/>
           </w:tcPr>
-          <w:p/>
-        </w:tc>
-        <w:tc>
-          <w:tcPr>
-            <w:tcW w:w="1700" w:type="dxa"/>
+          <w:p>
+            <w:r>
+              <w:t>index.html</w:t>
+            </w:r>
+          </w:p>
+        </w:tc>
+        <w:tc>
+          <w:tcPr>
+            <w:tcW w:w="2089" w:type="dxa"/>
             <w:tcBorders>
               <w:top w:val="single" w:sz="6" w:space="0" w:color="ADB9CA"/>
               <w:left w:val="single" w:sz="6" w:space="0" w:color="ADB9CA"/>
@@ -1013,11 +1025,21 @@
             </w:tcMar>
             <w:vAlign w:val="center"/>
           </w:tcPr>
-          <w:p/>
-        </w:tc>
-        <w:tc>
-          <w:tcPr>
-            <w:tcW w:w="1700" w:type="dxa"/>
+          <w:p>
+            <w:r>
+              <w:t xml:space="preserve">feature/ </w:t>
+            </w:r>
+            <w:r>
+              <w:t>A-D-H-I-56</w:t>
+            </w:r>
+            <w:r>
+              <w:t>/index-page</w:t>
+            </w:r>
+          </w:p>
+        </w:tc>
+        <w:tc>
+          <w:tcPr>
+            <w:tcW w:w="1579" w:type="dxa"/>
             <w:tcBorders>
               <w:top w:val="single" w:sz="6" w:space="0" w:color="ADB9CA"/>
               <w:left w:val="single" w:sz="6" w:space="0" w:color="ADB9CA"/>
@@ -1033,19 +1055,20 @@
             </w:tcMar>
             <w:vAlign w:val="center"/>
           </w:tcPr>
-          <w:p/>
+          <w:p>
+            <w:r>
+              <w:t>Yes</w:t>
+            </w:r>
+          </w:p>
         </w:tc>
       </w:tr>
       <w:tr>
-        <w:tblPrEx>
-          <w:tblCellMar>
-            <w:top w:w="0" w:type="dxa"/>
-            <w:bottom w:w="0" w:type="dxa"/>
-          </w:tblCellMar>
-        </w:tblPrEx>
-        <w:tc>
-          <w:tcPr>
-            <w:tcW w:w="440" w:type="dxa"/>
+        <w:trPr>
+          <w:trHeight w:val="256"/>
+        </w:trPr>
+        <w:tc>
+          <w:tcPr>
+            <w:tcW w:w="498" w:type="dxa"/>
             <w:tcBorders>
               <w:top w:val="single" w:sz="6" w:space="0" w:color="ADB9CA"/>
               <w:left w:val="single" w:sz="6" w:space="0" w:color="ADB9CA"/>
@@ -1075,7 +1098,7 @@
         </w:tc>
         <w:tc>
           <w:tcPr>
-            <w:tcW w:w="1500" w:type="dxa"/>
+            <w:tcW w:w="2026" w:type="dxa"/>
             <w:tcBorders>
               <w:top w:val="single" w:sz="6" w:space="0" w:color="ADB9CA"/>
               <w:left w:val="single" w:sz="6" w:space="0" w:color="ADB9CA"/>
@@ -1095,7 +1118,7 @@
         </w:tc>
         <w:tc>
           <w:tcPr>
-            <w:tcW w:w="1380" w:type="dxa"/>
+            <w:tcW w:w="1608" w:type="dxa"/>
             <w:tcBorders>
               <w:top w:val="single" w:sz="6" w:space="0" w:color="ADB9CA"/>
               <w:left w:val="single" w:sz="6" w:space="0" w:color="ADB9CA"/>
@@ -1115,7 +1138,7 @@
         </w:tc>
         <w:tc>
           <w:tcPr>
-            <w:tcW w:w="1300" w:type="dxa"/>
+            <w:tcW w:w="1104" w:type="dxa"/>
             <w:tcBorders>
               <w:top w:val="single" w:sz="6" w:space="0" w:color="ADB9CA"/>
               <w:left w:val="single" w:sz="6" w:space="0" w:color="ADB9CA"/>
@@ -1135,7 +1158,7 @@
         </w:tc>
         <w:tc>
           <w:tcPr>
-            <w:tcW w:w="1340" w:type="dxa"/>
+            <w:tcW w:w="1712" w:type="dxa"/>
             <w:tcBorders>
               <w:top w:val="single" w:sz="6" w:space="0" w:color="ADB9CA"/>
               <w:left w:val="single" w:sz="6" w:space="0" w:color="ADB9CA"/>
@@ -1155,7 +1178,7 @@
         </w:tc>
         <w:tc>
           <w:tcPr>
-            <w:tcW w:w="1700" w:type="dxa"/>
+            <w:tcW w:w="2089" w:type="dxa"/>
             <w:tcBorders>
               <w:top w:val="single" w:sz="6" w:space="0" w:color="ADB9CA"/>
               <w:left w:val="single" w:sz="6" w:space="0" w:color="ADB9CA"/>
@@ -1175,7 +1198,7 @@
         </w:tc>
         <w:tc>
           <w:tcPr>
-            <w:tcW w:w="1700" w:type="dxa"/>
+            <w:tcW w:w="1579" w:type="dxa"/>
             <w:tcBorders>
               <w:top w:val="single" w:sz="6" w:space="0" w:color="ADB9CA"/>
               <w:left w:val="single" w:sz="6" w:space="0" w:color="ADB9CA"/>
@@ -1195,15 +1218,12 @@
         </w:tc>
       </w:tr>
       <w:tr>
-        <w:tblPrEx>
-          <w:tblCellMar>
-            <w:top w:w="0" w:type="dxa"/>
-            <w:bottom w:w="0" w:type="dxa"/>
-          </w:tblCellMar>
-        </w:tblPrEx>
-        <w:tc>
-          <w:tcPr>
-            <w:tcW w:w="440" w:type="dxa"/>
+        <w:trPr>
+          <w:trHeight w:val="256"/>
+        </w:trPr>
+        <w:tc>
+          <w:tcPr>
+            <w:tcW w:w="498" w:type="dxa"/>
             <w:tcBorders>
               <w:top w:val="single" w:sz="6" w:space="0" w:color="ADB9CA"/>
               <w:left w:val="single" w:sz="6" w:space="0" w:color="ADB9CA"/>
@@ -1233,7 +1253,7 @@
         </w:tc>
         <w:tc>
           <w:tcPr>
-            <w:tcW w:w="1500" w:type="dxa"/>
+            <w:tcW w:w="2026" w:type="dxa"/>
             <w:tcBorders>
               <w:top w:val="single" w:sz="6" w:space="0" w:color="ADB9CA"/>
               <w:left w:val="single" w:sz="6" w:space="0" w:color="ADB9CA"/>
@@ -1253,7 +1273,7 @@
         </w:tc>
         <w:tc>
           <w:tcPr>
-            <w:tcW w:w="1380" w:type="dxa"/>
+            <w:tcW w:w="1608" w:type="dxa"/>
             <w:tcBorders>
               <w:top w:val="single" w:sz="6" w:space="0" w:color="ADB9CA"/>
               <w:left w:val="single" w:sz="6" w:space="0" w:color="ADB9CA"/>
@@ -1273,7 +1293,7 @@
         </w:tc>
         <w:tc>
           <w:tcPr>
-            <w:tcW w:w="1300" w:type="dxa"/>
+            <w:tcW w:w="1104" w:type="dxa"/>
             <w:tcBorders>
               <w:top w:val="single" w:sz="6" w:space="0" w:color="ADB9CA"/>
               <w:left w:val="single" w:sz="6" w:space="0" w:color="ADB9CA"/>
@@ -1293,7 +1313,7 @@
         </w:tc>
         <w:tc>
           <w:tcPr>
-            <w:tcW w:w="1340" w:type="dxa"/>
+            <w:tcW w:w="1712" w:type="dxa"/>
             <w:tcBorders>
               <w:top w:val="single" w:sz="6" w:space="0" w:color="ADB9CA"/>
               <w:left w:val="single" w:sz="6" w:space="0" w:color="ADB9CA"/>
@@ -1313,7 +1333,7 @@
         </w:tc>
         <w:tc>
           <w:tcPr>
-            <w:tcW w:w="1700" w:type="dxa"/>
+            <w:tcW w:w="2089" w:type="dxa"/>
             <w:tcBorders>
               <w:top w:val="single" w:sz="6" w:space="0" w:color="ADB9CA"/>
               <w:left w:val="single" w:sz="6" w:space="0" w:color="ADB9CA"/>
@@ -1333,7 +1353,7 @@
         </w:tc>
         <w:tc>
           <w:tcPr>
-            <w:tcW w:w="1700" w:type="dxa"/>
+            <w:tcW w:w="1579" w:type="dxa"/>
             <w:tcBorders>
               <w:top w:val="single" w:sz="6" w:space="0" w:color="ADB9CA"/>
               <w:left w:val="single" w:sz="6" w:space="0" w:color="ADB9CA"/>
@@ -1353,15 +1373,12 @@
         </w:tc>
       </w:tr>
       <w:tr>
-        <w:tblPrEx>
-          <w:tblCellMar>
-            <w:top w:w="0" w:type="dxa"/>
-            <w:bottom w:w="0" w:type="dxa"/>
-          </w:tblCellMar>
-        </w:tblPrEx>
-        <w:tc>
-          <w:tcPr>
-            <w:tcW w:w="440" w:type="dxa"/>
+        <w:trPr>
+          <w:trHeight w:val="256"/>
+        </w:trPr>
+        <w:tc>
+          <w:tcPr>
+            <w:tcW w:w="498" w:type="dxa"/>
             <w:tcBorders>
               <w:top w:val="single" w:sz="6" w:space="0" w:color="ADB9CA"/>
               <w:left w:val="single" w:sz="6" w:space="0" w:color="ADB9CA"/>
@@ -1391,7 +1408,7 @@
         </w:tc>
         <w:tc>
           <w:tcPr>
-            <w:tcW w:w="1500" w:type="dxa"/>
+            <w:tcW w:w="2026" w:type="dxa"/>
             <w:tcBorders>
               <w:top w:val="single" w:sz="6" w:space="0" w:color="ADB9CA"/>
               <w:left w:val="single" w:sz="6" w:space="0" w:color="ADB9CA"/>
@@ -1411,7 +1428,7 @@
         </w:tc>
         <w:tc>
           <w:tcPr>
-            <w:tcW w:w="1380" w:type="dxa"/>
+            <w:tcW w:w="1608" w:type="dxa"/>
             <w:tcBorders>
               <w:top w:val="single" w:sz="6" w:space="0" w:color="ADB9CA"/>
               <w:left w:val="single" w:sz="6" w:space="0" w:color="ADB9CA"/>
@@ -1431,7 +1448,7 @@
         </w:tc>
         <w:tc>
           <w:tcPr>
-            <w:tcW w:w="1300" w:type="dxa"/>
+            <w:tcW w:w="1104" w:type="dxa"/>
             <w:tcBorders>
               <w:top w:val="single" w:sz="6" w:space="0" w:color="ADB9CA"/>
               <w:left w:val="single" w:sz="6" w:space="0" w:color="ADB9CA"/>
@@ -1451,7 +1468,7 @@
         </w:tc>
         <w:tc>
           <w:tcPr>
-            <w:tcW w:w="1340" w:type="dxa"/>
+            <w:tcW w:w="1712" w:type="dxa"/>
             <w:tcBorders>
               <w:top w:val="single" w:sz="6" w:space="0" w:color="ADB9CA"/>
               <w:left w:val="single" w:sz="6" w:space="0" w:color="ADB9CA"/>
@@ -1471,7 +1488,7 @@
         </w:tc>
         <w:tc>
           <w:tcPr>
-            <w:tcW w:w="1700" w:type="dxa"/>
+            <w:tcW w:w="2089" w:type="dxa"/>
             <w:tcBorders>
               <w:top w:val="single" w:sz="6" w:space="0" w:color="ADB9CA"/>
               <w:left w:val="single" w:sz="6" w:space="0" w:color="ADB9CA"/>
@@ -1491,7 +1508,7 @@
         </w:tc>
         <w:tc>
           <w:tcPr>
-            <w:tcW w:w="1700" w:type="dxa"/>
+            <w:tcW w:w="1579" w:type="dxa"/>
             <w:tcBorders>
               <w:top w:val="single" w:sz="6" w:space="0" w:color="ADB9CA"/>
               <w:left w:val="single" w:sz="6" w:space="0" w:color="ADB9CA"/>
@@ -1511,15 +1528,12 @@
         </w:tc>
       </w:tr>
       <w:tr>
-        <w:tblPrEx>
-          <w:tblCellMar>
-            <w:top w:w="0" w:type="dxa"/>
-            <w:bottom w:w="0" w:type="dxa"/>
-          </w:tblCellMar>
-        </w:tblPrEx>
-        <w:tc>
-          <w:tcPr>
-            <w:tcW w:w="440" w:type="dxa"/>
+        <w:trPr>
+          <w:trHeight w:val="256"/>
+        </w:trPr>
+        <w:tc>
+          <w:tcPr>
+            <w:tcW w:w="498" w:type="dxa"/>
             <w:tcBorders>
               <w:top w:val="single" w:sz="6" w:space="0" w:color="ADB9CA"/>
               <w:left w:val="single" w:sz="6" w:space="0" w:color="ADB9CA"/>
@@ -1549,7 +1563,7 @@
         </w:tc>
         <w:tc>
           <w:tcPr>
-            <w:tcW w:w="1500" w:type="dxa"/>
+            <w:tcW w:w="2026" w:type="dxa"/>
             <w:tcBorders>
               <w:top w:val="single" w:sz="6" w:space="0" w:color="ADB9CA"/>
               <w:left w:val="single" w:sz="6" w:space="0" w:color="ADB9CA"/>
@@ -1569,7 +1583,7 @@
         </w:tc>
         <w:tc>
           <w:tcPr>
-            <w:tcW w:w="1380" w:type="dxa"/>
+            <w:tcW w:w="1608" w:type="dxa"/>
             <w:tcBorders>
               <w:top w:val="single" w:sz="6" w:space="0" w:color="ADB9CA"/>
               <w:left w:val="single" w:sz="6" w:space="0" w:color="ADB9CA"/>
@@ -1589,7 +1603,7 @@
         </w:tc>
         <w:tc>
           <w:tcPr>
-            <w:tcW w:w="1300" w:type="dxa"/>
+            <w:tcW w:w="1104" w:type="dxa"/>
             <w:tcBorders>
               <w:top w:val="single" w:sz="6" w:space="0" w:color="ADB9CA"/>
               <w:left w:val="single" w:sz="6" w:space="0" w:color="ADB9CA"/>
@@ -1609,7 +1623,7 @@
         </w:tc>
         <w:tc>
           <w:tcPr>
-            <w:tcW w:w="1340" w:type="dxa"/>
+            <w:tcW w:w="1712" w:type="dxa"/>
             <w:tcBorders>
               <w:top w:val="single" w:sz="6" w:space="0" w:color="ADB9CA"/>
               <w:left w:val="single" w:sz="6" w:space="0" w:color="ADB9CA"/>
@@ -1629,7 +1643,7 @@
         </w:tc>
         <w:tc>
           <w:tcPr>
-            <w:tcW w:w="1700" w:type="dxa"/>
+            <w:tcW w:w="2089" w:type="dxa"/>
             <w:tcBorders>
               <w:top w:val="single" w:sz="6" w:space="0" w:color="ADB9CA"/>
               <w:left w:val="single" w:sz="6" w:space="0" w:color="ADB9CA"/>
@@ -1649,7 +1663,7 @@
         </w:tc>
         <w:tc>
           <w:tcPr>
-            <w:tcW w:w="1700" w:type="dxa"/>
+            <w:tcW w:w="1579" w:type="dxa"/>
             <w:tcBorders>
               <w:top w:val="single" w:sz="6" w:space="0" w:color="ADB9CA"/>
               <w:left w:val="single" w:sz="6" w:space="0" w:color="ADB9CA"/>
@@ -1678,15 +1692,45 @@
       <w:pPr>
         <w:spacing w:before="60" w:after="40"/>
         <w:jc w:val="both"/>
-      </w:pPr>
-      <w:r>
         <w:rPr>
           <w:rFonts w:ascii="Arial" w:eastAsia="Arial" w:hAnsi="Arial" w:cs="Arial"/>
           <w:b/>
           <w:bCs/>
           <w:color w:val="000000"/>
         </w:rPr>
+      </w:pPr>
+      <w:r>
+        <w:rPr>
+          <w:rFonts w:ascii="Arial" w:eastAsia="Arial" w:hAnsi="Arial" w:cs="Arial"/>
+          <w:b/>
+          <w:bCs/>
+          <w:color w:val="000000"/>
+        </w:rPr>
         <w:t>Group Repository URL:</w:t>
+      </w:r>
+    </w:p>
+    <w:p>
+      <w:pPr>
+        <w:spacing w:before="60" w:after="40"/>
+        <w:jc w:val="both"/>
+      </w:pPr>
+      <w:r>
+        <w:t>https://github.com/A-D-H-I-56/TaskFlow.git</w:t>
+      </w:r>
+    </w:p>
+    <w:p>
+      <w:pPr>
+        <w:spacing w:before="60" w:after="40"/>
+        <w:jc w:val="both"/>
+      </w:pPr>
+      <w:r>
+        <w:rPr>
+          <w:rFonts w:ascii="Arial" w:eastAsia="Arial" w:hAnsi="Arial" w:cs="Arial"/>
+          <w:b/>
+          <w:bCs/>
+          <w:color w:val="000000"/>
+        </w:rPr>
+        <w:t>Deployed Application URL:</w:t>
       </w:r>
     </w:p>
     <w:p>
@@ -1695,39 +1739,7 @@
         <w:jc w:val="both"/>
       </w:pPr>
       <w:r>
-        <w:rPr>
-          <w:rFonts w:ascii="Arial" w:eastAsia="Arial" w:hAnsi="Arial" w:cs="Arial"/>
-          <w:color w:val="555555"/>
-        </w:rPr>
-        <w:t>[Paste Your GitHub Repository URL Here]</w:t>
-      </w:r>
-    </w:p>
-    <w:p>
-      <w:pPr>
-        <w:spacing w:before="60" w:after="40"/>
-        <w:jc w:val="both"/>
-      </w:pPr>
-      <w:r>
-        <w:rPr>
-          <w:rFonts w:ascii="Arial" w:eastAsia="Arial" w:hAnsi="Arial" w:cs="Arial"/>
-          <w:b/>
-          <w:bCs/>
-          <w:color w:val="000000"/>
-        </w:rPr>
-        <w:t>Deployed Application URL:</w:t>
-      </w:r>
-    </w:p>
-    <w:p>
-      <w:pPr>
-        <w:spacing w:before="60" w:after="120"/>
-        <w:jc w:val="both"/>
-      </w:pPr>
-      <w:r>
-        <w:rPr>
-          <w:rFonts w:ascii="Arial" w:eastAsia="Arial" w:hAnsi="Arial" w:cs="Arial"/>
-          <w:color w:val="555555"/>
-        </w:rPr>
-        <w:t>[Paste Your Render Live URL Here]</w:t>
+        <w:t>https://taskflow-cicd-v01.onrender.com/</w:t>
       </w:r>
     </w:p>
     <w:p>
@@ -1831,12 +1843,6 @@
         <w:gridCol w:w="4860"/>
       </w:tblGrid>
       <w:tr>
-        <w:tblPrEx>
-          <w:tblCellMar>
-            <w:top w:w="0" w:type="dxa"/>
-            <w:bottom w:w="0" w:type="dxa"/>
-          </w:tblCellMar>
-        </w:tblPrEx>
         <w:trPr>
           <w:tblHeader/>
         </w:trPr>
@@ -1970,12 +1976,6 @@
         </w:tc>
       </w:tr>
       <w:tr>
-        <w:tblPrEx>
-          <w:tblCellMar>
-            <w:top w:w="0" w:type="dxa"/>
-            <w:bottom w:w="0" w:type="dxa"/>
-          </w:tblCellMar>
-        </w:tblPrEx>
         <w:tc>
           <w:tcPr>
             <w:tcW w:w="500" w:type="dxa"/>
@@ -2102,12 +2102,6 @@
         </w:tc>
       </w:tr>
       <w:tr>
-        <w:tblPrEx>
-          <w:tblCellMar>
-            <w:top w:w="0" w:type="dxa"/>
-            <w:bottom w:w="0" w:type="dxa"/>
-          </w:tblCellMar>
-        </w:tblPrEx>
         <w:tc>
           <w:tcPr>
             <w:tcW w:w="500" w:type="dxa"/>
@@ -2252,12 +2246,6 @@
         </w:tc>
       </w:tr>
       <w:tr>
-        <w:tblPrEx>
-          <w:tblCellMar>
-            <w:top w:w="0" w:type="dxa"/>
-            <w:bottom w:w="0" w:type="dxa"/>
-          </w:tblCellMar>
-        </w:tblPrEx>
         <w:tc>
           <w:tcPr>
             <w:tcW w:w="500" w:type="dxa"/>
@@ -2384,12 +2372,6 @@
         </w:tc>
       </w:tr>
       <w:tr>
-        <w:tblPrEx>
-          <w:tblCellMar>
-            <w:top w:w="0" w:type="dxa"/>
-            <w:bottom w:w="0" w:type="dxa"/>
-          </w:tblCellMar>
-        </w:tblPrEx>
         <w:tc>
           <w:tcPr>
             <w:tcW w:w="500" w:type="dxa"/>
@@ -2516,12 +2498,6 @@
         </w:tc>
       </w:tr>
       <w:tr>
-        <w:tblPrEx>
-          <w:tblCellMar>
-            <w:top w:w="0" w:type="dxa"/>
-            <w:bottom w:w="0" w:type="dxa"/>
-          </w:tblCellMar>
-        </w:tblPrEx>
         <w:tc>
           <w:tcPr>
             <w:tcW w:w="500" w:type="dxa"/>
@@ -2550,6 +2526,7 @@
                 <w:sz w:val="18"/>
                 <w:szCs w:val="18"/>
               </w:rPr>
+              <w:lastRenderedPageBreak/>
               <w:t>5</w:t>
             </w:r>
           </w:p>
@@ -2665,7 +2642,6 @@
           <w:bCs/>
           <w:color w:val="000000"/>
         </w:rPr>
-        <w:lastRenderedPageBreak/>
         <w:t>Each member's individual workflow:</w:t>
       </w:r>
     </w:p>
@@ -3037,12 +3013,6 @@
         <w:gridCol w:w="6160"/>
       </w:tblGrid>
       <w:tr>
-        <w:tblPrEx>
-          <w:tblCellMar>
-            <w:top w:w="0" w:type="dxa"/>
-            <w:bottom w:w="0" w:type="dxa"/>
-          </w:tblCellMar>
-        </w:tblPrEx>
         <w:trPr>
           <w:tblHeader/>
         </w:trPr>
@@ -3112,12 +3082,6 @@
         </w:tc>
       </w:tr>
       <w:tr>
-        <w:tblPrEx>
-          <w:tblCellMar>
-            <w:top w:w="0" w:type="dxa"/>
-            <w:bottom w:w="0" w:type="dxa"/>
-          </w:tblCellMar>
-        </w:tblPrEx>
         <w:tc>
           <w:tcPr>
             <w:tcW w:w="3200" w:type="dxa"/>
@@ -3200,12 +3164,6 @@
         </w:tc>
       </w:tr>
       <w:tr>
-        <w:tblPrEx>
-          <w:tblCellMar>
-            <w:top w:w="0" w:type="dxa"/>
-            <w:bottom w:w="0" w:type="dxa"/>
-          </w:tblCellMar>
-        </w:tblPrEx>
         <w:tc>
           <w:tcPr>
             <w:tcW w:w="3200" w:type="dxa"/>
@@ -3288,12 +3246,6 @@
         </w:tc>
       </w:tr>
       <w:tr>
-        <w:tblPrEx>
-          <w:tblCellMar>
-            <w:top w:w="0" w:type="dxa"/>
-            <w:bottom w:w="0" w:type="dxa"/>
-          </w:tblCellMar>
-        </w:tblPrEx>
         <w:tc>
           <w:tcPr>
             <w:tcW w:w="3200" w:type="dxa"/>
@@ -3376,12 +3328,6 @@
         </w:tc>
       </w:tr>
       <w:tr>
-        <w:tblPrEx>
-          <w:tblCellMar>
-            <w:top w:w="0" w:type="dxa"/>
-            <w:bottom w:w="0" w:type="dxa"/>
-          </w:tblCellMar>
-        </w:tblPrEx>
         <w:tc>
           <w:tcPr>
             <w:tcW w:w="3200" w:type="dxa"/>
@@ -3464,12 +3410,6 @@
         </w:tc>
       </w:tr>
       <w:tr>
-        <w:tblPrEx>
-          <w:tblCellMar>
-            <w:top w:w="0" w:type="dxa"/>
-            <w:bottom w:w="0" w:type="dxa"/>
-          </w:tblCellMar>
-        </w:tblPrEx>
         <w:tc>
           <w:tcPr>
             <w:tcW w:w="3200" w:type="dxa"/>
@@ -3552,12 +3492,6 @@
         </w:tc>
       </w:tr>
       <w:tr>
-        <w:tblPrEx>
-          <w:tblCellMar>
-            <w:top w:w="0" w:type="dxa"/>
-            <w:bottom w:w="0" w:type="dxa"/>
-          </w:tblCellMar>
-        </w:tblPrEx>
         <w:tc>
           <w:tcPr>
             <w:tcW w:w="3200" w:type="dxa"/>
@@ -3640,12 +3574,6 @@
         </w:tc>
       </w:tr>
       <w:tr>
-        <w:tblPrEx>
-          <w:tblCellMar>
-            <w:top w:w="0" w:type="dxa"/>
-            <w:bottom w:w="0" w:type="dxa"/>
-          </w:tblCellMar>
-        </w:tblPrEx>
         <w:tc>
           <w:tcPr>
             <w:tcW w:w="3200" w:type="dxa"/>
@@ -3710,12 +3638,6 @@
         </w:tc>
       </w:tr>
       <w:tr>
-        <w:tblPrEx>
-          <w:tblCellMar>
-            <w:top w:w="0" w:type="dxa"/>
-            <w:bottom w:w="0" w:type="dxa"/>
-          </w:tblCellMar>
-        </w:tblPrEx>
         <w:tc>
           <w:tcPr>
             <w:tcW w:w="3200" w:type="dxa"/>
@@ -3789,12 +3711,6 @@
         </w:tc>
       </w:tr>
       <w:tr>
-        <w:tblPrEx>
-          <w:tblCellMar>
-            <w:top w:w="0" w:type="dxa"/>
-            <w:bottom w:w="0" w:type="dxa"/>
-          </w:tblCellMar>
-        </w:tblPrEx>
         <w:tc>
           <w:tcPr>
             <w:tcW w:w="3200" w:type="dxa"/>
@@ -3868,12 +3784,6 @@
         </w:tc>
       </w:tr>
       <w:tr>
-        <w:tblPrEx>
-          <w:tblCellMar>
-            <w:top w:w="0" w:type="dxa"/>
-            <w:bottom w:w="0" w:type="dxa"/>
-          </w:tblCellMar>
-        </w:tblPrEx>
         <w:tc>
           <w:tcPr>
             <w:tcW w:w="3200" w:type="dxa"/>
@@ -3902,6 +3812,7 @@
                 <w:sz w:val="18"/>
                 <w:szCs w:val="18"/>
               </w:rPr>
+              <w:lastRenderedPageBreak/>
               <w:t>Assignment_04_Spring2026.docx</w:t>
             </w:r>
           </w:p>
@@ -3972,7 +3883,6 @@
           <w:rFonts w:ascii="Arial" w:eastAsia="Arial" w:hAnsi="Arial" w:cs="Arial"/>
           <w:color w:val="000000"/>
         </w:rPr>
-        <w:lastRenderedPageBreak/>
         <w:t xml:space="preserve">The Team Lead (TL) is responsible for creating all secrets listed below. The TL is the repository admin and the credentials in use </w:t>
       </w:r>
       <w:r>
@@ -4120,12 +4030,6 @@
         <w:gridCol w:w="4420"/>
       </w:tblGrid>
       <w:tr>
-        <w:tblPrEx>
-          <w:tblCellMar>
-            <w:top w:w="0" w:type="dxa"/>
-            <w:bottom w:w="0" w:type="dxa"/>
-          </w:tblCellMar>
-        </w:tblPrEx>
         <w:trPr>
           <w:tblHeader/>
         </w:trPr>
@@ -4227,12 +4131,6 @@
         </w:tc>
       </w:tr>
       <w:tr>
-        <w:tblPrEx>
-          <w:tblCellMar>
-            <w:top w:w="0" w:type="dxa"/>
-            <w:bottom w:w="0" w:type="dxa"/>
-          </w:tblCellMar>
-        </w:tblPrEx>
         <w:trPr>
           <w:trHeight w:val="427"/>
         </w:trPr>
@@ -4336,12 +4234,6 @@
         </w:tc>
       </w:tr>
       <w:tr>
-        <w:tblPrEx>
-          <w:tblCellMar>
-            <w:top w:w="0" w:type="dxa"/>
-            <w:bottom w:w="0" w:type="dxa"/>
-          </w:tblCellMar>
-        </w:tblPrEx>
         <w:tc>
           <w:tcPr>
             <w:tcW w:w="2000" w:type="dxa"/>
@@ -4454,12 +4346,6 @@
         </w:tc>
       </w:tr>
       <w:tr>
-        <w:tblPrEx>
-          <w:tblCellMar>
-            <w:top w:w="0" w:type="dxa"/>
-            <w:bottom w:w="0" w:type="dxa"/>
-          </w:tblCellMar>
-        </w:tblPrEx>
         <w:tc>
           <w:tcPr>
             <w:tcW w:w="2000" w:type="dxa"/>
@@ -4815,6 +4701,7 @@
           <w:rFonts w:ascii="Arial" w:eastAsia="Arial" w:hAnsi="Arial" w:cs="Arial"/>
           <w:color w:val="000000"/>
         </w:rPr>
+        <w:lastRenderedPageBreak/>
         <w:t xml:space="preserve">The CI status check must appear as a required check in the Branch Protection Rules on </w:t>
       </w:r>
       <w:r>
@@ -5141,12 +5028,6 @@
         <w:gridCol w:w="4380"/>
       </w:tblGrid>
       <w:tr>
-        <w:tblPrEx>
-          <w:tblCellMar>
-            <w:top w:w="0" w:type="dxa"/>
-            <w:bottom w:w="0" w:type="dxa"/>
-          </w:tblCellMar>
-        </w:tblPrEx>
         <w:trPr>
           <w:tblHeader/>
         </w:trPr>
@@ -5248,12 +5129,6 @@
         </w:tc>
       </w:tr>
       <w:tr>
-        <w:tblPrEx>
-          <w:tblCellMar>
-            <w:top w:w="0" w:type="dxa"/>
-            <w:bottom w:w="0" w:type="dxa"/>
-          </w:tblCellMar>
-        </w:tblPrEx>
         <w:tc>
           <w:tcPr>
             <w:tcW w:w="1600" w:type="dxa"/>
@@ -5366,12 +5241,6 @@
         </w:tc>
       </w:tr>
       <w:tr>
-        <w:tblPrEx>
-          <w:tblCellMar>
-            <w:top w:w="0" w:type="dxa"/>
-            <w:bottom w:w="0" w:type="dxa"/>
-          </w:tblCellMar>
-        </w:tblPrEx>
         <w:tc>
           <w:tcPr>
             <w:tcW w:w="1600" w:type="dxa"/>
@@ -5863,6 +5732,7 @@
           <w:sz w:val="19"/>
           <w:szCs w:val="19"/>
         </w:rPr>
+        <w:lastRenderedPageBreak/>
         <w:t>Build the assigned HTML page with proper content and link it to style.css</w:t>
       </w:r>
     </w:p>
@@ -6066,12 +5936,6 @@
         <w:gridCol w:w="2150"/>
       </w:tblGrid>
       <w:tr>
-        <w:tblPrEx>
-          <w:tblCellMar>
-            <w:top w:w="0" w:type="dxa"/>
-            <w:bottom w:w="0" w:type="dxa"/>
-          </w:tblCellMar>
-        </w:tblPrEx>
         <w:trPr>
           <w:tblHeader/>
         </w:trPr>
@@ -6173,12 +6037,6 @@
         </w:tc>
       </w:tr>
       <w:tr>
-        <w:tblPrEx>
-          <w:tblCellMar>
-            <w:top w:w="0" w:type="dxa"/>
-            <w:bottom w:w="0" w:type="dxa"/>
-          </w:tblCellMar>
-        </w:tblPrEx>
         <w:tc>
           <w:tcPr>
             <w:tcW w:w="700" w:type="dxa"/>
@@ -6265,12 +6123,6 @@
         </w:tc>
       </w:tr>
       <w:tr>
-        <w:tblPrEx>
-          <w:tblCellMar>
-            <w:top w:w="0" w:type="dxa"/>
-            <w:bottom w:w="0" w:type="dxa"/>
-          </w:tblCellMar>
-        </w:tblPrEx>
         <w:tc>
           <w:tcPr>
             <w:tcW w:w="700" w:type="dxa"/>
@@ -6365,12 +6217,6 @@
         </w:tc>
       </w:tr>
       <w:tr>
-        <w:tblPrEx>
-          <w:tblCellMar>
-            <w:top w:w="0" w:type="dxa"/>
-            <w:bottom w:w="0" w:type="dxa"/>
-          </w:tblCellMar>
-        </w:tblPrEx>
         <w:tc>
           <w:tcPr>
             <w:tcW w:w="700" w:type="dxa"/>
@@ -6465,12 +6311,6 @@
         </w:tc>
       </w:tr>
       <w:tr>
-        <w:tblPrEx>
-          <w:tblCellMar>
-            <w:top w:w="0" w:type="dxa"/>
-            <w:bottom w:w="0" w:type="dxa"/>
-          </w:tblCellMar>
-        </w:tblPrEx>
         <w:tc>
           <w:tcPr>
             <w:tcW w:w="700" w:type="dxa"/>
@@ -6557,12 +6397,6 @@
         </w:tc>
       </w:tr>
       <w:tr>
-        <w:tblPrEx>
-          <w:tblCellMar>
-            <w:top w:w="0" w:type="dxa"/>
-            <w:bottom w:w="0" w:type="dxa"/>
-          </w:tblCellMar>
-        </w:tblPrEx>
         <w:tc>
           <w:tcPr>
             <w:tcW w:w="700" w:type="dxa"/>
@@ -6666,12 +6500,6 @@
         </w:tc>
       </w:tr>
       <w:tr>
-        <w:tblPrEx>
-          <w:tblCellMar>
-            <w:top w:w="0" w:type="dxa"/>
-            <w:bottom w:w="0" w:type="dxa"/>
-          </w:tblCellMar>
-        </w:tblPrEx>
         <w:tc>
           <w:tcPr>
             <w:tcW w:w="700" w:type="dxa"/>
@@ -6766,12 +6594,6 @@
         </w:tc>
       </w:tr>
       <w:tr>
-        <w:tblPrEx>
-          <w:tblCellMar>
-            <w:top w:w="0" w:type="dxa"/>
-            <w:bottom w:w="0" w:type="dxa"/>
-          </w:tblCellMar>
-        </w:tblPrEx>
         <w:tc>
           <w:tcPr>
             <w:tcW w:w="700" w:type="dxa"/>
@@ -6875,12 +6697,6 @@
         </w:tc>
       </w:tr>
       <w:tr>
-        <w:tblPrEx>
-          <w:tblCellMar>
-            <w:top w:w="0" w:type="dxa"/>
-            <w:bottom w:w="0" w:type="dxa"/>
-          </w:tblCellMar>
-        </w:tblPrEx>
         <w:tc>
           <w:tcPr>
             <w:tcW w:w="700" w:type="dxa"/>
@@ -6967,12 +6783,6 @@
         </w:tc>
       </w:tr>
       <w:tr>
-        <w:tblPrEx>
-          <w:tblCellMar>
-            <w:top w:w="0" w:type="dxa"/>
-            <w:bottom w:w="0" w:type="dxa"/>
-          </w:tblCellMar>
-        </w:tblPrEx>
         <w:tc>
           <w:tcPr>
             <w:tcW w:w="700" w:type="dxa"/>
@@ -7067,12 +6877,6 @@
         </w:tc>
       </w:tr>
       <w:tr>
-        <w:tblPrEx>
-          <w:tblCellMar>
-            <w:top w:w="0" w:type="dxa"/>
-            <w:bottom w:w="0" w:type="dxa"/>
-          </w:tblCellMar>
-        </w:tblPrEx>
         <w:tc>
           <w:tcPr>
             <w:tcW w:w="700" w:type="dxa"/>
@@ -7167,12 +6971,6 @@
         </w:tc>
       </w:tr>
       <w:tr>
-        <w:tblPrEx>
-          <w:tblCellMar>
-            <w:top w:w="0" w:type="dxa"/>
-            <w:bottom w:w="0" w:type="dxa"/>
-          </w:tblCellMar>
-        </w:tblPrEx>
         <w:tc>
           <w:tcPr>
             <w:tcW w:w="700" w:type="dxa"/>
@@ -7285,12 +7083,6 @@
         </w:tc>
       </w:tr>
       <w:tr>
-        <w:tblPrEx>
-          <w:tblCellMar>
-            <w:top w:w="0" w:type="dxa"/>
-            <w:bottom w:w="0" w:type="dxa"/>
-          </w:tblCellMar>
-        </w:tblPrEx>
         <w:tc>
           <w:tcPr>
             <w:tcW w:w="700" w:type="dxa"/>
@@ -7377,12 +7169,6 @@
         </w:tc>
       </w:tr>
       <w:tr>
-        <w:tblPrEx>
-          <w:tblCellMar>
-            <w:top w:w="0" w:type="dxa"/>
-            <w:bottom w:w="0" w:type="dxa"/>
-          </w:tblCellMar>
-        </w:tblPrEx>
         <w:tc>
           <w:tcPr>
             <w:tcW w:w="700" w:type="dxa"/>
@@ -7486,12 +7272,6 @@
         </w:tc>
       </w:tr>
       <w:tr>
-        <w:tblPrEx>
-          <w:tblCellMar>
-            <w:top w:w="0" w:type="dxa"/>
-            <w:bottom w:w="0" w:type="dxa"/>
-          </w:tblCellMar>
-        </w:tblPrEx>
         <w:tc>
           <w:tcPr>
             <w:tcW w:w="700" w:type="dxa"/>
@@ -7586,12 +7366,6 @@
         </w:tc>
       </w:tr>
       <w:tr>
-        <w:tblPrEx>
-          <w:tblCellMar>
-            <w:top w:w="0" w:type="dxa"/>
-            <w:bottom w:w="0" w:type="dxa"/>
-          </w:tblCellMar>
-        </w:tblPrEx>
         <w:tc>
           <w:tcPr>
             <w:tcW w:w="700" w:type="dxa"/>
@@ -7686,12 +7460,6 @@
         </w:tc>
       </w:tr>
       <w:tr>
-        <w:tblPrEx>
-          <w:tblCellMar>
-            <w:top w:w="0" w:type="dxa"/>
-            <w:bottom w:w="0" w:type="dxa"/>
-          </w:tblCellMar>
-        </w:tblPrEx>
         <w:tc>
           <w:tcPr>
             <w:tcW w:w="700" w:type="dxa"/>
@@ -7786,12 +7554,6 @@
         </w:tc>
       </w:tr>
       <w:tr>
-        <w:tblPrEx>
-          <w:tblCellMar>
-            <w:top w:w="0" w:type="dxa"/>
-            <w:bottom w:w="0" w:type="dxa"/>
-          </w:tblCellMar>
-        </w:tblPrEx>
         <w:tc>
           <w:tcPr>
             <w:tcW w:w="700" w:type="dxa"/>
@@ -7878,12 +7640,6 @@
         </w:tc>
       </w:tr>
       <w:tr>
-        <w:tblPrEx>
-          <w:tblCellMar>
-            <w:top w:w="0" w:type="dxa"/>
-            <w:bottom w:w="0" w:type="dxa"/>
-          </w:tblCellMar>
-        </w:tblPrEx>
         <w:tc>
           <w:tcPr>
             <w:tcW w:w="700" w:type="dxa"/>
@@ -7987,12 +7743,6 @@
         </w:tc>
       </w:tr>
       <w:tr>
-        <w:tblPrEx>
-          <w:tblCellMar>
-            <w:top w:w="0" w:type="dxa"/>
-            <w:bottom w:w="0" w:type="dxa"/>
-          </w:tblCellMar>
-        </w:tblPrEx>
         <w:tc>
           <w:tcPr>
             <w:tcW w:w="700" w:type="dxa"/>
@@ -8087,12 +7837,6 @@
         </w:tc>
       </w:tr>
       <w:tr>
-        <w:tblPrEx>
-          <w:tblCellMar>
-            <w:top w:w="0" w:type="dxa"/>
-            <w:bottom w:w="0" w:type="dxa"/>
-          </w:tblCellMar>
-        </w:tblPrEx>
         <w:tc>
           <w:tcPr>
             <w:tcW w:w="700" w:type="dxa"/>
@@ -8121,6 +7865,7 @@
                 <w:sz w:val="18"/>
                 <w:szCs w:val="18"/>
               </w:rPr>
+              <w:lastRenderedPageBreak/>
               <w:t>15</w:t>
             </w:r>
           </w:p>
@@ -8187,12 +7932,6 @@
         </w:tc>
       </w:tr>
       <w:tr>
-        <w:tblPrEx>
-          <w:tblCellMar>
-            <w:top w:w="0" w:type="dxa"/>
-            <w:bottom w:w="0" w:type="dxa"/>
-          </w:tblCellMar>
-        </w:tblPrEx>
         <w:tc>
           <w:tcPr>
             <w:tcW w:w="700" w:type="dxa"/>
@@ -8279,12 +8018,6 @@
         </w:tc>
       </w:tr>
       <w:tr>
-        <w:tblPrEx>
-          <w:tblCellMar>
-            <w:top w:w="0" w:type="dxa"/>
-            <w:bottom w:w="0" w:type="dxa"/>
-          </w:tblCellMar>
-        </w:tblPrEx>
         <w:tc>
           <w:tcPr>
             <w:tcW w:w="700" w:type="dxa"/>
@@ -8379,12 +8112,6 @@
         </w:tc>
       </w:tr>
       <w:tr>
-        <w:tblPrEx>
-          <w:tblCellMar>
-            <w:top w:w="0" w:type="dxa"/>
-            <w:bottom w:w="0" w:type="dxa"/>
-          </w:tblCellMar>
-        </w:tblPrEx>
         <w:tc>
           <w:tcPr>
             <w:tcW w:w="700" w:type="dxa"/>
@@ -8479,12 +8206,6 @@
         </w:tc>
       </w:tr>
       <w:tr>
-        <w:tblPrEx>
-          <w:tblCellMar>
-            <w:top w:w="0" w:type="dxa"/>
-            <w:bottom w:w="0" w:type="dxa"/>
-          </w:tblCellMar>
-        </w:tblPrEx>
         <w:tc>
           <w:tcPr>
             <w:tcW w:w="700" w:type="dxa"/>
@@ -8889,12 +8610,6 @@
         <w:gridCol w:w="6160"/>
       </w:tblGrid>
       <w:tr>
-        <w:tblPrEx>
-          <w:tblCellMar>
-            <w:top w:w="0" w:type="dxa"/>
-            <w:bottom w:w="0" w:type="dxa"/>
-          </w:tblCellMar>
-        </w:tblPrEx>
         <w:tc>
           <w:tcPr>
             <w:tcW w:w="3200" w:type="dxa"/>
@@ -8961,12 +8676,6 @@
         </w:tc>
       </w:tr>
       <w:tr>
-        <w:tblPrEx>
-          <w:tblCellMar>
-            <w:top w:w="0" w:type="dxa"/>
-            <w:bottom w:w="0" w:type="dxa"/>
-          </w:tblCellMar>
-        </w:tblPrEx>
         <w:tc>
           <w:tcPr>
             <w:tcW w:w="3200" w:type="dxa"/>
@@ -9043,12 +8752,6 @@
         </w:tc>
       </w:tr>
       <w:tr>
-        <w:tblPrEx>
-          <w:tblCellMar>
-            <w:top w:w="0" w:type="dxa"/>
-            <w:bottom w:w="0" w:type="dxa"/>
-          </w:tblCellMar>
-        </w:tblPrEx>
         <w:tc>
           <w:tcPr>
             <w:tcW w:w="3200" w:type="dxa"/>
@@ -9103,12 +8806,6 @@
         </w:tc>
       </w:tr>
       <w:tr>
-        <w:tblPrEx>
-          <w:tblCellMar>
-            <w:top w:w="0" w:type="dxa"/>
-            <w:bottom w:w="0" w:type="dxa"/>
-          </w:tblCellMar>
-        </w:tblPrEx>
         <w:tc>
           <w:tcPr>
             <w:tcW w:w="3200" w:type="dxa"/>
@@ -9163,12 +8860,6 @@
         </w:tc>
       </w:tr>
       <w:tr>
-        <w:tblPrEx>
-          <w:tblCellMar>
-            <w:top w:w="0" w:type="dxa"/>
-            <w:bottom w:w="0" w:type="dxa"/>
-          </w:tblCellMar>
-        </w:tblPrEx>
         <w:tc>
           <w:tcPr>
             <w:tcW w:w="3200" w:type="dxa"/>
@@ -9234,12 +8925,6 @@
         </w:tc>
       </w:tr>
       <w:tr>
-        <w:tblPrEx>
-          <w:tblCellMar>
-            <w:top w:w="0" w:type="dxa"/>
-            <w:bottom w:w="0" w:type="dxa"/>
-          </w:tblCellMar>
-        </w:tblPrEx>
         <w:tc>
           <w:tcPr>
             <w:tcW w:w="3200" w:type="dxa"/>
@@ -9294,12 +8979,6 @@
         </w:tc>
       </w:tr>
       <w:tr>
-        <w:tblPrEx>
-          <w:tblCellMar>
-            <w:top w:w="0" w:type="dxa"/>
-            <w:bottom w:w="0" w:type="dxa"/>
-          </w:tblCellMar>
-        </w:tblPrEx>
         <w:tc>
           <w:tcPr>
             <w:tcW w:w="3200" w:type="dxa"/>
@@ -9375,6 +9054,7 @@
           <w:sz w:val="28"/>
           <w:szCs w:val="28"/>
         </w:rPr>
+        <w:lastRenderedPageBreak/>
         <w:t>TEAM REFLECTION</w:t>
       </w:r>
     </w:p>
@@ -9432,12 +9112,6 @@
         <w:gridCol w:w="9360"/>
       </w:tblGrid>
       <w:tr>
-        <w:tblPrEx>
-          <w:tblCellMar>
-            <w:top w:w="0" w:type="dxa"/>
-            <w:bottom w:w="0" w:type="dxa"/>
-          </w:tblCellMar>
-        </w:tblPrEx>
         <w:tc>
           <w:tcPr>
             <w:tcW w:w="9360" w:type="dxa"/>
@@ -9460,12 +9134,6 @@
         </w:tc>
       </w:tr>
       <w:tr>
-        <w:tblPrEx>
-          <w:tblCellMar>
-            <w:top w:w="0" w:type="dxa"/>
-            <w:bottom w:w="0" w:type="dxa"/>
-          </w:tblCellMar>
-        </w:tblPrEx>
         <w:tc>
           <w:tcPr>
             <w:tcW w:w="9360" w:type="dxa"/>
@@ -9488,12 +9156,6 @@
         </w:tc>
       </w:tr>
       <w:tr>
-        <w:tblPrEx>
-          <w:tblCellMar>
-            <w:top w:w="0" w:type="dxa"/>
-            <w:bottom w:w="0" w:type="dxa"/>
-          </w:tblCellMar>
-        </w:tblPrEx>
         <w:tc>
           <w:tcPr>
             <w:tcW w:w="9360" w:type="dxa"/>
@@ -9557,12 +9219,6 @@
         <w:gridCol w:w="9360"/>
       </w:tblGrid>
       <w:tr>
-        <w:tblPrEx>
-          <w:tblCellMar>
-            <w:top w:w="0" w:type="dxa"/>
-            <w:bottom w:w="0" w:type="dxa"/>
-          </w:tblCellMar>
-        </w:tblPrEx>
         <w:tc>
           <w:tcPr>
             <w:tcW w:w="9360" w:type="dxa"/>
@@ -9585,12 +9241,6 @@
         </w:tc>
       </w:tr>
       <w:tr>
-        <w:tblPrEx>
-          <w:tblCellMar>
-            <w:top w:w="0" w:type="dxa"/>
-            <w:bottom w:w="0" w:type="dxa"/>
-          </w:tblCellMar>
-        </w:tblPrEx>
         <w:tc>
           <w:tcPr>
             <w:tcW w:w="9360" w:type="dxa"/>
@@ -9613,12 +9263,6 @@
         </w:tc>
       </w:tr>
       <w:tr>
-        <w:tblPrEx>
-          <w:tblCellMar>
-            <w:top w:w="0" w:type="dxa"/>
-            <w:bottom w:w="0" w:type="dxa"/>
-          </w:tblCellMar>
-        </w:tblPrEx>
         <w:tc>
           <w:tcPr>
             <w:tcW w:w="9360" w:type="dxa"/>
@@ -9682,12 +9326,6 @@
         <w:gridCol w:w="9360"/>
       </w:tblGrid>
       <w:tr>
-        <w:tblPrEx>
-          <w:tblCellMar>
-            <w:top w:w="0" w:type="dxa"/>
-            <w:bottom w:w="0" w:type="dxa"/>
-          </w:tblCellMar>
-        </w:tblPrEx>
         <w:tc>
           <w:tcPr>
             <w:tcW w:w="9360" w:type="dxa"/>
@@ -9710,12 +9348,6 @@
         </w:tc>
       </w:tr>
       <w:tr>
-        <w:tblPrEx>
-          <w:tblCellMar>
-            <w:top w:w="0" w:type="dxa"/>
-            <w:bottom w:w="0" w:type="dxa"/>
-          </w:tblCellMar>
-        </w:tblPrEx>
         <w:tc>
           <w:tcPr>
             <w:tcW w:w="9360" w:type="dxa"/>
@@ -9738,12 +9370,6 @@
         </w:tc>
       </w:tr>
       <w:tr>
-        <w:tblPrEx>
-          <w:tblCellMar>
-            <w:top w:w="0" w:type="dxa"/>
-            <w:bottom w:w="0" w:type="dxa"/>
-          </w:tblCellMar>
-        </w:tblPrEx>
         <w:tc>
           <w:tcPr>
             <w:tcW w:w="9360" w:type="dxa"/>
@@ -9807,12 +9433,6 @@
         <w:gridCol w:w="9360"/>
       </w:tblGrid>
       <w:tr>
-        <w:tblPrEx>
-          <w:tblCellMar>
-            <w:top w:w="0" w:type="dxa"/>
-            <w:bottom w:w="0" w:type="dxa"/>
-          </w:tblCellMar>
-        </w:tblPrEx>
         <w:tc>
           <w:tcPr>
             <w:tcW w:w="9360" w:type="dxa"/>
@@ -9835,12 +9455,6 @@
         </w:tc>
       </w:tr>
       <w:tr>
-        <w:tblPrEx>
-          <w:tblCellMar>
-            <w:top w:w="0" w:type="dxa"/>
-            <w:bottom w:w="0" w:type="dxa"/>
-          </w:tblCellMar>
-        </w:tblPrEx>
         <w:tc>
           <w:tcPr>
             <w:tcW w:w="9360" w:type="dxa"/>
@@ -9863,12 +9477,6 @@
         </w:tc>
       </w:tr>
       <w:tr>
-        <w:tblPrEx>
-          <w:tblCellMar>
-            <w:top w:w="0" w:type="dxa"/>
-            <w:bottom w:w="0" w:type="dxa"/>
-          </w:tblCellMar>
-        </w:tblPrEx>
         <w:tc>
           <w:tcPr>
             <w:tcW w:w="9360" w:type="dxa"/>
@@ -9932,12 +9540,6 @@
         <w:gridCol w:w="9360"/>
       </w:tblGrid>
       <w:tr>
-        <w:tblPrEx>
-          <w:tblCellMar>
-            <w:top w:w="0" w:type="dxa"/>
-            <w:bottom w:w="0" w:type="dxa"/>
-          </w:tblCellMar>
-        </w:tblPrEx>
         <w:tc>
           <w:tcPr>
             <w:tcW w:w="9360" w:type="dxa"/>
@@ -9960,12 +9562,6 @@
         </w:tc>
       </w:tr>
       <w:tr>
-        <w:tblPrEx>
-          <w:tblCellMar>
-            <w:top w:w="0" w:type="dxa"/>
-            <w:bottom w:w="0" w:type="dxa"/>
-          </w:tblCellMar>
-        </w:tblPrEx>
         <w:tc>
           <w:tcPr>
             <w:tcW w:w="9360" w:type="dxa"/>
@@ -9988,12 +9584,6 @@
         </w:tc>
       </w:tr>
       <w:tr>
-        <w:tblPrEx>
-          <w:tblCellMar>
-            <w:top w:w="0" w:type="dxa"/>
-            <w:bottom w:w="0" w:type="dxa"/>
-          </w:tblCellMar>
-        </w:tblPrEx>
         <w:tc>
           <w:tcPr>
             <w:tcW w:w="9360" w:type="dxa"/>
@@ -10038,7 +9628,7 @@
 </file>
 
 <file path=word/endnotes.xml><?xml version="1.0" encoding="utf-8"?>
-<w:endnotes xmlns:wpc="http://schemas.microsoft.com/office/word/2010/wordprocessingCanvas" xmlns:cx="http://schemas.microsoft.com/office/drawing/2014/chartex" xmlns:cx1="http://schemas.microsoft.com/office/drawing/2015/9/8/chartex" xmlns:cx2="http://schemas.microsoft.com/office/drawing/2015/10/21/chartex" xmlns:cx3="http://schemas.microsoft.com/office/drawing/2016/5/9/chartex" xmlns:cx4="http://schemas.microsoft.com/office/drawing/2016/5/10/chartex" xmlns:cx5="http://schemas.microsoft.com/office/drawing/2016/5/11/chartex" xmlns:cx6="http://schemas.microsoft.com/office/drawing/2016/5/12/chartex" xmlns:cx7="http://schemas.microsoft.com/office/drawing/2016/5/13/chartex" xmlns:cx8="http://schemas.microsoft.com/office/drawing/2016/5/14/chartex" xmlns:mc="http://schemas.openxmlformats.org/markup-compatibility/2006" xmlns:aink="http://schemas.microsoft.com/office/drawing/2016/ink" xmlns:am3d="http://schemas.microsoft.com/office/drawing/2017/model3d" xmlns:o="urn:schemas-microsoft-com:office:office" xmlns:oel="http://schemas.microsoft.com/office/2019/extlst" xmlns:r="http://schemas.openxmlformats.org/officeDocument/2006/relationships" xmlns:m="http://schemas.openxmlformats.org/officeDocument/2006/math" xmlns:v="urn:schemas-microsoft-com:vml" xmlns:wp14="http://schemas.microsoft.com/office/word/2010/wordprocessingDrawing" xmlns:wp="http://schemas.openxmlformats.org/drawingml/2006/wordprocessingDrawing" xmlns:w10="urn:schemas-microsoft-com:office:word" xmlns:w="http://schemas.openxmlformats.org/wordprocessingml/2006/main" xmlns:w14="http://schemas.microsoft.com/office/word/2010/wordml" xmlns:w15="http://schemas.microsoft.com/office/word/2012/wordml" xmlns:w16cex="http://schemas.microsoft.com/office/word/2018/wordml/cex" xmlns:w16cid="http://schemas.microsoft.com/office/word/2016/wordml/cid" xmlns:w16="http://schemas.microsoft.com/office/word/2018/wordml" xmlns:w16du="http://schemas.microsoft.com/office/word/2023/wordml/word16du" xmlns:w16sdtdh="http://schemas.microsoft.com/office/word/2020/wordml/sdtdatahash" xmlns:w16sdtfl="http://schemas.microsoft.com/office/word/2024/wordml/sdtformatlock" xmlns:w16se="http://schemas.microsoft.com/office/word/2015/wordml/symex" xmlns:wpg="http://schemas.microsoft.com/office/word/2010/wordprocessingGroup" xmlns:wpi="http://schemas.microsoft.com/office/word/2010/wordprocessingInk" xmlns:wne="http://schemas.microsoft.com/office/word/2006/wordml" xmlns:wps="http://schemas.microsoft.com/office/word/2010/wordprocessingShape" mc:Ignorable="w14 w15 w16se w16cid w16 w16cex w16sdtdh w16sdtfl w16du wp14">
+<w:endnotes xmlns:wpc="http://schemas.microsoft.com/office/word/2010/wordprocessingCanvas" xmlns:cx="http://schemas.microsoft.com/office/drawing/2014/chartex" xmlns:cx1="http://schemas.microsoft.com/office/drawing/2015/9/8/chartex" xmlns:cx2="http://schemas.microsoft.com/office/drawing/2015/10/21/chartex" xmlns:cx3="http://schemas.microsoft.com/office/drawing/2016/5/9/chartex" xmlns:cx4="http://schemas.microsoft.com/office/drawing/2016/5/10/chartex" xmlns:cx5="http://schemas.microsoft.com/office/drawing/2016/5/11/chartex" xmlns:cx6="http://schemas.microsoft.com/office/drawing/2016/5/12/chartex" xmlns:cx7="http://schemas.microsoft.com/office/drawing/2016/5/13/chartex" xmlns:cx8="http://schemas.microsoft.com/office/drawing/2016/5/14/chartex" xmlns:mc="http://schemas.openxmlformats.org/markup-compatibility/2006" xmlns:aink="http://schemas.microsoft.com/office/drawing/2016/ink" xmlns:am3d="http://schemas.microsoft.com/office/drawing/2017/model3d" xmlns:o="urn:schemas-microsoft-com:office:office" xmlns:oel="http://schemas.microsoft.com/office/2019/extlst" xmlns:r="http://schemas.openxmlformats.org/officeDocument/2006/relationships" xmlns:m="http://schemas.openxmlformats.org/officeDocument/2006/math" xmlns:v="urn:schemas-microsoft-com:vml" xmlns:wp14="http://schemas.microsoft.com/office/word/2010/wordprocessingDrawing" xmlns:wp="http://schemas.openxmlformats.org/drawingml/2006/wordprocessingDrawing" xmlns:w10="urn:schemas-microsoft-com:office:word" xmlns:w="http://schemas.openxmlformats.org/wordprocessingml/2006/main" xmlns:w14="http://schemas.microsoft.com/office/word/2010/wordml" xmlns:w15="http://schemas.microsoft.com/office/word/2012/wordml" xmlns:w16cex="http://schemas.microsoft.com/office/word/2018/wordml/cex" xmlns:w16cid="http://schemas.microsoft.com/office/word/2016/wordml/cid" xmlns:w16="http://schemas.microsoft.com/office/word/2018/wordml" xmlns:w16sdtdh="http://schemas.microsoft.com/office/word/2020/wordml/sdtdatahash" xmlns:w16se="http://schemas.microsoft.com/office/word/2015/wordml/symex" xmlns:wpg="http://schemas.microsoft.com/office/word/2010/wordprocessingGroup" xmlns:wpi="http://schemas.microsoft.com/office/word/2010/wordprocessingInk" xmlns:wne="http://schemas.microsoft.com/office/word/2006/wordml" xmlns:wps="http://schemas.microsoft.com/office/word/2010/wordprocessingShape" mc:Ignorable="w14 w15 w16se w16cid w16 w16cex w16sdtdh wp14">
   <w:endnote w:type="separator" w:id="-1">
     <w:p>
       <w:r>
@@ -10057,7 +9647,7 @@
 </file>
 
 <file path=word/footer1.xml><?xml version="1.0" encoding="utf-8"?>
-<w:ftr xmlns:wpc="http://schemas.microsoft.com/office/word/2010/wordprocessingCanvas" xmlns:cx="http://schemas.microsoft.com/office/drawing/2014/chartex" xmlns:cx1="http://schemas.microsoft.com/office/drawing/2015/9/8/chartex" xmlns:cx2="http://schemas.microsoft.com/office/drawing/2015/10/21/chartex" xmlns:cx3="http://schemas.microsoft.com/office/drawing/2016/5/9/chartex" xmlns:cx4="http://schemas.microsoft.com/office/drawing/2016/5/10/chartex" xmlns:cx5="http://schemas.microsoft.com/office/drawing/2016/5/11/chartex" xmlns:cx6="http://schemas.microsoft.com/office/drawing/2016/5/12/chartex" xmlns:cx7="http://schemas.microsoft.com/office/drawing/2016/5/13/chartex" xmlns:cx8="http://schemas.microsoft.com/office/drawing/2016/5/14/chartex" xmlns:mc="http://schemas.openxmlformats.org/markup-compatibility/2006" xmlns:aink="http://schemas.microsoft.com/office/drawing/2016/ink" xmlns:am3d="http://schemas.microsoft.com/office/drawing/2017/model3d" xmlns:o="urn:schemas-microsoft-com:office:office" xmlns:oel="http://schemas.microsoft.com/office/2019/extlst" xmlns:r="http://schemas.openxmlformats.org/officeDocument/2006/relationships" xmlns:m="http://schemas.openxmlformats.org/officeDocument/2006/math" xmlns:v="urn:schemas-microsoft-com:vml" xmlns:wp14="http://schemas.microsoft.com/office/word/2010/wordprocessingDrawing" xmlns:wp="http://schemas.openxmlformats.org/drawingml/2006/wordprocessingDrawing" xmlns:w10="urn:schemas-microsoft-com:office:word" xmlns:w="http://schemas.openxmlformats.org/wordprocessingml/2006/main" xmlns:w14="http://schemas.microsoft.com/office/word/2010/wordml" xmlns:w15="http://schemas.microsoft.com/office/word/2012/wordml" xmlns:w16cex="http://schemas.microsoft.com/office/word/2018/wordml/cex" xmlns:w16cid="http://schemas.microsoft.com/office/word/2016/wordml/cid" xmlns:w16="http://schemas.microsoft.com/office/word/2018/wordml" xmlns:w16du="http://schemas.microsoft.com/office/word/2023/wordml/word16du" xmlns:w16sdtdh="http://schemas.microsoft.com/office/word/2020/wordml/sdtdatahash" xmlns:w16sdtfl="http://schemas.microsoft.com/office/word/2024/wordml/sdtformatlock" xmlns:w16se="http://schemas.microsoft.com/office/word/2015/wordml/symex" xmlns:wpg="http://schemas.microsoft.com/office/word/2010/wordprocessingGroup" xmlns:wpi="http://schemas.microsoft.com/office/word/2010/wordprocessingInk" xmlns:wne="http://schemas.microsoft.com/office/word/2006/wordml" xmlns:wps="http://schemas.microsoft.com/office/word/2010/wordprocessingShape" mc:Ignorable="w14 w15 w16se w16cid w16 w16cex w16sdtdh w16sdtfl w16du wp14">
+<w:ftr xmlns:wpc="http://schemas.microsoft.com/office/word/2010/wordprocessingCanvas" xmlns:cx="http://schemas.microsoft.com/office/drawing/2014/chartex" xmlns:cx1="http://schemas.microsoft.com/office/drawing/2015/9/8/chartex" xmlns:cx2="http://schemas.microsoft.com/office/drawing/2015/10/21/chartex" xmlns:cx3="http://schemas.microsoft.com/office/drawing/2016/5/9/chartex" xmlns:cx4="http://schemas.microsoft.com/office/drawing/2016/5/10/chartex" xmlns:cx5="http://schemas.microsoft.com/office/drawing/2016/5/11/chartex" xmlns:cx6="http://schemas.microsoft.com/office/drawing/2016/5/12/chartex" xmlns:cx7="http://schemas.microsoft.com/office/drawing/2016/5/13/chartex" xmlns:cx8="http://schemas.microsoft.com/office/drawing/2016/5/14/chartex" xmlns:mc="http://schemas.openxmlformats.org/markup-compatibility/2006" xmlns:aink="http://schemas.microsoft.com/office/drawing/2016/ink" xmlns:am3d="http://schemas.microsoft.com/office/drawing/2017/model3d" xmlns:o="urn:schemas-microsoft-com:office:office" xmlns:oel="http://schemas.microsoft.com/office/2019/extlst" xmlns:r="http://schemas.openxmlformats.org/officeDocument/2006/relationships" xmlns:m="http://schemas.openxmlformats.org/officeDocument/2006/math" xmlns:v="urn:schemas-microsoft-com:vml" xmlns:wp14="http://schemas.microsoft.com/office/word/2010/wordprocessingDrawing" xmlns:wp="http://schemas.openxmlformats.org/drawingml/2006/wordprocessingDrawing" xmlns:w10="urn:schemas-microsoft-com:office:word" xmlns:w="http://schemas.openxmlformats.org/wordprocessingml/2006/main" xmlns:w14="http://schemas.microsoft.com/office/word/2010/wordml" xmlns:w15="http://schemas.microsoft.com/office/word/2012/wordml" xmlns:w16cex="http://schemas.microsoft.com/office/word/2018/wordml/cex" xmlns:w16cid="http://schemas.microsoft.com/office/word/2016/wordml/cid" xmlns:w16="http://schemas.microsoft.com/office/word/2018/wordml" xmlns:w16sdtdh="http://schemas.microsoft.com/office/word/2020/wordml/sdtdatahash" xmlns:w16se="http://schemas.microsoft.com/office/word/2015/wordml/symex" xmlns:wpg="http://schemas.microsoft.com/office/word/2010/wordprocessingGroup" xmlns:wpi="http://schemas.microsoft.com/office/word/2010/wordprocessingInk" xmlns:wne="http://schemas.microsoft.com/office/word/2006/wordml" xmlns:wps="http://schemas.microsoft.com/office/word/2010/wordprocessingShape" mc:Ignorable="w14 w15 w16se w16cid w16 w16cex w16sdtdh wp14">
   <w:p>
     <w:pPr>
       <w:pStyle w:val="Footer"/>
@@ -10067,7 +9657,7 @@
 </file>
 
 <file path=word/footer2.xml><?xml version="1.0" encoding="utf-8"?>
-<w:ftr xmlns:wpc="http://schemas.microsoft.com/office/word/2010/wordprocessingCanvas" xmlns:cx="http://schemas.microsoft.com/office/drawing/2014/chartex" xmlns:cx1="http://schemas.microsoft.com/office/drawing/2015/9/8/chartex" xmlns:cx2="http://schemas.microsoft.com/office/drawing/2015/10/21/chartex" xmlns:cx3="http://schemas.microsoft.com/office/drawing/2016/5/9/chartex" xmlns:cx4="http://schemas.microsoft.com/office/drawing/2016/5/10/chartex" xmlns:cx5="http://schemas.microsoft.com/office/drawing/2016/5/11/chartex" xmlns:cx6="http://schemas.microsoft.com/office/drawing/2016/5/12/chartex" xmlns:cx7="http://schemas.microsoft.com/office/drawing/2016/5/13/chartex" xmlns:cx8="http://schemas.microsoft.com/office/drawing/2016/5/14/chartex" xmlns:mc="http://schemas.openxmlformats.org/markup-compatibility/2006" xmlns:aink="http://schemas.microsoft.com/office/drawing/2016/ink" xmlns:am3d="http://schemas.microsoft.com/office/drawing/2017/model3d" xmlns:o="urn:schemas-microsoft-com:office:office" xmlns:oel="http://schemas.microsoft.com/office/2019/extlst" xmlns:r="http://schemas.openxmlformats.org/officeDocument/2006/relationships" xmlns:m="http://schemas.openxmlformats.org/officeDocument/2006/math" xmlns:v="urn:schemas-microsoft-com:vml" xmlns:wp14="http://schemas.microsoft.com/office/word/2010/wordprocessingDrawing" xmlns:wp="http://schemas.openxmlformats.org/drawingml/2006/wordprocessingDrawing" xmlns:w10="urn:schemas-microsoft-com:office:word" xmlns:w="http://schemas.openxmlformats.org/wordprocessingml/2006/main" xmlns:w14="http://schemas.microsoft.com/office/word/2010/wordml" xmlns:w15="http://schemas.microsoft.com/office/word/2012/wordml" xmlns:w16cex="http://schemas.microsoft.com/office/word/2018/wordml/cex" xmlns:w16cid="http://schemas.microsoft.com/office/word/2016/wordml/cid" xmlns:w16="http://schemas.microsoft.com/office/word/2018/wordml" xmlns:w16du="http://schemas.microsoft.com/office/word/2023/wordml/word16du" xmlns:w16sdtdh="http://schemas.microsoft.com/office/word/2020/wordml/sdtdatahash" xmlns:w16sdtfl="http://schemas.microsoft.com/office/word/2024/wordml/sdtformatlock" xmlns:w16se="http://schemas.microsoft.com/office/word/2015/wordml/symex" xmlns:wpg="http://schemas.microsoft.com/office/word/2010/wordprocessingGroup" xmlns:wpi="http://schemas.microsoft.com/office/word/2010/wordprocessingInk" xmlns:wne="http://schemas.microsoft.com/office/word/2006/wordml" xmlns:wps="http://schemas.microsoft.com/office/word/2010/wordprocessingShape" mc:Ignorable="w14 w15 w16se w16cid w16 w16cex w16sdtdh w16sdtfl w16du wp14">
+<w:ftr xmlns:wpc="http://schemas.microsoft.com/office/word/2010/wordprocessingCanvas" xmlns:cx="http://schemas.microsoft.com/office/drawing/2014/chartex" xmlns:cx1="http://schemas.microsoft.com/office/drawing/2015/9/8/chartex" xmlns:cx2="http://schemas.microsoft.com/office/drawing/2015/10/21/chartex" xmlns:cx3="http://schemas.microsoft.com/office/drawing/2016/5/9/chartex" xmlns:cx4="http://schemas.microsoft.com/office/drawing/2016/5/10/chartex" xmlns:cx5="http://schemas.microsoft.com/office/drawing/2016/5/11/chartex" xmlns:cx6="http://schemas.microsoft.com/office/drawing/2016/5/12/chartex" xmlns:cx7="http://schemas.microsoft.com/office/drawing/2016/5/13/chartex" xmlns:cx8="http://schemas.microsoft.com/office/drawing/2016/5/14/chartex" xmlns:mc="http://schemas.openxmlformats.org/markup-compatibility/2006" xmlns:aink="http://schemas.microsoft.com/office/drawing/2016/ink" xmlns:am3d="http://schemas.microsoft.com/office/drawing/2017/model3d" xmlns:o="urn:schemas-microsoft-com:office:office" xmlns:oel="http://schemas.microsoft.com/office/2019/extlst" xmlns:r="http://schemas.openxmlformats.org/officeDocument/2006/relationships" xmlns:m="http://schemas.openxmlformats.org/officeDocument/2006/math" xmlns:v="urn:schemas-microsoft-com:vml" xmlns:wp14="http://schemas.microsoft.com/office/word/2010/wordprocessingDrawing" xmlns:wp="http://schemas.openxmlformats.org/drawingml/2006/wordprocessingDrawing" xmlns:w10="urn:schemas-microsoft-com:office:word" xmlns:w="http://schemas.openxmlformats.org/wordprocessingml/2006/main" xmlns:w14="http://schemas.microsoft.com/office/word/2010/wordml" xmlns:w15="http://schemas.microsoft.com/office/word/2012/wordml" xmlns:w16cex="http://schemas.microsoft.com/office/word/2018/wordml/cex" xmlns:w16cid="http://schemas.microsoft.com/office/word/2016/wordml/cid" xmlns:w16="http://schemas.microsoft.com/office/word/2018/wordml" xmlns:w16sdtdh="http://schemas.microsoft.com/office/word/2020/wordml/sdtdatahash" xmlns:w16se="http://schemas.microsoft.com/office/word/2015/wordml/symex" xmlns:wpg="http://schemas.microsoft.com/office/word/2010/wordprocessingGroup" xmlns:wpi="http://schemas.microsoft.com/office/word/2010/wordprocessingInk" xmlns:wne="http://schemas.microsoft.com/office/word/2006/wordml" xmlns:wps="http://schemas.microsoft.com/office/word/2010/wordprocessingShape" mc:Ignorable="w14 w15 w16se w16cid w16 w16cex w16sdtdh wp14">
   <w:p>
     <w:pPr>
       <w:pBdr>
@@ -10149,7 +9739,7 @@
 </file>
 
 <file path=word/footer3.xml><?xml version="1.0" encoding="utf-8"?>
-<w:ftr xmlns:wpc="http://schemas.microsoft.com/office/word/2010/wordprocessingCanvas" xmlns:cx="http://schemas.microsoft.com/office/drawing/2014/chartex" xmlns:cx1="http://schemas.microsoft.com/office/drawing/2015/9/8/chartex" xmlns:cx2="http://schemas.microsoft.com/office/drawing/2015/10/21/chartex" xmlns:cx3="http://schemas.microsoft.com/office/drawing/2016/5/9/chartex" xmlns:cx4="http://schemas.microsoft.com/office/drawing/2016/5/10/chartex" xmlns:cx5="http://schemas.microsoft.com/office/drawing/2016/5/11/chartex" xmlns:cx6="http://schemas.microsoft.com/office/drawing/2016/5/12/chartex" xmlns:cx7="http://schemas.microsoft.com/office/drawing/2016/5/13/chartex" xmlns:cx8="http://schemas.microsoft.com/office/drawing/2016/5/14/chartex" xmlns:mc="http://schemas.openxmlformats.org/markup-compatibility/2006" xmlns:aink="http://schemas.microsoft.com/office/drawing/2016/ink" xmlns:am3d="http://schemas.microsoft.com/office/drawing/2017/model3d" xmlns:o="urn:schemas-microsoft-com:office:office" xmlns:oel="http://schemas.microsoft.com/office/2019/extlst" xmlns:r="http://schemas.openxmlformats.org/officeDocument/2006/relationships" xmlns:m="http://schemas.openxmlformats.org/officeDocument/2006/math" xmlns:v="urn:schemas-microsoft-com:vml" xmlns:wp14="http://schemas.microsoft.com/office/word/2010/wordprocessingDrawing" xmlns:wp="http://schemas.openxmlformats.org/drawingml/2006/wordprocessingDrawing" xmlns:w10="urn:schemas-microsoft-com:office:word" xmlns:w="http://schemas.openxmlformats.org/wordprocessingml/2006/main" xmlns:w14="http://schemas.microsoft.com/office/word/2010/wordml" xmlns:w15="http://schemas.microsoft.com/office/word/2012/wordml" xmlns:w16cex="http://schemas.microsoft.com/office/word/2018/wordml/cex" xmlns:w16cid="http://schemas.microsoft.com/office/word/2016/wordml/cid" xmlns:w16="http://schemas.microsoft.com/office/word/2018/wordml" xmlns:w16du="http://schemas.microsoft.com/office/word/2023/wordml/word16du" xmlns:w16sdtdh="http://schemas.microsoft.com/office/word/2020/wordml/sdtdatahash" xmlns:w16sdtfl="http://schemas.microsoft.com/office/word/2024/wordml/sdtformatlock" xmlns:w16se="http://schemas.microsoft.com/office/word/2015/wordml/symex" xmlns:wpg="http://schemas.microsoft.com/office/word/2010/wordprocessingGroup" xmlns:wpi="http://schemas.microsoft.com/office/word/2010/wordprocessingInk" xmlns:wne="http://schemas.microsoft.com/office/word/2006/wordml" xmlns:wps="http://schemas.microsoft.com/office/word/2010/wordprocessingShape" mc:Ignorable="w14 w15 w16se w16cid w16 w16cex w16sdtdh w16sdtfl w16du wp14">
+<w:ftr xmlns:wpc="http://schemas.microsoft.com/office/word/2010/wordprocessingCanvas" xmlns:cx="http://schemas.microsoft.com/office/drawing/2014/chartex" xmlns:cx1="http://schemas.microsoft.com/office/drawing/2015/9/8/chartex" xmlns:cx2="http://schemas.microsoft.com/office/drawing/2015/10/21/chartex" xmlns:cx3="http://schemas.microsoft.com/office/drawing/2016/5/9/chartex" xmlns:cx4="http://schemas.microsoft.com/office/drawing/2016/5/10/chartex" xmlns:cx5="http://schemas.microsoft.com/office/drawing/2016/5/11/chartex" xmlns:cx6="http://schemas.microsoft.com/office/drawing/2016/5/12/chartex" xmlns:cx7="http://schemas.microsoft.com/office/drawing/2016/5/13/chartex" xmlns:cx8="http://schemas.microsoft.com/office/drawing/2016/5/14/chartex" xmlns:mc="http://schemas.openxmlformats.org/markup-compatibility/2006" xmlns:aink="http://schemas.microsoft.com/office/drawing/2016/ink" xmlns:am3d="http://schemas.microsoft.com/office/drawing/2017/model3d" xmlns:o="urn:schemas-microsoft-com:office:office" xmlns:oel="http://schemas.microsoft.com/office/2019/extlst" xmlns:r="http://schemas.openxmlformats.org/officeDocument/2006/relationships" xmlns:m="http://schemas.openxmlformats.org/officeDocument/2006/math" xmlns:v="urn:schemas-microsoft-com:vml" xmlns:wp14="http://schemas.microsoft.com/office/word/2010/wordprocessingDrawing" xmlns:wp="http://schemas.openxmlformats.org/drawingml/2006/wordprocessingDrawing" xmlns:w10="urn:schemas-microsoft-com:office:word" xmlns:w="http://schemas.openxmlformats.org/wordprocessingml/2006/main" xmlns:w14="http://schemas.microsoft.com/office/word/2010/wordml" xmlns:w15="http://schemas.microsoft.com/office/word/2012/wordml" xmlns:w16cex="http://schemas.microsoft.com/office/word/2018/wordml/cex" xmlns:w16cid="http://schemas.microsoft.com/office/word/2016/wordml/cid" xmlns:w16="http://schemas.microsoft.com/office/word/2018/wordml" xmlns:w16sdtdh="http://schemas.microsoft.com/office/word/2020/wordml/sdtdatahash" xmlns:w16se="http://schemas.microsoft.com/office/word/2015/wordml/symex" xmlns:wpg="http://schemas.microsoft.com/office/word/2010/wordprocessingGroup" xmlns:wpi="http://schemas.microsoft.com/office/word/2010/wordprocessingInk" xmlns:wne="http://schemas.microsoft.com/office/word/2006/wordml" xmlns:wps="http://schemas.microsoft.com/office/word/2010/wordprocessingShape" mc:Ignorable="w14 w15 w16se w16cid w16 w16cex w16sdtdh wp14">
   <w:p>
     <w:pPr>
       <w:pStyle w:val="Footer"/>
@@ -10159,7 +9749,7 @@
 </file>
 
 <file path=word/footnotes.xml><?xml version="1.0" encoding="utf-8"?>
-<w:footnotes xmlns:wpc="http://schemas.microsoft.com/office/word/2010/wordprocessingCanvas" xmlns:cx="http://schemas.microsoft.com/office/drawing/2014/chartex" xmlns:cx1="http://schemas.microsoft.com/office/drawing/2015/9/8/chartex" xmlns:cx2="http://schemas.microsoft.com/office/drawing/2015/10/21/chartex" xmlns:cx3="http://schemas.microsoft.com/office/drawing/2016/5/9/chartex" xmlns:cx4="http://schemas.microsoft.com/office/drawing/2016/5/10/chartex" xmlns:cx5="http://schemas.microsoft.com/office/drawing/2016/5/11/chartex" xmlns:cx6="http://schemas.microsoft.com/office/drawing/2016/5/12/chartex" xmlns:cx7="http://schemas.microsoft.com/office/drawing/2016/5/13/chartex" xmlns:cx8="http://schemas.microsoft.com/office/drawing/2016/5/14/chartex" xmlns:mc="http://schemas.openxmlformats.org/markup-compatibility/2006" xmlns:aink="http://schemas.microsoft.com/office/drawing/2016/ink" xmlns:am3d="http://schemas.microsoft.com/office/drawing/2017/model3d" xmlns:o="urn:schemas-microsoft-com:office:office" xmlns:oel="http://schemas.microsoft.com/office/2019/extlst" xmlns:r="http://schemas.openxmlformats.org/officeDocument/2006/relationships" xmlns:m="http://schemas.openxmlformats.org/officeDocument/2006/math" xmlns:v="urn:schemas-microsoft-com:vml" xmlns:wp14="http://schemas.microsoft.com/office/word/2010/wordprocessingDrawing" xmlns:wp="http://schemas.openxmlformats.org/drawingml/2006/wordprocessingDrawing" xmlns:w10="urn:schemas-microsoft-com:office:word" xmlns:w="http://schemas.openxmlformats.org/wordprocessingml/2006/main" xmlns:w14="http://schemas.microsoft.com/office/word/2010/wordml" xmlns:w15="http://schemas.microsoft.com/office/word/2012/wordml" xmlns:w16cex="http://schemas.microsoft.com/office/word/2018/wordml/cex" xmlns:w16cid="http://schemas.microsoft.com/office/word/2016/wordml/cid" xmlns:w16="http://schemas.microsoft.com/office/word/2018/wordml" xmlns:w16du="http://schemas.microsoft.com/office/word/2023/wordml/word16du" xmlns:w16sdtdh="http://schemas.microsoft.com/office/word/2020/wordml/sdtdatahash" xmlns:w16sdtfl="http://schemas.microsoft.com/office/word/2024/wordml/sdtformatlock" xmlns:w16se="http://schemas.microsoft.com/office/word/2015/wordml/symex" xmlns:wpg="http://schemas.microsoft.com/office/word/2010/wordprocessingGroup" xmlns:wpi="http://schemas.microsoft.com/office/word/2010/wordprocessingInk" xmlns:wne="http://schemas.microsoft.com/office/word/2006/wordml" xmlns:wps="http://schemas.microsoft.com/office/word/2010/wordprocessingShape" mc:Ignorable="w14 w15 w16se w16cid w16 w16cex w16sdtdh w16sdtfl w16du wp14">
+<w:footnotes xmlns:wpc="http://schemas.microsoft.com/office/word/2010/wordprocessingCanvas" xmlns:cx="http://schemas.microsoft.com/office/drawing/2014/chartex" xmlns:cx1="http://schemas.microsoft.com/office/drawing/2015/9/8/chartex" xmlns:cx2="http://schemas.microsoft.com/office/drawing/2015/10/21/chartex" xmlns:cx3="http://schemas.microsoft.com/office/drawing/2016/5/9/chartex" xmlns:cx4="http://schemas.microsoft.com/office/drawing/2016/5/10/chartex" xmlns:cx5="http://schemas.microsoft.com/office/drawing/2016/5/11/chartex" xmlns:cx6="http://schemas.microsoft.com/office/drawing/2016/5/12/chartex" xmlns:cx7="http://schemas.microsoft.com/office/drawing/2016/5/13/chartex" xmlns:cx8="http://schemas.microsoft.com/office/drawing/2016/5/14/chartex" xmlns:mc="http://schemas.openxmlformats.org/markup-compatibility/2006" xmlns:aink="http://schemas.microsoft.com/office/drawing/2016/ink" xmlns:am3d="http://schemas.microsoft.com/office/drawing/2017/model3d" xmlns:o="urn:schemas-microsoft-com:office:office" xmlns:oel="http://schemas.microsoft.com/office/2019/extlst" xmlns:r="http://schemas.openxmlformats.org/officeDocument/2006/relationships" xmlns:m="http://schemas.openxmlformats.org/officeDocument/2006/math" xmlns:v="urn:schemas-microsoft-com:vml" xmlns:wp14="http://schemas.microsoft.com/office/word/2010/wordprocessingDrawing" xmlns:wp="http://schemas.openxmlformats.org/drawingml/2006/wordprocessingDrawing" xmlns:w10="urn:schemas-microsoft-com:office:word" xmlns:w="http://schemas.openxmlformats.org/wordprocessingml/2006/main" xmlns:w14="http://schemas.microsoft.com/office/word/2010/wordml" xmlns:w15="http://schemas.microsoft.com/office/word/2012/wordml" xmlns:w16cex="http://schemas.microsoft.com/office/word/2018/wordml/cex" xmlns:w16cid="http://schemas.microsoft.com/office/word/2016/wordml/cid" xmlns:w16="http://schemas.microsoft.com/office/word/2018/wordml" xmlns:w16sdtdh="http://schemas.microsoft.com/office/word/2020/wordml/sdtdatahash" xmlns:w16se="http://schemas.microsoft.com/office/word/2015/wordml/symex" xmlns:wpg="http://schemas.microsoft.com/office/word/2010/wordprocessingGroup" xmlns:wpi="http://schemas.microsoft.com/office/word/2010/wordprocessingInk" xmlns:wne="http://schemas.microsoft.com/office/word/2006/wordml" xmlns:wps="http://schemas.microsoft.com/office/word/2010/wordprocessingShape" mc:Ignorable="w14 w15 w16se w16cid w16 w16cex w16sdtdh wp14">
   <w:footnote w:type="separator" w:id="-1">
     <w:p>
       <w:r>
@@ -10178,7 +9768,7 @@
 </file>
 
 <file path=word/header1.xml><?xml version="1.0" encoding="utf-8"?>
-<w:hdr xmlns:wpc="http://schemas.microsoft.com/office/word/2010/wordprocessingCanvas" xmlns:cx="http://schemas.microsoft.com/office/drawing/2014/chartex" xmlns:cx1="http://schemas.microsoft.com/office/drawing/2015/9/8/chartex" xmlns:cx2="http://schemas.microsoft.com/office/drawing/2015/10/21/chartex" xmlns:cx3="http://schemas.microsoft.com/office/drawing/2016/5/9/chartex" xmlns:cx4="http://schemas.microsoft.com/office/drawing/2016/5/10/chartex" xmlns:cx5="http://schemas.microsoft.com/office/drawing/2016/5/11/chartex" xmlns:cx6="http://schemas.microsoft.com/office/drawing/2016/5/12/chartex" xmlns:cx7="http://schemas.microsoft.com/office/drawing/2016/5/13/chartex" xmlns:cx8="http://schemas.microsoft.com/office/drawing/2016/5/14/chartex" xmlns:mc="http://schemas.openxmlformats.org/markup-compatibility/2006" xmlns:aink="http://schemas.microsoft.com/office/drawing/2016/ink" xmlns:am3d="http://schemas.microsoft.com/office/drawing/2017/model3d" xmlns:o="urn:schemas-microsoft-com:office:office" xmlns:oel="http://schemas.microsoft.com/office/2019/extlst" xmlns:r="http://schemas.openxmlformats.org/officeDocument/2006/relationships" xmlns:m="http://schemas.openxmlformats.org/officeDocument/2006/math" xmlns:v="urn:schemas-microsoft-com:vml" xmlns:wp14="http://schemas.microsoft.com/office/word/2010/wordprocessingDrawing" xmlns:wp="http://schemas.openxmlformats.org/drawingml/2006/wordprocessingDrawing" xmlns:w10="urn:schemas-microsoft-com:office:word" xmlns:w="http://schemas.openxmlformats.org/wordprocessingml/2006/main" xmlns:w14="http://schemas.microsoft.com/office/word/2010/wordml" xmlns:w15="http://schemas.microsoft.com/office/word/2012/wordml" xmlns:w16cex="http://schemas.microsoft.com/office/word/2018/wordml/cex" xmlns:w16cid="http://schemas.microsoft.com/office/word/2016/wordml/cid" xmlns:w16="http://schemas.microsoft.com/office/word/2018/wordml" xmlns:w16du="http://schemas.microsoft.com/office/word/2023/wordml/word16du" xmlns:w16sdtdh="http://schemas.microsoft.com/office/word/2020/wordml/sdtdatahash" xmlns:w16sdtfl="http://schemas.microsoft.com/office/word/2024/wordml/sdtformatlock" xmlns:w16se="http://schemas.microsoft.com/office/word/2015/wordml/symex" xmlns:wpg="http://schemas.microsoft.com/office/word/2010/wordprocessingGroup" xmlns:wpi="http://schemas.microsoft.com/office/word/2010/wordprocessingInk" xmlns:wne="http://schemas.microsoft.com/office/word/2006/wordml" xmlns:wps="http://schemas.microsoft.com/office/word/2010/wordprocessingShape" mc:Ignorable="w14 w15 w16se w16cid w16 w16cex w16sdtdh w16sdtfl w16du wp14">
+<w:hdr xmlns:wpc="http://schemas.microsoft.com/office/word/2010/wordprocessingCanvas" xmlns:cx="http://schemas.microsoft.com/office/drawing/2014/chartex" xmlns:cx1="http://schemas.microsoft.com/office/drawing/2015/9/8/chartex" xmlns:cx2="http://schemas.microsoft.com/office/drawing/2015/10/21/chartex" xmlns:cx3="http://schemas.microsoft.com/office/drawing/2016/5/9/chartex" xmlns:cx4="http://schemas.microsoft.com/office/drawing/2016/5/10/chartex" xmlns:cx5="http://schemas.microsoft.com/office/drawing/2016/5/11/chartex" xmlns:cx6="http://schemas.microsoft.com/office/drawing/2016/5/12/chartex" xmlns:cx7="http://schemas.microsoft.com/office/drawing/2016/5/13/chartex" xmlns:cx8="http://schemas.microsoft.com/office/drawing/2016/5/14/chartex" xmlns:mc="http://schemas.openxmlformats.org/markup-compatibility/2006" xmlns:aink="http://schemas.microsoft.com/office/drawing/2016/ink" xmlns:am3d="http://schemas.microsoft.com/office/drawing/2017/model3d" xmlns:o="urn:schemas-microsoft-com:office:office" xmlns:oel="http://schemas.microsoft.com/office/2019/extlst" xmlns:r="http://schemas.openxmlformats.org/officeDocument/2006/relationships" xmlns:m="http://schemas.openxmlformats.org/officeDocument/2006/math" xmlns:v="urn:schemas-microsoft-com:vml" xmlns:wp14="http://schemas.microsoft.com/office/word/2010/wordprocessingDrawing" xmlns:wp="http://schemas.openxmlformats.org/drawingml/2006/wordprocessingDrawing" xmlns:w10="urn:schemas-microsoft-com:office:word" xmlns:w="http://schemas.openxmlformats.org/wordprocessingml/2006/main" xmlns:w14="http://schemas.microsoft.com/office/word/2010/wordml" xmlns:w15="http://schemas.microsoft.com/office/word/2012/wordml" xmlns:w16cex="http://schemas.microsoft.com/office/word/2018/wordml/cex" xmlns:w16cid="http://schemas.microsoft.com/office/word/2016/wordml/cid" xmlns:w16="http://schemas.microsoft.com/office/word/2018/wordml" xmlns:w16sdtdh="http://schemas.microsoft.com/office/word/2020/wordml/sdtdatahash" xmlns:w16se="http://schemas.microsoft.com/office/word/2015/wordml/symex" xmlns:wpg="http://schemas.microsoft.com/office/word/2010/wordprocessingGroup" xmlns:wpi="http://schemas.microsoft.com/office/word/2010/wordprocessingInk" xmlns:wne="http://schemas.microsoft.com/office/word/2006/wordml" xmlns:wps="http://schemas.microsoft.com/office/word/2010/wordprocessingShape" mc:Ignorable="w14 w15 w16se w16cid w16 w16cex w16sdtdh wp14">
   <w:p>
     <w:pPr>
       <w:pStyle w:val="Header"/>
@@ -10188,7 +9778,7 @@
 </file>
 
 <file path=word/header2.xml><?xml version="1.0" encoding="utf-8"?>
-<w:hdr xmlns:wpc="http://schemas.microsoft.com/office/word/2010/wordprocessingCanvas" xmlns:cx="http://schemas.microsoft.com/office/drawing/2014/chartex" xmlns:cx1="http://schemas.microsoft.com/office/drawing/2015/9/8/chartex" xmlns:cx2="http://schemas.microsoft.com/office/drawing/2015/10/21/chartex" xmlns:cx3="http://schemas.microsoft.com/office/drawing/2016/5/9/chartex" xmlns:cx4="http://schemas.microsoft.com/office/drawing/2016/5/10/chartex" xmlns:cx5="http://schemas.microsoft.com/office/drawing/2016/5/11/chartex" xmlns:cx6="http://schemas.microsoft.com/office/drawing/2016/5/12/chartex" xmlns:cx7="http://schemas.microsoft.com/office/drawing/2016/5/13/chartex" xmlns:cx8="http://schemas.microsoft.com/office/drawing/2016/5/14/chartex" xmlns:mc="http://schemas.openxmlformats.org/markup-compatibility/2006" xmlns:aink="http://schemas.microsoft.com/office/drawing/2016/ink" xmlns:am3d="http://schemas.microsoft.com/office/drawing/2017/model3d" xmlns:o="urn:schemas-microsoft-com:office:office" xmlns:oel="http://schemas.microsoft.com/office/2019/extlst" xmlns:r="http://schemas.openxmlformats.org/officeDocument/2006/relationships" xmlns:m="http://schemas.openxmlformats.org/officeDocument/2006/math" xmlns:v="urn:schemas-microsoft-com:vml" xmlns:wp14="http://schemas.microsoft.com/office/word/2010/wordprocessingDrawing" xmlns:wp="http://schemas.openxmlformats.org/drawingml/2006/wordprocessingDrawing" xmlns:w10="urn:schemas-microsoft-com:office:word" xmlns:w="http://schemas.openxmlformats.org/wordprocessingml/2006/main" xmlns:w14="http://schemas.microsoft.com/office/word/2010/wordml" xmlns:w15="http://schemas.microsoft.com/office/word/2012/wordml" xmlns:w16cex="http://schemas.microsoft.com/office/word/2018/wordml/cex" xmlns:w16cid="http://schemas.microsoft.com/office/word/2016/wordml/cid" xmlns:w16="http://schemas.microsoft.com/office/word/2018/wordml" xmlns:w16du="http://schemas.microsoft.com/office/word/2023/wordml/word16du" xmlns:w16sdtdh="http://schemas.microsoft.com/office/word/2020/wordml/sdtdatahash" xmlns:w16sdtfl="http://schemas.microsoft.com/office/word/2024/wordml/sdtformatlock" xmlns:w16se="http://schemas.microsoft.com/office/word/2015/wordml/symex" xmlns:wpg="http://schemas.microsoft.com/office/word/2010/wordprocessingGroup" xmlns:wpi="http://schemas.microsoft.com/office/word/2010/wordprocessingInk" xmlns:wne="http://schemas.microsoft.com/office/word/2006/wordml" xmlns:wps="http://schemas.microsoft.com/office/word/2010/wordprocessingShape" mc:Ignorable="w14 w15 w16se w16cid w16 w16cex w16sdtdh w16sdtfl w16du wp14">
+<w:hdr xmlns:wpc="http://schemas.microsoft.com/office/word/2010/wordprocessingCanvas" xmlns:cx="http://schemas.microsoft.com/office/drawing/2014/chartex" xmlns:cx1="http://schemas.microsoft.com/office/drawing/2015/9/8/chartex" xmlns:cx2="http://schemas.microsoft.com/office/drawing/2015/10/21/chartex" xmlns:cx3="http://schemas.microsoft.com/office/drawing/2016/5/9/chartex" xmlns:cx4="http://schemas.microsoft.com/office/drawing/2016/5/10/chartex" xmlns:cx5="http://schemas.microsoft.com/office/drawing/2016/5/11/chartex" xmlns:cx6="http://schemas.microsoft.com/office/drawing/2016/5/12/chartex" xmlns:cx7="http://schemas.microsoft.com/office/drawing/2016/5/13/chartex" xmlns:cx8="http://schemas.microsoft.com/office/drawing/2016/5/14/chartex" xmlns:mc="http://schemas.openxmlformats.org/markup-compatibility/2006" xmlns:aink="http://schemas.microsoft.com/office/drawing/2016/ink" xmlns:am3d="http://schemas.microsoft.com/office/drawing/2017/model3d" xmlns:o="urn:schemas-microsoft-com:office:office" xmlns:oel="http://schemas.microsoft.com/office/2019/extlst" xmlns:r="http://schemas.openxmlformats.org/officeDocument/2006/relationships" xmlns:m="http://schemas.openxmlformats.org/officeDocument/2006/math" xmlns:v="urn:schemas-microsoft-com:vml" xmlns:wp14="http://schemas.microsoft.com/office/word/2010/wordprocessingDrawing" xmlns:wp="http://schemas.openxmlformats.org/drawingml/2006/wordprocessingDrawing" xmlns:w10="urn:schemas-microsoft-com:office:word" xmlns:w="http://schemas.openxmlformats.org/wordprocessingml/2006/main" xmlns:w14="http://schemas.microsoft.com/office/word/2010/wordml" xmlns:w15="http://schemas.microsoft.com/office/word/2012/wordml" xmlns:w16cex="http://schemas.microsoft.com/office/word/2018/wordml/cex" xmlns:w16cid="http://schemas.microsoft.com/office/word/2016/wordml/cid" xmlns:w16="http://schemas.microsoft.com/office/word/2018/wordml" xmlns:w16sdtdh="http://schemas.microsoft.com/office/word/2020/wordml/sdtdatahash" xmlns:w16se="http://schemas.microsoft.com/office/word/2015/wordml/symex" xmlns:wpg="http://schemas.microsoft.com/office/word/2010/wordprocessingGroup" xmlns:wpi="http://schemas.microsoft.com/office/word/2010/wordprocessingInk" xmlns:wne="http://schemas.microsoft.com/office/word/2006/wordml" xmlns:wps="http://schemas.microsoft.com/office/word/2010/wordprocessingShape" mc:Ignorable="w14 w15 w16se w16cid w16 w16cex w16sdtdh wp14">
   <w:p>
     <w:pPr>
       <w:pBdr>
@@ -10231,7 +9821,7 @@
 </file>
 
 <file path=word/header3.xml><?xml version="1.0" encoding="utf-8"?>
-<w:hdr xmlns:wpc="http://schemas.microsoft.com/office/word/2010/wordprocessingCanvas" xmlns:cx="http://schemas.microsoft.com/office/drawing/2014/chartex" xmlns:cx1="http://schemas.microsoft.com/office/drawing/2015/9/8/chartex" xmlns:cx2="http://schemas.microsoft.com/office/drawing/2015/10/21/chartex" xmlns:cx3="http://schemas.microsoft.com/office/drawing/2016/5/9/chartex" xmlns:cx4="http://schemas.microsoft.com/office/drawing/2016/5/10/chartex" xmlns:cx5="http://schemas.microsoft.com/office/drawing/2016/5/11/chartex" xmlns:cx6="http://schemas.microsoft.com/office/drawing/2016/5/12/chartex" xmlns:cx7="http://schemas.microsoft.com/office/drawing/2016/5/13/chartex" xmlns:cx8="http://schemas.microsoft.com/office/drawing/2016/5/14/chartex" xmlns:mc="http://schemas.openxmlformats.org/markup-compatibility/2006" xmlns:aink="http://schemas.microsoft.com/office/drawing/2016/ink" xmlns:am3d="http://schemas.microsoft.com/office/drawing/2017/model3d" xmlns:o="urn:schemas-microsoft-com:office:office" xmlns:oel="http://schemas.microsoft.com/office/2019/extlst" xmlns:r="http://schemas.openxmlformats.org/officeDocument/2006/relationships" xmlns:m="http://schemas.openxmlformats.org/officeDocument/2006/math" xmlns:v="urn:schemas-microsoft-com:vml" xmlns:wp14="http://schemas.microsoft.com/office/word/2010/wordprocessingDrawing" xmlns:wp="http://schemas.openxmlformats.org/drawingml/2006/wordprocessingDrawing" xmlns:w10="urn:schemas-microsoft-com:office:word" xmlns:w="http://schemas.openxmlformats.org/wordprocessingml/2006/main" xmlns:w14="http://schemas.microsoft.com/office/word/2010/wordml" xmlns:w15="http://schemas.microsoft.com/office/word/2012/wordml" xmlns:w16cex="http://schemas.microsoft.com/office/word/2018/wordml/cex" xmlns:w16cid="http://schemas.microsoft.com/office/word/2016/wordml/cid" xmlns:w16="http://schemas.microsoft.com/office/word/2018/wordml" xmlns:w16du="http://schemas.microsoft.com/office/word/2023/wordml/word16du" xmlns:w16sdtdh="http://schemas.microsoft.com/office/word/2020/wordml/sdtdatahash" xmlns:w16sdtfl="http://schemas.microsoft.com/office/word/2024/wordml/sdtformatlock" xmlns:w16se="http://schemas.microsoft.com/office/word/2015/wordml/symex" xmlns:wpg="http://schemas.microsoft.com/office/word/2010/wordprocessingGroup" xmlns:wpi="http://schemas.microsoft.com/office/word/2010/wordprocessingInk" xmlns:wne="http://schemas.microsoft.com/office/word/2006/wordml" xmlns:wps="http://schemas.microsoft.com/office/word/2010/wordprocessingShape" mc:Ignorable="w14 w15 w16se w16cid w16 w16cex w16sdtdh w16sdtfl w16du wp14">
+<w:hdr xmlns:wpc="http://schemas.microsoft.com/office/word/2010/wordprocessingCanvas" xmlns:cx="http://schemas.microsoft.com/office/drawing/2014/chartex" xmlns:cx1="http://schemas.microsoft.com/office/drawing/2015/9/8/chartex" xmlns:cx2="http://schemas.microsoft.com/office/drawing/2015/10/21/chartex" xmlns:cx3="http://schemas.microsoft.com/office/drawing/2016/5/9/chartex" xmlns:cx4="http://schemas.microsoft.com/office/drawing/2016/5/10/chartex" xmlns:cx5="http://schemas.microsoft.com/office/drawing/2016/5/11/chartex" xmlns:cx6="http://schemas.microsoft.com/office/drawing/2016/5/12/chartex" xmlns:cx7="http://schemas.microsoft.com/office/drawing/2016/5/13/chartex" xmlns:cx8="http://schemas.microsoft.com/office/drawing/2016/5/14/chartex" xmlns:mc="http://schemas.openxmlformats.org/markup-compatibility/2006" xmlns:aink="http://schemas.microsoft.com/office/drawing/2016/ink" xmlns:am3d="http://schemas.microsoft.com/office/drawing/2017/model3d" xmlns:o="urn:schemas-microsoft-com:office:office" xmlns:oel="http://schemas.microsoft.com/office/2019/extlst" xmlns:r="http://schemas.openxmlformats.org/officeDocument/2006/relationships" xmlns:m="http://schemas.openxmlformats.org/officeDocument/2006/math" xmlns:v="urn:schemas-microsoft-com:vml" xmlns:wp14="http://schemas.microsoft.com/office/word/2010/wordprocessingDrawing" xmlns:wp="http://schemas.openxmlformats.org/drawingml/2006/wordprocessingDrawing" xmlns:w10="urn:schemas-microsoft-com:office:word" xmlns:w="http://schemas.openxmlformats.org/wordprocessingml/2006/main" xmlns:w14="http://schemas.microsoft.com/office/word/2010/wordml" xmlns:w15="http://schemas.microsoft.com/office/word/2012/wordml" xmlns:w16cex="http://schemas.microsoft.com/office/word/2018/wordml/cex" xmlns:w16cid="http://schemas.microsoft.com/office/word/2016/wordml/cid" xmlns:w16="http://schemas.microsoft.com/office/word/2018/wordml" xmlns:w16sdtdh="http://schemas.microsoft.com/office/word/2020/wordml/sdtdatahash" xmlns:w16se="http://schemas.microsoft.com/office/word/2015/wordml/symex" xmlns:wpg="http://schemas.microsoft.com/office/word/2010/wordprocessingGroup" xmlns:wpi="http://schemas.microsoft.com/office/word/2010/wordprocessingInk" xmlns:wne="http://schemas.microsoft.com/office/word/2006/wordml" xmlns:wps="http://schemas.microsoft.com/office/word/2010/wordprocessingShape" mc:Ignorable="w14 w15 w16se w16cid w16 w16cex w16sdtdh wp14">
   <w:p>
     <w:pPr>
       <w:pStyle w:val="Header"/>
@@ -10241,7 +9831,7 @@
 </file>
 
 <file path=word/numbering.xml><?xml version="1.0" encoding="utf-8"?>
-<w:numbering xmlns:wpc="http://schemas.microsoft.com/office/word/2010/wordprocessingCanvas" xmlns:cx="http://schemas.microsoft.com/office/drawing/2014/chartex" xmlns:cx1="http://schemas.microsoft.com/office/drawing/2015/9/8/chartex" xmlns:cx2="http://schemas.microsoft.com/office/drawing/2015/10/21/chartex" xmlns:cx3="http://schemas.microsoft.com/office/drawing/2016/5/9/chartex" xmlns:cx4="http://schemas.microsoft.com/office/drawing/2016/5/10/chartex" xmlns:cx5="http://schemas.microsoft.com/office/drawing/2016/5/11/chartex" xmlns:cx6="http://schemas.microsoft.com/office/drawing/2016/5/12/chartex" xmlns:cx7="http://schemas.microsoft.com/office/drawing/2016/5/13/chartex" xmlns:cx8="http://schemas.microsoft.com/office/drawing/2016/5/14/chartex" xmlns:mc="http://schemas.openxmlformats.org/markup-compatibility/2006" xmlns:aink="http://schemas.microsoft.com/office/drawing/2016/ink" xmlns:am3d="http://schemas.microsoft.com/office/drawing/2017/model3d" xmlns:o="urn:schemas-microsoft-com:office:office" xmlns:oel="http://schemas.microsoft.com/office/2019/extlst" xmlns:r="http://schemas.openxmlformats.org/officeDocument/2006/relationships" xmlns:m="http://schemas.openxmlformats.org/officeDocument/2006/math" xmlns:v="urn:schemas-microsoft-com:vml" xmlns:wp14="http://schemas.microsoft.com/office/word/2010/wordprocessingDrawing" xmlns:wp="http://schemas.openxmlformats.org/drawingml/2006/wordprocessingDrawing" xmlns:w10="urn:schemas-microsoft-com:office:word" xmlns:w="http://schemas.openxmlformats.org/wordprocessingml/2006/main" xmlns:w14="http://schemas.microsoft.com/office/word/2010/wordml" xmlns:w15="http://schemas.microsoft.com/office/word/2012/wordml" xmlns:w16cex="http://schemas.microsoft.com/office/word/2018/wordml/cex" xmlns:w16cid="http://schemas.microsoft.com/office/word/2016/wordml/cid" xmlns:w16="http://schemas.microsoft.com/office/word/2018/wordml" xmlns:w16du="http://schemas.microsoft.com/office/word/2023/wordml/word16du" xmlns:w16sdtdh="http://schemas.microsoft.com/office/word/2020/wordml/sdtdatahash" xmlns:w16sdtfl="http://schemas.microsoft.com/office/word/2024/wordml/sdtformatlock" xmlns:w16se="http://schemas.microsoft.com/office/word/2015/wordml/symex" xmlns:wpg="http://schemas.microsoft.com/office/word/2010/wordprocessingGroup" xmlns:wpi="http://schemas.microsoft.com/office/word/2010/wordprocessingInk" xmlns:wne="http://schemas.microsoft.com/office/word/2006/wordml" xmlns:wps="http://schemas.microsoft.com/office/word/2010/wordprocessingShape" mc:Ignorable="w14 w15 w16se w16cid w16 w16cex w16sdtdh w16sdtfl w16du wp14">
+<w:numbering xmlns:wpc="http://schemas.microsoft.com/office/word/2010/wordprocessingCanvas" xmlns:cx="http://schemas.microsoft.com/office/drawing/2014/chartex" xmlns:cx1="http://schemas.microsoft.com/office/drawing/2015/9/8/chartex" xmlns:cx2="http://schemas.microsoft.com/office/drawing/2015/10/21/chartex" xmlns:cx3="http://schemas.microsoft.com/office/drawing/2016/5/9/chartex" xmlns:cx4="http://schemas.microsoft.com/office/drawing/2016/5/10/chartex" xmlns:cx5="http://schemas.microsoft.com/office/drawing/2016/5/11/chartex" xmlns:cx6="http://schemas.microsoft.com/office/drawing/2016/5/12/chartex" xmlns:cx7="http://schemas.microsoft.com/office/drawing/2016/5/13/chartex" xmlns:cx8="http://schemas.microsoft.com/office/drawing/2016/5/14/chartex" xmlns:mc="http://schemas.openxmlformats.org/markup-compatibility/2006" xmlns:aink="http://schemas.microsoft.com/office/drawing/2016/ink" xmlns:am3d="http://schemas.microsoft.com/office/drawing/2017/model3d" xmlns:o="urn:schemas-microsoft-com:office:office" xmlns:oel="http://schemas.microsoft.com/office/2019/extlst" xmlns:r="http://schemas.openxmlformats.org/officeDocument/2006/relationships" xmlns:m="http://schemas.openxmlformats.org/officeDocument/2006/math" xmlns:v="urn:schemas-microsoft-com:vml" xmlns:wp14="http://schemas.microsoft.com/office/word/2010/wordprocessingDrawing" xmlns:wp="http://schemas.openxmlformats.org/drawingml/2006/wordprocessingDrawing" xmlns:w10="urn:schemas-microsoft-com:office:word" xmlns:w="http://schemas.openxmlformats.org/wordprocessingml/2006/main" xmlns:w14="http://schemas.microsoft.com/office/word/2010/wordml" xmlns:w15="http://schemas.microsoft.com/office/word/2012/wordml" xmlns:w16cex="http://schemas.microsoft.com/office/word/2018/wordml/cex" xmlns:w16cid="http://schemas.microsoft.com/office/word/2016/wordml/cid" xmlns:w16="http://schemas.microsoft.com/office/word/2018/wordml" xmlns:w16sdtdh="http://schemas.microsoft.com/office/word/2020/wordml/sdtdatahash" xmlns:w16se="http://schemas.microsoft.com/office/word/2015/wordml/symex" xmlns:wpg="http://schemas.microsoft.com/office/word/2010/wordprocessingGroup" xmlns:wpi="http://schemas.microsoft.com/office/word/2010/wordprocessingInk" xmlns:wne="http://schemas.microsoft.com/office/word/2006/wordml" xmlns:wps="http://schemas.microsoft.com/office/word/2010/wordprocessingShape" mc:Ignorable="w14 w15 w16se w16cid w16 w16cex w16sdtdh wp14">
   <w:abstractNum w:abstractNumId="0" w15:restartNumberingAfterBreak="0">
     <w:nsid w:val="19B85A84"/>
     <w:multiLevelType w:val="hybridMultilevel"/>
@@ -10586,7 +10176,7 @@
 </file>
 
 <file path=word/styles.xml><?xml version="1.0" encoding="utf-8"?>
-<w:styles xmlns:mc="http://schemas.openxmlformats.org/markup-compatibility/2006" xmlns:r="http://schemas.openxmlformats.org/officeDocument/2006/relationships" xmlns:w="http://schemas.openxmlformats.org/wordprocessingml/2006/main" xmlns:w14="http://schemas.microsoft.com/office/word/2010/wordml" xmlns:w15="http://schemas.microsoft.com/office/word/2012/wordml" xmlns:w16cex="http://schemas.microsoft.com/office/word/2018/wordml/cex" xmlns:w16cid="http://schemas.microsoft.com/office/word/2016/wordml/cid" xmlns:w16="http://schemas.microsoft.com/office/word/2018/wordml" xmlns:w16du="http://schemas.microsoft.com/office/word/2023/wordml/word16du" xmlns:w16sdtdh="http://schemas.microsoft.com/office/word/2020/wordml/sdtdatahash" xmlns:w16sdtfl="http://schemas.microsoft.com/office/word/2024/wordml/sdtformatlock" xmlns:w16se="http://schemas.microsoft.com/office/word/2015/wordml/symex" mc:Ignorable="w14 w15 w16se w16cid w16 w16cex w16sdtdh w16sdtfl w16du">
+<w:styles xmlns:mc="http://schemas.openxmlformats.org/markup-compatibility/2006" xmlns:r="http://schemas.openxmlformats.org/officeDocument/2006/relationships" xmlns:w="http://schemas.openxmlformats.org/wordprocessingml/2006/main" xmlns:w14="http://schemas.microsoft.com/office/word/2010/wordml" xmlns:w15="http://schemas.microsoft.com/office/word/2012/wordml" xmlns:w16cex="http://schemas.microsoft.com/office/word/2018/wordml/cex" xmlns:w16cid="http://schemas.microsoft.com/office/word/2016/wordml/cid" xmlns:w16="http://schemas.microsoft.com/office/word/2018/wordml" xmlns:w16sdtdh="http://schemas.microsoft.com/office/word/2020/wordml/sdtdatahash" xmlns:w16se="http://schemas.microsoft.com/office/word/2015/wordml/symex" mc:Ignorable="w14 w15 w16se w16cid w16 w16cex w16sdtdh">
   <w:docDefaults>
     <w:rPrDefault>
       <w:rPr>

</xml_diff>

<commit_message>
Added Environment Configure Screenshot in the document
</commit_message>
<xml_diff>
--- a/Assignment_04_Spring2026.docx
+++ b/Assignment_04_Spring2026.docx
@@ -348,7 +348,27 @@
           <w:sz w:val="24"/>
           <w:szCs w:val="24"/>
         </w:rPr>
-        <w:t xml:space="preserve"> (can be six members but in that case TL has to create an additional page for that member and then assign all tasks accordingly)</w:t>
+        <w:t xml:space="preserve"> (can be six members but in that </w:t>
+      </w:r>
+      <w:proofErr w:type="gramStart"/>
+      <w:r>
+        <w:rPr>
+          <w:rFonts w:ascii="Arial" w:eastAsia="Arial" w:hAnsi="Arial" w:cs="Arial"/>
+          <w:color w:val="000000"/>
+          <w:sz w:val="24"/>
+          <w:szCs w:val="24"/>
+        </w:rPr>
+        <w:t>case</w:t>
+      </w:r>
+      <w:proofErr w:type="gramEnd"/>
+      <w:r>
+        <w:rPr>
+          <w:rFonts w:ascii="Arial" w:eastAsia="Arial" w:hAnsi="Arial" w:cs="Arial"/>
+          <w:color w:val="000000"/>
+          <w:sz w:val="24"/>
+          <w:szCs w:val="24"/>
+        </w:rPr>
+        <w:t xml:space="preserve"> TL has to create an additional page for that member and then assign all tasks accordingly)</w:t>
       </w:r>
     </w:p>
     <w:p>
@@ -592,8 +612,9 @@
           <w:sz w:val="18"/>
           <w:szCs w:val="18"/>
         </w:rPr>
-        <w:t xml:space="preserve">Table 1: Group Details </w:t>
-      </w:r>
+        <w:t xml:space="preserve">Table 1: Group </w:t>
+      </w:r>
+      <w:proofErr w:type="gramStart"/>
       <w:r>
         <w:rPr>
           <w:rFonts w:ascii="Arial" w:eastAsia="Arial" w:hAnsi="Arial" w:cs="Arial"/>
@@ -603,8 +624,20 @@
           <w:sz w:val="18"/>
           <w:szCs w:val="18"/>
         </w:rPr>
+        <w:t xml:space="preserve">Details </w:t>
+      </w:r>
+      <w:r>
+        <w:rPr>
+          <w:rFonts w:ascii="Arial" w:eastAsia="Arial" w:hAnsi="Arial" w:cs="Arial"/>
+          <w:b/>
+          <w:bCs/>
+          <w:color w:val="444444"/>
+          <w:sz w:val="18"/>
+          <w:szCs w:val="18"/>
+        </w:rPr>
         <w:t>,</w:t>
       </w:r>
+      <w:proofErr w:type="gramEnd"/>
       <w:r>
         <w:rPr>
           <w:rFonts w:ascii="Arial" w:eastAsia="Arial" w:hAnsi="Arial" w:cs="Arial"/>
@@ -1776,7 +1809,39 @@
           <w:rFonts w:ascii="Arial" w:eastAsia="Arial" w:hAnsi="Arial" w:cs="Arial"/>
           <w:color w:val="000000"/>
         </w:rPr>
-        <w:t>Your team is the development crew for TaskFlow, a lightweight task-management web application consisting of five HTML pages. The Team Lead sets up the repository, Dockerfile, shared stylesheet, and the CI/CD pipelines. Each team member is then individually responsible for building one specific page of the application, following the full Git, GitHub, and Docker flow independently.</w:t>
+        <w:t xml:space="preserve">Your team is the development crew for </w:t>
+      </w:r>
+      <w:proofErr w:type="spellStart"/>
+      <w:r>
+        <w:rPr>
+          <w:rFonts w:ascii="Arial" w:eastAsia="Arial" w:hAnsi="Arial" w:cs="Arial"/>
+          <w:color w:val="000000"/>
+        </w:rPr>
+        <w:t>TaskFlow</w:t>
+      </w:r>
+      <w:proofErr w:type="spellEnd"/>
+      <w:r>
+        <w:rPr>
+          <w:rFonts w:ascii="Arial" w:eastAsia="Arial" w:hAnsi="Arial" w:cs="Arial"/>
+          <w:color w:val="000000"/>
+        </w:rPr>
+        <w:t xml:space="preserve">, a lightweight task-management web application consisting of five HTML pages. The Team Lead sets up the repository, </w:t>
+      </w:r>
+      <w:proofErr w:type="spellStart"/>
+      <w:r>
+        <w:rPr>
+          <w:rFonts w:ascii="Arial" w:eastAsia="Arial" w:hAnsi="Arial" w:cs="Arial"/>
+          <w:color w:val="000000"/>
+        </w:rPr>
+        <w:t>Dockerfile</w:t>
+      </w:r>
+      <w:proofErr w:type="spellEnd"/>
+      <w:r>
+        <w:rPr>
+          <w:rFonts w:ascii="Arial" w:eastAsia="Arial" w:hAnsi="Arial" w:cs="Arial"/>
+          <w:color w:val="000000"/>
+        </w:rPr>
+        <w:t>, shared stylesheet, and the CI/CD pipelines. Each team member is then individually responsible for building one specific page of the application, following the full Git, GitHub, and Docker flow independently.</w:t>
       </w:r>
     </w:p>
     <w:p>
@@ -1794,7 +1859,23 @@
           <w:rFonts w:ascii="Arial" w:eastAsia="Arial" w:hAnsi="Arial" w:cs="Arial"/>
           <w:color w:val="000000"/>
         </w:rPr>
-        <w:t>The 5 pages of the TaskFlow application and their assignment are defined in Table 3 below. The Team Lead takes Page 1 (Home / Dashboard) in addition to their setup responsibilities.</w:t>
+        <w:t xml:space="preserve">The 5 pages of the </w:t>
+      </w:r>
+      <w:proofErr w:type="spellStart"/>
+      <w:r>
+        <w:rPr>
+          <w:rFonts w:ascii="Arial" w:eastAsia="Arial" w:hAnsi="Arial" w:cs="Arial"/>
+          <w:color w:val="000000"/>
+        </w:rPr>
+        <w:t>TaskFlow</w:t>
+      </w:r>
+      <w:proofErr w:type="spellEnd"/>
+      <w:r>
+        <w:rPr>
+          <w:rFonts w:ascii="Arial" w:eastAsia="Arial" w:hAnsi="Arial" w:cs="Arial"/>
+          <w:color w:val="000000"/>
+        </w:rPr>
+        <w:t xml:space="preserve"> application and their assignment are defined in Table 3 below. The Team Lead takes Page 1 (Home / Dashboard) in addition to their setup responsibilities.</w:t>
       </w:r>
     </w:p>
     <w:p>
@@ -1816,7 +1897,31 @@
           <w:sz w:val="18"/>
           <w:szCs w:val="18"/>
         </w:rPr>
-        <w:t>Table 3: TaskFlow Page Assignment</w:t>
+        <w:t xml:space="preserve">Table 3: </w:t>
+      </w:r>
+      <w:proofErr w:type="spellStart"/>
+      <w:r>
+        <w:rPr>
+          <w:rFonts w:ascii="Arial" w:eastAsia="Arial" w:hAnsi="Arial" w:cs="Arial"/>
+          <w:b/>
+          <w:bCs/>
+          <w:color w:val="444444"/>
+          <w:sz w:val="18"/>
+          <w:szCs w:val="18"/>
+        </w:rPr>
+        <w:t>TaskFlow</w:t>
+      </w:r>
+      <w:proofErr w:type="spellEnd"/>
+      <w:r>
+        <w:rPr>
+          <w:rFonts w:ascii="Arial" w:eastAsia="Arial" w:hAnsi="Arial" w:cs="Arial"/>
+          <w:b/>
+          <w:bCs/>
+          <w:color w:val="444444"/>
+          <w:sz w:val="18"/>
+          <w:szCs w:val="18"/>
+        </w:rPr>
+        <w:t xml:space="preserve"> Page Assignment</w:t>
       </w:r>
     </w:p>
     <w:tbl>
@@ -2222,7 +2327,17 @@
                 <w:sz w:val="18"/>
                 <w:szCs w:val="18"/>
               </w:rPr>
-              <w:t xml:space="preserve">An HTML form allowing the user to enter a new task </w:t>
+              <w:t xml:space="preserve">An HTML form allowing the user to enter a new </w:t>
+            </w:r>
+            <w:proofErr w:type="gramStart"/>
+            <w:r>
+              <w:rPr>
+                <w:rFonts w:ascii="Arial" w:eastAsia="Arial" w:hAnsi="Arial" w:cs="Arial"/>
+                <w:color w:val="000000"/>
+                <w:sz w:val="18"/>
+                <w:szCs w:val="18"/>
+              </w:rPr>
+              <w:t xml:space="preserve">task </w:t>
             </w:r>
             <w:r>
               <w:rPr>
@@ -2233,6 +2348,7 @@
               </w:rPr>
               <w:t>,</w:t>
             </w:r>
+            <w:proofErr w:type="gramEnd"/>
             <w:r>
               <w:rPr>
                 <w:rFonts w:ascii="Arial" w:eastAsia="Arial" w:hAnsi="Arial" w:cs="Arial"/>
@@ -2619,7 +2735,27 @@
                 <w:sz w:val="18"/>
                 <w:szCs w:val="18"/>
               </w:rPr>
-              <w:t>A page describing the TaskFlow application, its purpose, and a simple usage guide explaining how to navigate and use the app.</w:t>
+              <w:t xml:space="preserve">A page describing the </w:t>
+            </w:r>
+            <w:proofErr w:type="spellStart"/>
+            <w:r>
+              <w:rPr>
+                <w:rFonts w:ascii="Arial" w:eastAsia="Arial" w:hAnsi="Arial" w:cs="Arial"/>
+                <w:color w:val="000000"/>
+                <w:sz w:val="18"/>
+                <w:szCs w:val="18"/>
+              </w:rPr>
+              <w:t>TaskFlow</w:t>
+            </w:r>
+            <w:proofErr w:type="spellEnd"/>
+            <w:r>
+              <w:rPr>
+                <w:rFonts w:ascii="Arial" w:eastAsia="Arial" w:hAnsi="Arial" w:cs="Arial"/>
+                <w:color w:val="000000"/>
+                <w:sz w:val="18"/>
+                <w:szCs w:val="18"/>
+              </w:rPr>
+              <w:t xml:space="preserve"> application, its purpose, and a simple usage guide explaining how to navigate and use the app.</w:t>
             </w:r>
           </w:p>
         </w:tc>
@@ -2673,7 +2809,55 @@
           <w:rFonts w:ascii="Arial" w:eastAsia="Arial" w:hAnsi="Arial" w:cs="Arial"/>
           <w:color w:val="000000"/>
         </w:rPr>
-        <w:t xml:space="preserve"> using the naming convention: feature/&lt;member-github-username&gt;/&lt;page-name&gt;  (e.g., feature/ali-hassan/add-task).</w:t>
+        <w:t xml:space="preserve"> using the naming convention: feature/&lt;member-</w:t>
+      </w:r>
+      <w:proofErr w:type="spellStart"/>
+      <w:r>
+        <w:rPr>
+          <w:rFonts w:ascii="Arial" w:eastAsia="Arial" w:hAnsi="Arial" w:cs="Arial"/>
+          <w:color w:val="000000"/>
+        </w:rPr>
+        <w:t>github</w:t>
+      </w:r>
+      <w:proofErr w:type="spellEnd"/>
+      <w:r>
+        <w:rPr>
+          <w:rFonts w:ascii="Arial" w:eastAsia="Arial" w:hAnsi="Arial" w:cs="Arial"/>
+          <w:color w:val="000000"/>
+        </w:rPr>
+        <w:t>-username&gt;/&lt;page-name</w:t>
+      </w:r>
+      <w:proofErr w:type="gramStart"/>
+      <w:r>
+        <w:rPr>
+          <w:rFonts w:ascii="Arial" w:eastAsia="Arial" w:hAnsi="Arial" w:cs="Arial"/>
+          <w:color w:val="000000"/>
+        </w:rPr>
+        <w:t>&gt;  (</w:t>
+      </w:r>
+      <w:proofErr w:type="gramEnd"/>
+      <w:r>
+        <w:rPr>
+          <w:rFonts w:ascii="Arial" w:eastAsia="Arial" w:hAnsi="Arial" w:cs="Arial"/>
+          <w:color w:val="000000"/>
+        </w:rPr>
+        <w:t>e.g., feature/</w:t>
+      </w:r>
+      <w:proofErr w:type="spellStart"/>
+      <w:r>
+        <w:rPr>
+          <w:rFonts w:ascii="Arial" w:eastAsia="Arial" w:hAnsi="Arial" w:cs="Arial"/>
+          <w:color w:val="000000"/>
+        </w:rPr>
+        <w:t>ali-hassan</w:t>
+      </w:r>
+      <w:proofErr w:type="spellEnd"/>
+      <w:r>
+        <w:rPr>
+          <w:rFonts w:ascii="Arial" w:eastAsia="Arial" w:hAnsi="Arial" w:cs="Arial"/>
+          <w:color w:val="000000"/>
+        </w:rPr>
+        <w:t>/add-task).</w:t>
       </w:r>
     </w:p>
     <w:p>
@@ -2801,7 +2985,23 @@
           <w:rFonts w:ascii="Arial" w:eastAsia="Arial" w:hAnsi="Arial" w:cs="Arial"/>
           <w:color w:val="2E75B6"/>
         </w:rPr>
-        <w:t xml:space="preserve"> → CD deploys to Render → Live TaskFlow updated with the new page.</w:t>
+        <w:t xml:space="preserve"> → CD deploys to Render → Live </w:t>
+      </w:r>
+      <w:proofErr w:type="spellStart"/>
+      <w:r>
+        <w:rPr>
+          <w:rFonts w:ascii="Arial" w:eastAsia="Arial" w:hAnsi="Arial" w:cs="Arial"/>
+          <w:color w:val="2E75B6"/>
+        </w:rPr>
+        <w:t>TaskFlow</w:t>
+      </w:r>
+      <w:proofErr w:type="spellEnd"/>
+      <w:r>
+        <w:rPr>
+          <w:rFonts w:ascii="Arial" w:eastAsia="Arial" w:hAnsi="Arial" w:cs="Arial"/>
+          <w:color w:val="2E75B6"/>
+        </w:rPr>
+        <w:t xml:space="preserve"> updated with the new page.</w:t>
       </w:r>
     </w:p>
     <w:p>
@@ -2855,7 +3055,23 @@
           <w:rFonts w:ascii="Arial" w:eastAsia="Arial" w:hAnsi="Arial" w:cs="Arial"/>
           <w:color w:val="000000"/>
         </w:rPr>
-        <w:t>Create a new public GitHub repository named taskflow-cicd (or a name agreed by the team). Do NOT clone or fork any existing repository.</w:t>
+        <w:t xml:space="preserve">Create a new public GitHub repository named </w:t>
+      </w:r>
+      <w:proofErr w:type="spellStart"/>
+      <w:r>
+        <w:rPr>
+          <w:rFonts w:ascii="Arial" w:eastAsia="Arial" w:hAnsi="Arial" w:cs="Arial"/>
+          <w:color w:val="000000"/>
+        </w:rPr>
+        <w:t>taskflow-cicd</w:t>
+      </w:r>
+      <w:proofErr w:type="spellEnd"/>
+      <w:r>
+        <w:rPr>
+          <w:rFonts w:ascii="Arial" w:eastAsia="Arial" w:hAnsi="Arial" w:cs="Arial"/>
+          <w:color w:val="000000"/>
+        </w:rPr>
+        <w:t xml:space="preserve"> (or a name agreed by the team). Do NOT clone or fork any existing repository.</w:t>
       </w:r>
     </w:p>
     <w:p>
@@ -3140,7 +3356,17 @@
                 <w:sz w:val="18"/>
                 <w:szCs w:val="18"/>
               </w:rPr>
-              <w:t xml:space="preserve">Home / Dashboard page </w:t>
+              <w:t xml:space="preserve">Home / Dashboard </w:t>
+            </w:r>
+            <w:proofErr w:type="gramStart"/>
+            <w:r>
+              <w:rPr>
+                <w:rFonts w:ascii="Arial" w:eastAsia="Arial" w:hAnsi="Arial" w:cs="Arial"/>
+                <w:color w:val="000000"/>
+                <w:sz w:val="18"/>
+                <w:szCs w:val="18"/>
+              </w:rPr>
+              <w:t xml:space="preserve">page </w:t>
             </w:r>
             <w:r>
               <w:rPr>
@@ -3151,6 +3377,7 @@
               </w:rPr>
               <w:t>,</w:t>
             </w:r>
+            <w:proofErr w:type="gramEnd"/>
             <w:r>
               <w:rPr>
                 <w:rFonts w:ascii="Arial" w:eastAsia="Arial" w:hAnsi="Arial" w:cs="Arial"/>
@@ -3222,7 +3449,17 @@
                 <w:sz w:val="18"/>
                 <w:szCs w:val="18"/>
               </w:rPr>
-              <w:t xml:space="preserve">Add Task page </w:t>
+              <w:t xml:space="preserve">Add Task </w:t>
+            </w:r>
+            <w:proofErr w:type="gramStart"/>
+            <w:r>
+              <w:rPr>
+                <w:rFonts w:ascii="Arial" w:eastAsia="Arial" w:hAnsi="Arial" w:cs="Arial"/>
+                <w:color w:val="000000"/>
+                <w:sz w:val="18"/>
+                <w:szCs w:val="18"/>
+              </w:rPr>
+              <w:t xml:space="preserve">page </w:t>
             </w:r>
             <w:r>
               <w:rPr>
@@ -3233,6 +3470,7 @@
               </w:rPr>
               <w:t>,</w:t>
             </w:r>
+            <w:proofErr w:type="gramEnd"/>
             <w:r>
               <w:rPr>
                 <w:rFonts w:ascii="Arial" w:eastAsia="Arial" w:hAnsi="Arial" w:cs="Arial"/>
@@ -3304,7 +3542,17 @@
                 <w:sz w:val="18"/>
                 <w:szCs w:val="18"/>
               </w:rPr>
-              <w:t xml:space="preserve">Task List page </w:t>
+              <w:t xml:space="preserve">Task List </w:t>
+            </w:r>
+            <w:proofErr w:type="gramStart"/>
+            <w:r>
+              <w:rPr>
+                <w:rFonts w:ascii="Arial" w:eastAsia="Arial" w:hAnsi="Arial" w:cs="Arial"/>
+                <w:color w:val="000000"/>
+                <w:sz w:val="18"/>
+                <w:szCs w:val="18"/>
+              </w:rPr>
+              <w:t xml:space="preserve">page </w:t>
             </w:r>
             <w:r>
               <w:rPr>
@@ -3315,6 +3563,7 @@
               </w:rPr>
               <w:t>,</w:t>
             </w:r>
+            <w:proofErr w:type="gramEnd"/>
             <w:r>
               <w:rPr>
                 <w:rFonts w:ascii="Arial" w:eastAsia="Arial" w:hAnsi="Arial" w:cs="Arial"/>
@@ -3386,7 +3635,17 @@
                 <w:sz w:val="18"/>
                 <w:szCs w:val="18"/>
               </w:rPr>
-              <w:t xml:space="preserve">Task Detail page </w:t>
+              <w:t xml:space="preserve">Task Detail </w:t>
+            </w:r>
+            <w:proofErr w:type="gramStart"/>
+            <w:r>
+              <w:rPr>
+                <w:rFonts w:ascii="Arial" w:eastAsia="Arial" w:hAnsi="Arial" w:cs="Arial"/>
+                <w:color w:val="000000"/>
+                <w:sz w:val="18"/>
+                <w:szCs w:val="18"/>
+              </w:rPr>
+              <w:t xml:space="preserve">page </w:t>
             </w:r>
             <w:r>
               <w:rPr>
@@ -3397,6 +3656,7 @@
               </w:rPr>
               <w:t>,</w:t>
             </w:r>
+            <w:proofErr w:type="gramEnd"/>
             <w:r>
               <w:rPr>
                 <w:rFonts w:ascii="Arial" w:eastAsia="Arial" w:hAnsi="Arial" w:cs="Arial"/>
@@ -3468,7 +3728,17 @@
                 <w:sz w:val="18"/>
                 <w:szCs w:val="18"/>
               </w:rPr>
-              <w:t xml:space="preserve">About / Help page </w:t>
+              <w:t xml:space="preserve">About / Help </w:t>
+            </w:r>
+            <w:proofErr w:type="gramStart"/>
+            <w:r>
+              <w:rPr>
+                <w:rFonts w:ascii="Arial" w:eastAsia="Arial" w:hAnsi="Arial" w:cs="Arial"/>
+                <w:color w:val="000000"/>
+                <w:sz w:val="18"/>
+                <w:szCs w:val="18"/>
+              </w:rPr>
+              <w:t xml:space="preserve">page </w:t>
             </w:r>
             <w:r>
               <w:rPr>
@@ -3479,6 +3749,7 @@
               </w:rPr>
               <w:t>,</w:t>
             </w:r>
+            <w:proofErr w:type="gramEnd"/>
             <w:r>
               <w:rPr>
                 <w:rFonts w:ascii="Arial" w:eastAsia="Arial" w:hAnsi="Arial" w:cs="Arial"/>
@@ -3550,7 +3821,17 @@
                 <w:sz w:val="18"/>
                 <w:szCs w:val="18"/>
               </w:rPr>
-              <w:t xml:space="preserve">Shared stylesheet </w:t>
+              <w:t xml:space="preserve">Shared </w:t>
+            </w:r>
+            <w:proofErr w:type="gramStart"/>
+            <w:r>
+              <w:rPr>
+                <w:rFonts w:ascii="Arial" w:eastAsia="Arial" w:hAnsi="Arial" w:cs="Arial"/>
+                <w:color w:val="000000"/>
+                <w:sz w:val="18"/>
+                <w:szCs w:val="18"/>
+              </w:rPr>
+              <w:t xml:space="preserve">stylesheet </w:t>
             </w:r>
             <w:r>
               <w:rPr>
@@ -3561,6 +3842,7 @@
               </w:rPr>
               <w:t>,</w:t>
             </w:r>
+            <w:proofErr w:type="gramEnd"/>
             <w:r>
               <w:rPr>
                 <w:rFonts w:ascii="Arial" w:eastAsia="Arial" w:hAnsi="Arial" w:cs="Arial"/>
@@ -3593,6 +3875,7 @@
             <w:vAlign w:val="center"/>
           </w:tcPr>
           <w:p>
+            <w:proofErr w:type="spellStart"/>
             <w:r>
               <w:rPr>
                 <w:rFonts w:ascii="Arial" w:eastAsia="Arial" w:hAnsi="Arial" w:cs="Arial"/>
@@ -3604,6 +3887,7 @@
               </w:rPr>
               <w:t>Dockerfile</w:t>
             </w:r>
+            <w:proofErr w:type="spellEnd"/>
           </w:p>
         </w:tc>
         <w:tc>
@@ -3625,14 +3909,25 @@
             <w:vAlign w:val="center"/>
           </w:tcPr>
           <w:p>
-            <w:r>
-              <w:rPr>
-                <w:rFonts w:ascii="Arial" w:eastAsia="Arial" w:hAnsi="Arial" w:cs="Arial"/>
-                <w:color w:val="000000"/>
-                <w:sz w:val="18"/>
-                <w:szCs w:val="18"/>
-              </w:rPr>
-              <w:t>Dockerfile to containerize the application (nginx-based)</w:t>
+            <w:proofErr w:type="spellStart"/>
+            <w:r>
+              <w:rPr>
+                <w:rFonts w:ascii="Arial" w:eastAsia="Arial" w:hAnsi="Arial" w:cs="Arial"/>
+                <w:color w:val="000000"/>
+                <w:sz w:val="18"/>
+                <w:szCs w:val="18"/>
+              </w:rPr>
+              <w:t>Dockerfile</w:t>
+            </w:r>
+            <w:proofErr w:type="spellEnd"/>
+            <w:r>
+              <w:rPr>
+                <w:rFonts w:ascii="Arial" w:eastAsia="Arial" w:hAnsi="Arial" w:cs="Arial"/>
+                <w:color w:val="000000"/>
+                <w:sz w:val="18"/>
+                <w:szCs w:val="18"/>
+              </w:rPr>
+              <w:t xml:space="preserve"> to containerize the application (nginx-based)</w:t>
             </w:r>
           </w:p>
         </w:tc>
@@ -3666,8 +3961,45 @@
                 <w:sz w:val="18"/>
                 <w:szCs w:val="18"/>
               </w:rPr>
-              <w:t>.github/workflows/ci.yml</w:t>
-            </w:r>
+              <w:t>.</w:t>
+            </w:r>
+            <w:proofErr w:type="spellStart"/>
+            <w:r>
+              <w:rPr>
+                <w:rFonts w:ascii="Arial" w:eastAsia="Arial" w:hAnsi="Arial" w:cs="Arial"/>
+                <w:b/>
+                <w:bCs/>
+                <w:color w:val="000000"/>
+                <w:sz w:val="18"/>
+                <w:szCs w:val="18"/>
+              </w:rPr>
+              <w:t>github</w:t>
+            </w:r>
+            <w:proofErr w:type="spellEnd"/>
+            <w:r>
+              <w:rPr>
+                <w:rFonts w:ascii="Arial" w:eastAsia="Arial" w:hAnsi="Arial" w:cs="Arial"/>
+                <w:b/>
+                <w:bCs/>
+                <w:color w:val="000000"/>
+                <w:sz w:val="18"/>
+                <w:szCs w:val="18"/>
+              </w:rPr>
+              <w:t>/workflows/</w:t>
+            </w:r>
+            <w:proofErr w:type="spellStart"/>
+            <w:r>
+              <w:rPr>
+                <w:rFonts w:ascii="Arial" w:eastAsia="Arial" w:hAnsi="Arial" w:cs="Arial"/>
+                <w:b/>
+                <w:bCs/>
+                <w:color w:val="000000"/>
+                <w:sz w:val="18"/>
+                <w:szCs w:val="18"/>
+              </w:rPr>
+              <w:t>ci.yml</w:t>
+            </w:r>
+            <w:proofErr w:type="spellEnd"/>
           </w:p>
         </w:tc>
         <w:tc>
@@ -3739,8 +4071,45 @@
                 <w:sz w:val="18"/>
                 <w:szCs w:val="18"/>
               </w:rPr>
-              <w:t>.github/workflows/cd.yml</w:t>
-            </w:r>
+              <w:t>.</w:t>
+            </w:r>
+            <w:proofErr w:type="spellStart"/>
+            <w:r>
+              <w:rPr>
+                <w:rFonts w:ascii="Arial" w:eastAsia="Arial" w:hAnsi="Arial" w:cs="Arial"/>
+                <w:b/>
+                <w:bCs/>
+                <w:color w:val="000000"/>
+                <w:sz w:val="18"/>
+                <w:szCs w:val="18"/>
+              </w:rPr>
+              <w:t>github</w:t>
+            </w:r>
+            <w:proofErr w:type="spellEnd"/>
+            <w:r>
+              <w:rPr>
+                <w:rFonts w:ascii="Arial" w:eastAsia="Arial" w:hAnsi="Arial" w:cs="Arial"/>
+                <w:b/>
+                <w:bCs/>
+                <w:color w:val="000000"/>
+                <w:sz w:val="18"/>
+                <w:szCs w:val="18"/>
+              </w:rPr>
+              <w:t>/workflows/</w:t>
+            </w:r>
+            <w:proofErr w:type="spellStart"/>
+            <w:r>
+              <w:rPr>
+                <w:rFonts w:ascii="Arial" w:eastAsia="Arial" w:hAnsi="Arial" w:cs="Arial"/>
+                <w:b/>
+                <w:bCs/>
+                <w:color w:val="000000"/>
+                <w:sz w:val="18"/>
+                <w:szCs w:val="18"/>
+              </w:rPr>
+              <w:t>cd.yml</w:t>
+            </w:r>
+            <w:proofErr w:type="spellEnd"/>
           </w:p>
         </w:tc>
         <w:tc>
@@ -3883,7 +4252,15 @@
           <w:rFonts w:ascii="Arial" w:eastAsia="Arial" w:hAnsi="Arial" w:cs="Arial"/>
           <w:color w:val="000000"/>
         </w:rPr>
-        <w:t xml:space="preserve">The Team Lead (TL) is responsible for creating all secrets listed below. The TL is the repository admin and the credentials in use </w:t>
+        <w:t xml:space="preserve">The Team Lead (TL) is responsible for creating all secrets listed below. The TL is the repository admin and the credentials in </w:t>
+      </w:r>
+      <w:proofErr w:type="gramStart"/>
+      <w:r>
+        <w:rPr>
+          <w:rFonts w:ascii="Arial" w:eastAsia="Arial" w:hAnsi="Arial" w:cs="Arial"/>
+          <w:color w:val="000000"/>
+        </w:rPr>
+        <w:t xml:space="preserve">use </w:t>
       </w:r>
       <w:r>
         <w:rPr>
@@ -3892,6 +4269,7 @@
         </w:rPr>
         <w:t>,</w:t>
       </w:r>
+      <w:proofErr w:type="gramEnd"/>
       <w:r>
         <w:rPr>
           <w:rFonts w:ascii="Arial" w:eastAsia="Arial" w:hAnsi="Arial" w:cs="Arial"/>
@@ -4322,7 +4700,17 @@
                 <w:sz w:val="18"/>
                 <w:szCs w:val="18"/>
               </w:rPr>
-              <w:t xml:space="preserve">Team Lead's Docker Hub Personal Access Token (PAT) </w:t>
+              <w:t>Team Lead's Docker Hub Personal Access Token (PAT</w:t>
+            </w:r>
+            <w:proofErr w:type="gramStart"/>
+            <w:r>
+              <w:rPr>
+                <w:rFonts w:ascii="Arial" w:eastAsia="Arial" w:hAnsi="Arial" w:cs="Arial"/>
+                <w:color w:val="000000"/>
+                <w:sz w:val="18"/>
+                <w:szCs w:val="18"/>
+              </w:rPr>
+              <w:t xml:space="preserve">) </w:t>
             </w:r>
             <w:r>
               <w:rPr>
@@ -4333,6 +4721,7 @@
               </w:rPr>
               <w:t>,</w:t>
             </w:r>
+            <w:proofErr w:type="gramEnd"/>
             <w:r>
               <w:rPr>
                 <w:rFonts w:ascii="Arial" w:eastAsia="Arial" w:hAnsi="Arial" w:cs="Arial"/>
@@ -4499,7 +4888,79 @@
           <w:sz w:val="28"/>
           <w:szCs w:val="28"/>
         </w:rPr>
-        <w:t>CI PIPELINE REQUIREMENTS  (.github/workflows/ci.yml)</w:t>
+        <w:t xml:space="preserve">CI PIPELINE </w:t>
+      </w:r>
+      <w:proofErr w:type="gramStart"/>
+      <w:r>
+        <w:rPr>
+          <w:rFonts w:ascii="Arial" w:eastAsia="Arial" w:hAnsi="Arial" w:cs="Arial"/>
+          <w:b/>
+          <w:bCs/>
+          <w:color w:val="1F3864"/>
+          <w:sz w:val="28"/>
+          <w:szCs w:val="28"/>
+        </w:rPr>
+        <w:t>REQUIREMENTS  (</w:t>
+      </w:r>
+      <w:proofErr w:type="gramEnd"/>
+      <w:r>
+        <w:rPr>
+          <w:rFonts w:ascii="Arial" w:eastAsia="Arial" w:hAnsi="Arial" w:cs="Arial"/>
+          <w:b/>
+          <w:bCs/>
+          <w:color w:val="1F3864"/>
+          <w:sz w:val="28"/>
+          <w:szCs w:val="28"/>
+        </w:rPr>
+        <w:t>.</w:t>
+      </w:r>
+      <w:proofErr w:type="spellStart"/>
+      <w:r>
+        <w:rPr>
+          <w:rFonts w:ascii="Arial" w:eastAsia="Arial" w:hAnsi="Arial" w:cs="Arial"/>
+          <w:b/>
+          <w:bCs/>
+          <w:color w:val="1F3864"/>
+          <w:sz w:val="28"/>
+          <w:szCs w:val="28"/>
+        </w:rPr>
+        <w:t>github</w:t>
+      </w:r>
+      <w:proofErr w:type="spellEnd"/>
+      <w:r>
+        <w:rPr>
+          <w:rFonts w:ascii="Arial" w:eastAsia="Arial" w:hAnsi="Arial" w:cs="Arial"/>
+          <w:b/>
+          <w:bCs/>
+          <w:color w:val="1F3864"/>
+          <w:sz w:val="28"/>
+          <w:szCs w:val="28"/>
+        </w:rPr>
+        <w:t>/workflows/</w:t>
+      </w:r>
+      <w:proofErr w:type="spellStart"/>
+      <w:r>
+        <w:rPr>
+          <w:rFonts w:ascii="Arial" w:eastAsia="Arial" w:hAnsi="Arial" w:cs="Arial"/>
+          <w:b/>
+          <w:bCs/>
+          <w:color w:val="1F3864"/>
+          <w:sz w:val="28"/>
+          <w:szCs w:val="28"/>
+        </w:rPr>
+        <w:t>ci.yml</w:t>
+      </w:r>
+      <w:proofErr w:type="spellEnd"/>
+      <w:r>
+        <w:rPr>
+          <w:rFonts w:ascii="Arial" w:eastAsia="Arial" w:hAnsi="Arial" w:cs="Arial"/>
+          <w:b/>
+          <w:bCs/>
+          <w:color w:val="1F3864"/>
+          <w:sz w:val="28"/>
+          <w:szCs w:val="28"/>
+        </w:rPr>
+        <w:t>)</w:t>
       </w:r>
     </w:p>
     <w:p>
@@ -4514,7 +4975,27 @@
           <w:bCs/>
           <w:color w:val="000000"/>
         </w:rPr>
-        <w:t xml:space="preserve">Trigger: The CI workflow must be triggered by a pull_request event targeting the </w:t>
+        <w:t xml:space="preserve">Trigger: The CI workflow must be triggered by a </w:t>
+      </w:r>
+      <w:proofErr w:type="spellStart"/>
+      <w:r>
+        <w:rPr>
+          <w:rFonts w:ascii="Arial" w:eastAsia="Arial" w:hAnsi="Arial" w:cs="Arial"/>
+          <w:b/>
+          <w:bCs/>
+          <w:color w:val="000000"/>
+        </w:rPr>
+        <w:t>pull_request</w:t>
+      </w:r>
+      <w:proofErr w:type="spellEnd"/>
+      <w:r>
+        <w:rPr>
+          <w:rFonts w:ascii="Arial" w:eastAsia="Arial" w:hAnsi="Arial" w:cs="Arial"/>
+          <w:b/>
+          <w:bCs/>
+          <w:color w:val="000000"/>
+        </w:rPr>
+        <w:t xml:space="preserve"> event targeting the </w:t>
       </w:r>
       <w:r>
         <w:rPr>
@@ -4601,7 +5082,23 @@
           <w:rFonts w:ascii="Arial" w:eastAsia="Arial" w:hAnsi="Arial" w:cs="Arial"/>
           <w:color w:val="000000"/>
         </w:rPr>
-        <w:t>Step 3 – Build Image: Build the Docker image from the Dockerfile in the project root.</w:t>
+        <w:t xml:space="preserve">Step 3 – Build Image: Build the Docker image from the </w:t>
+      </w:r>
+      <w:proofErr w:type="spellStart"/>
+      <w:r>
+        <w:rPr>
+          <w:rFonts w:ascii="Arial" w:eastAsia="Arial" w:hAnsi="Arial" w:cs="Arial"/>
+          <w:color w:val="000000"/>
+        </w:rPr>
+        <w:t>Dockerfile</w:t>
+      </w:r>
+      <w:proofErr w:type="spellEnd"/>
+      <w:r>
+        <w:rPr>
+          <w:rFonts w:ascii="Arial" w:eastAsia="Arial" w:hAnsi="Arial" w:cs="Arial"/>
+          <w:color w:val="000000"/>
+        </w:rPr>
+        <w:t xml:space="preserve"> in the project root.</w:t>
       </w:r>
     </w:p>
     <w:p>
@@ -4618,7 +5115,15 @@
           <w:rFonts w:ascii="Arial" w:eastAsia="Arial" w:hAnsi="Arial" w:cs="Arial"/>
           <w:color w:val="000000"/>
         </w:rPr>
-        <w:t xml:space="preserve">Step 4 – Tag Image: Tag the image using a meaningful strategy </w:t>
+        <w:t xml:space="preserve">Step 4 – Tag Image: Tag the image using a meaningful </w:t>
+      </w:r>
+      <w:proofErr w:type="gramStart"/>
+      <w:r>
+        <w:rPr>
+          <w:rFonts w:ascii="Arial" w:eastAsia="Arial" w:hAnsi="Arial" w:cs="Arial"/>
+          <w:color w:val="000000"/>
+        </w:rPr>
+        <w:t xml:space="preserve">strategy </w:t>
       </w:r>
       <w:r>
         <w:rPr>
@@ -4627,12 +5132,29 @@
         </w:rPr>
         <w:t>,</w:t>
       </w:r>
-      <w:r>
-        <w:rPr>
-          <w:rFonts w:ascii="Arial" w:eastAsia="Arial" w:hAnsi="Arial" w:cs="Arial"/>
-          <w:color w:val="000000"/>
-        </w:rPr>
-        <w:t xml:space="preserve"> at minimum the 'latest' tag; optionally also tag with the short commit SHA (github.sha).</w:t>
+      <w:proofErr w:type="gramEnd"/>
+      <w:r>
+        <w:rPr>
+          <w:rFonts w:ascii="Arial" w:eastAsia="Arial" w:hAnsi="Arial" w:cs="Arial"/>
+          <w:color w:val="000000"/>
+        </w:rPr>
+        <w:t xml:space="preserve"> at minimum the 'latest' tag; optionally also tag with the short commit SHA (</w:t>
+      </w:r>
+      <w:proofErr w:type="spellStart"/>
+      <w:r>
+        <w:rPr>
+          <w:rFonts w:ascii="Arial" w:eastAsia="Arial" w:hAnsi="Arial" w:cs="Arial"/>
+          <w:color w:val="000000"/>
+        </w:rPr>
+        <w:t>github.sha</w:t>
+      </w:r>
+      <w:proofErr w:type="spellEnd"/>
+      <w:r>
+        <w:rPr>
+          <w:rFonts w:ascii="Arial" w:eastAsia="Arial" w:hAnsi="Arial" w:cs="Arial"/>
+          <w:color w:val="000000"/>
+        </w:rPr>
+        <w:t>).</w:t>
       </w:r>
     </w:p>
     <w:p>
@@ -4740,7 +5262,79 @@
           <w:sz w:val="28"/>
           <w:szCs w:val="28"/>
         </w:rPr>
-        <w:t>CD PIPELINE REQUIREMENTS  (.github/workflows/cd.yml)</w:t>
+        <w:t xml:space="preserve">CD PIPELINE </w:t>
+      </w:r>
+      <w:proofErr w:type="gramStart"/>
+      <w:r>
+        <w:rPr>
+          <w:rFonts w:ascii="Arial" w:eastAsia="Arial" w:hAnsi="Arial" w:cs="Arial"/>
+          <w:b/>
+          <w:bCs/>
+          <w:color w:val="1F3864"/>
+          <w:sz w:val="28"/>
+          <w:szCs w:val="28"/>
+        </w:rPr>
+        <w:t>REQUIREMENTS  (</w:t>
+      </w:r>
+      <w:proofErr w:type="gramEnd"/>
+      <w:r>
+        <w:rPr>
+          <w:rFonts w:ascii="Arial" w:eastAsia="Arial" w:hAnsi="Arial" w:cs="Arial"/>
+          <w:b/>
+          <w:bCs/>
+          <w:color w:val="1F3864"/>
+          <w:sz w:val="28"/>
+          <w:szCs w:val="28"/>
+        </w:rPr>
+        <w:t>.</w:t>
+      </w:r>
+      <w:proofErr w:type="spellStart"/>
+      <w:r>
+        <w:rPr>
+          <w:rFonts w:ascii="Arial" w:eastAsia="Arial" w:hAnsi="Arial" w:cs="Arial"/>
+          <w:b/>
+          <w:bCs/>
+          <w:color w:val="1F3864"/>
+          <w:sz w:val="28"/>
+          <w:szCs w:val="28"/>
+        </w:rPr>
+        <w:t>github</w:t>
+      </w:r>
+      <w:proofErr w:type="spellEnd"/>
+      <w:r>
+        <w:rPr>
+          <w:rFonts w:ascii="Arial" w:eastAsia="Arial" w:hAnsi="Arial" w:cs="Arial"/>
+          <w:b/>
+          <w:bCs/>
+          <w:color w:val="1F3864"/>
+          <w:sz w:val="28"/>
+          <w:szCs w:val="28"/>
+        </w:rPr>
+        <w:t>/workflows/</w:t>
+      </w:r>
+      <w:proofErr w:type="spellStart"/>
+      <w:r>
+        <w:rPr>
+          <w:rFonts w:ascii="Arial" w:eastAsia="Arial" w:hAnsi="Arial" w:cs="Arial"/>
+          <w:b/>
+          <w:bCs/>
+          <w:color w:val="1F3864"/>
+          <w:sz w:val="28"/>
+          <w:szCs w:val="28"/>
+        </w:rPr>
+        <w:t>cd.yml</w:t>
+      </w:r>
+      <w:proofErr w:type="spellEnd"/>
+      <w:r>
+        <w:rPr>
+          <w:rFonts w:ascii="Arial" w:eastAsia="Arial" w:hAnsi="Arial" w:cs="Arial"/>
+          <w:b/>
+          <w:bCs/>
+          <w:color w:val="1F3864"/>
+          <w:sz w:val="28"/>
+          <w:szCs w:val="28"/>
+        </w:rPr>
+        <w:t>)</w:t>
       </w:r>
     </w:p>
     <w:p>
@@ -4878,7 +5472,43 @@
           <w:sz w:val="19"/>
           <w:szCs w:val="19"/>
         </w:rPr>
-        <w:t>curl -X POST ${{ secrets.RENDER_DEPLOY_HOOK_URL }}</w:t>
+        <w:t>curl -X POST $</w:t>
+      </w:r>
+      <w:proofErr w:type="gramStart"/>
+      <w:r>
+        <w:rPr>
+          <w:rFonts w:ascii="Arial" w:eastAsia="Arial" w:hAnsi="Arial" w:cs="Arial"/>
+          <w:sz w:val="19"/>
+          <w:szCs w:val="19"/>
+        </w:rPr>
+        <w:t xml:space="preserve">{{ </w:t>
+      </w:r>
+      <w:proofErr w:type="spellStart"/>
+      <w:r>
+        <w:rPr>
+          <w:rFonts w:ascii="Arial" w:eastAsia="Arial" w:hAnsi="Arial" w:cs="Arial"/>
+          <w:sz w:val="19"/>
+          <w:szCs w:val="19"/>
+        </w:rPr>
+        <w:t>secrets</w:t>
+      </w:r>
+      <w:proofErr w:type="gramEnd"/>
+      <w:r>
+        <w:rPr>
+          <w:rFonts w:ascii="Arial" w:eastAsia="Arial" w:hAnsi="Arial" w:cs="Arial"/>
+          <w:sz w:val="19"/>
+          <w:szCs w:val="19"/>
+        </w:rPr>
+        <w:t>.RENDER_DEPLOY_HOOK_URL</w:t>
+      </w:r>
+      <w:proofErr w:type="spellEnd"/>
+      <w:r>
+        <w:rPr>
+          <w:rFonts w:ascii="Arial" w:eastAsia="Arial" w:hAnsi="Arial" w:cs="Arial"/>
+          <w:sz w:val="19"/>
+          <w:szCs w:val="19"/>
+        </w:rPr>
+        <w:t xml:space="preserve"> }}</w:t>
       </w:r>
     </w:p>
     <w:p>
@@ -4947,7 +5577,15 @@
           <w:rFonts w:ascii="Arial" w:eastAsia="Arial" w:hAnsi="Arial" w:cs="Arial"/>
           <w:color w:val="000000"/>
         </w:rPr>
-        <w:t xml:space="preserve">The job must NOT contain any Docker build or push steps </w:t>
+        <w:t xml:space="preserve">The job must NOT contain any Docker build or push </w:t>
+      </w:r>
+      <w:proofErr w:type="gramStart"/>
+      <w:r>
+        <w:rPr>
+          <w:rFonts w:ascii="Arial" w:eastAsia="Arial" w:hAnsi="Arial" w:cs="Arial"/>
+          <w:color w:val="000000"/>
+        </w:rPr>
+        <w:t xml:space="preserve">steps </w:t>
       </w:r>
       <w:r>
         <w:rPr>
@@ -4956,6 +5594,7 @@
         </w:rPr>
         <w:t>,</w:t>
       </w:r>
+      <w:proofErr w:type="gramEnd"/>
       <w:r>
         <w:rPr>
           <w:rFonts w:ascii="Arial" w:eastAsia="Arial" w:hAnsi="Arial" w:cs="Arial"/>
@@ -5148,6 +5787,7 @@
             <w:vAlign w:val="center"/>
           </w:tcPr>
           <w:p>
+            <w:proofErr w:type="spellStart"/>
             <w:r>
               <w:rPr>
                 <w:rFonts w:ascii="Arial" w:eastAsia="Arial" w:hAnsi="Arial" w:cs="Arial"/>
@@ -5159,6 +5799,7 @@
               </w:rPr>
               <w:t>ci.yml</w:t>
             </w:r>
+            <w:proofErr w:type="spellEnd"/>
           </w:p>
         </w:tc>
         <w:tc>
@@ -5180,14 +5821,25 @@
             <w:vAlign w:val="center"/>
           </w:tcPr>
           <w:p>
-            <w:r>
-              <w:rPr>
-                <w:rFonts w:ascii="Arial" w:eastAsia="Arial" w:hAnsi="Arial" w:cs="Arial"/>
-                <w:color w:val="000000"/>
-                <w:sz w:val="18"/>
-                <w:szCs w:val="18"/>
-              </w:rPr>
-              <w:t xml:space="preserve">pull_request event targeting </w:t>
+            <w:proofErr w:type="spellStart"/>
+            <w:r>
+              <w:rPr>
+                <w:rFonts w:ascii="Arial" w:eastAsia="Arial" w:hAnsi="Arial" w:cs="Arial"/>
+                <w:color w:val="000000"/>
+                <w:sz w:val="18"/>
+                <w:szCs w:val="18"/>
+              </w:rPr>
+              <w:t>pull_request</w:t>
+            </w:r>
+            <w:proofErr w:type="spellEnd"/>
+            <w:r>
+              <w:rPr>
+                <w:rFonts w:ascii="Arial" w:eastAsia="Arial" w:hAnsi="Arial" w:cs="Arial"/>
+                <w:color w:val="000000"/>
+                <w:sz w:val="18"/>
+                <w:szCs w:val="18"/>
+              </w:rPr>
+              <w:t xml:space="preserve"> event targeting </w:t>
             </w:r>
             <w:r>
               <w:rPr>
@@ -5260,6 +5912,7 @@
             <w:vAlign w:val="center"/>
           </w:tcPr>
           <w:p>
+            <w:proofErr w:type="spellStart"/>
             <w:r>
               <w:rPr>
                 <w:rFonts w:ascii="Arial" w:eastAsia="Arial" w:hAnsi="Arial" w:cs="Arial"/>
@@ -5271,6 +5924,7 @@
               </w:rPr>
               <w:t>cd.yml</w:t>
             </w:r>
+            <w:proofErr w:type="spellEnd"/>
           </w:p>
         </w:tc>
         <w:tc>
@@ -5409,7 +6063,23 @@
           <w:rFonts w:ascii="Arial" w:eastAsia="Arial" w:hAnsi="Arial" w:cs="Arial"/>
           <w:color w:val="000000"/>
         </w:rPr>
-        <w:t>Create a new GitHub repository from scratch (taskflow-cicd or team-agreed name). Do NOT reuse any previous repository.</w:t>
+        <w:t>Create a new GitHub repository from scratch (</w:t>
+      </w:r>
+      <w:proofErr w:type="spellStart"/>
+      <w:r>
+        <w:rPr>
+          <w:rFonts w:ascii="Arial" w:eastAsia="Arial" w:hAnsi="Arial" w:cs="Arial"/>
+          <w:color w:val="000000"/>
+        </w:rPr>
+        <w:t>taskflow-cicd</w:t>
+      </w:r>
+      <w:proofErr w:type="spellEnd"/>
+      <w:r>
+        <w:rPr>
+          <w:rFonts w:ascii="Arial" w:eastAsia="Arial" w:hAnsi="Arial" w:cs="Arial"/>
+          <w:color w:val="000000"/>
+        </w:rPr>
+        <w:t xml:space="preserve"> or team-agreed name). Do NOT reuse any previous repository.</w:t>
       </w:r>
     </w:p>
     <w:p>
@@ -5426,7 +6096,15 @@
           <w:rFonts w:ascii="Arial" w:eastAsia="Arial" w:hAnsi="Arial" w:cs="Arial"/>
           <w:color w:val="000000"/>
         </w:rPr>
-        <w:t xml:space="preserve">Team Lead: Set up the initial repository structure </w:t>
+        <w:t xml:space="preserve">Team Lead: Set up the initial repository </w:t>
+      </w:r>
+      <w:proofErr w:type="gramStart"/>
+      <w:r>
+        <w:rPr>
+          <w:rFonts w:ascii="Arial" w:eastAsia="Arial" w:hAnsi="Arial" w:cs="Arial"/>
+          <w:color w:val="000000"/>
+        </w:rPr>
+        <w:t xml:space="preserve">structure </w:t>
       </w:r>
       <w:r>
         <w:rPr>
@@ -5435,6 +6113,7 @@
         </w:rPr>
         <w:t>,</w:t>
       </w:r>
+      <w:proofErr w:type="gramEnd"/>
       <w:r>
         <w:rPr>
           <w:rFonts w:ascii="Arial" w:eastAsia="Arial" w:hAnsi="Arial" w:cs="Arial"/>
@@ -5454,7 +6133,23 @@
           <w:rFonts w:ascii="Arial" w:eastAsia="Arial" w:hAnsi="Arial" w:cs="Arial"/>
           <w:color w:val="000000"/>
         </w:rPr>
-        <w:t xml:space="preserve"> branch, commit the shared style.css, Dockerfile, and a skeleton index.html (Home / Dashboard page).</w:t>
+        <w:t xml:space="preserve"> branch, commit the shared style.css, </w:t>
+      </w:r>
+      <w:proofErr w:type="spellStart"/>
+      <w:r>
+        <w:rPr>
+          <w:rFonts w:ascii="Arial" w:eastAsia="Arial" w:hAnsi="Arial" w:cs="Arial"/>
+          <w:color w:val="000000"/>
+        </w:rPr>
+        <w:t>Dockerfile</w:t>
+      </w:r>
+      <w:proofErr w:type="spellEnd"/>
+      <w:r>
+        <w:rPr>
+          <w:rFonts w:ascii="Arial" w:eastAsia="Arial" w:hAnsi="Arial" w:cs="Arial"/>
+          <w:color w:val="000000"/>
+        </w:rPr>
+        <w:t>, and a skeleton index.html (Home / Dashboard page).</w:t>
       </w:r>
     </w:p>
     <w:p>
@@ -5471,7 +6166,15 @@
           <w:rFonts w:ascii="Arial" w:eastAsia="Arial" w:hAnsi="Arial" w:cs="Arial"/>
           <w:color w:val="000000"/>
         </w:rPr>
-        <w:t xml:space="preserve">Commit the Assignment 04 question paper (.docx) to the root of the repository. Every team member must fill in their details </w:t>
+        <w:t xml:space="preserve">Commit the Assignment 04 question paper (.docx) to the root of the repository. Every team member must fill in their </w:t>
+      </w:r>
+      <w:proofErr w:type="gramStart"/>
+      <w:r>
+        <w:rPr>
+          <w:rFonts w:ascii="Arial" w:eastAsia="Arial" w:hAnsi="Arial" w:cs="Arial"/>
+          <w:color w:val="000000"/>
+        </w:rPr>
+        <w:t xml:space="preserve">details </w:t>
       </w:r>
       <w:r>
         <w:rPr>
@@ -5480,6 +6183,7 @@
         </w:rPr>
         <w:t>,</w:t>
       </w:r>
+      <w:proofErr w:type="gramEnd"/>
       <w:r>
         <w:rPr>
           <w:rFonts w:ascii="Arial" w:eastAsia="Arial" w:hAnsi="Arial" w:cs="Arial"/>
@@ -5530,7 +6234,15 @@
           <w:rFonts w:ascii="Arial" w:eastAsia="Arial" w:hAnsi="Arial" w:cs="Arial"/>
           <w:color w:val="000000"/>
         </w:rPr>
-        <w:t xml:space="preserve"> and configure all three secrets </w:t>
+        <w:t xml:space="preserve"> and configure all three </w:t>
+      </w:r>
+      <w:proofErr w:type="gramStart"/>
+      <w:r>
+        <w:rPr>
+          <w:rFonts w:ascii="Arial" w:eastAsia="Arial" w:hAnsi="Arial" w:cs="Arial"/>
+          <w:color w:val="000000"/>
+        </w:rPr>
+        <w:t xml:space="preserve">secrets </w:t>
       </w:r>
       <w:r>
         <w:rPr>
@@ -5539,6 +6251,7 @@
         </w:rPr>
         <w:t>,</w:t>
       </w:r>
+      <w:proofErr w:type="gramEnd"/>
       <w:r>
         <w:rPr>
           <w:rFonts w:ascii="Arial" w:eastAsia="Arial" w:hAnsi="Arial" w:cs="Arial"/>
@@ -5606,7 +6319,47 @@
           <w:rFonts w:ascii="Arial" w:eastAsia="Arial" w:hAnsi="Arial" w:cs="Arial"/>
           <w:color w:val="000000"/>
         </w:rPr>
-        <w:t xml:space="preserve">Create the CI workflow at .github/workflows/ci.yml </w:t>
+        <w:t xml:space="preserve">Create the CI workflow at </w:t>
+      </w:r>
+      <w:proofErr w:type="gramStart"/>
+      <w:r>
+        <w:rPr>
+          <w:rFonts w:ascii="Arial" w:eastAsia="Arial" w:hAnsi="Arial" w:cs="Arial"/>
+          <w:color w:val="000000"/>
+        </w:rPr>
+        <w:t>.</w:t>
+      </w:r>
+      <w:proofErr w:type="spellStart"/>
+      <w:r>
+        <w:rPr>
+          <w:rFonts w:ascii="Arial" w:eastAsia="Arial" w:hAnsi="Arial" w:cs="Arial"/>
+          <w:color w:val="000000"/>
+        </w:rPr>
+        <w:t>github</w:t>
+      </w:r>
+      <w:proofErr w:type="spellEnd"/>
+      <w:r>
+        <w:rPr>
+          <w:rFonts w:ascii="Arial" w:eastAsia="Arial" w:hAnsi="Arial" w:cs="Arial"/>
+          <w:color w:val="000000"/>
+        </w:rPr>
+        <w:t>/workflows/</w:t>
+      </w:r>
+      <w:proofErr w:type="spellStart"/>
+      <w:r>
+        <w:rPr>
+          <w:rFonts w:ascii="Arial" w:eastAsia="Arial" w:hAnsi="Arial" w:cs="Arial"/>
+          <w:color w:val="000000"/>
+        </w:rPr>
+        <w:t>ci.yml</w:t>
+      </w:r>
+      <w:proofErr w:type="spellEnd"/>
+      <w:r>
+        <w:rPr>
+          <w:rFonts w:ascii="Arial" w:eastAsia="Arial" w:hAnsi="Arial" w:cs="Arial"/>
+          <w:color w:val="000000"/>
+        </w:rPr>
+        <w:t xml:space="preserve"> </w:t>
       </w:r>
       <w:r>
         <w:rPr>
@@ -5615,12 +6368,29 @@
         </w:rPr>
         <w:t>,</w:t>
       </w:r>
-      <w:r>
-        <w:rPr>
-          <w:rFonts w:ascii="Arial" w:eastAsia="Arial" w:hAnsi="Arial" w:cs="Arial"/>
-          <w:color w:val="000000"/>
-        </w:rPr>
-        <w:t xml:space="preserve"> triggered on pull_request targeting </w:t>
+      <w:proofErr w:type="gramEnd"/>
+      <w:r>
+        <w:rPr>
+          <w:rFonts w:ascii="Arial" w:eastAsia="Arial" w:hAnsi="Arial" w:cs="Arial"/>
+          <w:color w:val="000000"/>
+        </w:rPr>
+        <w:t xml:space="preserve"> triggered on </w:t>
+      </w:r>
+      <w:proofErr w:type="spellStart"/>
+      <w:r>
+        <w:rPr>
+          <w:rFonts w:ascii="Arial" w:eastAsia="Arial" w:hAnsi="Arial" w:cs="Arial"/>
+          <w:color w:val="000000"/>
+        </w:rPr>
+        <w:t>pull_request</w:t>
+      </w:r>
+      <w:proofErr w:type="spellEnd"/>
+      <w:r>
+        <w:rPr>
+          <w:rFonts w:ascii="Arial" w:eastAsia="Arial" w:hAnsi="Arial" w:cs="Arial"/>
+          <w:color w:val="000000"/>
+        </w:rPr>
+        <w:t xml:space="preserve"> targeting </w:t>
       </w:r>
       <w:r>
         <w:rPr>
@@ -5651,7 +6421,47 @@
           <w:rFonts w:ascii="Arial" w:eastAsia="Arial" w:hAnsi="Arial" w:cs="Arial"/>
           <w:color w:val="000000"/>
         </w:rPr>
-        <w:t xml:space="preserve">Create the CD workflow at .github/workflows/cd.yml </w:t>
+        <w:t xml:space="preserve">Create the CD workflow at </w:t>
+      </w:r>
+      <w:proofErr w:type="gramStart"/>
+      <w:r>
+        <w:rPr>
+          <w:rFonts w:ascii="Arial" w:eastAsia="Arial" w:hAnsi="Arial" w:cs="Arial"/>
+          <w:color w:val="000000"/>
+        </w:rPr>
+        <w:t>.</w:t>
+      </w:r>
+      <w:proofErr w:type="spellStart"/>
+      <w:r>
+        <w:rPr>
+          <w:rFonts w:ascii="Arial" w:eastAsia="Arial" w:hAnsi="Arial" w:cs="Arial"/>
+          <w:color w:val="000000"/>
+        </w:rPr>
+        <w:t>github</w:t>
+      </w:r>
+      <w:proofErr w:type="spellEnd"/>
+      <w:r>
+        <w:rPr>
+          <w:rFonts w:ascii="Arial" w:eastAsia="Arial" w:hAnsi="Arial" w:cs="Arial"/>
+          <w:color w:val="000000"/>
+        </w:rPr>
+        <w:t>/workflows/</w:t>
+      </w:r>
+      <w:proofErr w:type="spellStart"/>
+      <w:r>
+        <w:rPr>
+          <w:rFonts w:ascii="Arial" w:eastAsia="Arial" w:hAnsi="Arial" w:cs="Arial"/>
+          <w:color w:val="000000"/>
+        </w:rPr>
+        <w:t>cd.yml</w:t>
+      </w:r>
+      <w:proofErr w:type="spellEnd"/>
+      <w:r>
+        <w:rPr>
+          <w:rFonts w:ascii="Arial" w:eastAsia="Arial" w:hAnsi="Arial" w:cs="Arial"/>
+          <w:color w:val="000000"/>
+        </w:rPr>
+        <w:t xml:space="preserve"> </w:t>
       </w:r>
       <w:r>
         <w:rPr>
@@ -5660,6 +6470,7 @@
         </w:rPr>
         <w:t>,</w:t>
       </w:r>
+      <w:proofErr w:type="gramEnd"/>
       <w:r>
         <w:rPr>
           <w:rFonts w:ascii="Arial" w:eastAsia="Arial" w:hAnsi="Arial" w:cs="Arial"/>
@@ -5714,7 +6525,25 @@
           <w:sz w:val="19"/>
           <w:szCs w:val="19"/>
         </w:rPr>
-        <w:t>Create a feature branch: feature/&lt;github-username&gt;/&lt;page-name&gt;</w:t>
+        <w:t>Create a feature branch: feature/&lt;</w:t>
+      </w:r>
+      <w:proofErr w:type="spellStart"/>
+      <w:r>
+        <w:rPr>
+          <w:rFonts w:ascii="Arial" w:eastAsia="Arial" w:hAnsi="Arial" w:cs="Arial"/>
+          <w:sz w:val="19"/>
+          <w:szCs w:val="19"/>
+        </w:rPr>
+        <w:t>github</w:t>
+      </w:r>
+      <w:proofErr w:type="spellEnd"/>
+      <w:r>
+        <w:rPr>
+          <w:rFonts w:ascii="Arial" w:eastAsia="Arial" w:hAnsi="Arial" w:cs="Arial"/>
+          <w:sz w:val="19"/>
+          <w:szCs w:val="19"/>
+        </w:rPr>
+        <w:t>-username&gt;/&lt;page-name&gt;</w:t>
       </w:r>
     </w:p>
     <w:p>
@@ -5777,15 +6606,16 @@
           <w:sz w:val="19"/>
           <w:szCs w:val="19"/>
         </w:rPr>
-        <w:t>“develop”</w:t>
-      </w:r>
+        <w:t>“develop</w:t>
+      </w:r>
+      <w:proofErr w:type="gramStart"/>
       <w:r>
         <w:rPr>
           <w:rFonts w:ascii="Arial" w:eastAsia="Arial" w:hAnsi="Arial" w:cs="Arial"/>
           <w:sz w:val="19"/>
           <w:szCs w:val="19"/>
         </w:rPr>
-        <w:t xml:space="preserve"> </w:t>
+        <w:t>”</w:t>
       </w:r>
       <w:r>
         <w:rPr>
@@ -5793,8 +6623,17 @@
           <w:sz w:val="19"/>
           <w:szCs w:val="19"/>
         </w:rPr>
+        <w:t xml:space="preserve"> </w:t>
+      </w:r>
+      <w:r>
+        <w:rPr>
+          <w:rFonts w:ascii="Arial" w:eastAsia="Arial" w:hAnsi="Arial" w:cs="Arial"/>
+          <w:sz w:val="19"/>
+          <w:szCs w:val="19"/>
+        </w:rPr>
         <w:t>,</w:t>
       </w:r>
+      <w:proofErr w:type="gramEnd"/>
       <w:r>
         <w:rPr>
           <w:rFonts w:ascii="Arial" w:eastAsia="Arial" w:hAnsi="Arial" w:cs="Arial"/>
@@ -5819,16 +6658,26 @@
           <w:sz w:val="19"/>
           <w:szCs w:val="19"/>
         </w:rPr>
-        <w:t xml:space="preserve">Request a review; after approval the Team Lead merges the PR </w:t>
-      </w:r>
+        <w:t xml:space="preserve">Request a review; after approval the Team Lead merges the </w:t>
+      </w:r>
+      <w:proofErr w:type="gramStart"/>
       <w:r>
         <w:rPr>
           <w:rFonts w:ascii="Arial" w:eastAsia="Arial" w:hAnsi="Arial" w:cs="Arial"/>
           <w:sz w:val="19"/>
           <w:szCs w:val="19"/>
         </w:rPr>
+        <w:t xml:space="preserve">PR </w:t>
+      </w:r>
+      <w:r>
+        <w:rPr>
+          <w:rFonts w:ascii="Arial" w:eastAsia="Arial" w:hAnsi="Arial" w:cs="Arial"/>
+          <w:sz w:val="19"/>
+          <w:szCs w:val="19"/>
+        </w:rPr>
         <w:t>,</w:t>
       </w:r>
+      <w:proofErr w:type="gramEnd"/>
       <w:r>
         <w:rPr>
           <w:rFonts w:ascii="Arial" w:eastAsia="Arial" w:hAnsi="Arial" w:cs="Arial"/>
@@ -5852,7 +6701,39 @@
           <w:rFonts w:ascii="Arial" w:eastAsia="Arial" w:hAnsi="Arial" w:cs="Arial"/>
           <w:color w:val="000000"/>
         </w:rPr>
-        <w:t>After all 5 PRs are merged, verify the live TaskFlow application on Render contains all five pages and navigation between them works correctly.</w:t>
+        <w:t xml:space="preserve">After </w:t>
+      </w:r>
+      <w:proofErr w:type="gramStart"/>
+      <w:r>
+        <w:rPr>
+          <w:rFonts w:ascii="Arial" w:eastAsia="Arial" w:hAnsi="Arial" w:cs="Arial"/>
+          <w:color w:val="000000"/>
+        </w:rPr>
+        <w:t>all</w:t>
+      </w:r>
+      <w:proofErr w:type="gramEnd"/>
+      <w:r>
+        <w:rPr>
+          <w:rFonts w:ascii="Arial" w:eastAsia="Arial" w:hAnsi="Arial" w:cs="Arial"/>
+          <w:color w:val="000000"/>
+        </w:rPr>
+        <w:t xml:space="preserve"> 5 PRs are merged, verify the live </w:t>
+      </w:r>
+      <w:proofErr w:type="spellStart"/>
+      <w:r>
+        <w:rPr>
+          <w:rFonts w:ascii="Arial" w:eastAsia="Arial" w:hAnsi="Arial" w:cs="Arial"/>
+          <w:color w:val="000000"/>
+        </w:rPr>
+        <w:t>TaskFlow</w:t>
+      </w:r>
+      <w:proofErr w:type="spellEnd"/>
+      <w:r>
+        <w:rPr>
+          <w:rFonts w:ascii="Arial" w:eastAsia="Arial" w:hAnsi="Arial" w:cs="Arial"/>
+          <w:color w:val="000000"/>
+        </w:rPr>
+        <w:t xml:space="preserve"> application on Render contains all five pages and navigation between them works correctly.</w:t>
       </w:r>
     </w:p>
     <w:p>
@@ -7131,29 +8012,9 @@
                 <w:sz w:val="18"/>
                 <w:szCs w:val="18"/>
               </w:rPr>
-              <w:t>CI Pipeline – Build &amp; Push Docker Image (ci.yml)</w:t>
-            </w:r>
-          </w:p>
-        </w:tc>
-        <w:tc>
-          <w:tcPr>
-            <w:tcW w:w="2150" w:type="dxa"/>
-            <w:tcBorders>
-              <w:top w:val="single" w:sz="6" w:space="0" w:color="ADB9CA"/>
-              <w:left w:val="single" w:sz="6" w:space="0" w:color="ADB9CA"/>
-              <w:bottom w:val="single" w:sz="6" w:space="0" w:color="ADB9CA"/>
-              <w:right w:val="single" w:sz="6" w:space="0" w:color="ADB9CA"/>
-            </w:tcBorders>
-            <w:shd w:val="clear" w:color="auto" w:fill="2E75B6"/>
-            <w:tcMar>
-              <w:top w:w="80" w:type="dxa"/>
-              <w:left w:w="140" w:type="dxa"/>
-              <w:bottom w:w="80" w:type="dxa"/>
-              <w:right w:w="140" w:type="dxa"/>
-            </w:tcMar>
-            <w:vAlign w:val="center"/>
-          </w:tcPr>
-          <w:p>
+              <w:t>CI Pipeline – Build &amp; Push Docker Image (</w:t>
+            </w:r>
+            <w:proofErr w:type="spellStart"/>
             <w:r>
               <w:rPr>
                 <w:rFonts w:ascii="Arial" w:eastAsia="Arial" w:hAnsi="Arial" w:cs="Arial"/>
@@ -7163,436 +8024,9 @@
                 <w:sz w:val="18"/>
                 <w:szCs w:val="18"/>
               </w:rPr>
-              <w:t>25 Marks</w:t>
-            </w:r>
-          </w:p>
-        </w:tc>
-      </w:tr>
-      <w:tr>
-        <w:tc>
-          <w:tcPr>
-            <w:tcW w:w="700" w:type="dxa"/>
-            <w:tcBorders>
-              <w:top w:val="single" w:sz="6" w:space="0" w:color="ADB9CA"/>
-              <w:left w:val="single" w:sz="6" w:space="0" w:color="ADB9CA"/>
-              <w:bottom w:val="single" w:sz="6" w:space="0" w:color="ADB9CA"/>
-              <w:right w:val="single" w:sz="6" w:space="0" w:color="ADB9CA"/>
-            </w:tcBorders>
-            <w:shd w:val="clear" w:color="auto" w:fill="E8F0FB"/>
-            <w:tcMar>
-              <w:top w:w="80" w:type="dxa"/>
-              <w:left w:w="140" w:type="dxa"/>
-              <w:bottom w:w="80" w:type="dxa"/>
-              <w:right w:w="140" w:type="dxa"/>
-            </w:tcMar>
-            <w:vAlign w:val="center"/>
-          </w:tcPr>
-          <w:p>
-            <w:r>
-              <w:rPr>
-                <w:rFonts w:ascii="Arial" w:eastAsia="Arial" w:hAnsi="Arial" w:cs="Arial"/>
-                <w:b/>
-                <w:bCs/>
-                <w:color w:val="000000"/>
-                <w:sz w:val="18"/>
-                <w:szCs w:val="18"/>
-              </w:rPr>
-              <w:t>9</w:t>
-            </w:r>
-          </w:p>
-        </w:tc>
-        <w:tc>
-          <w:tcPr>
-            <w:tcW w:w="6510" w:type="dxa"/>
-            <w:tcBorders>
-              <w:top w:val="single" w:sz="6" w:space="0" w:color="ADB9CA"/>
-              <w:left w:val="single" w:sz="6" w:space="0" w:color="ADB9CA"/>
-              <w:bottom w:val="single" w:sz="6" w:space="0" w:color="ADB9CA"/>
-              <w:right w:val="single" w:sz="6" w:space="0" w:color="ADB9CA"/>
-            </w:tcBorders>
-            <w:shd w:val="clear" w:color="auto" w:fill="E8F0FB"/>
-            <w:tcMar>
-              <w:top w:w="80" w:type="dxa"/>
-              <w:left w:w="140" w:type="dxa"/>
-              <w:bottom w:w="80" w:type="dxa"/>
-              <w:right w:w="140" w:type="dxa"/>
-            </w:tcMar>
-            <w:vAlign w:val="center"/>
-          </w:tcPr>
-          <w:p>
-            <w:r>
-              <w:rPr>
-                <w:rFonts w:ascii="Arial" w:eastAsia="Arial" w:hAnsi="Arial" w:cs="Arial"/>
-                <w:color w:val="000000"/>
-                <w:sz w:val="18"/>
-                <w:szCs w:val="18"/>
-              </w:rPr>
-              <w:t xml:space="preserve">CI workflow file created at .github/workflows/ci.yml with correct pull_request trigger targeting </w:t>
-            </w:r>
-            <w:r>
-              <w:rPr>
-                <w:rFonts w:ascii="Arial" w:eastAsia="Arial" w:hAnsi="Arial" w:cs="Arial"/>
-                <w:color w:val="000000"/>
-                <w:sz w:val="18"/>
-                <w:szCs w:val="18"/>
-              </w:rPr>
-              <w:t>“develop”</w:t>
-            </w:r>
-          </w:p>
-        </w:tc>
-        <w:tc>
-          <w:tcPr>
-            <w:tcW w:w="2150" w:type="dxa"/>
-            <w:tcBorders>
-              <w:top w:val="single" w:sz="6" w:space="0" w:color="ADB9CA"/>
-              <w:left w:val="single" w:sz="6" w:space="0" w:color="ADB9CA"/>
-              <w:bottom w:val="single" w:sz="6" w:space="0" w:color="ADB9CA"/>
-              <w:right w:val="single" w:sz="6" w:space="0" w:color="ADB9CA"/>
-            </w:tcBorders>
-            <w:shd w:val="clear" w:color="auto" w:fill="E8F0FB"/>
-            <w:tcMar>
-              <w:top w:w="80" w:type="dxa"/>
-              <w:left w:w="140" w:type="dxa"/>
-              <w:bottom w:w="80" w:type="dxa"/>
-              <w:right w:w="140" w:type="dxa"/>
-            </w:tcMar>
-            <w:vAlign w:val="center"/>
-          </w:tcPr>
-          <w:p>
-            <w:r>
-              <w:rPr>
-                <w:rFonts w:ascii="Arial" w:eastAsia="Arial" w:hAnsi="Arial" w:cs="Arial"/>
-                <w:color w:val="000000"/>
-                <w:sz w:val="18"/>
-                <w:szCs w:val="18"/>
-              </w:rPr>
-              <w:t>07</w:t>
-            </w:r>
-          </w:p>
-        </w:tc>
-      </w:tr>
-      <w:tr>
-        <w:tc>
-          <w:tcPr>
-            <w:tcW w:w="700" w:type="dxa"/>
-            <w:tcBorders>
-              <w:top w:val="single" w:sz="6" w:space="0" w:color="ADB9CA"/>
-              <w:left w:val="single" w:sz="6" w:space="0" w:color="ADB9CA"/>
-              <w:bottom w:val="single" w:sz="6" w:space="0" w:color="ADB9CA"/>
-              <w:right w:val="single" w:sz="6" w:space="0" w:color="ADB9CA"/>
-            </w:tcBorders>
-            <w:shd w:val="clear" w:color="auto" w:fill="FFFFFF"/>
-            <w:tcMar>
-              <w:top w:w="80" w:type="dxa"/>
-              <w:left w:w="140" w:type="dxa"/>
-              <w:bottom w:w="80" w:type="dxa"/>
-              <w:right w:w="140" w:type="dxa"/>
-            </w:tcMar>
-            <w:vAlign w:val="center"/>
-          </w:tcPr>
-          <w:p>
-            <w:r>
-              <w:rPr>
-                <w:rFonts w:ascii="Arial" w:eastAsia="Arial" w:hAnsi="Arial" w:cs="Arial"/>
-                <w:b/>
-                <w:bCs/>
-                <w:color w:val="000000"/>
-                <w:sz w:val="18"/>
-                <w:szCs w:val="18"/>
-              </w:rPr>
-              <w:t>10</w:t>
-            </w:r>
-          </w:p>
-        </w:tc>
-        <w:tc>
-          <w:tcPr>
-            <w:tcW w:w="6510" w:type="dxa"/>
-            <w:tcBorders>
-              <w:top w:val="single" w:sz="6" w:space="0" w:color="ADB9CA"/>
-              <w:left w:val="single" w:sz="6" w:space="0" w:color="ADB9CA"/>
-              <w:bottom w:val="single" w:sz="6" w:space="0" w:color="ADB9CA"/>
-              <w:right w:val="single" w:sz="6" w:space="0" w:color="ADB9CA"/>
-            </w:tcBorders>
-            <w:shd w:val="clear" w:color="auto" w:fill="FFFFFF"/>
-            <w:tcMar>
-              <w:top w:w="80" w:type="dxa"/>
-              <w:left w:w="140" w:type="dxa"/>
-              <w:bottom w:w="80" w:type="dxa"/>
-              <w:right w:w="140" w:type="dxa"/>
-            </w:tcMar>
-            <w:vAlign w:val="center"/>
-          </w:tcPr>
-          <w:p>
-            <w:r>
-              <w:rPr>
-                <w:rFonts w:ascii="Arial" w:eastAsia="Arial" w:hAnsi="Arial" w:cs="Arial"/>
-                <w:color w:val="000000"/>
-                <w:sz w:val="18"/>
-                <w:szCs w:val="18"/>
-              </w:rPr>
-              <w:t>Checkout code, login to Docker Hub using Team Lead's repository secrets</w:t>
-            </w:r>
-          </w:p>
-        </w:tc>
-        <w:tc>
-          <w:tcPr>
-            <w:tcW w:w="2150" w:type="dxa"/>
-            <w:tcBorders>
-              <w:top w:val="single" w:sz="6" w:space="0" w:color="ADB9CA"/>
-              <w:left w:val="single" w:sz="6" w:space="0" w:color="ADB9CA"/>
-              <w:bottom w:val="single" w:sz="6" w:space="0" w:color="ADB9CA"/>
-              <w:right w:val="single" w:sz="6" w:space="0" w:color="ADB9CA"/>
-            </w:tcBorders>
-            <w:shd w:val="clear" w:color="auto" w:fill="FFFFFF"/>
-            <w:tcMar>
-              <w:top w:w="80" w:type="dxa"/>
-              <w:left w:w="140" w:type="dxa"/>
-              <w:bottom w:w="80" w:type="dxa"/>
-              <w:right w:w="140" w:type="dxa"/>
-            </w:tcMar>
-            <w:vAlign w:val="center"/>
-          </w:tcPr>
-          <w:p>
-            <w:r>
-              <w:rPr>
-                <w:rFonts w:ascii="Arial" w:eastAsia="Arial" w:hAnsi="Arial" w:cs="Arial"/>
-                <w:color w:val="000000"/>
-                <w:sz w:val="18"/>
-                <w:szCs w:val="18"/>
-              </w:rPr>
-              <w:t>06</w:t>
-            </w:r>
-          </w:p>
-        </w:tc>
-      </w:tr>
-      <w:tr>
-        <w:tc>
-          <w:tcPr>
-            <w:tcW w:w="700" w:type="dxa"/>
-            <w:tcBorders>
-              <w:top w:val="single" w:sz="6" w:space="0" w:color="ADB9CA"/>
-              <w:left w:val="single" w:sz="6" w:space="0" w:color="ADB9CA"/>
-              <w:bottom w:val="single" w:sz="6" w:space="0" w:color="ADB9CA"/>
-              <w:right w:val="single" w:sz="6" w:space="0" w:color="ADB9CA"/>
-            </w:tcBorders>
-            <w:shd w:val="clear" w:color="auto" w:fill="E8F0FB"/>
-            <w:tcMar>
-              <w:top w:w="80" w:type="dxa"/>
-              <w:left w:w="140" w:type="dxa"/>
-              <w:bottom w:w="80" w:type="dxa"/>
-              <w:right w:w="140" w:type="dxa"/>
-            </w:tcMar>
-            <w:vAlign w:val="center"/>
-          </w:tcPr>
-          <w:p>
-            <w:r>
-              <w:rPr>
-                <w:rFonts w:ascii="Arial" w:eastAsia="Arial" w:hAnsi="Arial" w:cs="Arial"/>
-                <w:b/>
-                <w:bCs/>
-                <w:color w:val="000000"/>
-                <w:sz w:val="18"/>
-                <w:szCs w:val="18"/>
-              </w:rPr>
-              <w:t>11</w:t>
-            </w:r>
-          </w:p>
-        </w:tc>
-        <w:tc>
-          <w:tcPr>
-            <w:tcW w:w="6510" w:type="dxa"/>
-            <w:tcBorders>
-              <w:top w:val="single" w:sz="6" w:space="0" w:color="ADB9CA"/>
-              <w:left w:val="single" w:sz="6" w:space="0" w:color="ADB9CA"/>
-              <w:bottom w:val="single" w:sz="6" w:space="0" w:color="ADB9CA"/>
-              <w:right w:val="single" w:sz="6" w:space="0" w:color="ADB9CA"/>
-            </w:tcBorders>
-            <w:shd w:val="clear" w:color="auto" w:fill="E8F0FB"/>
-            <w:tcMar>
-              <w:top w:w="80" w:type="dxa"/>
-              <w:left w:w="140" w:type="dxa"/>
-              <w:bottom w:w="80" w:type="dxa"/>
-              <w:right w:w="140" w:type="dxa"/>
-            </w:tcMar>
-            <w:vAlign w:val="center"/>
-          </w:tcPr>
-          <w:p>
-            <w:r>
-              <w:rPr>
-                <w:rFonts w:ascii="Arial" w:eastAsia="Arial" w:hAnsi="Arial" w:cs="Arial"/>
-                <w:color w:val="000000"/>
-                <w:sz w:val="18"/>
-                <w:szCs w:val="18"/>
-              </w:rPr>
-              <w:t>Build Docker image and tag correctly (latest and/or commit SHA)</w:t>
-            </w:r>
-          </w:p>
-        </w:tc>
-        <w:tc>
-          <w:tcPr>
-            <w:tcW w:w="2150" w:type="dxa"/>
-            <w:tcBorders>
-              <w:top w:val="single" w:sz="6" w:space="0" w:color="ADB9CA"/>
-              <w:left w:val="single" w:sz="6" w:space="0" w:color="ADB9CA"/>
-              <w:bottom w:val="single" w:sz="6" w:space="0" w:color="ADB9CA"/>
-              <w:right w:val="single" w:sz="6" w:space="0" w:color="ADB9CA"/>
-            </w:tcBorders>
-            <w:shd w:val="clear" w:color="auto" w:fill="E8F0FB"/>
-            <w:tcMar>
-              <w:top w:w="80" w:type="dxa"/>
-              <w:left w:w="140" w:type="dxa"/>
-              <w:bottom w:w="80" w:type="dxa"/>
-              <w:right w:w="140" w:type="dxa"/>
-            </w:tcMar>
-            <w:vAlign w:val="center"/>
-          </w:tcPr>
-          <w:p>
-            <w:r>
-              <w:rPr>
-                <w:rFonts w:ascii="Arial" w:eastAsia="Arial" w:hAnsi="Arial" w:cs="Arial"/>
-                <w:color w:val="000000"/>
-                <w:sz w:val="18"/>
-                <w:szCs w:val="18"/>
-              </w:rPr>
-              <w:t>06</w:t>
-            </w:r>
-          </w:p>
-        </w:tc>
-      </w:tr>
-      <w:tr>
-        <w:tc>
-          <w:tcPr>
-            <w:tcW w:w="700" w:type="dxa"/>
-            <w:tcBorders>
-              <w:top w:val="single" w:sz="6" w:space="0" w:color="ADB9CA"/>
-              <w:left w:val="single" w:sz="6" w:space="0" w:color="ADB9CA"/>
-              <w:bottom w:val="single" w:sz="6" w:space="0" w:color="ADB9CA"/>
-              <w:right w:val="single" w:sz="6" w:space="0" w:color="ADB9CA"/>
-            </w:tcBorders>
-            <w:shd w:val="clear" w:color="auto" w:fill="FFFFFF"/>
-            <w:tcMar>
-              <w:top w:w="80" w:type="dxa"/>
-              <w:left w:w="140" w:type="dxa"/>
-              <w:bottom w:w="80" w:type="dxa"/>
-              <w:right w:w="140" w:type="dxa"/>
-            </w:tcMar>
-            <w:vAlign w:val="center"/>
-          </w:tcPr>
-          <w:p>
-            <w:r>
-              <w:rPr>
-                <w:rFonts w:ascii="Arial" w:eastAsia="Arial" w:hAnsi="Arial" w:cs="Arial"/>
-                <w:b/>
-                <w:bCs/>
-                <w:color w:val="000000"/>
-                <w:sz w:val="18"/>
-                <w:szCs w:val="18"/>
-              </w:rPr>
-              <w:t>12</w:t>
-            </w:r>
-          </w:p>
-        </w:tc>
-        <w:tc>
-          <w:tcPr>
-            <w:tcW w:w="6510" w:type="dxa"/>
-            <w:tcBorders>
-              <w:top w:val="single" w:sz="6" w:space="0" w:color="ADB9CA"/>
-              <w:left w:val="single" w:sz="6" w:space="0" w:color="ADB9CA"/>
-              <w:bottom w:val="single" w:sz="6" w:space="0" w:color="ADB9CA"/>
-              <w:right w:val="single" w:sz="6" w:space="0" w:color="ADB9CA"/>
-            </w:tcBorders>
-            <w:shd w:val="clear" w:color="auto" w:fill="FFFFFF"/>
-            <w:tcMar>
-              <w:top w:w="80" w:type="dxa"/>
-              <w:left w:w="140" w:type="dxa"/>
-              <w:bottom w:w="80" w:type="dxa"/>
-              <w:right w:w="140" w:type="dxa"/>
-            </w:tcMar>
-            <w:vAlign w:val="center"/>
-          </w:tcPr>
-          <w:p>
-            <w:r>
-              <w:rPr>
-                <w:rFonts w:ascii="Arial" w:eastAsia="Arial" w:hAnsi="Arial" w:cs="Arial"/>
-                <w:color w:val="000000"/>
-                <w:sz w:val="18"/>
-                <w:szCs w:val="18"/>
-              </w:rPr>
-              <w:t>Push image to Docker Hub successfully; workflow exits on any step failure</w:t>
-            </w:r>
-          </w:p>
-        </w:tc>
-        <w:tc>
-          <w:tcPr>
-            <w:tcW w:w="2150" w:type="dxa"/>
-            <w:tcBorders>
-              <w:top w:val="single" w:sz="6" w:space="0" w:color="ADB9CA"/>
-              <w:left w:val="single" w:sz="6" w:space="0" w:color="ADB9CA"/>
-              <w:bottom w:val="single" w:sz="6" w:space="0" w:color="ADB9CA"/>
-              <w:right w:val="single" w:sz="6" w:space="0" w:color="ADB9CA"/>
-            </w:tcBorders>
-            <w:shd w:val="clear" w:color="auto" w:fill="FFFFFF"/>
-            <w:tcMar>
-              <w:top w:w="80" w:type="dxa"/>
-              <w:left w:w="140" w:type="dxa"/>
-              <w:bottom w:w="80" w:type="dxa"/>
-              <w:right w:w="140" w:type="dxa"/>
-            </w:tcMar>
-            <w:vAlign w:val="center"/>
-          </w:tcPr>
-          <w:p>
-            <w:r>
-              <w:rPr>
-                <w:rFonts w:ascii="Arial" w:eastAsia="Arial" w:hAnsi="Arial" w:cs="Arial"/>
-                <w:color w:val="000000"/>
-                <w:sz w:val="18"/>
-                <w:szCs w:val="18"/>
-              </w:rPr>
-              <w:t>06</w:t>
-            </w:r>
-          </w:p>
-        </w:tc>
-      </w:tr>
-      <w:tr>
-        <w:tc>
-          <w:tcPr>
-            <w:tcW w:w="700" w:type="dxa"/>
-            <w:tcBorders>
-              <w:top w:val="single" w:sz="6" w:space="0" w:color="ADB9CA"/>
-              <w:left w:val="single" w:sz="6" w:space="0" w:color="ADB9CA"/>
-              <w:bottom w:val="single" w:sz="6" w:space="0" w:color="ADB9CA"/>
-              <w:right w:val="single" w:sz="6" w:space="0" w:color="ADB9CA"/>
-            </w:tcBorders>
-            <w:shd w:val="clear" w:color="auto" w:fill="2E75B6"/>
-            <w:tcMar>
-              <w:top w:w="80" w:type="dxa"/>
-              <w:left w:w="140" w:type="dxa"/>
-              <w:bottom w:w="80" w:type="dxa"/>
-              <w:right w:w="140" w:type="dxa"/>
-            </w:tcMar>
-            <w:vAlign w:val="center"/>
-          </w:tcPr>
-          <w:p/>
-        </w:tc>
-        <w:tc>
-          <w:tcPr>
-            <w:tcW w:w="6510" w:type="dxa"/>
-            <w:tcBorders>
-              <w:top w:val="single" w:sz="6" w:space="0" w:color="ADB9CA"/>
-              <w:left w:val="single" w:sz="6" w:space="0" w:color="ADB9CA"/>
-              <w:bottom w:val="single" w:sz="6" w:space="0" w:color="ADB9CA"/>
-              <w:right w:val="single" w:sz="6" w:space="0" w:color="ADB9CA"/>
-            </w:tcBorders>
-            <w:shd w:val="clear" w:color="auto" w:fill="2E75B6"/>
-            <w:tcMar>
-              <w:top w:w="80" w:type="dxa"/>
-              <w:left w:w="140" w:type="dxa"/>
-              <w:bottom w:w="80" w:type="dxa"/>
-              <w:right w:w="140" w:type="dxa"/>
-            </w:tcMar>
-            <w:vAlign w:val="center"/>
-          </w:tcPr>
-          <w:p>
+              <w:t>ci.yml</w:t>
+            </w:r>
+            <w:proofErr w:type="spellEnd"/>
             <w:r>
               <w:rPr>
                 <w:rFonts w:ascii="Arial" w:eastAsia="Arial" w:hAnsi="Arial" w:cs="Arial"/>
@@ -7602,7 +8036,7 @@
                 <w:sz w:val="18"/>
                 <w:szCs w:val="18"/>
               </w:rPr>
-              <w:t>CD Pipeline – Automated Deployment to Render (cd.yml)</w:t>
+              <w:t>)</w:t>
             </w:r>
           </w:p>
         </w:tc>
@@ -7634,7 +8068,7 @@
                 <w:sz w:val="18"/>
                 <w:szCs w:val="18"/>
               </w:rPr>
-              <w:t>20 Marks</w:t>
+              <w:t>25 Marks</w:t>
             </w:r>
           </w:p>
         </w:tc>
@@ -7668,6 +8102,581 @@
                 <w:sz w:val="18"/>
                 <w:szCs w:val="18"/>
               </w:rPr>
+              <w:t>9</w:t>
+            </w:r>
+          </w:p>
+        </w:tc>
+        <w:tc>
+          <w:tcPr>
+            <w:tcW w:w="6510" w:type="dxa"/>
+            <w:tcBorders>
+              <w:top w:val="single" w:sz="6" w:space="0" w:color="ADB9CA"/>
+              <w:left w:val="single" w:sz="6" w:space="0" w:color="ADB9CA"/>
+              <w:bottom w:val="single" w:sz="6" w:space="0" w:color="ADB9CA"/>
+              <w:right w:val="single" w:sz="6" w:space="0" w:color="ADB9CA"/>
+            </w:tcBorders>
+            <w:shd w:val="clear" w:color="auto" w:fill="E8F0FB"/>
+            <w:tcMar>
+              <w:top w:w="80" w:type="dxa"/>
+              <w:left w:w="140" w:type="dxa"/>
+              <w:bottom w:w="80" w:type="dxa"/>
+              <w:right w:w="140" w:type="dxa"/>
+            </w:tcMar>
+            <w:vAlign w:val="center"/>
+          </w:tcPr>
+          <w:p>
+            <w:r>
+              <w:rPr>
+                <w:rFonts w:ascii="Arial" w:eastAsia="Arial" w:hAnsi="Arial" w:cs="Arial"/>
+                <w:color w:val="000000"/>
+                <w:sz w:val="18"/>
+                <w:szCs w:val="18"/>
+              </w:rPr>
+              <w:t>CI workflow file created at .</w:t>
+            </w:r>
+            <w:proofErr w:type="spellStart"/>
+            <w:r>
+              <w:rPr>
+                <w:rFonts w:ascii="Arial" w:eastAsia="Arial" w:hAnsi="Arial" w:cs="Arial"/>
+                <w:color w:val="000000"/>
+                <w:sz w:val="18"/>
+                <w:szCs w:val="18"/>
+              </w:rPr>
+              <w:t>github</w:t>
+            </w:r>
+            <w:proofErr w:type="spellEnd"/>
+            <w:r>
+              <w:rPr>
+                <w:rFonts w:ascii="Arial" w:eastAsia="Arial" w:hAnsi="Arial" w:cs="Arial"/>
+                <w:color w:val="000000"/>
+                <w:sz w:val="18"/>
+                <w:szCs w:val="18"/>
+              </w:rPr>
+              <w:t>/workflows/</w:t>
+            </w:r>
+            <w:proofErr w:type="spellStart"/>
+            <w:r>
+              <w:rPr>
+                <w:rFonts w:ascii="Arial" w:eastAsia="Arial" w:hAnsi="Arial" w:cs="Arial"/>
+                <w:color w:val="000000"/>
+                <w:sz w:val="18"/>
+                <w:szCs w:val="18"/>
+              </w:rPr>
+              <w:t>ci.yml</w:t>
+            </w:r>
+            <w:proofErr w:type="spellEnd"/>
+            <w:r>
+              <w:rPr>
+                <w:rFonts w:ascii="Arial" w:eastAsia="Arial" w:hAnsi="Arial" w:cs="Arial"/>
+                <w:color w:val="000000"/>
+                <w:sz w:val="18"/>
+                <w:szCs w:val="18"/>
+              </w:rPr>
+              <w:t xml:space="preserve"> with correct </w:t>
+            </w:r>
+            <w:proofErr w:type="spellStart"/>
+            <w:r>
+              <w:rPr>
+                <w:rFonts w:ascii="Arial" w:eastAsia="Arial" w:hAnsi="Arial" w:cs="Arial"/>
+                <w:color w:val="000000"/>
+                <w:sz w:val="18"/>
+                <w:szCs w:val="18"/>
+              </w:rPr>
+              <w:t>pull_request</w:t>
+            </w:r>
+            <w:proofErr w:type="spellEnd"/>
+            <w:r>
+              <w:rPr>
+                <w:rFonts w:ascii="Arial" w:eastAsia="Arial" w:hAnsi="Arial" w:cs="Arial"/>
+                <w:color w:val="000000"/>
+                <w:sz w:val="18"/>
+                <w:szCs w:val="18"/>
+              </w:rPr>
+              <w:t xml:space="preserve"> trigger targeting </w:t>
+            </w:r>
+            <w:r>
+              <w:rPr>
+                <w:rFonts w:ascii="Arial" w:eastAsia="Arial" w:hAnsi="Arial" w:cs="Arial"/>
+                <w:color w:val="000000"/>
+                <w:sz w:val="18"/>
+                <w:szCs w:val="18"/>
+              </w:rPr>
+              <w:t>“</w:t>
+            </w:r>
+            <w:proofErr w:type="gramStart"/>
+            <w:r>
+              <w:rPr>
+                <w:rFonts w:ascii="Arial" w:eastAsia="Arial" w:hAnsi="Arial" w:cs="Arial"/>
+                <w:color w:val="000000"/>
+                <w:sz w:val="18"/>
+                <w:szCs w:val="18"/>
+              </w:rPr>
+              <w:t>develop</w:t>
+            </w:r>
+            <w:proofErr w:type="gramEnd"/>
+            <w:r>
+              <w:rPr>
+                <w:rFonts w:ascii="Arial" w:eastAsia="Arial" w:hAnsi="Arial" w:cs="Arial"/>
+                <w:color w:val="000000"/>
+                <w:sz w:val="18"/>
+                <w:szCs w:val="18"/>
+              </w:rPr>
+              <w:t>”</w:t>
+            </w:r>
+          </w:p>
+        </w:tc>
+        <w:tc>
+          <w:tcPr>
+            <w:tcW w:w="2150" w:type="dxa"/>
+            <w:tcBorders>
+              <w:top w:val="single" w:sz="6" w:space="0" w:color="ADB9CA"/>
+              <w:left w:val="single" w:sz="6" w:space="0" w:color="ADB9CA"/>
+              <w:bottom w:val="single" w:sz="6" w:space="0" w:color="ADB9CA"/>
+              <w:right w:val="single" w:sz="6" w:space="0" w:color="ADB9CA"/>
+            </w:tcBorders>
+            <w:shd w:val="clear" w:color="auto" w:fill="E8F0FB"/>
+            <w:tcMar>
+              <w:top w:w="80" w:type="dxa"/>
+              <w:left w:w="140" w:type="dxa"/>
+              <w:bottom w:w="80" w:type="dxa"/>
+              <w:right w:w="140" w:type="dxa"/>
+            </w:tcMar>
+            <w:vAlign w:val="center"/>
+          </w:tcPr>
+          <w:p>
+            <w:r>
+              <w:rPr>
+                <w:rFonts w:ascii="Arial" w:eastAsia="Arial" w:hAnsi="Arial" w:cs="Arial"/>
+                <w:color w:val="000000"/>
+                <w:sz w:val="18"/>
+                <w:szCs w:val="18"/>
+              </w:rPr>
+              <w:t>07</w:t>
+            </w:r>
+          </w:p>
+        </w:tc>
+      </w:tr>
+      <w:tr>
+        <w:tc>
+          <w:tcPr>
+            <w:tcW w:w="700" w:type="dxa"/>
+            <w:tcBorders>
+              <w:top w:val="single" w:sz="6" w:space="0" w:color="ADB9CA"/>
+              <w:left w:val="single" w:sz="6" w:space="0" w:color="ADB9CA"/>
+              <w:bottom w:val="single" w:sz="6" w:space="0" w:color="ADB9CA"/>
+              <w:right w:val="single" w:sz="6" w:space="0" w:color="ADB9CA"/>
+            </w:tcBorders>
+            <w:shd w:val="clear" w:color="auto" w:fill="FFFFFF"/>
+            <w:tcMar>
+              <w:top w:w="80" w:type="dxa"/>
+              <w:left w:w="140" w:type="dxa"/>
+              <w:bottom w:w="80" w:type="dxa"/>
+              <w:right w:w="140" w:type="dxa"/>
+            </w:tcMar>
+            <w:vAlign w:val="center"/>
+          </w:tcPr>
+          <w:p>
+            <w:r>
+              <w:rPr>
+                <w:rFonts w:ascii="Arial" w:eastAsia="Arial" w:hAnsi="Arial" w:cs="Arial"/>
+                <w:b/>
+                <w:bCs/>
+                <w:color w:val="000000"/>
+                <w:sz w:val="18"/>
+                <w:szCs w:val="18"/>
+              </w:rPr>
+              <w:t>10</w:t>
+            </w:r>
+          </w:p>
+        </w:tc>
+        <w:tc>
+          <w:tcPr>
+            <w:tcW w:w="6510" w:type="dxa"/>
+            <w:tcBorders>
+              <w:top w:val="single" w:sz="6" w:space="0" w:color="ADB9CA"/>
+              <w:left w:val="single" w:sz="6" w:space="0" w:color="ADB9CA"/>
+              <w:bottom w:val="single" w:sz="6" w:space="0" w:color="ADB9CA"/>
+              <w:right w:val="single" w:sz="6" w:space="0" w:color="ADB9CA"/>
+            </w:tcBorders>
+            <w:shd w:val="clear" w:color="auto" w:fill="FFFFFF"/>
+            <w:tcMar>
+              <w:top w:w="80" w:type="dxa"/>
+              <w:left w:w="140" w:type="dxa"/>
+              <w:bottom w:w="80" w:type="dxa"/>
+              <w:right w:w="140" w:type="dxa"/>
+            </w:tcMar>
+            <w:vAlign w:val="center"/>
+          </w:tcPr>
+          <w:p>
+            <w:r>
+              <w:rPr>
+                <w:rFonts w:ascii="Arial" w:eastAsia="Arial" w:hAnsi="Arial" w:cs="Arial"/>
+                <w:color w:val="000000"/>
+                <w:sz w:val="18"/>
+                <w:szCs w:val="18"/>
+              </w:rPr>
+              <w:t>Checkout code, login to Docker Hub using Team Lead's repository secrets</w:t>
+            </w:r>
+          </w:p>
+        </w:tc>
+        <w:tc>
+          <w:tcPr>
+            <w:tcW w:w="2150" w:type="dxa"/>
+            <w:tcBorders>
+              <w:top w:val="single" w:sz="6" w:space="0" w:color="ADB9CA"/>
+              <w:left w:val="single" w:sz="6" w:space="0" w:color="ADB9CA"/>
+              <w:bottom w:val="single" w:sz="6" w:space="0" w:color="ADB9CA"/>
+              <w:right w:val="single" w:sz="6" w:space="0" w:color="ADB9CA"/>
+            </w:tcBorders>
+            <w:shd w:val="clear" w:color="auto" w:fill="FFFFFF"/>
+            <w:tcMar>
+              <w:top w:w="80" w:type="dxa"/>
+              <w:left w:w="140" w:type="dxa"/>
+              <w:bottom w:w="80" w:type="dxa"/>
+              <w:right w:w="140" w:type="dxa"/>
+            </w:tcMar>
+            <w:vAlign w:val="center"/>
+          </w:tcPr>
+          <w:p>
+            <w:r>
+              <w:rPr>
+                <w:rFonts w:ascii="Arial" w:eastAsia="Arial" w:hAnsi="Arial" w:cs="Arial"/>
+                <w:color w:val="000000"/>
+                <w:sz w:val="18"/>
+                <w:szCs w:val="18"/>
+              </w:rPr>
+              <w:t>06</w:t>
+            </w:r>
+          </w:p>
+        </w:tc>
+      </w:tr>
+      <w:tr>
+        <w:tc>
+          <w:tcPr>
+            <w:tcW w:w="700" w:type="dxa"/>
+            <w:tcBorders>
+              <w:top w:val="single" w:sz="6" w:space="0" w:color="ADB9CA"/>
+              <w:left w:val="single" w:sz="6" w:space="0" w:color="ADB9CA"/>
+              <w:bottom w:val="single" w:sz="6" w:space="0" w:color="ADB9CA"/>
+              <w:right w:val="single" w:sz="6" w:space="0" w:color="ADB9CA"/>
+            </w:tcBorders>
+            <w:shd w:val="clear" w:color="auto" w:fill="E8F0FB"/>
+            <w:tcMar>
+              <w:top w:w="80" w:type="dxa"/>
+              <w:left w:w="140" w:type="dxa"/>
+              <w:bottom w:w="80" w:type="dxa"/>
+              <w:right w:w="140" w:type="dxa"/>
+            </w:tcMar>
+            <w:vAlign w:val="center"/>
+          </w:tcPr>
+          <w:p>
+            <w:r>
+              <w:rPr>
+                <w:rFonts w:ascii="Arial" w:eastAsia="Arial" w:hAnsi="Arial" w:cs="Arial"/>
+                <w:b/>
+                <w:bCs/>
+                <w:color w:val="000000"/>
+                <w:sz w:val="18"/>
+                <w:szCs w:val="18"/>
+              </w:rPr>
+              <w:t>11</w:t>
+            </w:r>
+          </w:p>
+        </w:tc>
+        <w:tc>
+          <w:tcPr>
+            <w:tcW w:w="6510" w:type="dxa"/>
+            <w:tcBorders>
+              <w:top w:val="single" w:sz="6" w:space="0" w:color="ADB9CA"/>
+              <w:left w:val="single" w:sz="6" w:space="0" w:color="ADB9CA"/>
+              <w:bottom w:val="single" w:sz="6" w:space="0" w:color="ADB9CA"/>
+              <w:right w:val="single" w:sz="6" w:space="0" w:color="ADB9CA"/>
+            </w:tcBorders>
+            <w:shd w:val="clear" w:color="auto" w:fill="E8F0FB"/>
+            <w:tcMar>
+              <w:top w:w="80" w:type="dxa"/>
+              <w:left w:w="140" w:type="dxa"/>
+              <w:bottom w:w="80" w:type="dxa"/>
+              <w:right w:w="140" w:type="dxa"/>
+            </w:tcMar>
+            <w:vAlign w:val="center"/>
+          </w:tcPr>
+          <w:p>
+            <w:r>
+              <w:rPr>
+                <w:rFonts w:ascii="Arial" w:eastAsia="Arial" w:hAnsi="Arial" w:cs="Arial"/>
+                <w:color w:val="000000"/>
+                <w:sz w:val="18"/>
+                <w:szCs w:val="18"/>
+              </w:rPr>
+              <w:t>Build Docker image and tag correctly (latest and/or commit SHA)</w:t>
+            </w:r>
+          </w:p>
+        </w:tc>
+        <w:tc>
+          <w:tcPr>
+            <w:tcW w:w="2150" w:type="dxa"/>
+            <w:tcBorders>
+              <w:top w:val="single" w:sz="6" w:space="0" w:color="ADB9CA"/>
+              <w:left w:val="single" w:sz="6" w:space="0" w:color="ADB9CA"/>
+              <w:bottom w:val="single" w:sz="6" w:space="0" w:color="ADB9CA"/>
+              <w:right w:val="single" w:sz="6" w:space="0" w:color="ADB9CA"/>
+            </w:tcBorders>
+            <w:shd w:val="clear" w:color="auto" w:fill="E8F0FB"/>
+            <w:tcMar>
+              <w:top w:w="80" w:type="dxa"/>
+              <w:left w:w="140" w:type="dxa"/>
+              <w:bottom w:w="80" w:type="dxa"/>
+              <w:right w:w="140" w:type="dxa"/>
+            </w:tcMar>
+            <w:vAlign w:val="center"/>
+          </w:tcPr>
+          <w:p>
+            <w:r>
+              <w:rPr>
+                <w:rFonts w:ascii="Arial" w:eastAsia="Arial" w:hAnsi="Arial" w:cs="Arial"/>
+                <w:color w:val="000000"/>
+                <w:sz w:val="18"/>
+                <w:szCs w:val="18"/>
+              </w:rPr>
+              <w:t>06</w:t>
+            </w:r>
+          </w:p>
+        </w:tc>
+      </w:tr>
+      <w:tr>
+        <w:tc>
+          <w:tcPr>
+            <w:tcW w:w="700" w:type="dxa"/>
+            <w:tcBorders>
+              <w:top w:val="single" w:sz="6" w:space="0" w:color="ADB9CA"/>
+              <w:left w:val="single" w:sz="6" w:space="0" w:color="ADB9CA"/>
+              <w:bottom w:val="single" w:sz="6" w:space="0" w:color="ADB9CA"/>
+              <w:right w:val="single" w:sz="6" w:space="0" w:color="ADB9CA"/>
+            </w:tcBorders>
+            <w:shd w:val="clear" w:color="auto" w:fill="FFFFFF"/>
+            <w:tcMar>
+              <w:top w:w="80" w:type="dxa"/>
+              <w:left w:w="140" w:type="dxa"/>
+              <w:bottom w:w="80" w:type="dxa"/>
+              <w:right w:w="140" w:type="dxa"/>
+            </w:tcMar>
+            <w:vAlign w:val="center"/>
+          </w:tcPr>
+          <w:p>
+            <w:r>
+              <w:rPr>
+                <w:rFonts w:ascii="Arial" w:eastAsia="Arial" w:hAnsi="Arial" w:cs="Arial"/>
+                <w:b/>
+                <w:bCs/>
+                <w:color w:val="000000"/>
+                <w:sz w:val="18"/>
+                <w:szCs w:val="18"/>
+              </w:rPr>
+              <w:t>12</w:t>
+            </w:r>
+          </w:p>
+        </w:tc>
+        <w:tc>
+          <w:tcPr>
+            <w:tcW w:w="6510" w:type="dxa"/>
+            <w:tcBorders>
+              <w:top w:val="single" w:sz="6" w:space="0" w:color="ADB9CA"/>
+              <w:left w:val="single" w:sz="6" w:space="0" w:color="ADB9CA"/>
+              <w:bottom w:val="single" w:sz="6" w:space="0" w:color="ADB9CA"/>
+              <w:right w:val="single" w:sz="6" w:space="0" w:color="ADB9CA"/>
+            </w:tcBorders>
+            <w:shd w:val="clear" w:color="auto" w:fill="FFFFFF"/>
+            <w:tcMar>
+              <w:top w:w="80" w:type="dxa"/>
+              <w:left w:w="140" w:type="dxa"/>
+              <w:bottom w:w="80" w:type="dxa"/>
+              <w:right w:w="140" w:type="dxa"/>
+            </w:tcMar>
+            <w:vAlign w:val="center"/>
+          </w:tcPr>
+          <w:p>
+            <w:r>
+              <w:rPr>
+                <w:rFonts w:ascii="Arial" w:eastAsia="Arial" w:hAnsi="Arial" w:cs="Arial"/>
+                <w:color w:val="000000"/>
+                <w:sz w:val="18"/>
+                <w:szCs w:val="18"/>
+              </w:rPr>
+              <w:t>Push image to Docker Hub successfully; workflow exits on any step failure</w:t>
+            </w:r>
+          </w:p>
+        </w:tc>
+        <w:tc>
+          <w:tcPr>
+            <w:tcW w:w="2150" w:type="dxa"/>
+            <w:tcBorders>
+              <w:top w:val="single" w:sz="6" w:space="0" w:color="ADB9CA"/>
+              <w:left w:val="single" w:sz="6" w:space="0" w:color="ADB9CA"/>
+              <w:bottom w:val="single" w:sz="6" w:space="0" w:color="ADB9CA"/>
+              <w:right w:val="single" w:sz="6" w:space="0" w:color="ADB9CA"/>
+            </w:tcBorders>
+            <w:shd w:val="clear" w:color="auto" w:fill="FFFFFF"/>
+            <w:tcMar>
+              <w:top w:w="80" w:type="dxa"/>
+              <w:left w:w="140" w:type="dxa"/>
+              <w:bottom w:w="80" w:type="dxa"/>
+              <w:right w:w="140" w:type="dxa"/>
+            </w:tcMar>
+            <w:vAlign w:val="center"/>
+          </w:tcPr>
+          <w:p>
+            <w:r>
+              <w:rPr>
+                <w:rFonts w:ascii="Arial" w:eastAsia="Arial" w:hAnsi="Arial" w:cs="Arial"/>
+                <w:color w:val="000000"/>
+                <w:sz w:val="18"/>
+                <w:szCs w:val="18"/>
+              </w:rPr>
+              <w:t>06</w:t>
+            </w:r>
+          </w:p>
+        </w:tc>
+      </w:tr>
+      <w:tr>
+        <w:tc>
+          <w:tcPr>
+            <w:tcW w:w="700" w:type="dxa"/>
+            <w:tcBorders>
+              <w:top w:val="single" w:sz="6" w:space="0" w:color="ADB9CA"/>
+              <w:left w:val="single" w:sz="6" w:space="0" w:color="ADB9CA"/>
+              <w:bottom w:val="single" w:sz="6" w:space="0" w:color="ADB9CA"/>
+              <w:right w:val="single" w:sz="6" w:space="0" w:color="ADB9CA"/>
+            </w:tcBorders>
+            <w:shd w:val="clear" w:color="auto" w:fill="2E75B6"/>
+            <w:tcMar>
+              <w:top w:w="80" w:type="dxa"/>
+              <w:left w:w="140" w:type="dxa"/>
+              <w:bottom w:w="80" w:type="dxa"/>
+              <w:right w:w="140" w:type="dxa"/>
+            </w:tcMar>
+            <w:vAlign w:val="center"/>
+          </w:tcPr>
+          <w:p/>
+        </w:tc>
+        <w:tc>
+          <w:tcPr>
+            <w:tcW w:w="6510" w:type="dxa"/>
+            <w:tcBorders>
+              <w:top w:val="single" w:sz="6" w:space="0" w:color="ADB9CA"/>
+              <w:left w:val="single" w:sz="6" w:space="0" w:color="ADB9CA"/>
+              <w:bottom w:val="single" w:sz="6" w:space="0" w:color="ADB9CA"/>
+              <w:right w:val="single" w:sz="6" w:space="0" w:color="ADB9CA"/>
+            </w:tcBorders>
+            <w:shd w:val="clear" w:color="auto" w:fill="2E75B6"/>
+            <w:tcMar>
+              <w:top w:w="80" w:type="dxa"/>
+              <w:left w:w="140" w:type="dxa"/>
+              <w:bottom w:w="80" w:type="dxa"/>
+              <w:right w:w="140" w:type="dxa"/>
+            </w:tcMar>
+            <w:vAlign w:val="center"/>
+          </w:tcPr>
+          <w:p>
+            <w:r>
+              <w:rPr>
+                <w:rFonts w:ascii="Arial" w:eastAsia="Arial" w:hAnsi="Arial" w:cs="Arial"/>
+                <w:b/>
+                <w:bCs/>
+                <w:color w:val="FFFFFF"/>
+                <w:sz w:val="18"/>
+                <w:szCs w:val="18"/>
+              </w:rPr>
+              <w:t>CD Pipeline – Automated Deployment to Render (</w:t>
+            </w:r>
+            <w:proofErr w:type="spellStart"/>
+            <w:r>
+              <w:rPr>
+                <w:rFonts w:ascii="Arial" w:eastAsia="Arial" w:hAnsi="Arial" w:cs="Arial"/>
+                <w:b/>
+                <w:bCs/>
+                <w:color w:val="FFFFFF"/>
+                <w:sz w:val="18"/>
+                <w:szCs w:val="18"/>
+              </w:rPr>
+              <w:t>cd.yml</w:t>
+            </w:r>
+            <w:proofErr w:type="spellEnd"/>
+            <w:r>
+              <w:rPr>
+                <w:rFonts w:ascii="Arial" w:eastAsia="Arial" w:hAnsi="Arial" w:cs="Arial"/>
+                <w:b/>
+                <w:bCs/>
+                <w:color w:val="FFFFFF"/>
+                <w:sz w:val="18"/>
+                <w:szCs w:val="18"/>
+              </w:rPr>
+              <w:t>)</w:t>
+            </w:r>
+          </w:p>
+        </w:tc>
+        <w:tc>
+          <w:tcPr>
+            <w:tcW w:w="2150" w:type="dxa"/>
+            <w:tcBorders>
+              <w:top w:val="single" w:sz="6" w:space="0" w:color="ADB9CA"/>
+              <w:left w:val="single" w:sz="6" w:space="0" w:color="ADB9CA"/>
+              <w:bottom w:val="single" w:sz="6" w:space="0" w:color="ADB9CA"/>
+              <w:right w:val="single" w:sz="6" w:space="0" w:color="ADB9CA"/>
+            </w:tcBorders>
+            <w:shd w:val="clear" w:color="auto" w:fill="2E75B6"/>
+            <w:tcMar>
+              <w:top w:w="80" w:type="dxa"/>
+              <w:left w:w="140" w:type="dxa"/>
+              <w:bottom w:w="80" w:type="dxa"/>
+              <w:right w:w="140" w:type="dxa"/>
+            </w:tcMar>
+            <w:vAlign w:val="center"/>
+          </w:tcPr>
+          <w:p>
+            <w:r>
+              <w:rPr>
+                <w:rFonts w:ascii="Arial" w:eastAsia="Arial" w:hAnsi="Arial" w:cs="Arial"/>
+                <w:b/>
+                <w:bCs/>
+                <w:color w:val="FFFFFF"/>
+                <w:sz w:val="18"/>
+                <w:szCs w:val="18"/>
+              </w:rPr>
+              <w:t>20 Marks</w:t>
+            </w:r>
+          </w:p>
+        </w:tc>
+      </w:tr>
+      <w:tr>
+        <w:tc>
+          <w:tcPr>
+            <w:tcW w:w="700" w:type="dxa"/>
+            <w:tcBorders>
+              <w:top w:val="single" w:sz="6" w:space="0" w:color="ADB9CA"/>
+              <w:left w:val="single" w:sz="6" w:space="0" w:color="ADB9CA"/>
+              <w:bottom w:val="single" w:sz="6" w:space="0" w:color="ADB9CA"/>
+              <w:right w:val="single" w:sz="6" w:space="0" w:color="ADB9CA"/>
+            </w:tcBorders>
+            <w:shd w:val="clear" w:color="auto" w:fill="E8F0FB"/>
+            <w:tcMar>
+              <w:top w:w="80" w:type="dxa"/>
+              <w:left w:w="140" w:type="dxa"/>
+              <w:bottom w:w="80" w:type="dxa"/>
+              <w:right w:w="140" w:type="dxa"/>
+            </w:tcMar>
+            <w:vAlign w:val="center"/>
+          </w:tcPr>
+          <w:p>
+            <w:r>
+              <w:rPr>
+                <w:rFonts w:ascii="Arial" w:eastAsia="Arial" w:hAnsi="Arial" w:cs="Arial"/>
+                <w:b/>
+                <w:bCs/>
+                <w:color w:val="000000"/>
+                <w:sz w:val="18"/>
+                <w:szCs w:val="18"/>
+              </w:rPr>
               <w:t>13</w:t>
             </w:r>
           </w:p>
@@ -7698,7 +8707,47 @@
                 <w:sz w:val="18"/>
                 <w:szCs w:val="18"/>
               </w:rPr>
-              <w:t xml:space="preserve">CD workflow file created at .github/workflows/cd.yml with correct push trigger on </w:t>
+              <w:t>CD workflow file created at .</w:t>
+            </w:r>
+            <w:proofErr w:type="spellStart"/>
+            <w:r>
+              <w:rPr>
+                <w:rFonts w:ascii="Arial" w:eastAsia="Arial" w:hAnsi="Arial" w:cs="Arial"/>
+                <w:color w:val="000000"/>
+                <w:sz w:val="18"/>
+                <w:szCs w:val="18"/>
+              </w:rPr>
+              <w:t>github</w:t>
+            </w:r>
+            <w:proofErr w:type="spellEnd"/>
+            <w:r>
+              <w:rPr>
+                <w:rFonts w:ascii="Arial" w:eastAsia="Arial" w:hAnsi="Arial" w:cs="Arial"/>
+                <w:color w:val="000000"/>
+                <w:sz w:val="18"/>
+                <w:szCs w:val="18"/>
+              </w:rPr>
+              <w:t>/workflows/</w:t>
+            </w:r>
+            <w:proofErr w:type="spellStart"/>
+            <w:r>
+              <w:rPr>
+                <w:rFonts w:ascii="Arial" w:eastAsia="Arial" w:hAnsi="Arial" w:cs="Arial"/>
+                <w:color w:val="000000"/>
+                <w:sz w:val="18"/>
+                <w:szCs w:val="18"/>
+              </w:rPr>
+              <w:t>cd.yml</w:t>
+            </w:r>
+            <w:proofErr w:type="spellEnd"/>
+            <w:r>
+              <w:rPr>
+                <w:rFonts w:ascii="Arial" w:eastAsia="Arial" w:hAnsi="Arial" w:cs="Arial"/>
+                <w:color w:val="000000"/>
+                <w:sz w:val="18"/>
+                <w:szCs w:val="18"/>
+              </w:rPr>
+              <w:t xml:space="preserve"> with correct push trigger on </w:t>
             </w:r>
             <w:r>
               <w:rPr>
@@ -8421,7 +9470,15 @@
           <w:rFonts w:ascii="Arial" w:eastAsia="Arial" w:hAnsi="Arial" w:cs="Arial"/>
           <w:color w:val="000000"/>
         </w:rPr>
-        <w:t xml:space="preserve">Screenshot 2: Each member's CI workflow run triggered by their individual PR </w:t>
+        <w:t xml:space="preserve">Screenshot 2: Each member's CI workflow run triggered by their individual </w:t>
+      </w:r>
+      <w:proofErr w:type="gramStart"/>
+      <w:r>
+        <w:rPr>
+          <w:rFonts w:ascii="Arial" w:eastAsia="Arial" w:hAnsi="Arial" w:cs="Arial"/>
+          <w:color w:val="000000"/>
+        </w:rPr>
+        <w:t xml:space="preserve">PR </w:t>
       </w:r>
       <w:r>
         <w:rPr>
@@ -8430,6 +9487,7 @@
         </w:rPr>
         <w:t>,</w:t>
       </w:r>
+      <w:proofErr w:type="gramEnd"/>
       <w:r>
         <w:rPr>
           <w:rFonts w:ascii="Arial" w:eastAsia="Arial" w:hAnsi="Arial" w:cs="Arial"/>
@@ -8476,7 +9534,15 @@
           <w:rFonts w:ascii="Arial" w:eastAsia="Arial" w:hAnsi="Arial" w:cs="Arial"/>
           <w:color w:val="000000"/>
         </w:rPr>
-        <w:t>“develop”</w:t>
+        <w:t>“develop</w:t>
+      </w:r>
+      <w:proofErr w:type="gramStart"/>
+      <w:r>
+        <w:rPr>
+          <w:rFonts w:ascii="Arial" w:eastAsia="Arial" w:hAnsi="Arial" w:cs="Arial"/>
+          <w:color w:val="000000"/>
+        </w:rPr>
+        <w:t>”</w:t>
       </w:r>
       <w:r>
         <w:rPr>
@@ -8492,6 +9558,7 @@
         </w:rPr>
         <w:t>,</w:t>
       </w:r>
+      <w:proofErr w:type="gramEnd"/>
       <w:r>
         <w:rPr>
           <w:rFonts w:ascii="Arial" w:eastAsia="Arial" w:hAnsi="Arial" w:cs="Arial"/>
@@ -8514,7 +9581,23 @@
           <w:rFonts w:ascii="Arial" w:eastAsia="Arial" w:hAnsi="Arial" w:cs="Arial"/>
           <w:color w:val="000000"/>
         </w:rPr>
-        <w:t>Screenshot 5: Live TaskFlow application on Render showing all five pages are accessible.</w:t>
+        <w:t xml:space="preserve">Screenshot 5: Live </w:t>
+      </w:r>
+      <w:proofErr w:type="spellStart"/>
+      <w:r>
+        <w:rPr>
+          <w:rFonts w:ascii="Arial" w:eastAsia="Arial" w:hAnsi="Arial" w:cs="Arial"/>
+          <w:color w:val="000000"/>
+        </w:rPr>
+        <w:t>TaskFlow</w:t>
+      </w:r>
+      <w:proofErr w:type="spellEnd"/>
+      <w:r>
+        <w:rPr>
+          <w:rFonts w:ascii="Arial" w:eastAsia="Arial" w:hAnsi="Arial" w:cs="Arial"/>
+          <w:color w:val="000000"/>
+        </w:rPr>
+        <w:t xml:space="preserve"> application on Render showing all five pages are accessible.</w:t>
       </w:r>
     </w:p>
     <w:p>
@@ -8606,8 +9689,8 @@
         <w:tblLook w:val="0000" w:firstRow="0" w:lastRow="0" w:firstColumn="0" w:lastColumn="0" w:noHBand="0" w:noVBand="0"/>
       </w:tblPr>
       <w:tblGrid>
-        <w:gridCol w:w="3200"/>
-        <w:gridCol w:w="6160"/>
+        <w:gridCol w:w="2930"/>
+        <w:gridCol w:w="6430"/>
       </w:tblGrid>
       <w:tr>
         <w:tc>
@@ -8704,6 +9787,7 @@
                 <w:sz w:val="18"/>
                 <w:szCs w:val="18"/>
               </w:rPr>
+              <w:lastRenderedPageBreak/>
               <w:t xml:space="preserve">GitHub </w:t>
             </w:r>
             <w:r>
@@ -8748,7 +9832,65 @@
             </w:tcMar>
             <w:vAlign w:val="center"/>
           </w:tcPr>
-          <w:p/>
+          <w:p>
+            <w:r>
+              <w:drawing>
+                <wp:anchor distT="0" distB="0" distL="114300" distR="114300" simplePos="0" relativeHeight="251658240" behindDoc="0" locked="0" layoutInCell="1" allowOverlap="1" wp14:anchorId="1F331120" wp14:editId="5B3042DA">
+                  <wp:simplePos x="0" y="0"/>
+                  <wp:positionH relativeFrom="column">
+                    <wp:posOffset>-55245</wp:posOffset>
+                  </wp:positionH>
+                  <wp:positionV relativeFrom="paragraph">
+                    <wp:posOffset>-3374390</wp:posOffset>
+                  </wp:positionV>
+                  <wp:extent cx="3905250" cy="3373120"/>
+                  <wp:effectExtent l="0" t="0" r="0" b="0"/>
+                  <wp:wrapSquare wrapText="bothSides"/>
+                  <wp:docPr id="1" name="Picture 1"/>
+                  <wp:cNvGraphicFramePr>
+                    <a:graphicFrameLocks xmlns:a="http://schemas.openxmlformats.org/drawingml/2006/main" noChangeAspect="1"/>
+                  </wp:cNvGraphicFramePr>
+                  <a:graphic xmlns:a="http://schemas.openxmlformats.org/drawingml/2006/main">
+                    <a:graphicData uri="http://schemas.openxmlformats.org/drawingml/2006/picture">
+                      <pic:pic xmlns:pic="http://schemas.openxmlformats.org/drawingml/2006/picture">
+                        <pic:nvPicPr>
+                          <pic:cNvPr id="1" name=""/>
+                          <pic:cNvPicPr/>
+                        </pic:nvPicPr>
+                        <pic:blipFill>
+                          <a:blip r:embed="rId7" cstate="print">
+                            <a:extLst>
+                              <a:ext uri="{28A0092B-C50C-407E-A947-70E740481C1C}">
+                                <a14:useLocalDpi xmlns:a14="http://schemas.microsoft.com/office/drawing/2010/main" val="0"/>
+                              </a:ext>
+                            </a:extLst>
+                          </a:blip>
+                          <a:stretch>
+                            <a:fillRect/>
+                          </a:stretch>
+                        </pic:blipFill>
+                        <pic:spPr>
+                          <a:xfrm>
+                            <a:off x="0" y="0"/>
+                            <a:ext cx="3905250" cy="3373120"/>
+                          </a:xfrm>
+                          <a:prstGeom prst="rect">
+                            <a:avLst/>
+                          </a:prstGeom>
+                        </pic:spPr>
+                      </pic:pic>
+                    </a:graphicData>
+                  </a:graphic>
+                  <wp14:sizeRelH relativeFrom="margin">
+                    <wp14:pctWidth>0</wp14:pctWidth>
+                  </wp14:sizeRelH>
+                  <wp14:sizeRelV relativeFrom="margin">
+                    <wp14:pctHeight>0</wp14:pctHeight>
+                  </wp14:sizeRelV>
+                </wp:anchor>
+              </w:drawing>
+            </w:r>
+          </w:p>
         </w:tc>
       </w:tr>
       <w:tr>
@@ -8953,7 +10095,31 @@
                 <w:sz w:val="18"/>
                 <w:szCs w:val="18"/>
               </w:rPr>
-              <w:t>Live TaskFlow on Render – All 5 Pages Accessible</w:t>
+              <w:t xml:space="preserve">Live </w:t>
+            </w:r>
+            <w:proofErr w:type="spellStart"/>
+            <w:r>
+              <w:rPr>
+                <w:rFonts w:ascii="Arial" w:eastAsia="Arial" w:hAnsi="Arial" w:cs="Arial"/>
+                <w:b/>
+                <w:bCs/>
+                <w:color w:val="000000"/>
+                <w:sz w:val="18"/>
+                <w:szCs w:val="18"/>
+              </w:rPr>
+              <w:t>TaskFlow</w:t>
+            </w:r>
+            <w:proofErr w:type="spellEnd"/>
+            <w:r>
+              <w:rPr>
+                <w:rFonts w:ascii="Arial" w:eastAsia="Arial" w:hAnsi="Arial" w:cs="Arial"/>
+                <w:b/>
+                <w:bCs/>
+                <w:color w:val="000000"/>
+                <w:sz w:val="18"/>
+                <w:szCs w:val="18"/>
+              </w:rPr>
+              <w:t xml:space="preserve"> on Render – All 5 Pages Accessible</w:t>
             </w:r>
           </w:p>
         </w:tc>
@@ -9054,7 +10220,6 @@
           <w:sz w:val="28"/>
           <w:szCs w:val="28"/>
         </w:rPr>
-        <w:lastRenderedPageBreak/>
         <w:t>TEAM REFLECTION</w:t>
       </w:r>
     </w:p>
@@ -9088,7 +10253,27 @@
           <w:bCs/>
           <w:color w:val="000000"/>
         </w:rPr>
-        <w:t>Member 1  (Name: _______________________________________________)</w:t>
+        <w:t xml:space="preserve">Member </w:t>
+      </w:r>
+      <w:proofErr w:type="gramStart"/>
+      <w:r>
+        <w:rPr>
+          <w:rFonts w:ascii="Arial" w:eastAsia="Arial" w:hAnsi="Arial" w:cs="Arial"/>
+          <w:b/>
+          <w:bCs/>
+          <w:color w:val="000000"/>
+        </w:rPr>
+        <w:t>1  (</w:t>
+      </w:r>
+      <w:proofErr w:type="gramEnd"/>
+      <w:r>
+        <w:rPr>
+          <w:rFonts w:ascii="Arial" w:eastAsia="Arial" w:hAnsi="Arial" w:cs="Arial"/>
+          <w:b/>
+          <w:bCs/>
+          <w:color w:val="000000"/>
+        </w:rPr>
+        <w:t>Name: _______________________________________________)</w:t>
       </w:r>
     </w:p>
     <w:tbl>
@@ -9195,7 +10380,27 @@
           <w:bCs/>
           <w:color w:val="000000"/>
         </w:rPr>
-        <w:t>Member 2  (Name: _______________________________________________)</w:t>
+        <w:t xml:space="preserve">Member </w:t>
+      </w:r>
+      <w:proofErr w:type="gramStart"/>
+      <w:r>
+        <w:rPr>
+          <w:rFonts w:ascii="Arial" w:eastAsia="Arial" w:hAnsi="Arial" w:cs="Arial"/>
+          <w:b/>
+          <w:bCs/>
+          <w:color w:val="000000"/>
+        </w:rPr>
+        <w:t>2  (</w:t>
+      </w:r>
+      <w:proofErr w:type="gramEnd"/>
+      <w:r>
+        <w:rPr>
+          <w:rFonts w:ascii="Arial" w:eastAsia="Arial" w:hAnsi="Arial" w:cs="Arial"/>
+          <w:b/>
+          <w:bCs/>
+          <w:color w:val="000000"/>
+        </w:rPr>
+        <w:t>Name: _______________________________________________)</w:t>
       </w:r>
     </w:p>
     <w:tbl>
@@ -9302,7 +10507,27 @@
           <w:bCs/>
           <w:color w:val="000000"/>
         </w:rPr>
-        <w:t>Member 3  (Name: _______________________________________________)</w:t>
+        <w:t xml:space="preserve">Member </w:t>
+      </w:r>
+      <w:proofErr w:type="gramStart"/>
+      <w:r>
+        <w:rPr>
+          <w:rFonts w:ascii="Arial" w:eastAsia="Arial" w:hAnsi="Arial" w:cs="Arial"/>
+          <w:b/>
+          <w:bCs/>
+          <w:color w:val="000000"/>
+        </w:rPr>
+        <w:t>3  (</w:t>
+      </w:r>
+      <w:proofErr w:type="gramEnd"/>
+      <w:r>
+        <w:rPr>
+          <w:rFonts w:ascii="Arial" w:eastAsia="Arial" w:hAnsi="Arial" w:cs="Arial"/>
+          <w:b/>
+          <w:bCs/>
+          <w:color w:val="000000"/>
+        </w:rPr>
+        <w:t>Name: _______________________________________________)</w:t>
       </w:r>
     </w:p>
     <w:tbl>
@@ -9409,7 +10634,27 @@
           <w:bCs/>
           <w:color w:val="000000"/>
         </w:rPr>
-        <w:t>Member 4  (Name: _______________________________________________)</w:t>
+        <w:t xml:space="preserve">Member </w:t>
+      </w:r>
+      <w:proofErr w:type="gramStart"/>
+      <w:r>
+        <w:rPr>
+          <w:rFonts w:ascii="Arial" w:eastAsia="Arial" w:hAnsi="Arial" w:cs="Arial"/>
+          <w:b/>
+          <w:bCs/>
+          <w:color w:val="000000"/>
+        </w:rPr>
+        <w:t>4  (</w:t>
+      </w:r>
+      <w:proofErr w:type="gramEnd"/>
+      <w:r>
+        <w:rPr>
+          <w:rFonts w:ascii="Arial" w:eastAsia="Arial" w:hAnsi="Arial" w:cs="Arial"/>
+          <w:b/>
+          <w:bCs/>
+          <w:color w:val="000000"/>
+        </w:rPr>
+        <w:t>Name: _______________________________________________)</w:t>
       </w:r>
     </w:p>
     <w:tbl>
@@ -9516,7 +10761,27 @@
           <w:bCs/>
           <w:color w:val="000000"/>
         </w:rPr>
-        <w:t>Member 5  (Name: _______________________________________________)</w:t>
+        <w:t xml:space="preserve">Member </w:t>
+      </w:r>
+      <w:proofErr w:type="gramStart"/>
+      <w:r>
+        <w:rPr>
+          <w:rFonts w:ascii="Arial" w:eastAsia="Arial" w:hAnsi="Arial" w:cs="Arial"/>
+          <w:b/>
+          <w:bCs/>
+          <w:color w:val="000000"/>
+        </w:rPr>
+        <w:t>5  (</w:t>
+      </w:r>
+      <w:proofErr w:type="gramEnd"/>
+      <w:r>
+        <w:rPr>
+          <w:rFonts w:ascii="Arial" w:eastAsia="Arial" w:hAnsi="Arial" w:cs="Arial"/>
+          <w:b/>
+          <w:bCs/>
+          <w:color w:val="000000"/>
+        </w:rPr>
+        <w:t>Name: _______________________________________________)</w:t>
       </w:r>
     </w:p>
     <w:tbl>
@@ -9612,12 +10877,12 @@
       </w:pPr>
     </w:p>
     <w:sectPr>
-      <w:headerReference w:type="even" r:id="rId7"/>
-      <w:headerReference w:type="default" r:id="rId8"/>
-      <w:footerReference w:type="even" r:id="rId9"/>
-      <w:footerReference w:type="default" r:id="rId10"/>
-      <w:headerReference w:type="first" r:id="rId11"/>
-      <w:footerReference w:type="first" r:id="rId12"/>
+      <w:headerReference w:type="even" r:id="rId8"/>
+      <w:headerReference w:type="default" r:id="rId9"/>
+      <w:footerReference w:type="even" r:id="rId10"/>
+      <w:footerReference w:type="default" r:id="rId11"/>
+      <w:headerReference w:type="first" r:id="rId12"/>
+      <w:footerReference w:type="first" r:id="rId13"/>
       <w:pgSz w:w="12240" w:h="15840"/>
       <w:pgMar w:top="1080" w:right="1080" w:bottom="1080" w:left="1080" w:header="708" w:footer="708" w:gutter="0"/>
       <w:cols w:space="720"/>
@@ -9676,7 +10941,17 @@
         <w:sz w:val="16"/>
         <w:szCs w:val="16"/>
       </w:rPr>
-      <w:t xml:space="preserve">Assignment 04 – CI/CD Pipeline Integration  </w:t>
+      <w:t xml:space="preserve">Assignment 04 – CI/CD Pipeline </w:t>
+    </w:r>
+    <w:proofErr w:type="gramStart"/>
+    <w:r>
+      <w:rPr>
+        <w:rFonts w:ascii="Arial" w:eastAsia="Arial" w:hAnsi="Arial" w:cs="Arial"/>
+        <w:color w:val="555555"/>
+        <w:sz w:val="16"/>
+        <w:szCs w:val="16"/>
+      </w:rPr>
+      <w:t xml:space="preserve">Integration  </w:t>
     </w:r>
     <w:r>
       <w:rPr>
@@ -9686,6 +10961,15 @@
         <w:szCs w:val="16"/>
       </w:rPr>
       <w:tab/>
+    </w:r>
+    <w:proofErr w:type="gramEnd"/>
+    <w:r>
+      <w:rPr>
+        <w:rFonts w:ascii="Arial" w:eastAsia="Arial" w:hAnsi="Arial" w:cs="Arial"/>
+        <w:color w:val="555555"/>
+        <w:sz w:val="16"/>
+        <w:szCs w:val="16"/>
+      </w:rPr>
       <w:t xml:space="preserve"> Page </w:t>
     </w:r>
     <w:r>
@@ -9796,7 +11080,19 @@
         <w:sz w:val="18"/>
         <w:szCs w:val="18"/>
       </w:rPr>
-      <w:t>University of Central Punjab – Faculty of Information Technology</w:t>
+      <w:t xml:space="preserve">University of Central Punjab – Faculty of Information </w:t>
+    </w:r>
+    <w:proofErr w:type="gramStart"/>
+    <w:r>
+      <w:rPr>
+        <w:rFonts w:ascii="Arial" w:eastAsia="Arial" w:hAnsi="Arial" w:cs="Arial"/>
+        <w:b/>
+        <w:bCs/>
+        <w:color w:val="1F3864"/>
+        <w:sz w:val="18"/>
+        <w:szCs w:val="18"/>
+      </w:rPr>
+      <w:t>Technology</w:t>
     </w:r>
     <w:r>
       <w:rPr>
@@ -9805,7 +11101,17 @@
         <w:sz w:val="18"/>
         <w:szCs w:val="18"/>
       </w:rPr>
-      <w:t xml:space="preserve">  |  </w:t>
+      <w:t xml:space="preserve">  |</w:t>
+    </w:r>
+    <w:proofErr w:type="gramEnd"/>
+    <w:r>
+      <w:rPr>
+        <w:rFonts w:ascii="Arial" w:eastAsia="Arial" w:hAnsi="Arial" w:cs="Arial"/>
+        <w:color w:val="ADB9CA"/>
+        <w:sz w:val="18"/>
+        <w:szCs w:val="18"/>
+      </w:rPr>
+      <w:t xml:space="preserve">  </w:t>
     </w:r>
     <w:r>
       <w:rPr>

</xml_diff>

<commit_message>
Add task-list page and update group details
</commit_message>
<xml_diff>
--- a/Assignment_04_Spring2026.docx
+++ b/Assignment_04_Spring2026.docx
@@ -348,27 +348,7 @@
           <w:sz w:val="24"/>
           <w:szCs w:val="24"/>
         </w:rPr>
-        <w:t xml:space="preserve"> (can be six members but in that </w:t>
-      </w:r>
-      <w:proofErr w:type="gramStart"/>
-      <w:r>
-        <w:rPr>
-          <w:rFonts w:ascii="Arial" w:eastAsia="Arial" w:hAnsi="Arial" w:cs="Arial"/>
-          <w:color w:val="000000"/>
-          <w:sz w:val="24"/>
-          <w:szCs w:val="24"/>
-        </w:rPr>
-        <w:t>case</w:t>
-      </w:r>
-      <w:proofErr w:type="gramEnd"/>
-      <w:r>
-        <w:rPr>
-          <w:rFonts w:ascii="Arial" w:eastAsia="Arial" w:hAnsi="Arial" w:cs="Arial"/>
-          <w:color w:val="000000"/>
-          <w:sz w:val="24"/>
-          <w:szCs w:val="24"/>
-        </w:rPr>
-        <w:t xml:space="preserve"> TL has to create an additional page for that member and then assign all tasks accordingly)</w:t>
+        <w:t xml:space="preserve"> (can be six members but in that case TL has to create an additional page for that member and then assign all tasks accordingly)</w:t>
       </w:r>
     </w:p>
     <w:p>
@@ -612,9 +592,8 @@
           <w:sz w:val="18"/>
           <w:szCs w:val="18"/>
         </w:rPr>
-        <w:t xml:space="preserve">Table 1: Group </w:t>
-      </w:r>
-      <w:proofErr w:type="gramStart"/>
+        <w:t xml:space="preserve">Table 1: Group Details </w:t>
+      </w:r>
       <w:r>
         <w:rPr>
           <w:rFonts w:ascii="Arial" w:eastAsia="Arial" w:hAnsi="Arial" w:cs="Arial"/>
@@ -624,20 +603,8 @@
           <w:sz w:val="18"/>
           <w:szCs w:val="18"/>
         </w:rPr>
-        <w:t xml:space="preserve">Details </w:t>
-      </w:r>
-      <w:r>
-        <w:rPr>
-          <w:rFonts w:ascii="Arial" w:eastAsia="Arial" w:hAnsi="Arial" w:cs="Arial"/>
-          <w:b/>
-          <w:bCs/>
-          <w:color w:val="444444"/>
-          <w:sz w:val="18"/>
-          <w:szCs w:val="18"/>
-        </w:rPr>
         <w:t>,</w:t>
       </w:r>
-      <w:proofErr w:type="gramEnd"/>
       <w:r>
         <w:rPr>
           <w:rFonts w:ascii="Arial" w:eastAsia="Arial" w:hAnsi="Arial" w:cs="Arial"/>
@@ -1060,13 +1027,7 @@
           </w:tcPr>
           <w:p>
             <w:r>
-              <w:t xml:space="preserve">feature/ </w:t>
-            </w:r>
-            <w:r>
-              <w:t>A-D-H-I-56</w:t>
-            </w:r>
-            <w:r>
-              <w:t>/index-page</w:t>
+              <w:t>feature/ A-D-H-I-56/index-page</w:t>
             </w:r>
           </w:p>
         </w:tc>
@@ -1302,7 +1263,11 @@
             </w:tcMar>
             <w:vAlign w:val="center"/>
           </w:tcPr>
-          <w:p/>
+          <w:p>
+            <w:r>
+              <w:t xml:space="preserve">SANA NADEEM </w:t>
+            </w:r>
+          </w:p>
         </w:tc>
         <w:tc>
           <w:tcPr>
@@ -1322,7 +1287,11 @@
             </w:tcMar>
             <w:vAlign w:val="center"/>
           </w:tcPr>
-          <w:p/>
+          <w:p>
+            <w:r>
+              <w:t>sana05022</w:t>
+            </w:r>
+          </w:p>
         </w:tc>
         <w:tc>
           <w:tcPr>
@@ -1342,7 +1311,11 @@
             </w:tcMar>
             <w:vAlign w:val="center"/>
           </w:tcPr>
-          <w:p/>
+          <w:p>
+            <w:r>
+              <w:t>Team Member</w:t>
+            </w:r>
+          </w:p>
         </w:tc>
         <w:tc>
           <w:tcPr>
@@ -1362,7 +1335,11 @@
             </w:tcMar>
             <w:vAlign w:val="center"/>
           </w:tcPr>
-          <w:p/>
+          <w:p>
+            <w:r>
+              <w:t>task-list.html</w:t>
+            </w:r>
+          </w:p>
         </w:tc>
         <w:tc>
           <w:tcPr>
@@ -1382,7 +1359,11 @@
             </w:tcMar>
             <w:vAlign w:val="center"/>
           </w:tcPr>
-          <w:p/>
+          <w:p>
+            <w:r>
+              <w:t>feature/sana05022/task-list-page</w:t>
+            </w:r>
+          </w:p>
         </w:tc>
         <w:tc>
           <w:tcPr>
@@ -1402,7 +1383,11 @@
             </w:tcMar>
             <w:vAlign w:val="center"/>
           </w:tcPr>
-          <w:p/>
+          <w:p>
+            <w:r>
+              <w:t>Yes</w:t>
+            </w:r>
+          </w:p>
         </w:tc>
       </w:tr>
       <w:tr>
@@ -1809,39 +1794,7 @@
           <w:rFonts w:ascii="Arial" w:eastAsia="Arial" w:hAnsi="Arial" w:cs="Arial"/>
           <w:color w:val="000000"/>
         </w:rPr>
-        <w:t xml:space="preserve">Your team is the development crew for </w:t>
-      </w:r>
-      <w:proofErr w:type="spellStart"/>
-      <w:r>
-        <w:rPr>
-          <w:rFonts w:ascii="Arial" w:eastAsia="Arial" w:hAnsi="Arial" w:cs="Arial"/>
-          <w:color w:val="000000"/>
-        </w:rPr>
-        <w:t>TaskFlow</w:t>
-      </w:r>
-      <w:proofErr w:type="spellEnd"/>
-      <w:r>
-        <w:rPr>
-          <w:rFonts w:ascii="Arial" w:eastAsia="Arial" w:hAnsi="Arial" w:cs="Arial"/>
-          <w:color w:val="000000"/>
-        </w:rPr>
-        <w:t xml:space="preserve">, a lightweight task-management web application consisting of five HTML pages. The Team Lead sets up the repository, </w:t>
-      </w:r>
-      <w:proofErr w:type="spellStart"/>
-      <w:r>
-        <w:rPr>
-          <w:rFonts w:ascii="Arial" w:eastAsia="Arial" w:hAnsi="Arial" w:cs="Arial"/>
-          <w:color w:val="000000"/>
-        </w:rPr>
-        <w:t>Dockerfile</w:t>
-      </w:r>
-      <w:proofErr w:type="spellEnd"/>
-      <w:r>
-        <w:rPr>
-          <w:rFonts w:ascii="Arial" w:eastAsia="Arial" w:hAnsi="Arial" w:cs="Arial"/>
-          <w:color w:val="000000"/>
-        </w:rPr>
-        <w:t>, shared stylesheet, and the CI/CD pipelines. Each team member is then individually responsible for building one specific page of the application, following the full Git, GitHub, and Docker flow independently.</w:t>
+        <w:t>Your team is the development crew for TaskFlow, a lightweight task-management web application consisting of five HTML pages. The Team Lead sets up the repository, Dockerfile, shared stylesheet, and the CI/CD pipelines. Each team member is then individually responsible for building one specific page of the application, following the full Git, GitHub, and Docker flow independently.</w:t>
       </w:r>
     </w:p>
     <w:p>
@@ -1859,23 +1812,7 @@
           <w:rFonts w:ascii="Arial" w:eastAsia="Arial" w:hAnsi="Arial" w:cs="Arial"/>
           <w:color w:val="000000"/>
         </w:rPr>
-        <w:t xml:space="preserve">The 5 pages of the </w:t>
-      </w:r>
-      <w:proofErr w:type="spellStart"/>
-      <w:r>
-        <w:rPr>
-          <w:rFonts w:ascii="Arial" w:eastAsia="Arial" w:hAnsi="Arial" w:cs="Arial"/>
-          <w:color w:val="000000"/>
-        </w:rPr>
-        <w:t>TaskFlow</w:t>
-      </w:r>
-      <w:proofErr w:type="spellEnd"/>
-      <w:r>
-        <w:rPr>
-          <w:rFonts w:ascii="Arial" w:eastAsia="Arial" w:hAnsi="Arial" w:cs="Arial"/>
-          <w:color w:val="000000"/>
-        </w:rPr>
-        <w:t xml:space="preserve"> application and their assignment are defined in Table 3 below. The Team Lead takes Page 1 (Home / Dashboard) in addition to their setup responsibilities.</w:t>
+        <w:t>The 5 pages of the TaskFlow application and their assignment are defined in Table 3 below. The Team Lead takes Page 1 (Home / Dashboard) in addition to their setup responsibilities.</w:t>
       </w:r>
     </w:p>
     <w:p>
@@ -1897,31 +1834,7 @@
           <w:sz w:val="18"/>
           <w:szCs w:val="18"/>
         </w:rPr>
-        <w:t xml:space="preserve">Table 3: </w:t>
-      </w:r>
-      <w:proofErr w:type="spellStart"/>
-      <w:r>
-        <w:rPr>
-          <w:rFonts w:ascii="Arial" w:eastAsia="Arial" w:hAnsi="Arial" w:cs="Arial"/>
-          <w:b/>
-          <w:bCs/>
-          <w:color w:val="444444"/>
-          <w:sz w:val="18"/>
-          <w:szCs w:val="18"/>
-        </w:rPr>
-        <w:t>TaskFlow</w:t>
-      </w:r>
-      <w:proofErr w:type="spellEnd"/>
-      <w:r>
-        <w:rPr>
-          <w:rFonts w:ascii="Arial" w:eastAsia="Arial" w:hAnsi="Arial" w:cs="Arial"/>
-          <w:b/>
-          <w:bCs/>
-          <w:color w:val="444444"/>
-          <w:sz w:val="18"/>
-          <w:szCs w:val="18"/>
-        </w:rPr>
-        <w:t xml:space="preserve"> Page Assignment</w:t>
+        <w:t>Table 3: TaskFlow Page Assignment</w:t>
       </w:r>
     </w:p>
     <w:tbl>
@@ -2327,17 +2240,7 @@
                 <w:sz w:val="18"/>
                 <w:szCs w:val="18"/>
               </w:rPr>
-              <w:t xml:space="preserve">An HTML form allowing the user to enter a new </w:t>
-            </w:r>
-            <w:proofErr w:type="gramStart"/>
-            <w:r>
-              <w:rPr>
-                <w:rFonts w:ascii="Arial" w:eastAsia="Arial" w:hAnsi="Arial" w:cs="Arial"/>
-                <w:color w:val="000000"/>
-                <w:sz w:val="18"/>
-                <w:szCs w:val="18"/>
-              </w:rPr>
-              <w:t xml:space="preserve">task </w:t>
+              <w:t xml:space="preserve">An HTML form allowing the user to enter a new task </w:t>
             </w:r>
             <w:r>
               <w:rPr>
@@ -2348,7 +2251,6 @@
               </w:rPr>
               <w:t>,</w:t>
             </w:r>
-            <w:proofErr w:type="gramEnd"/>
             <w:r>
               <w:rPr>
                 <w:rFonts w:ascii="Arial" w:eastAsia="Arial" w:hAnsi="Arial" w:cs="Arial"/>
@@ -2735,27 +2637,7 @@
                 <w:sz w:val="18"/>
                 <w:szCs w:val="18"/>
               </w:rPr>
-              <w:t xml:space="preserve">A page describing the </w:t>
-            </w:r>
-            <w:proofErr w:type="spellStart"/>
-            <w:r>
-              <w:rPr>
-                <w:rFonts w:ascii="Arial" w:eastAsia="Arial" w:hAnsi="Arial" w:cs="Arial"/>
-                <w:color w:val="000000"/>
-                <w:sz w:val="18"/>
-                <w:szCs w:val="18"/>
-              </w:rPr>
-              <w:t>TaskFlow</w:t>
-            </w:r>
-            <w:proofErr w:type="spellEnd"/>
-            <w:r>
-              <w:rPr>
-                <w:rFonts w:ascii="Arial" w:eastAsia="Arial" w:hAnsi="Arial" w:cs="Arial"/>
-                <w:color w:val="000000"/>
-                <w:sz w:val="18"/>
-                <w:szCs w:val="18"/>
-              </w:rPr>
-              <w:t xml:space="preserve"> application, its purpose, and a simple usage guide explaining how to navigate and use the app.</w:t>
+              <w:t>A page describing the TaskFlow application, its purpose, and a simple usage guide explaining how to navigate and use the app.</w:t>
             </w:r>
           </w:p>
         </w:tc>
@@ -2809,55 +2691,7 @@
           <w:rFonts w:ascii="Arial" w:eastAsia="Arial" w:hAnsi="Arial" w:cs="Arial"/>
           <w:color w:val="000000"/>
         </w:rPr>
-        <w:t xml:space="preserve"> using the naming convention: feature/&lt;member-</w:t>
-      </w:r>
-      <w:proofErr w:type="spellStart"/>
-      <w:r>
-        <w:rPr>
-          <w:rFonts w:ascii="Arial" w:eastAsia="Arial" w:hAnsi="Arial" w:cs="Arial"/>
-          <w:color w:val="000000"/>
-        </w:rPr>
-        <w:t>github</w:t>
-      </w:r>
-      <w:proofErr w:type="spellEnd"/>
-      <w:r>
-        <w:rPr>
-          <w:rFonts w:ascii="Arial" w:eastAsia="Arial" w:hAnsi="Arial" w:cs="Arial"/>
-          <w:color w:val="000000"/>
-        </w:rPr>
-        <w:t>-username&gt;/&lt;page-name</w:t>
-      </w:r>
-      <w:proofErr w:type="gramStart"/>
-      <w:r>
-        <w:rPr>
-          <w:rFonts w:ascii="Arial" w:eastAsia="Arial" w:hAnsi="Arial" w:cs="Arial"/>
-          <w:color w:val="000000"/>
-        </w:rPr>
-        <w:t>&gt;  (</w:t>
-      </w:r>
-      <w:proofErr w:type="gramEnd"/>
-      <w:r>
-        <w:rPr>
-          <w:rFonts w:ascii="Arial" w:eastAsia="Arial" w:hAnsi="Arial" w:cs="Arial"/>
-          <w:color w:val="000000"/>
-        </w:rPr>
-        <w:t>e.g., feature/</w:t>
-      </w:r>
-      <w:proofErr w:type="spellStart"/>
-      <w:r>
-        <w:rPr>
-          <w:rFonts w:ascii="Arial" w:eastAsia="Arial" w:hAnsi="Arial" w:cs="Arial"/>
-          <w:color w:val="000000"/>
-        </w:rPr>
-        <w:t>ali-hassan</w:t>
-      </w:r>
-      <w:proofErr w:type="spellEnd"/>
-      <w:r>
-        <w:rPr>
-          <w:rFonts w:ascii="Arial" w:eastAsia="Arial" w:hAnsi="Arial" w:cs="Arial"/>
-          <w:color w:val="000000"/>
-        </w:rPr>
-        <w:t>/add-task).</w:t>
+        <w:t xml:space="preserve"> using the naming convention: feature/&lt;member-github-username&gt;/&lt;page-name&gt;  (e.g., feature/ali-hassan/add-task).</w:t>
       </w:r>
     </w:p>
     <w:p>
@@ -2985,23 +2819,7 @@
           <w:rFonts w:ascii="Arial" w:eastAsia="Arial" w:hAnsi="Arial" w:cs="Arial"/>
           <w:color w:val="2E75B6"/>
         </w:rPr>
-        <w:t xml:space="preserve"> → CD deploys to Render → Live </w:t>
-      </w:r>
-      <w:proofErr w:type="spellStart"/>
-      <w:r>
-        <w:rPr>
-          <w:rFonts w:ascii="Arial" w:eastAsia="Arial" w:hAnsi="Arial" w:cs="Arial"/>
-          <w:color w:val="2E75B6"/>
-        </w:rPr>
-        <w:t>TaskFlow</w:t>
-      </w:r>
-      <w:proofErr w:type="spellEnd"/>
-      <w:r>
-        <w:rPr>
-          <w:rFonts w:ascii="Arial" w:eastAsia="Arial" w:hAnsi="Arial" w:cs="Arial"/>
-          <w:color w:val="2E75B6"/>
-        </w:rPr>
-        <w:t xml:space="preserve"> updated with the new page.</w:t>
+        <w:t xml:space="preserve"> → CD deploys to Render → Live TaskFlow updated with the new page.</w:t>
       </w:r>
     </w:p>
     <w:p>
@@ -3055,23 +2873,7 @@
           <w:rFonts w:ascii="Arial" w:eastAsia="Arial" w:hAnsi="Arial" w:cs="Arial"/>
           <w:color w:val="000000"/>
         </w:rPr>
-        <w:t xml:space="preserve">Create a new public GitHub repository named </w:t>
-      </w:r>
-      <w:proofErr w:type="spellStart"/>
-      <w:r>
-        <w:rPr>
-          <w:rFonts w:ascii="Arial" w:eastAsia="Arial" w:hAnsi="Arial" w:cs="Arial"/>
-          <w:color w:val="000000"/>
-        </w:rPr>
-        <w:t>taskflow-cicd</w:t>
-      </w:r>
-      <w:proofErr w:type="spellEnd"/>
-      <w:r>
-        <w:rPr>
-          <w:rFonts w:ascii="Arial" w:eastAsia="Arial" w:hAnsi="Arial" w:cs="Arial"/>
-          <w:color w:val="000000"/>
-        </w:rPr>
-        <w:t xml:space="preserve"> (or a name agreed by the team). Do NOT clone or fork any existing repository.</w:t>
+        <w:t>Create a new public GitHub repository named taskflow-cicd (or a name agreed by the team). Do NOT clone or fork any existing repository.</w:t>
       </w:r>
     </w:p>
     <w:p>
@@ -3356,17 +3158,7 @@
                 <w:sz w:val="18"/>
                 <w:szCs w:val="18"/>
               </w:rPr>
-              <w:t xml:space="preserve">Home / Dashboard </w:t>
-            </w:r>
-            <w:proofErr w:type="gramStart"/>
-            <w:r>
-              <w:rPr>
-                <w:rFonts w:ascii="Arial" w:eastAsia="Arial" w:hAnsi="Arial" w:cs="Arial"/>
-                <w:color w:val="000000"/>
-                <w:sz w:val="18"/>
-                <w:szCs w:val="18"/>
-              </w:rPr>
-              <w:t xml:space="preserve">page </w:t>
+              <w:t xml:space="preserve">Home / Dashboard page </w:t>
             </w:r>
             <w:r>
               <w:rPr>
@@ -3377,7 +3169,6 @@
               </w:rPr>
               <w:t>,</w:t>
             </w:r>
-            <w:proofErr w:type="gramEnd"/>
             <w:r>
               <w:rPr>
                 <w:rFonts w:ascii="Arial" w:eastAsia="Arial" w:hAnsi="Arial" w:cs="Arial"/>
@@ -3449,17 +3240,7 @@
                 <w:sz w:val="18"/>
                 <w:szCs w:val="18"/>
               </w:rPr>
-              <w:t xml:space="preserve">Add Task </w:t>
-            </w:r>
-            <w:proofErr w:type="gramStart"/>
-            <w:r>
-              <w:rPr>
-                <w:rFonts w:ascii="Arial" w:eastAsia="Arial" w:hAnsi="Arial" w:cs="Arial"/>
-                <w:color w:val="000000"/>
-                <w:sz w:val="18"/>
-                <w:szCs w:val="18"/>
-              </w:rPr>
-              <w:t xml:space="preserve">page </w:t>
+              <w:t xml:space="preserve">Add Task page </w:t>
             </w:r>
             <w:r>
               <w:rPr>
@@ -3470,7 +3251,6 @@
               </w:rPr>
               <w:t>,</w:t>
             </w:r>
-            <w:proofErr w:type="gramEnd"/>
             <w:r>
               <w:rPr>
                 <w:rFonts w:ascii="Arial" w:eastAsia="Arial" w:hAnsi="Arial" w:cs="Arial"/>
@@ -3542,17 +3322,7 @@
                 <w:sz w:val="18"/>
                 <w:szCs w:val="18"/>
               </w:rPr>
-              <w:t xml:space="preserve">Task List </w:t>
-            </w:r>
-            <w:proofErr w:type="gramStart"/>
-            <w:r>
-              <w:rPr>
-                <w:rFonts w:ascii="Arial" w:eastAsia="Arial" w:hAnsi="Arial" w:cs="Arial"/>
-                <w:color w:val="000000"/>
-                <w:sz w:val="18"/>
-                <w:szCs w:val="18"/>
-              </w:rPr>
-              <w:t xml:space="preserve">page </w:t>
+              <w:t xml:space="preserve">Task List page </w:t>
             </w:r>
             <w:r>
               <w:rPr>
@@ -3563,7 +3333,6 @@
               </w:rPr>
               <w:t>,</w:t>
             </w:r>
-            <w:proofErr w:type="gramEnd"/>
             <w:r>
               <w:rPr>
                 <w:rFonts w:ascii="Arial" w:eastAsia="Arial" w:hAnsi="Arial" w:cs="Arial"/>
@@ -3635,17 +3404,7 @@
                 <w:sz w:val="18"/>
                 <w:szCs w:val="18"/>
               </w:rPr>
-              <w:t xml:space="preserve">Task Detail </w:t>
-            </w:r>
-            <w:proofErr w:type="gramStart"/>
-            <w:r>
-              <w:rPr>
-                <w:rFonts w:ascii="Arial" w:eastAsia="Arial" w:hAnsi="Arial" w:cs="Arial"/>
-                <w:color w:val="000000"/>
-                <w:sz w:val="18"/>
-                <w:szCs w:val="18"/>
-              </w:rPr>
-              <w:t xml:space="preserve">page </w:t>
+              <w:t xml:space="preserve">Task Detail page </w:t>
             </w:r>
             <w:r>
               <w:rPr>
@@ -3656,7 +3415,6 @@
               </w:rPr>
               <w:t>,</w:t>
             </w:r>
-            <w:proofErr w:type="gramEnd"/>
             <w:r>
               <w:rPr>
                 <w:rFonts w:ascii="Arial" w:eastAsia="Arial" w:hAnsi="Arial" w:cs="Arial"/>
@@ -3728,17 +3486,7 @@
                 <w:sz w:val="18"/>
                 <w:szCs w:val="18"/>
               </w:rPr>
-              <w:t xml:space="preserve">About / Help </w:t>
-            </w:r>
-            <w:proofErr w:type="gramStart"/>
-            <w:r>
-              <w:rPr>
-                <w:rFonts w:ascii="Arial" w:eastAsia="Arial" w:hAnsi="Arial" w:cs="Arial"/>
-                <w:color w:val="000000"/>
-                <w:sz w:val="18"/>
-                <w:szCs w:val="18"/>
-              </w:rPr>
-              <w:t xml:space="preserve">page </w:t>
+              <w:t xml:space="preserve">About / Help page </w:t>
             </w:r>
             <w:r>
               <w:rPr>
@@ -3749,7 +3497,6 @@
               </w:rPr>
               <w:t>,</w:t>
             </w:r>
-            <w:proofErr w:type="gramEnd"/>
             <w:r>
               <w:rPr>
                 <w:rFonts w:ascii="Arial" w:eastAsia="Arial" w:hAnsi="Arial" w:cs="Arial"/>
@@ -3821,17 +3568,7 @@
                 <w:sz w:val="18"/>
                 <w:szCs w:val="18"/>
               </w:rPr>
-              <w:t xml:space="preserve">Shared </w:t>
-            </w:r>
-            <w:proofErr w:type="gramStart"/>
-            <w:r>
-              <w:rPr>
-                <w:rFonts w:ascii="Arial" w:eastAsia="Arial" w:hAnsi="Arial" w:cs="Arial"/>
-                <w:color w:val="000000"/>
-                <w:sz w:val="18"/>
-                <w:szCs w:val="18"/>
-              </w:rPr>
-              <w:t xml:space="preserve">stylesheet </w:t>
+              <w:t xml:space="preserve">Shared stylesheet </w:t>
             </w:r>
             <w:r>
               <w:rPr>
@@ -3842,7 +3579,6 @@
               </w:rPr>
               <w:t>,</w:t>
             </w:r>
-            <w:proofErr w:type="gramEnd"/>
             <w:r>
               <w:rPr>
                 <w:rFonts w:ascii="Arial" w:eastAsia="Arial" w:hAnsi="Arial" w:cs="Arial"/>
@@ -3875,7 +3611,6 @@
             <w:vAlign w:val="center"/>
           </w:tcPr>
           <w:p>
-            <w:proofErr w:type="spellStart"/>
             <w:r>
               <w:rPr>
                 <w:rFonts w:ascii="Arial" w:eastAsia="Arial" w:hAnsi="Arial" w:cs="Arial"/>
@@ -3887,7 +3622,6 @@
               </w:rPr>
               <w:t>Dockerfile</w:t>
             </w:r>
-            <w:proofErr w:type="spellEnd"/>
           </w:p>
         </w:tc>
         <w:tc>
@@ -3909,25 +3643,14 @@
             <w:vAlign w:val="center"/>
           </w:tcPr>
           <w:p>
-            <w:proofErr w:type="spellStart"/>
-            <w:r>
-              <w:rPr>
-                <w:rFonts w:ascii="Arial" w:eastAsia="Arial" w:hAnsi="Arial" w:cs="Arial"/>
-                <w:color w:val="000000"/>
-                <w:sz w:val="18"/>
-                <w:szCs w:val="18"/>
-              </w:rPr>
-              <w:t>Dockerfile</w:t>
-            </w:r>
-            <w:proofErr w:type="spellEnd"/>
-            <w:r>
-              <w:rPr>
-                <w:rFonts w:ascii="Arial" w:eastAsia="Arial" w:hAnsi="Arial" w:cs="Arial"/>
-                <w:color w:val="000000"/>
-                <w:sz w:val="18"/>
-                <w:szCs w:val="18"/>
-              </w:rPr>
-              <w:t xml:space="preserve"> to containerize the application (nginx-based)</w:t>
+            <w:r>
+              <w:rPr>
+                <w:rFonts w:ascii="Arial" w:eastAsia="Arial" w:hAnsi="Arial" w:cs="Arial"/>
+                <w:color w:val="000000"/>
+                <w:sz w:val="18"/>
+                <w:szCs w:val="18"/>
+              </w:rPr>
+              <w:t>Dockerfile to containerize the application (nginx-based)</w:t>
             </w:r>
           </w:p>
         </w:tc>
@@ -3961,9 +3684,70 @@
                 <w:sz w:val="18"/>
                 <w:szCs w:val="18"/>
               </w:rPr>
-              <w:t>.</w:t>
-            </w:r>
-            <w:proofErr w:type="spellStart"/>
+              <w:t>.github/workflows/ci.yml</w:t>
+            </w:r>
+          </w:p>
+        </w:tc>
+        <w:tc>
+          <w:tcPr>
+            <w:tcW w:w="6160" w:type="dxa"/>
+            <w:tcBorders>
+              <w:top w:val="single" w:sz="6" w:space="0" w:color="ADB9CA"/>
+              <w:left w:val="single" w:sz="6" w:space="0" w:color="ADB9CA"/>
+              <w:bottom w:val="single" w:sz="6" w:space="0" w:color="ADB9CA"/>
+              <w:right w:val="single" w:sz="6" w:space="0" w:color="ADB9CA"/>
+            </w:tcBorders>
+            <w:shd w:val="clear" w:color="auto" w:fill="FFFFFF"/>
+            <w:tcMar>
+              <w:top w:w="80" w:type="dxa"/>
+              <w:left w:w="140" w:type="dxa"/>
+              <w:bottom w:w="80" w:type="dxa"/>
+              <w:right w:w="140" w:type="dxa"/>
+            </w:tcMar>
+            <w:vAlign w:val="center"/>
+          </w:tcPr>
+          <w:p>
+            <w:r>
+              <w:rPr>
+                <w:rFonts w:ascii="Arial" w:eastAsia="Arial" w:hAnsi="Arial" w:cs="Arial"/>
+                <w:color w:val="000000"/>
+                <w:sz w:val="18"/>
+                <w:szCs w:val="18"/>
+              </w:rPr>
+              <w:t xml:space="preserve">CI workflow – triggered on Pull Request to </w:t>
+            </w:r>
+            <w:r>
+              <w:rPr>
+                <w:rFonts w:ascii="Arial" w:eastAsia="Arial" w:hAnsi="Arial" w:cs="Arial"/>
+                <w:color w:val="000000"/>
+                <w:sz w:val="18"/>
+                <w:szCs w:val="18"/>
+              </w:rPr>
+              <w:t>“develop”</w:t>
+            </w:r>
+          </w:p>
+        </w:tc>
+      </w:tr>
+      <w:tr>
+        <w:tc>
+          <w:tcPr>
+            <w:tcW w:w="3200" w:type="dxa"/>
+            <w:tcBorders>
+              <w:top w:val="single" w:sz="6" w:space="0" w:color="ADB9CA"/>
+              <w:left w:val="single" w:sz="6" w:space="0" w:color="ADB9CA"/>
+              <w:bottom w:val="single" w:sz="6" w:space="0" w:color="ADB9CA"/>
+              <w:right w:val="single" w:sz="6" w:space="0" w:color="ADB9CA"/>
+            </w:tcBorders>
+            <w:shd w:val="clear" w:color="auto" w:fill="E8F0FB"/>
+            <w:tcMar>
+              <w:top w:w="80" w:type="dxa"/>
+              <w:left w:w="140" w:type="dxa"/>
+              <w:bottom w:w="80" w:type="dxa"/>
+              <w:right w:w="140" w:type="dxa"/>
+            </w:tcMar>
+            <w:vAlign w:val="center"/>
+          </w:tcPr>
+          <w:p>
             <w:r>
               <w:rPr>
                 <w:rFonts w:ascii="Arial" w:eastAsia="Arial" w:hAnsi="Arial" w:cs="Arial"/>
@@ -3973,143 +3757,8 @@
                 <w:sz w:val="18"/>
                 <w:szCs w:val="18"/>
               </w:rPr>
-              <w:t>github</w:t>
-            </w:r>
-            <w:proofErr w:type="spellEnd"/>
-            <w:r>
-              <w:rPr>
-                <w:rFonts w:ascii="Arial" w:eastAsia="Arial" w:hAnsi="Arial" w:cs="Arial"/>
-                <w:b/>
-                <w:bCs/>
-                <w:color w:val="000000"/>
-                <w:sz w:val="18"/>
-                <w:szCs w:val="18"/>
-              </w:rPr>
-              <w:t>/workflows/</w:t>
-            </w:r>
-            <w:proofErr w:type="spellStart"/>
-            <w:r>
-              <w:rPr>
-                <w:rFonts w:ascii="Arial" w:eastAsia="Arial" w:hAnsi="Arial" w:cs="Arial"/>
-                <w:b/>
-                <w:bCs/>
-                <w:color w:val="000000"/>
-                <w:sz w:val="18"/>
-                <w:szCs w:val="18"/>
-              </w:rPr>
-              <w:t>ci.yml</w:t>
-            </w:r>
-            <w:proofErr w:type="spellEnd"/>
-          </w:p>
-        </w:tc>
-        <w:tc>
-          <w:tcPr>
-            <w:tcW w:w="6160" w:type="dxa"/>
-            <w:tcBorders>
-              <w:top w:val="single" w:sz="6" w:space="0" w:color="ADB9CA"/>
-              <w:left w:val="single" w:sz="6" w:space="0" w:color="ADB9CA"/>
-              <w:bottom w:val="single" w:sz="6" w:space="0" w:color="ADB9CA"/>
-              <w:right w:val="single" w:sz="6" w:space="0" w:color="ADB9CA"/>
-            </w:tcBorders>
-            <w:shd w:val="clear" w:color="auto" w:fill="FFFFFF"/>
-            <w:tcMar>
-              <w:top w:w="80" w:type="dxa"/>
-              <w:left w:w="140" w:type="dxa"/>
-              <w:bottom w:w="80" w:type="dxa"/>
-              <w:right w:w="140" w:type="dxa"/>
-            </w:tcMar>
-            <w:vAlign w:val="center"/>
-          </w:tcPr>
-          <w:p>
-            <w:r>
-              <w:rPr>
-                <w:rFonts w:ascii="Arial" w:eastAsia="Arial" w:hAnsi="Arial" w:cs="Arial"/>
-                <w:color w:val="000000"/>
-                <w:sz w:val="18"/>
-                <w:szCs w:val="18"/>
-              </w:rPr>
-              <w:t xml:space="preserve">CI workflow – triggered on Pull Request to </w:t>
-            </w:r>
-            <w:r>
-              <w:rPr>
-                <w:rFonts w:ascii="Arial" w:eastAsia="Arial" w:hAnsi="Arial" w:cs="Arial"/>
-                <w:color w:val="000000"/>
-                <w:sz w:val="18"/>
-                <w:szCs w:val="18"/>
-              </w:rPr>
-              <w:t>“develop”</w:t>
-            </w:r>
-          </w:p>
-        </w:tc>
-      </w:tr>
-      <w:tr>
-        <w:tc>
-          <w:tcPr>
-            <w:tcW w:w="3200" w:type="dxa"/>
-            <w:tcBorders>
-              <w:top w:val="single" w:sz="6" w:space="0" w:color="ADB9CA"/>
-              <w:left w:val="single" w:sz="6" w:space="0" w:color="ADB9CA"/>
-              <w:bottom w:val="single" w:sz="6" w:space="0" w:color="ADB9CA"/>
-              <w:right w:val="single" w:sz="6" w:space="0" w:color="ADB9CA"/>
-            </w:tcBorders>
-            <w:shd w:val="clear" w:color="auto" w:fill="E8F0FB"/>
-            <w:tcMar>
-              <w:top w:w="80" w:type="dxa"/>
-              <w:left w:w="140" w:type="dxa"/>
-              <w:bottom w:w="80" w:type="dxa"/>
-              <w:right w:w="140" w:type="dxa"/>
-            </w:tcMar>
-            <w:vAlign w:val="center"/>
-          </w:tcPr>
-          <w:p>
-            <w:r>
-              <w:rPr>
-                <w:rFonts w:ascii="Arial" w:eastAsia="Arial" w:hAnsi="Arial" w:cs="Arial"/>
-                <w:b/>
-                <w:bCs/>
-                <w:color w:val="000000"/>
-                <w:sz w:val="18"/>
-                <w:szCs w:val="18"/>
-              </w:rPr>
-              <w:t>.</w:t>
-            </w:r>
-            <w:proofErr w:type="spellStart"/>
-            <w:r>
-              <w:rPr>
-                <w:rFonts w:ascii="Arial" w:eastAsia="Arial" w:hAnsi="Arial" w:cs="Arial"/>
-                <w:b/>
-                <w:bCs/>
-                <w:color w:val="000000"/>
-                <w:sz w:val="18"/>
-                <w:szCs w:val="18"/>
-              </w:rPr>
-              <w:t>github</w:t>
-            </w:r>
-            <w:proofErr w:type="spellEnd"/>
-            <w:r>
-              <w:rPr>
-                <w:rFonts w:ascii="Arial" w:eastAsia="Arial" w:hAnsi="Arial" w:cs="Arial"/>
-                <w:b/>
-                <w:bCs/>
-                <w:color w:val="000000"/>
-                <w:sz w:val="18"/>
-                <w:szCs w:val="18"/>
-              </w:rPr>
-              <w:t>/workflows/</w:t>
-            </w:r>
-            <w:proofErr w:type="spellStart"/>
-            <w:r>
-              <w:rPr>
-                <w:rFonts w:ascii="Arial" w:eastAsia="Arial" w:hAnsi="Arial" w:cs="Arial"/>
-                <w:b/>
-                <w:bCs/>
-                <w:color w:val="000000"/>
-                <w:sz w:val="18"/>
-                <w:szCs w:val="18"/>
-              </w:rPr>
-              <w:t>cd.yml</w:t>
-            </w:r>
-            <w:proofErr w:type="spellEnd"/>
+              <w:t>.github/workflows/cd.yml</w:t>
+            </w:r>
           </w:p>
         </w:tc>
         <w:tc>
@@ -4252,15 +3901,7 @@
           <w:rFonts w:ascii="Arial" w:eastAsia="Arial" w:hAnsi="Arial" w:cs="Arial"/>
           <w:color w:val="000000"/>
         </w:rPr>
-        <w:t xml:space="preserve">The Team Lead (TL) is responsible for creating all secrets listed below. The TL is the repository admin and the credentials in </w:t>
-      </w:r>
-      <w:proofErr w:type="gramStart"/>
-      <w:r>
-        <w:rPr>
-          <w:rFonts w:ascii="Arial" w:eastAsia="Arial" w:hAnsi="Arial" w:cs="Arial"/>
-          <w:color w:val="000000"/>
-        </w:rPr>
-        <w:t xml:space="preserve">use </w:t>
+        <w:t xml:space="preserve">The Team Lead (TL) is responsible for creating all secrets listed below. The TL is the repository admin and the credentials in use </w:t>
       </w:r>
       <w:r>
         <w:rPr>
@@ -4269,7 +3910,6 @@
         </w:rPr>
         <w:t>,</w:t>
       </w:r>
-      <w:proofErr w:type="gramEnd"/>
       <w:r>
         <w:rPr>
           <w:rFonts w:ascii="Arial" w:eastAsia="Arial" w:hAnsi="Arial" w:cs="Arial"/>
@@ -4700,17 +4340,7 @@
                 <w:sz w:val="18"/>
                 <w:szCs w:val="18"/>
               </w:rPr>
-              <w:t>Team Lead's Docker Hub Personal Access Token (PAT</w:t>
-            </w:r>
-            <w:proofErr w:type="gramStart"/>
-            <w:r>
-              <w:rPr>
-                <w:rFonts w:ascii="Arial" w:eastAsia="Arial" w:hAnsi="Arial" w:cs="Arial"/>
-                <w:color w:val="000000"/>
-                <w:sz w:val="18"/>
-                <w:szCs w:val="18"/>
-              </w:rPr>
-              <w:t xml:space="preserve">) </w:t>
+              <w:t xml:space="preserve">Team Lead's Docker Hub Personal Access Token (PAT) </w:t>
             </w:r>
             <w:r>
               <w:rPr>
@@ -4721,7 +4351,6 @@
               </w:rPr>
               <w:t>,</w:t>
             </w:r>
-            <w:proofErr w:type="gramEnd"/>
             <w:r>
               <w:rPr>
                 <w:rFonts w:ascii="Arial" w:eastAsia="Arial" w:hAnsi="Arial" w:cs="Arial"/>
@@ -4888,114 +4517,22 @@
           <w:sz w:val="28"/>
           <w:szCs w:val="28"/>
         </w:rPr>
-        <w:t xml:space="preserve">CI PIPELINE </w:t>
-      </w:r>
-      <w:proofErr w:type="gramStart"/>
+        <w:t>CI PIPELINE REQUIREMENTS  (.github/workflows/ci.yml)</w:t>
+      </w:r>
+    </w:p>
+    <w:p>
+      <w:pPr>
+        <w:spacing w:before="60" w:after="120"/>
+        <w:jc w:val="both"/>
+      </w:pPr>
       <w:r>
         <w:rPr>
           <w:rFonts w:ascii="Arial" w:eastAsia="Arial" w:hAnsi="Arial" w:cs="Arial"/>
           <w:b/>
           <w:bCs/>
-          <w:color w:val="1F3864"/>
-          <w:sz w:val="28"/>
-          <w:szCs w:val="28"/>
-        </w:rPr>
-        <w:t>REQUIREMENTS  (</w:t>
-      </w:r>
-      <w:proofErr w:type="gramEnd"/>
-      <w:r>
-        <w:rPr>
-          <w:rFonts w:ascii="Arial" w:eastAsia="Arial" w:hAnsi="Arial" w:cs="Arial"/>
-          <w:b/>
-          <w:bCs/>
-          <w:color w:val="1F3864"/>
-          <w:sz w:val="28"/>
-          <w:szCs w:val="28"/>
-        </w:rPr>
-        <w:t>.</w:t>
-      </w:r>
-      <w:proofErr w:type="spellStart"/>
-      <w:r>
-        <w:rPr>
-          <w:rFonts w:ascii="Arial" w:eastAsia="Arial" w:hAnsi="Arial" w:cs="Arial"/>
-          <w:b/>
-          <w:bCs/>
-          <w:color w:val="1F3864"/>
-          <w:sz w:val="28"/>
-          <w:szCs w:val="28"/>
-        </w:rPr>
-        <w:t>github</w:t>
-      </w:r>
-      <w:proofErr w:type="spellEnd"/>
-      <w:r>
-        <w:rPr>
-          <w:rFonts w:ascii="Arial" w:eastAsia="Arial" w:hAnsi="Arial" w:cs="Arial"/>
-          <w:b/>
-          <w:bCs/>
-          <w:color w:val="1F3864"/>
-          <w:sz w:val="28"/>
-          <w:szCs w:val="28"/>
-        </w:rPr>
-        <w:t>/workflows/</w:t>
-      </w:r>
-      <w:proofErr w:type="spellStart"/>
-      <w:r>
-        <w:rPr>
-          <w:rFonts w:ascii="Arial" w:eastAsia="Arial" w:hAnsi="Arial" w:cs="Arial"/>
-          <w:b/>
-          <w:bCs/>
-          <w:color w:val="1F3864"/>
-          <w:sz w:val="28"/>
-          <w:szCs w:val="28"/>
-        </w:rPr>
-        <w:t>ci.yml</w:t>
-      </w:r>
-      <w:proofErr w:type="spellEnd"/>
-      <w:r>
-        <w:rPr>
-          <w:rFonts w:ascii="Arial" w:eastAsia="Arial" w:hAnsi="Arial" w:cs="Arial"/>
-          <w:b/>
-          <w:bCs/>
-          <w:color w:val="1F3864"/>
-          <w:sz w:val="28"/>
-          <w:szCs w:val="28"/>
-        </w:rPr>
-        <w:t>)</w:t>
-      </w:r>
-    </w:p>
-    <w:p>
-      <w:pPr>
-        <w:spacing w:before="60" w:after="120"/>
-        <w:jc w:val="both"/>
-      </w:pPr>
-      <w:r>
-        <w:rPr>
-          <w:rFonts w:ascii="Arial" w:eastAsia="Arial" w:hAnsi="Arial" w:cs="Arial"/>
-          <w:b/>
-          <w:bCs/>
-          <w:color w:val="000000"/>
-        </w:rPr>
-        <w:t xml:space="preserve">Trigger: The CI workflow must be triggered by a </w:t>
-      </w:r>
-      <w:proofErr w:type="spellStart"/>
-      <w:r>
-        <w:rPr>
-          <w:rFonts w:ascii="Arial" w:eastAsia="Arial" w:hAnsi="Arial" w:cs="Arial"/>
-          <w:b/>
-          <w:bCs/>
-          <w:color w:val="000000"/>
-        </w:rPr>
-        <w:t>pull_request</w:t>
-      </w:r>
-      <w:proofErr w:type="spellEnd"/>
-      <w:r>
-        <w:rPr>
-          <w:rFonts w:ascii="Arial" w:eastAsia="Arial" w:hAnsi="Arial" w:cs="Arial"/>
-          <w:b/>
-          <w:bCs/>
-          <w:color w:val="000000"/>
-        </w:rPr>
-        <w:t xml:space="preserve"> event targeting the </w:t>
+          <w:color w:val="000000"/>
+        </w:rPr>
+        <w:t xml:space="preserve">Trigger: The CI workflow must be triggered by a pull_request event targeting the </w:t>
       </w:r>
       <w:r>
         <w:rPr>
@@ -5082,23 +4619,7 @@
           <w:rFonts w:ascii="Arial" w:eastAsia="Arial" w:hAnsi="Arial" w:cs="Arial"/>
           <w:color w:val="000000"/>
         </w:rPr>
-        <w:t xml:space="preserve">Step 3 – Build Image: Build the Docker image from the </w:t>
-      </w:r>
-      <w:proofErr w:type="spellStart"/>
-      <w:r>
-        <w:rPr>
-          <w:rFonts w:ascii="Arial" w:eastAsia="Arial" w:hAnsi="Arial" w:cs="Arial"/>
-          <w:color w:val="000000"/>
-        </w:rPr>
-        <w:t>Dockerfile</w:t>
-      </w:r>
-      <w:proofErr w:type="spellEnd"/>
-      <w:r>
-        <w:rPr>
-          <w:rFonts w:ascii="Arial" w:eastAsia="Arial" w:hAnsi="Arial" w:cs="Arial"/>
-          <w:color w:val="000000"/>
-        </w:rPr>
-        <w:t xml:space="preserve"> in the project root.</w:t>
+        <w:t>Step 3 – Build Image: Build the Docker image from the Dockerfile in the project root.</w:t>
       </w:r>
     </w:p>
     <w:p>
@@ -5115,15 +4636,7 @@
           <w:rFonts w:ascii="Arial" w:eastAsia="Arial" w:hAnsi="Arial" w:cs="Arial"/>
           <w:color w:val="000000"/>
         </w:rPr>
-        <w:t xml:space="preserve">Step 4 – Tag Image: Tag the image using a meaningful </w:t>
-      </w:r>
-      <w:proofErr w:type="gramStart"/>
-      <w:r>
-        <w:rPr>
-          <w:rFonts w:ascii="Arial" w:eastAsia="Arial" w:hAnsi="Arial" w:cs="Arial"/>
-          <w:color w:val="000000"/>
-        </w:rPr>
-        <w:t xml:space="preserve">strategy </w:t>
+        <w:t xml:space="preserve">Step 4 – Tag Image: Tag the image using a meaningful strategy </w:t>
       </w:r>
       <w:r>
         <w:rPr>
@@ -5132,29 +4645,12 @@
         </w:rPr>
         <w:t>,</w:t>
       </w:r>
-      <w:proofErr w:type="gramEnd"/>
-      <w:r>
-        <w:rPr>
-          <w:rFonts w:ascii="Arial" w:eastAsia="Arial" w:hAnsi="Arial" w:cs="Arial"/>
-          <w:color w:val="000000"/>
-        </w:rPr>
-        <w:t xml:space="preserve"> at minimum the 'latest' tag; optionally also tag with the short commit SHA (</w:t>
-      </w:r>
-      <w:proofErr w:type="spellStart"/>
-      <w:r>
-        <w:rPr>
-          <w:rFonts w:ascii="Arial" w:eastAsia="Arial" w:hAnsi="Arial" w:cs="Arial"/>
-          <w:color w:val="000000"/>
-        </w:rPr>
-        <w:t>github.sha</w:t>
-      </w:r>
-      <w:proofErr w:type="spellEnd"/>
-      <w:r>
-        <w:rPr>
-          <w:rFonts w:ascii="Arial" w:eastAsia="Arial" w:hAnsi="Arial" w:cs="Arial"/>
-          <w:color w:val="000000"/>
-        </w:rPr>
-        <w:t>).</w:t>
+      <w:r>
+        <w:rPr>
+          <w:rFonts w:ascii="Arial" w:eastAsia="Arial" w:hAnsi="Arial" w:cs="Arial"/>
+          <w:color w:val="000000"/>
+        </w:rPr>
+        <w:t xml:space="preserve"> at minimum the 'latest' tag; optionally also tag with the short commit SHA (github.sha).</w:t>
       </w:r>
     </w:p>
     <w:p>
@@ -5262,79 +4758,7 @@
           <w:sz w:val="28"/>
           <w:szCs w:val="28"/>
         </w:rPr>
-        <w:t xml:space="preserve">CD PIPELINE </w:t>
-      </w:r>
-      <w:proofErr w:type="gramStart"/>
-      <w:r>
-        <w:rPr>
-          <w:rFonts w:ascii="Arial" w:eastAsia="Arial" w:hAnsi="Arial" w:cs="Arial"/>
-          <w:b/>
-          <w:bCs/>
-          <w:color w:val="1F3864"/>
-          <w:sz w:val="28"/>
-          <w:szCs w:val="28"/>
-        </w:rPr>
-        <w:t>REQUIREMENTS  (</w:t>
-      </w:r>
-      <w:proofErr w:type="gramEnd"/>
-      <w:r>
-        <w:rPr>
-          <w:rFonts w:ascii="Arial" w:eastAsia="Arial" w:hAnsi="Arial" w:cs="Arial"/>
-          <w:b/>
-          <w:bCs/>
-          <w:color w:val="1F3864"/>
-          <w:sz w:val="28"/>
-          <w:szCs w:val="28"/>
-        </w:rPr>
-        <w:t>.</w:t>
-      </w:r>
-      <w:proofErr w:type="spellStart"/>
-      <w:r>
-        <w:rPr>
-          <w:rFonts w:ascii="Arial" w:eastAsia="Arial" w:hAnsi="Arial" w:cs="Arial"/>
-          <w:b/>
-          <w:bCs/>
-          <w:color w:val="1F3864"/>
-          <w:sz w:val="28"/>
-          <w:szCs w:val="28"/>
-        </w:rPr>
-        <w:t>github</w:t>
-      </w:r>
-      <w:proofErr w:type="spellEnd"/>
-      <w:r>
-        <w:rPr>
-          <w:rFonts w:ascii="Arial" w:eastAsia="Arial" w:hAnsi="Arial" w:cs="Arial"/>
-          <w:b/>
-          <w:bCs/>
-          <w:color w:val="1F3864"/>
-          <w:sz w:val="28"/>
-          <w:szCs w:val="28"/>
-        </w:rPr>
-        <w:t>/workflows/</w:t>
-      </w:r>
-      <w:proofErr w:type="spellStart"/>
-      <w:r>
-        <w:rPr>
-          <w:rFonts w:ascii="Arial" w:eastAsia="Arial" w:hAnsi="Arial" w:cs="Arial"/>
-          <w:b/>
-          <w:bCs/>
-          <w:color w:val="1F3864"/>
-          <w:sz w:val="28"/>
-          <w:szCs w:val="28"/>
-        </w:rPr>
-        <w:t>cd.yml</w:t>
-      </w:r>
-      <w:proofErr w:type="spellEnd"/>
-      <w:r>
-        <w:rPr>
-          <w:rFonts w:ascii="Arial" w:eastAsia="Arial" w:hAnsi="Arial" w:cs="Arial"/>
-          <w:b/>
-          <w:bCs/>
-          <w:color w:val="1F3864"/>
-          <w:sz w:val="28"/>
-          <w:szCs w:val="28"/>
-        </w:rPr>
-        <w:t>)</w:t>
+        <w:t>CD PIPELINE REQUIREMENTS  (.github/workflows/cd.yml)</w:t>
       </w:r>
     </w:p>
     <w:p>
@@ -5472,43 +4896,7 @@
           <w:sz w:val="19"/>
           <w:szCs w:val="19"/>
         </w:rPr>
-        <w:t>curl -X POST $</w:t>
-      </w:r>
-      <w:proofErr w:type="gramStart"/>
-      <w:r>
-        <w:rPr>
-          <w:rFonts w:ascii="Arial" w:eastAsia="Arial" w:hAnsi="Arial" w:cs="Arial"/>
-          <w:sz w:val="19"/>
-          <w:szCs w:val="19"/>
-        </w:rPr>
-        <w:t xml:space="preserve">{{ </w:t>
-      </w:r>
-      <w:proofErr w:type="spellStart"/>
-      <w:r>
-        <w:rPr>
-          <w:rFonts w:ascii="Arial" w:eastAsia="Arial" w:hAnsi="Arial" w:cs="Arial"/>
-          <w:sz w:val="19"/>
-          <w:szCs w:val="19"/>
-        </w:rPr>
-        <w:t>secrets</w:t>
-      </w:r>
-      <w:proofErr w:type="gramEnd"/>
-      <w:r>
-        <w:rPr>
-          <w:rFonts w:ascii="Arial" w:eastAsia="Arial" w:hAnsi="Arial" w:cs="Arial"/>
-          <w:sz w:val="19"/>
-          <w:szCs w:val="19"/>
-        </w:rPr>
-        <w:t>.RENDER_DEPLOY_HOOK_URL</w:t>
-      </w:r>
-      <w:proofErr w:type="spellEnd"/>
-      <w:r>
-        <w:rPr>
-          <w:rFonts w:ascii="Arial" w:eastAsia="Arial" w:hAnsi="Arial" w:cs="Arial"/>
-          <w:sz w:val="19"/>
-          <w:szCs w:val="19"/>
-        </w:rPr>
-        <w:t xml:space="preserve"> }}</w:t>
+        <w:t>curl -X POST ${{ secrets.RENDER_DEPLOY_HOOK_URL }}</w:t>
       </w:r>
     </w:p>
     <w:p>
@@ -5577,15 +4965,7 @@
           <w:rFonts w:ascii="Arial" w:eastAsia="Arial" w:hAnsi="Arial" w:cs="Arial"/>
           <w:color w:val="000000"/>
         </w:rPr>
-        <w:t xml:space="preserve">The job must NOT contain any Docker build or push </w:t>
-      </w:r>
-      <w:proofErr w:type="gramStart"/>
-      <w:r>
-        <w:rPr>
-          <w:rFonts w:ascii="Arial" w:eastAsia="Arial" w:hAnsi="Arial" w:cs="Arial"/>
-          <w:color w:val="000000"/>
-        </w:rPr>
-        <w:t xml:space="preserve">steps </w:t>
+        <w:t xml:space="preserve">The job must NOT contain any Docker build or push steps </w:t>
       </w:r>
       <w:r>
         <w:rPr>
@@ -5594,7 +4974,6 @@
         </w:rPr>
         <w:t>,</w:t>
       </w:r>
-      <w:proofErr w:type="gramEnd"/>
       <w:r>
         <w:rPr>
           <w:rFonts w:ascii="Arial" w:eastAsia="Arial" w:hAnsi="Arial" w:cs="Arial"/>
@@ -5787,7 +5166,6 @@
             <w:vAlign w:val="center"/>
           </w:tcPr>
           <w:p>
-            <w:proofErr w:type="spellStart"/>
             <w:r>
               <w:rPr>
                 <w:rFonts w:ascii="Arial" w:eastAsia="Arial" w:hAnsi="Arial" w:cs="Arial"/>
@@ -5799,7 +5177,6 @@
               </w:rPr>
               <w:t>ci.yml</w:t>
             </w:r>
-            <w:proofErr w:type="spellEnd"/>
           </w:p>
         </w:tc>
         <w:tc>
@@ -5821,25 +5198,14 @@
             <w:vAlign w:val="center"/>
           </w:tcPr>
           <w:p>
-            <w:proofErr w:type="spellStart"/>
-            <w:r>
-              <w:rPr>
-                <w:rFonts w:ascii="Arial" w:eastAsia="Arial" w:hAnsi="Arial" w:cs="Arial"/>
-                <w:color w:val="000000"/>
-                <w:sz w:val="18"/>
-                <w:szCs w:val="18"/>
-              </w:rPr>
-              <w:t>pull_request</w:t>
-            </w:r>
-            <w:proofErr w:type="spellEnd"/>
-            <w:r>
-              <w:rPr>
-                <w:rFonts w:ascii="Arial" w:eastAsia="Arial" w:hAnsi="Arial" w:cs="Arial"/>
-                <w:color w:val="000000"/>
-                <w:sz w:val="18"/>
-                <w:szCs w:val="18"/>
-              </w:rPr>
-              <w:t xml:space="preserve"> event targeting </w:t>
+            <w:r>
+              <w:rPr>
+                <w:rFonts w:ascii="Arial" w:eastAsia="Arial" w:hAnsi="Arial" w:cs="Arial"/>
+                <w:color w:val="000000"/>
+                <w:sz w:val="18"/>
+                <w:szCs w:val="18"/>
+              </w:rPr>
+              <w:t xml:space="preserve">pull_request event targeting </w:t>
             </w:r>
             <w:r>
               <w:rPr>
@@ -5912,7 +5278,6 @@
             <w:vAlign w:val="center"/>
           </w:tcPr>
           <w:p>
-            <w:proofErr w:type="spellStart"/>
             <w:r>
               <w:rPr>
                 <w:rFonts w:ascii="Arial" w:eastAsia="Arial" w:hAnsi="Arial" w:cs="Arial"/>
@@ -5924,7 +5289,6 @@
               </w:rPr>
               <w:t>cd.yml</w:t>
             </w:r>
-            <w:proofErr w:type="spellEnd"/>
           </w:p>
         </w:tc>
         <w:tc>
@@ -6063,23 +5427,7 @@
           <w:rFonts w:ascii="Arial" w:eastAsia="Arial" w:hAnsi="Arial" w:cs="Arial"/>
           <w:color w:val="000000"/>
         </w:rPr>
-        <w:t>Create a new GitHub repository from scratch (</w:t>
-      </w:r>
-      <w:proofErr w:type="spellStart"/>
-      <w:r>
-        <w:rPr>
-          <w:rFonts w:ascii="Arial" w:eastAsia="Arial" w:hAnsi="Arial" w:cs="Arial"/>
-          <w:color w:val="000000"/>
-        </w:rPr>
-        <w:t>taskflow-cicd</w:t>
-      </w:r>
-      <w:proofErr w:type="spellEnd"/>
-      <w:r>
-        <w:rPr>
-          <w:rFonts w:ascii="Arial" w:eastAsia="Arial" w:hAnsi="Arial" w:cs="Arial"/>
-          <w:color w:val="000000"/>
-        </w:rPr>
-        <w:t xml:space="preserve"> or team-agreed name). Do NOT reuse any previous repository.</w:t>
+        <w:t>Create a new GitHub repository from scratch (taskflow-cicd or team-agreed name). Do NOT reuse any previous repository.</w:t>
       </w:r>
     </w:p>
     <w:p>
@@ -6096,15 +5444,7 @@
           <w:rFonts w:ascii="Arial" w:eastAsia="Arial" w:hAnsi="Arial" w:cs="Arial"/>
           <w:color w:val="000000"/>
         </w:rPr>
-        <w:t xml:space="preserve">Team Lead: Set up the initial repository </w:t>
-      </w:r>
-      <w:proofErr w:type="gramStart"/>
-      <w:r>
-        <w:rPr>
-          <w:rFonts w:ascii="Arial" w:eastAsia="Arial" w:hAnsi="Arial" w:cs="Arial"/>
-          <w:color w:val="000000"/>
-        </w:rPr>
-        <w:t xml:space="preserve">structure </w:t>
+        <w:t xml:space="preserve">Team Lead: Set up the initial repository structure </w:t>
       </w:r>
       <w:r>
         <w:rPr>
@@ -6113,7 +5453,6 @@
         </w:rPr>
         <w:t>,</w:t>
       </w:r>
-      <w:proofErr w:type="gramEnd"/>
       <w:r>
         <w:rPr>
           <w:rFonts w:ascii="Arial" w:eastAsia="Arial" w:hAnsi="Arial" w:cs="Arial"/>
@@ -6133,23 +5472,7 @@
           <w:rFonts w:ascii="Arial" w:eastAsia="Arial" w:hAnsi="Arial" w:cs="Arial"/>
           <w:color w:val="000000"/>
         </w:rPr>
-        <w:t xml:space="preserve"> branch, commit the shared style.css, </w:t>
-      </w:r>
-      <w:proofErr w:type="spellStart"/>
-      <w:r>
-        <w:rPr>
-          <w:rFonts w:ascii="Arial" w:eastAsia="Arial" w:hAnsi="Arial" w:cs="Arial"/>
-          <w:color w:val="000000"/>
-        </w:rPr>
-        <w:t>Dockerfile</w:t>
-      </w:r>
-      <w:proofErr w:type="spellEnd"/>
-      <w:r>
-        <w:rPr>
-          <w:rFonts w:ascii="Arial" w:eastAsia="Arial" w:hAnsi="Arial" w:cs="Arial"/>
-          <w:color w:val="000000"/>
-        </w:rPr>
-        <w:t>, and a skeleton index.html (Home / Dashboard page).</w:t>
+        <w:t xml:space="preserve"> branch, commit the shared style.css, Dockerfile, and a skeleton index.html (Home / Dashboard page).</w:t>
       </w:r>
     </w:p>
     <w:p>
@@ -6166,15 +5489,7 @@
           <w:rFonts w:ascii="Arial" w:eastAsia="Arial" w:hAnsi="Arial" w:cs="Arial"/>
           <w:color w:val="000000"/>
         </w:rPr>
-        <w:t xml:space="preserve">Commit the Assignment 04 question paper (.docx) to the root of the repository. Every team member must fill in their </w:t>
-      </w:r>
-      <w:proofErr w:type="gramStart"/>
-      <w:r>
-        <w:rPr>
-          <w:rFonts w:ascii="Arial" w:eastAsia="Arial" w:hAnsi="Arial" w:cs="Arial"/>
-          <w:color w:val="000000"/>
-        </w:rPr>
-        <w:t xml:space="preserve">details </w:t>
+        <w:t xml:space="preserve">Commit the Assignment 04 question paper (.docx) to the root of the repository. Every team member must fill in their details </w:t>
       </w:r>
       <w:r>
         <w:rPr>
@@ -6183,7 +5498,6 @@
         </w:rPr>
         <w:t>,</w:t>
       </w:r>
-      <w:proofErr w:type="gramEnd"/>
       <w:r>
         <w:rPr>
           <w:rFonts w:ascii="Arial" w:eastAsia="Arial" w:hAnsi="Arial" w:cs="Arial"/>
@@ -6234,15 +5548,7 @@
           <w:rFonts w:ascii="Arial" w:eastAsia="Arial" w:hAnsi="Arial" w:cs="Arial"/>
           <w:color w:val="000000"/>
         </w:rPr>
-        <w:t xml:space="preserve"> and configure all three </w:t>
-      </w:r>
-      <w:proofErr w:type="gramStart"/>
-      <w:r>
-        <w:rPr>
-          <w:rFonts w:ascii="Arial" w:eastAsia="Arial" w:hAnsi="Arial" w:cs="Arial"/>
-          <w:color w:val="000000"/>
-        </w:rPr>
-        <w:t xml:space="preserve">secrets </w:t>
+        <w:t xml:space="preserve"> and configure all three secrets </w:t>
       </w:r>
       <w:r>
         <w:rPr>
@@ -6251,7 +5557,6 @@
         </w:rPr>
         <w:t>,</w:t>
       </w:r>
-      <w:proofErr w:type="gramEnd"/>
       <w:r>
         <w:rPr>
           <w:rFonts w:ascii="Arial" w:eastAsia="Arial" w:hAnsi="Arial" w:cs="Arial"/>
@@ -6319,47 +5624,7 @@
           <w:rFonts w:ascii="Arial" w:eastAsia="Arial" w:hAnsi="Arial" w:cs="Arial"/>
           <w:color w:val="000000"/>
         </w:rPr>
-        <w:t xml:space="preserve">Create the CI workflow at </w:t>
-      </w:r>
-      <w:proofErr w:type="gramStart"/>
-      <w:r>
-        <w:rPr>
-          <w:rFonts w:ascii="Arial" w:eastAsia="Arial" w:hAnsi="Arial" w:cs="Arial"/>
-          <w:color w:val="000000"/>
-        </w:rPr>
-        <w:t>.</w:t>
-      </w:r>
-      <w:proofErr w:type="spellStart"/>
-      <w:r>
-        <w:rPr>
-          <w:rFonts w:ascii="Arial" w:eastAsia="Arial" w:hAnsi="Arial" w:cs="Arial"/>
-          <w:color w:val="000000"/>
-        </w:rPr>
-        <w:t>github</w:t>
-      </w:r>
-      <w:proofErr w:type="spellEnd"/>
-      <w:r>
-        <w:rPr>
-          <w:rFonts w:ascii="Arial" w:eastAsia="Arial" w:hAnsi="Arial" w:cs="Arial"/>
-          <w:color w:val="000000"/>
-        </w:rPr>
-        <w:t>/workflows/</w:t>
-      </w:r>
-      <w:proofErr w:type="spellStart"/>
-      <w:r>
-        <w:rPr>
-          <w:rFonts w:ascii="Arial" w:eastAsia="Arial" w:hAnsi="Arial" w:cs="Arial"/>
-          <w:color w:val="000000"/>
-        </w:rPr>
-        <w:t>ci.yml</w:t>
-      </w:r>
-      <w:proofErr w:type="spellEnd"/>
-      <w:r>
-        <w:rPr>
-          <w:rFonts w:ascii="Arial" w:eastAsia="Arial" w:hAnsi="Arial" w:cs="Arial"/>
-          <w:color w:val="000000"/>
-        </w:rPr>
-        <w:t xml:space="preserve"> </w:t>
+        <w:t xml:space="preserve">Create the CI workflow at .github/workflows/ci.yml </w:t>
       </w:r>
       <w:r>
         <w:rPr>
@@ -6368,29 +5633,12 @@
         </w:rPr>
         <w:t>,</w:t>
       </w:r>
-      <w:proofErr w:type="gramEnd"/>
-      <w:r>
-        <w:rPr>
-          <w:rFonts w:ascii="Arial" w:eastAsia="Arial" w:hAnsi="Arial" w:cs="Arial"/>
-          <w:color w:val="000000"/>
-        </w:rPr>
-        <w:t xml:space="preserve"> triggered on </w:t>
-      </w:r>
-      <w:proofErr w:type="spellStart"/>
-      <w:r>
-        <w:rPr>
-          <w:rFonts w:ascii="Arial" w:eastAsia="Arial" w:hAnsi="Arial" w:cs="Arial"/>
-          <w:color w:val="000000"/>
-        </w:rPr>
-        <w:t>pull_request</w:t>
-      </w:r>
-      <w:proofErr w:type="spellEnd"/>
-      <w:r>
-        <w:rPr>
-          <w:rFonts w:ascii="Arial" w:eastAsia="Arial" w:hAnsi="Arial" w:cs="Arial"/>
-          <w:color w:val="000000"/>
-        </w:rPr>
-        <w:t xml:space="preserve"> targeting </w:t>
+      <w:r>
+        <w:rPr>
+          <w:rFonts w:ascii="Arial" w:eastAsia="Arial" w:hAnsi="Arial" w:cs="Arial"/>
+          <w:color w:val="000000"/>
+        </w:rPr>
+        <w:t xml:space="preserve"> triggered on pull_request targeting </w:t>
       </w:r>
       <w:r>
         <w:rPr>
@@ -6421,47 +5669,7 @@
           <w:rFonts w:ascii="Arial" w:eastAsia="Arial" w:hAnsi="Arial" w:cs="Arial"/>
           <w:color w:val="000000"/>
         </w:rPr>
-        <w:t xml:space="preserve">Create the CD workflow at </w:t>
-      </w:r>
-      <w:proofErr w:type="gramStart"/>
-      <w:r>
-        <w:rPr>
-          <w:rFonts w:ascii="Arial" w:eastAsia="Arial" w:hAnsi="Arial" w:cs="Arial"/>
-          <w:color w:val="000000"/>
-        </w:rPr>
-        <w:t>.</w:t>
-      </w:r>
-      <w:proofErr w:type="spellStart"/>
-      <w:r>
-        <w:rPr>
-          <w:rFonts w:ascii="Arial" w:eastAsia="Arial" w:hAnsi="Arial" w:cs="Arial"/>
-          <w:color w:val="000000"/>
-        </w:rPr>
-        <w:t>github</w:t>
-      </w:r>
-      <w:proofErr w:type="spellEnd"/>
-      <w:r>
-        <w:rPr>
-          <w:rFonts w:ascii="Arial" w:eastAsia="Arial" w:hAnsi="Arial" w:cs="Arial"/>
-          <w:color w:val="000000"/>
-        </w:rPr>
-        <w:t>/workflows/</w:t>
-      </w:r>
-      <w:proofErr w:type="spellStart"/>
-      <w:r>
-        <w:rPr>
-          <w:rFonts w:ascii="Arial" w:eastAsia="Arial" w:hAnsi="Arial" w:cs="Arial"/>
-          <w:color w:val="000000"/>
-        </w:rPr>
-        <w:t>cd.yml</w:t>
-      </w:r>
-      <w:proofErr w:type="spellEnd"/>
-      <w:r>
-        <w:rPr>
-          <w:rFonts w:ascii="Arial" w:eastAsia="Arial" w:hAnsi="Arial" w:cs="Arial"/>
-          <w:color w:val="000000"/>
-        </w:rPr>
-        <w:t xml:space="preserve"> </w:t>
+        <w:t xml:space="preserve">Create the CD workflow at .github/workflows/cd.yml </w:t>
       </w:r>
       <w:r>
         <w:rPr>
@@ -6470,7 +5678,6 @@
         </w:rPr>
         <w:t>,</w:t>
       </w:r>
-      <w:proofErr w:type="gramEnd"/>
       <w:r>
         <w:rPr>
           <w:rFonts w:ascii="Arial" w:eastAsia="Arial" w:hAnsi="Arial" w:cs="Arial"/>
@@ -6525,25 +5732,7 @@
           <w:sz w:val="19"/>
           <w:szCs w:val="19"/>
         </w:rPr>
-        <w:t>Create a feature branch: feature/&lt;</w:t>
-      </w:r>
-      <w:proofErr w:type="spellStart"/>
-      <w:r>
-        <w:rPr>
-          <w:rFonts w:ascii="Arial" w:eastAsia="Arial" w:hAnsi="Arial" w:cs="Arial"/>
-          <w:sz w:val="19"/>
-          <w:szCs w:val="19"/>
-        </w:rPr>
-        <w:t>github</w:t>
-      </w:r>
-      <w:proofErr w:type="spellEnd"/>
-      <w:r>
-        <w:rPr>
-          <w:rFonts w:ascii="Arial" w:eastAsia="Arial" w:hAnsi="Arial" w:cs="Arial"/>
-          <w:sz w:val="19"/>
-          <w:szCs w:val="19"/>
-        </w:rPr>
-        <w:t>-username&gt;/&lt;page-name&gt;</w:t>
+        <w:t>Create a feature branch: feature/&lt;github-username&gt;/&lt;page-name&gt;</w:t>
       </w:r>
     </w:p>
     <w:p>
@@ -6606,16 +5795,15 @@
           <w:sz w:val="19"/>
           <w:szCs w:val="19"/>
         </w:rPr>
-        <w:t>“develop</w:t>
-      </w:r>
-      <w:proofErr w:type="gramStart"/>
+        <w:t>“develop”</w:t>
+      </w:r>
       <w:r>
         <w:rPr>
           <w:rFonts w:ascii="Arial" w:eastAsia="Arial" w:hAnsi="Arial" w:cs="Arial"/>
           <w:sz w:val="19"/>
           <w:szCs w:val="19"/>
         </w:rPr>
-        <w:t>”</w:t>
+        <w:t xml:space="preserve"> </w:t>
       </w:r>
       <w:r>
         <w:rPr>
@@ -6623,17 +5811,8 @@
           <w:sz w:val="19"/>
           <w:szCs w:val="19"/>
         </w:rPr>
-        <w:t xml:space="preserve"> </w:t>
-      </w:r>
-      <w:r>
-        <w:rPr>
-          <w:rFonts w:ascii="Arial" w:eastAsia="Arial" w:hAnsi="Arial" w:cs="Arial"/>
-          <w:sz w:val="19"/>
-          <w:szCs w:val="19"/>
-        </w:rPr>
         <w:t>,</w:t>
       </w:r>
-      <w:proofErr w:type="gramEnd"/>
       <w:r>
         <w:rPr>
           <w:rFonts w:ascii="Arial" w:eastAsia="Arial" w:hAnsi="Arial" w:cs="Arial"/>
@@ -6658,26 +5837,16 @@
           <w:sz w:val="19"/>
           <w:szCs w:val="19"/>
         </w:rPr>
-        <w:t xml:space="preserve">Request a review; after approval the Team Lead merges the </w:t>
-      </w:r>
-      <w:proofErr w:type="gramStart"/>
+        <w:t xml:space="preserve">Request a review; after approval the Team Lead merges the PR </w:t>
+      </w:r>
       <w:r>
         <w:rPr>
           <w:rFonts w:ascii="Arial" w:eastAsia="Arial" w:hAnsi="Arial" w:cs="Arial"/>
           <w:sz w:val="19"/>
           <w:szCs w:val="19"/>
         </w:rPr>
-        <w:t xml:space="preserve">PR </w:t>
-      </w:r>
-      <w:r>
-        <w:rPr>
-          <w:rFonts w:ascii="Arial" w:eastAsia="Arial" w:hAnsi="Arial" w:cs="Arial"/>
-          <w:sz w:val="19"/>
-          <w:szCs w:val="19"/>
-        </w:rPr>
         <w:t>,</w:t>
       </w:r>
-      <w:proofErr w:type="gramEnd"/>
       <w:r>
         <w:rPr>
           <w:rFonts w:ascii="Arial" w:eastAsia="Arial" w:hAnsi="Arial" w:cs="Arial"/>
@@ -6701,39 +5870,7 @@
           <w:rFonts w:ascii="Arial" w:eastAsia="Arial" w:hAnsi="Arial" w:cs="Arial"/>
           <w:color w:val="000000"/>
         </w:rPr>
-        <w:t xml:space="preserve">After </w:t>
-      </w:r>
-      <w:proofErr w:type="gramStart"/>
-      <w:r>
-        <w:rPr>
-          <w:rFonts w:ascii="Arial" w:eastAsia="Arial" w:hAnsi="Arial" w:cs="Arial"/>
-          <w:color w:val="000000"/>
-        </w:rPr>
-        <w:t>all</w:t>
-      </w:r>
-      <w:proofErr w:type="gramEnd"/>
-      <w:r>
-        <w:rPr>
-          <w:rFonts w:ascii="Arial" w:eastAsia="Arial" w:hAnsi="Arial" w:cs="Arial"/>
-          <w:color w:val="000000"/>
-        </w:rPr>
-        <w:t xml:space="preserve"> 5 PRs are merged, verify the live </w:t>
-      </w:r>
-      <w:proofErr w:type="spellStart"/>
-      <w:r>
-        <w:rPr>
-          <w:rFonts w:ascii="Arial" w:eastAsia="Arial" w:hAnsi="Arial" w:cs="Arial"/>
-          <w:color w:val="000000"/>
-        </w:rPr>
-        <w:t>TaskFlow</w:t>
-      </w:r>
-      <w:proofErr w:type="spellEnd"/>
-      <w:r>
-        <w:rPr>
-          <w:rFonts w:ascii="Arial" w:eastAsia="Arial" w:hAnsi="Arial" w:cs="Arial"/>
-          <w:color w:val="000000"/>
-        </w:rPr>
-        <w:t xml:space="preserve"> application on Render contains all five pages and navigation between them works correctly.</w:t>
+        <w:t>After all 5 PRs are merged, verify the live TaskFlow application on Render contains all five pages and navigation between them works correctly.</w:t>
       </w:r>
     </w:p>
     <w:p>
@@ -8012,9 +7149,29 @@
                 <w:sz w:val="18"/>
                 <w:szCs w:val="18"/>
               </w:rPr>
-              <w:t>CI Pipeline – Build &amp; Push Docker Image (</w:t>
-            </w:r>
-            <w:proofErr w:type="spellStart"/>
+              <w:t>CI Pipeline – Build &amp; Push Docker Image (ci.yml)</w:t>
+            </w:r>
+          </w:p>
+        </w:tc>
+        <w:tc>
+          <w:tcPr>
+            <w:tcW w:w="2150" w:type="dxa"/>
+            <w:tcBorders>
+              <w:top w:val="single" w:sz="6" w:space="0" w:color="ADB9CA"/>
+              <w:left w:val="single" w:sz="6" w:space="0" w:color="ADB9CA"/>
+              <w:bottom w:val="single" w:sz="6" w:space="0" w:color="ADB9CA"/>
+              <w:right w:val="single" w:sz="6" w:space="0" w:color="ADB9CA"/>
+            </w:tcBorders>
+            <w:shd w:val="clear" w:color="auto" w:fill="2E75B6"/>
+            <w:tcMar>
+              <w:top w:w="80" w:type="dxa"/>
+              <w:left w:w="140" w:type="dxa"/>
+              <w:bottom w:w="80" w:type="dxa"/>
+              <w:right w:w="140" w:type="dxa"/>
+            </w:tcMar>
+            <w:vAlign w:val="center"/>
+          </w:tcPr>
+          <w:p>
             <w:r>
               <w:rPr>
                 <w:rFonts w:ascii="Arial" w:eastAsia="Arial" w:hAnsi="Arial" w:cs="Arial"/>
@@ -8024,9 +7181,436 @@
                 <w:sz w:val="18"/>
                 <w:szCs w:val="18"/>
               </w:rPr>
-              <w:t>ci.yml</w:t>
-            </w:r>
-            <w:proofErr w:type="spellEnd"/>
+              <w:t>25 Marks</w:t>
+            </w:r>
+          </w:p>
+        </w:tc>
+      </w:tr>
+      <w:tr>
+        <w:tc>
+          <w:tcPr>
+            <w:tcW w:w="700" w:type="dxa"/>
+            <w:tcBorders>
+              <w:top w:val="single" w:sz="6" w:space="0" w:color="ADB9CA"/>
+              <w:left w:val="single" w:sz="6" w:space="0" w:color="ADB9CA"/>
+              <w:bottom w:val="single" w:sz="6" w:space="0" w:color="ADB9CA"/>
+              <w:right w:val="single" w:sz="6" w:space="0" w:color="ADB9CA"/>
+            </w:tcBorders>
+            <w:shd w:val="clear" w:color="auto" w:fill="E8F0FB"/>
+            <w:tcMar>
+              <w:top w:w="80" w:type="dxa"/>
+              <w:left w:w="140" w:type="dxa"/>
+              <w:bottom w:w="80" w:type="dxa"/>
+              <w:right w:w="140" w:type="dxa"/>
+            </w:tcMar>
+            <w:vAlign w:val="center"/>
+          </w:tcPr>
+          <w:p>
+            <w:r>
+              <w:rPr>
+                <w:rFonts w:ascii="Arial" w:eastAsia="Arial" w:hAnsi="Arial" w:cs="Arial"/>
+                <w:b/>
+                <w:bCs/>
+                <w:color w:val="000000"/>
+                <w:sz w:val="18"/>
+                <w:szCs w:val="18"/>
+              </w:rPr>
+              <w:t>9</w:t>
+            </w:r>
+          </w:p>
+        </w:tc>
+        <w:tc>
+          <w:tcPr>
+            <w:tcW w:w="6510" w:type="dxa"/>
+            <w:tcBorders>
+              <w:top w:val="single" w:sz="6" w:space="0" w:color="ADB9CA"/>
+              <w:left w:val="single" w:sz="6" w:space="0" w:color="ADB9CA"/>
+              <w:bottom w:val="single" w:sz="6" w:space="0" w:color="ADB9CA"/>
+              <w:right w:val="single" w:sz="6" w:space="0" w:color="ADB9CA"/>
+            </w:tcBorders>
+            <w:shd w:val="clear" w:color="auto" w:fill="E8F0FB"/>
+            <w:tcMar>
+              <w:top w:w="80" w:type="dxa"/>
+              <w:left w:w="140" w:type="dxa"/>
+              <w:bottom w:w="80" w:type="dxa"/>
+              <w:right w:w="140" w:type="dxa"/>
+            </w:tcMar>
+            <w:vAlign w:val="center"/>
+          </w:tcPr>
+          <w:p>
+            <w:r>
+              <w:rPr>
+                <w:rFonts w:ascii="Arial" w:eastAsia="Arial" w:hAnsi="Arial" w:cs="Arial"/>
+                <w:color w:val="000000"/>
+                <w:sz w:val="18"/>
+                <w:szCs w:val="18"/>
+              </w:rPr>
+              <w:t xml:space="preserve">CI workflow file created at .github/workflows/ci.yml with correct pull_request trigger targeting </w:t>
+            </w:r>
+            <w:r>
+              <w:rPr>
+                <w:rFonts w:ascii="Arial" w:eastAsia="Arial" w:hAnsi="Arial" w:cs="Arial"/>
+                <w:color w:val="000000"/>
+                <w:sz w:val="18"/>
+                <w:szCs w:val="18"/>
+              </w:rPr>
+              <w:t>“develop”</w:t>
+            </w:r>
+          </w:p>
+        </w:tc>
+        <w:tc>
+          <w:tcPr>
+            <w:tcW w:w="2150" w:type="dxa"/>
+            <w:tcBorders>
+              <w:top w:val="single" w:sz="6" w:space="0" w:color="ADB9CA"/>
+              <w:left w:val="single" w:sz="6" w:space="0" w:color="ADB9CA"/>
+              <w:bottom w:val="single" w:sz="6" w:space="0" w:color="ADB9CA"/>
+              <w:right w:val="single" w:sz="6" w:space="0" w:color="ADB9CA"/>
+            </w:tcBorders>
+            <w:shd w:val="clear" w:color="auto" w:fill="E8F0FB"/>
+            <w:tcMar>
+              <w:top w:w="80" w:type="dxa"/>
+              <w:left w:w="140" w:type="dxa"/>
+              <w:bottom w:w="80" w:type="dxa"/>
+              <w:right w:w="140" w:type="dxa"/>
+            </w:tcMar>
+            <w:vAlign w:val="center"/>
+          </w:tcPr>
+          <w:p>
+            <w:r>
+              <w:rPr>
+                <w:rFonts w:ascii="Arial" w:eastAsia="Arial" w:hAnsi="Arial" w:cs="Arial"/>
+                <w:color w:val="000000"/>
+                <w:sz w:val="18"/>
+                <w:szCs w:val="18"/>
+              </w:rPr>
+              <w:t>07</w:t>
+            </w:r>
+          </w:p>
+        </w:tc>
+      </w:tr>
+      <w:tr>
+        <w:tc>
+          <w:tcPr>
+            <w:tcW w:w="700" w:type="dxa"/>
+            <w:tcBorders>
+              <w:top w:val="single" w:sz="6" w:space="0" w:color="ADB9CA"/>
+              <w:left w:val="single" w:sz="6" w:space="0" w:color="ADB9CA"/>
+              <w:bottom w:val="single" w:sz="6" w:space="0" w:color="ADB9CA"/>
+              <w:right w:val="single" w:sz="6" w:space="0" w:color="ADB9CA"/>
+            </w:tcBorders>
+            <w:shd w:val="clear" w:color="auto" w:fill="FFFFFF"/>
+            <w:tcMar>
+              <w:top w:w="80" w:type="dxa"/>
+              <w:left w:w="140" w:type="dxa"/>
+              <w:bottom w:w="80" w:type="dxa"/>
+              <w:right w:w="140" w:type="dxa"/>
+            </w:tcMar>
+            <w:vAlign w:val="center"/>
+          </w:tcPr>
+          <w:p>
+            <w:r>
+              <w:rPr>
+                <w:rFonts w:ascii="Arial" w:eastAsia="Arial" w:hAnsi="Arial" w:cs="Arial"/>
+                <w:b/>
+                <w:bCs/>
+                <w:color w:val="000000"/>
+                <w:sz w:val="18"/>
+                <w:szCs w:val="18"/>
+              </w:rPr>
+              <w:t>10</w:t>
+            </w:r>
+          </w:p>
+        </w:tc>
+        <w:tc>
+          <w:tcPr>
+            <w:tcW w:w="6510" w:type="dxa"/>
+            <w:tcBorders>
+              <w:top w:val="single" w:sz="6" w:space="0" w:color="ADB9CA"/>
+              <w:left w:val="single" w:sz="6" w:space="0" w:color="ADB9CA"/>
+              <w:bottom w:val="single" w:sz="6" w:space="0" w:color="ADB9CA"/>
+              <w:right w:val="single" w:sz="6" w:space="0" w:color="ADB9CA"/>
+            </w:tcBorders>
+            <w:shd w:val="clear" w:color="auto" w:fill="FFFFFF"/>
+            <w:tcMar>
+              <w:top w:w="80" w:type="dxa"/>
+              <w:left w:w="140" w:type="dxa"/>
+              <w:bottom w:w="80" w:type="dxa"/>
+              <w:right w:w="140" w:type="dxa"/>
+            </w:tcMar>
+            <w:vAlign w:val="center"/>
+          </w:tcPr>
+          <w:p>
+            <w:r>
+              <w:rPr>
+                <w:rFonts w:ascii="Arial" w:eastAsia="Arial" w:hAnsi="Arial" w:cs="Arial"/>
+                <w:color w:val="000000"/>
+                <w:sz w:val="18"/>
+                <w:szCs w:val="18"/>
+              </w:rPr>
+              <w:t>Checkout code, login to Docker Hub using Team Lead's repository secrets</w:t>
+            </w:r>
+          </w:p>
+        </w:tc>
+        <w:tc>
+          <w:tcPr>
+            <w:tcW w:w="2150" w:type="dxa"/>
+            <w:tcBorders>
+              <w:top w:val="single" w:sz="6" w:space="0" w:color="ADB9CA"/>
+              <w:left w:val="single" w:sz="6" w:space="0" w:color="ADB9CA"/>
+              <w:bottom w:val="single" w:sz="6" w:space="0" w:color="ADB9CA"/>
+              <w:right w:val="single" w:sz="6" w:space="0" w:color="ADB9CA"/>
+            </w:tcBorders>
+            <w:shd w:val="clear" w:color="auto" w:fill="FFFFFF"/>
+            <w:tcMar>
+              <w:top w:w="80" w:type="dxa"/>
+              <w:left w:w="140" w:type="dxa"/>
+              <w:bottom w:w="80" w:type="dxa"/>
+              <w:right w:w="140" w:type="dxa"/>
+            </w:tcMar>
+            <w:vAlign w:val="center"/>
+          </w:tcPr>
+          <w:p>
+            <w:r>
+              <w:rPr>
+                <w:rFonts w:ascii="Arial" w:eastAsia="Arial" w:hAnsi="Arial" w:cs="Arial"/>
+                <w:color w:val="000000"/>
+                <w:sz w:val="18"/>
+                <w:szCs w:val="18"/>
+              </w:rPr>
+              <w:t>06</w:t>
+            </w:r>
+          </w:p>
+        </w:tc>
+      </w:tr>
+      <w:tr>
+        <w:tc>
+          <w:tcPr>
+            <w:tcW w:w="700" w:type="dxa"/>
+            <w:tcBorders>
+              <w:top w:val="single" w:sz="6" w:space="0" w:color="ADB9CA"/>
+              <w:left w:val="single" w:sz="6" w:space="0" w:color="ADB9CA"/>
+              <w:bottom w:val="single" w:sz="6" w:space="0" w:color="ADB9CA"/>
+              <w:right w:val="single" w:sz="6" w:space="0" w:color="ADB9CA"/>
+            </w:tcBorders>
+            <w:shd w:val="clear" w:color="auto" w:fill="E8F0FB"/>
+            <w:tcMar>
+              <w:top w:w="80" w:type="dxa"/>
+              <w:left w:w="140" w:type="dxa"/>
+              <w:bottom w:w="80" w:type="dxa"/>
+              <w:right w:w="140" w:type="dxa"/>
+            </w:tcMar>
+            <w:vAlign w:val="center"/>
+          </w:tcPr>
+          <w:p>
+            <w:r>
+              <w:rPr>
+                <w:rFonts w:ascii="Arial" w:eastAsia="Arial" w:hAnsi="Arial" w:cs="Arial"/>
+                <w:b/>
+                <w:bCs/>
+                <w:color w:val="000000"/>
+                <w:sz w:val="18"/>
+                <w:szCs w:val="18"/>
+              </w:rPr>
+              <w:t>11</w:t>
+            </w:r>
+          </w:p>
+        </w:tc>
+        <w:tc>
+          <w:tcPr>
+            <w:tcW w:w="6510" w:type="dxa"/>
+            <w:tcBorders>
+              <w:top w:val="single" w:sz="6" w:space="0" w:color="ADB9CA"/>
+              <w:left w:val="single" w:sz="6" w:space="0" w:color="ADB9CA"/>
+              <w:bottom w:val="single" w:sz="6" w:space="0" w:color="ADB9CA"/>
+              <w:right w:val="single" w:sz="6" w:space="0" w:color="ADB9CA"/>
+            </w:tcBorders>
+            <w:shd w:val="clear" w:color="auto" w:fill="E8F0FB"/>
+            <w:tcMar>
+              <w:top w:w="80" w:type="dxa"/>
+              <w:left w:w="140" w:type="dxa"/>
+              <w:bottom w:w="80" w:type="dxa"/>
+              <w:right w:w="140" w:type="dxa"/>
+            </w:tcMar>
+            <w:vAlign w:val="center"/>
+          </w:tcPr>
+          <w:p>
+            <w:r>
+              <w:rPr>
+                <w:rFonts w:ascii="Arial" w:eastAsia="Arial" w:hAnsi="Arial" w:cs="Arial"/>
+                <w:color w:val="000000"/>
+                <w:sz w:val="18"/>
+                <w:szCs w:val="18"/>
+              </w:rPr>
+              <w:t>Build Docker image and tag correctly (latest and/or commit SHA)</w:t>
+            </w:r>
+          </w:p>
+        </w:tc>
+        <w:tc>
+          <w:tcPr>
+            <w:tcW w:w="2150" w:type="dxa"/>
+            <w:tcBorders>
+              <w:top w:val="single" w:sz="6" w:space="0" w:color="ADB9CA"/>
+              <w:left w:val="single" w:sz="6" w:space="0" w:color="ADB9CA"/>
+              <w:bottom w:val="single" w:sz="6" w:space="0" w:color="ADB9CA"/>
+              <w:right w:val="single" w:sz="6" w:space="0" w:color="ADB9CA"/>
+            </w:tcBorders>
+            <w:shd w:val="clear" w:color="auto" w:fill="E8F0FB"/>
+            <w:tcMar>
+              <w:top w:w="80" w:type="dxa"/>
+              <w:left w:w="140" w:type="dxa"/>
+              <w:bottom w:w="80" w:type="dxa"/>
+              <w:right w:w="140" w:type="dxa"/>
+            </w:tcMar>
+            <w:vAlign w:val="center"/>
+          </w:tcPr>
+          <w:p>
+            <w:r>
+              <w:rPr>
+                <w:rFonts w:ascii="Arial" w:eastAsia="Arial" w:hAnsi="Arial" w:cs="Arial"/>
+                <w:color w:val="000000"/>
+                <w:sz w:val="18"/>
+                <w:szCs w:val="18"/>
+              </w:rPr>
+              <w:t>06</w:t>
+            </w:r>
+          </w:p>
+        </w:tc>
+      </w:tr>
+      <w:tr>
+        <w:tc>
+          <w:tcPr>
+            <w:tcW w:w="700" w:type="dxa"/>
+            <w:tcBorders>
+              <w:top w:val="single" w:sz="6" w:space="0" w:color="ADB9CA"/>
+              <w:left w:val="single" w:sz="6" w:space="0" w:color="ADB9CA"/>
+              <w:bottom w:val="single" w:sz="6" w:space="0" w:color="ADB9CA"/>
+              <w:right w:val="single" w:sz="6" w:space="0" w:color="ADB9CA"/>
+            </w:tcBorders>
+            <w:shd w:val="clear" w:color="auto" w:fill="FFFFFF"/>
+            <w:tcMar>
+              <w:top w:w="80" w:type="dxa"/>
+              <w:left w:w="140" w:type="dxa"/>
+              <w:bottom w:w="80" w:type="dxa"/>
+              <w:right w:w="140" w:type="dxa"/>
+            </w:tcMar>
+            <w:vAlign w:val="center"/>
+          </w:tcPr>
+          <w:p>
+            <w:r>
+              <w:rPr>
+                <w:rFonts w:ascii="Arial" w:eastAsia="Arial" w:hAnsi="Arial" w:cs="Arial"/>
+                <w:b/>
+                <w:bCs/>
+                <w:color w:val="000000"/>
+                <w:sz w:val="18"/>
+                <w:szCs w:val="18"/>
+              </w:rPr>
+              <w:t>12</w:t>
+            </w:r>
+          </w:p>
+        </w:tc>
+        <w:tc>
+          <w:tcPr>
+            <w:tcW w:w="6510" w:type="dxa"/>
+            <w:tcBorders>
+              <w:top w:val="single" w:sz="6" w:space="0" w:color="ADB9CA"/>
+              <w:left w:val="single" w:sz="6" w:space="0" w:color="ADB9CA"/>
+              <w:bottom w:val="single" w:sz="6" w:space="0" w:color="ADB9CA"/>
+              <w:right w:val="single" w:sz="6" w:space="0" w:color="ADB9CA"/>
+            </w:tcBorders>
+            <w:shd w:val="clear" w:color="auto" w:fill="FFFFFF"/>
+            <w:tcMar>
+              <w:top w:w="80" w:type="dxa"/>
+              <w:left w:w="140" w:type="dxa"/>
+              <w:bottom w:w="80" w:type="dxa"/>
+              <w:right w:w="140" w:type="dxa"/>
+            </w:tcMar>
+            <w:vAlign w:val="center"/>
+          </w:tcPr>
+          <w:p>
+            <w:r>
+              <w:rPr>
+                <w:rFonts w:ascii="Arial" w:eastAsia="Arial" w:hAnsi="Arial" w:cs="Arial"/>
+                <w:color w:val="000000"/>
+                <w:sz w:val="18"/>
+                <w:szCs w:val="18"/>
+              </w:rPr>
+              <w:t>Push image to Docker Hub successfully; workflow exits on any step failure</w:t>
+            </w:r>
+          </w:p>
+        </w:tc>
+        <w:tc>
+          <w:tcPr>
+            <w:tcW w:w="2150" w:type="dxa"/>
+            <w:tcBorders>
+              <w:top w:val="single" w:sz="6" w:space="0" w:color="ADB9CA"/>
+              <w:left w:val="single" w:sz="6" w:space="0" w:color="ADB9CA"/>
+              <w:bottom w:val="single" w:sz="6" w:space="0" w:color="ADB9CA"/>
+              <w:right w:val="single" w:sz="6" w:space="0" w:color="ADB9CA"/>
+            </w:tcBorders>
+            <w:shd w:val="clear" w:color="auto" w:fill="FFFFFF"/>
+            <w:tcMar>
+              <w:top w:w="80" w:type="dxa"/>
+              <w:left w:w="140" w:type="dxa"/>
+              <w:bottom w:w="80" w:type="dxa"/>
+              <w:right w:w="140" w:type="dxa"/>
+            </w:tcMar>
+            <w:vAlign w:val="center"/>
+          </w:tcPr>
+          <w:p>
+            <w:r>
+              <w:rPr>
+                <w:rFonts w:ascii="Arial" w:eastAsia="Arial" w:hAnsi="Arial" w:cs="Arial"/>
+                <w:color w:val="000000"/>
+                <w:sz w:val="18"/>
+                <w:szCs w:val="18"/>
+              </w:rPr>
+              <w:t>06</w:t>
+            </w:r>
+          </w:p>
+        </w:tc>
+      </w:tr>
+      <w:tr>
+        <w:tc>
+          <w:tcPr>
+            <w:tcW w:w="700" w:type="dxa"/>
+            <w:tcBorders>
+              <w:top w:val="single" w:sz="6" w:space="0" w:color="ADB9CA"/>
+              <w:left w:val="single" w:sz="6" w:space="0" w:color="ADB9CA"/>
+              <w:bottom w:val="single" w:sz="6" w:space="0" w:color="ADB9CA"/>
+              <w:right w:val="single" w:sz="6" w:space="0" w:color="ADB9CA"/>
+            </w:tcBorders>
+            <w:shd w:val="clear" w:color="auto" w:fill="2E75B6"/>
+            <w:tcMar>
+              <w:top w:w="80" w:type="dxa"/>
+              <w:left w:w="140" w:type="dxa"/>
+              <w:bottom w:w="80" w:type="dxa"/>
+              <w:right w:w="140" w:type="dxa"/>
+            </w:tcMar>
+            <w:vAlign w:val="center"/>
+          </w:tcPr>
+          <w:p/>
+        </w:tc>
+        <w:tc>
+          <w:tcPr>
+            <w:tcW w:w="6510" w:type="dxa"/>
+            <w:tcBorders>
+              <w:top w:val="single" w:sz="6" w:space="0" w:color="ADB9CA"/>
+              <w:left w:val="single" w:sz="6" w:space="0" w:color="ADB9CA"/>
+              <w:bottom w:val="single" w:sz="6" w:space="0" w:color="ADB9CA"/>
+              <w:right w:val="single" w:sz="6" w:space="0" w:color="ADB9CA"/>
+            </w:tcBorders>
+            <w:shd w:val="clear" w:color="auto" w:fill="2E75B6"/>
+            <w:tcMar>
+              <w:top w:w="80" w:type="dxa"/>
+              <w:left w:w="140" w:type="dxa"/>
+              <w:bottom w:w="80" w:type="dxa"/>
+              <w:right w:w="140" w:type="dxa"/>
+            </w:tcMar>
+            <w:vAlign w:val="center"/>
+          </w:tcPr>
+          <w:p>
             <w:r>
               <w:rPr>
                 <w:rFonts w:ascii="Arial" w:eastAsia="Arial" w:hAnsi="Arial" w:cs="Arial"/>
@@ -8036,7 +7620,7 @@
                 <w:sz w:val="18"/>
                 <w:szCs w:val="18"/>
               </w:rPr>
-              <w:t>)</w:t>
+              <w:t>CD Pipeline – Automated Deployment to Render (cd.yml)</w:t>
             </w:r>
           </w:p>
         </w:tc>
@@ -8068,7 +7652,7 @@
                 <w:sz w:val="18"/>
                 <w:szCs w:val="18"/>
               </w:rPr>
-              <w:t>25 Marks</w:t>
+              <w:t>20 Marks</w:t>
             </w:r>
           </w:p>
         </w:tc>
@@ -8102,7 +7686,7 @@
                 <w:sz w:val="18"/>
                 <w:szCs w:val="18"/>
               </w:rPr>
-              <w:t>9</w:t>
+              <w:t>13</w:t>
             </w:r>
           </w:p>
         </w:tc>
@@ -8132,622 +7716,7 @@
                 <w:sz w:val="18"/>
                 <w:szCs w:val="18"/>
               </w:rPr>
-              <w:t>CI workflow file created at .</w:t>
-            </w:r>
-            <w:proofErr w:type="spellStart"/>
-            <w:r>
-              <w:rPr>
-                <w:rFonts w:ascii="Arial" w:eastAsia="Arial" w:hAnsi="Arial" w:cs="Arial"/>
-                <w:color w:val="000000"/>
-                <w:sz w:val="18"/>
-                <w:szCs w:val="18"/>
-              </w:rPr>
-              <w:t>github</w:t>
-            </w:r>
-            <w:proofErr w:type="spellEnd"/>
-            <w:r>
-              <w:rPr>
-                <w:rFonts w:ascii="Arial" w:eastAsia="Arial" w:hAnsi="Arial" w:cs="Arial"/>
-                <w:color w:val="000000"/>
-                <w:sz w:val="18"/>
-                <w:szCs w:val="18"/>
-              </w:rPr>
-              <w:t>/workflows/</w:t>
-            </w:r>
-            <w:proofErr w:type="spellStart"/>
-            <w:r>
-              <w:rPr>
-                <w:rFonts w:ascii="Arial" w:eastAsia="Arial" w:hAnsi="Arial" w:cs="Arial"/>
-                <w:color w:val="000000"/>
-                <w:sz w:val="18"/>
-                <w:szCs w:val="18"/>
-              </w:rPr>
-              <w:t>ci.yml</w:t>
-            </w:r>
-            <w:proofErr w:type="spellEnd"/>
-            <w:r>
-              <w:rPr>
-                <w:rFonts w:ascii="Arial" w:eastAsia="Arial" w:hAnsi="Arial" w:cs="Arial"/>
-                <w:color w:val="000000"/>
-                <w:sz w:val="18"/>
-                <w:szCs w:val="18"/>
-              </w:rPr>
-              <w:t xml:space="preserve"> with correct </w:t>
-            </w:r>
-            <w:proofErr w:type="spellStart"/>
-            <w:r>
-              <w:rPr>
-                <w:rFonts w:ascii="Arial" w:eastAsia="Arial" w:hAnsi="Arial" w:cs="Arial"/>
-                <w:color w:val="000000"/>
-                <w:sz w:val="18"/>
-                <w:szCs w:val="18"/>
-              </w:rPr>
-              <w:t>pull_request</w:t>
-            </w:r>
-            <w:proofErr w:type="spellEnd"/>
-            <w:r>
-              <w:rPr>
-                <w:rFonts w:ascii="Arial" w:eastAsia="Arial" w:hAnsi="Arial" w:cs="Arial"/>
-                <w:color w:val="000000"/>
-                <w:sz w:val="18"/>
-                <w:szCs w:val="18"/>
-              </w:rPr>
-              <w:t xml:space="preserve"> trigger targeting </w:t>
-            </w:r>
-            <w:r>
-              <w:rPr>
-                <w:rFonts w:ascii="Arial" w:eastAsia="Arial" w:hAnsi="Arial" w:cs="Arial"/>
-                <w:color w:val="000000"/>
-                <w:sz w:val="18"/>
-                <w:szCs w:val="18"/>
-              </w:rPr>
-              <w:t>“</w:t>
-            </w:r>
-            <w:proofErr w:type="gramStart"/>
-            <w:r>
-              <w:rPr>
-                <w:rFonts w:ascii="Arial" w:eastAsia="Arial" w:hAnsi="Arial" w:cs="Arial"/>
-                <w:color w:val="000000"/>
-                <w:sz w:val="18"/>
-                <w:szCs w:val="18"/>
-              </w:rPr>
-              <w:t>develop</w:t>
-            </w:r>
-            <w:proofErr w:type="gramEnd"/>
-            <w:r>
-              <w:rPr>
-                <w:rFonts w:ascii="Arial" w:eastAsia="Arial" w:hAnsi="Arial" w:cs="Arial"/>
-                <w:color w:val="000000"/>
-                <w:sz w:val="18"/>
-                <w:szCs w:val="18"/>
-              </w:rPr>
-              <w:t>”</w:t>
-            </w:r>
-          </w:p>
-        </w:tc>
-        <w:tc>
-          <w:tcPr>
-            <w:tcW w:w="2150" w:type="dxa"/>
-            <w:tcBorders>
-              <w:top w:val="single" w:sz="6" w:space="0" w:color="ADB9CA"/>
-              <w:left w:val="single" w:sz="6" w:space="0" w:color="ADB9CA"/>
-              <w:bottom w:val="single" w:sz="6" w:space="0" w:color="ADB9CA"/>
-              <w:right w:val="single" w:sz="6" w:space="0" w:color="ADB9CA"/>
-            </w:tcBorders>
-            <w:shd w:val="clear" w:color="auto" w:fill="E8F0FB"/>
-            <w:tcMar>
-              <w:top w:w="80" w:type="dxa"/>
-              <w:left w:w="140" w:type="dxa"/>
-              <w:bottom w:w="80" w:type="dxa"/>
-              <w:right w:w="140" w:type="dxa"/>
-            </w:tcMar>
-            <w:vAlign w:val="center"/>
-          </w:tcPr>
-          <w:p>
-            <w:r>
-              <w:rPr>
-                <w:rFonts w:ascii="Arial" w:eastAsia="Arial" w:hAnsi="Arial" w:cs="Arial"/>
-                <w:color w:val="000000"/>
-                <w:sz w:val="18"/>
-                <w:szCs w:val="18"/>
-              </w:rPr>
-              <w:t>07</w:t>
-            </w:r>
-          </w:p>
-        </w:tc>
-      </w:tr>
-      <w:tr>
-        <w:tc>
-          <w:tcPr>
-            <w:tcW w:w="700" w:type="dxa"/>
-            <w:tcBorders>
-              <w:top w:val="single" w:sz="6" w:space="0" w:color="ADB9CA"/>
-              <w:left w:val="single" w:sz="6" w:space="0" w:color="ADB9CA"/>
-              <w:bottom w:val="single" w:sz="6" w:space="0" w:color="ADB9CA"/>
-              <w:right w:val="single" w:sz="6" w:space="0" w:color="ADB9CA"/>
-            </w:tcBorders>
-            <w:shd w:val="clear" w:color="auto" w:fill="FFFFFF"/>
-            <w:tcMar>
-              <w:top w:w="80" w:type="dxa"/>
-              <w:left w:w="140" w:type="dxa"/>
-              <w:bottom w:w="80" w:type="dxa"/>
-              <w:right w:w="140" w:type="dxa"/>
-            </w:tcMar>
-            <w:vAlign w:val="center"/>
-          </w:tcPr>
-          <w:p>
-            <w:r>
-              <w:rPr>
-                <w:rFonts w:ascii="Arial" w:eastAsia="Arial" w:hAnsi="Arial" w:cs="Arial"/>
-                <w:b/>
-                <w:bCs/>
-                <w:color w:val="000000"/>
-                <w:sz w:val="18"/>
-                <w:szCs w:val="18"/>
-              </w:rPr>
-              <w:t>10</w:t>
-            </w:r>
-          </w:p>
-        </w:tc>
-        <w:tc>
-          <w:tcPr>
-            <w:tcW w:w="6510" w:type="dxa"/>
-            <w:tcBorders>
-              <w:top w:val="single" w:sz="6" w:space="0" w:color="ADB9CA"/>
-              <w:left w:val="single" w:sz="6" w:space="0" w:color="ADB9CA"/>
-              <w:bottom w:val="single" w:sz="6" w:space="0" w:color="ADB9CA"/>
-              <w:right w:val="single" w:sz="6" w:space="0" w:color="ADB9CA"/>
-            </w:tcBorders>
-            <w:shd w:val="clear" w:color="auto" w:fill="FFFFFF"/>
-            <w:tcMar>
-              <w:top w:w="80" w:type="dxa"/>
-              <w:left w:w="140" w:type="dxa"/>
-              <w:bottom w:w="80" w:type="dxa"/>
-              <w:right w:w="140" w:type="dxa"/>
-            </w:tcMar>
-            <w:vAlign w:val="center"/>
-          </w:tcPr>
-          <w:p>
-            <w:r>
-              <w:rPr>
-                <w:rFonts w:ascii="Arial" w:eastAsia="Arial" w:hAnsi="Arial" w:cs="Arial"/>
-                <w:color w:val="000000"/>
-                <w:sz w:val="18"/>
-                <w:szCs w:val="18"/>
-              </w:rPr>
-              <w:t>Checkout code, login to Docker Hub using Team Lead's repository secrets</w:t>
-            </w:r>
-          </w:p>
-        </w:tc>
-        <w:tc>
-          <w:tcPr>
-            <w:tcW w:w="2150" w:type="dxa"/>
-            <w:tcBorders>
-              <w:top w:val="single" w:sz="6" w:space="0" w:color="ADB9CA"/>
-              <w:left w:val="single" w:sz="6" w:space="0" w:color="ADB9CA"/>
-              <w:bottom w:val="single" w:sz="6" w:space="0" w:color="ADB9CA"/>
-              <w:right w:val="single" w:sz="6" w:space="0" w:color="ADB9CA"/>
-            </w:tcBorders>
-            <w:shd w:val="clear" w:color="auto" w:fill="FFFFFF"/>
-            <w:tcMar>
-              <w:top w:w="80" w:type="dxa"/>
-              <w:left w:w="140" w:type="dxa"/>
-              <w:bottom w:w="80" w:type="dxa"/>
-              <w:right w:w="140" w:type="dxa"/>
-            </w:tcMar>
-            <w:vAlign w:val="center"/>
-          </w:tcPr>
-          <w:p>
-            <w:r>
-              <w:rPr>
-                <w:rFonts w:ascii="Arial" w:eastAsia="Arial" w:hAnsi="Arial" w:cs="Arial"/>
-                <w:color w:val="000000"/>
-                <w:sz w:val="18"/>
-                <w:szCs w:val="18"/>
-              </w:rPr>
-              <w:t>06</w:t>
-            </w:r>
-          </w:p>
-        </w:tc>
-      </w:tr>
-      <w:tr>
-        <w:tc>
-          <w:tcPr>
-            <w:tcW w:w="700" w:type="dxa"/>
-            <w:tcBorders>
-              <w:top w:val="single" w:sz="6" w:space="0" w:color="ADB9CA"/>
-              <w:left w:val="single" w:sz="6" w:space="0" w:color="ADB9CA"/>
-              <w:bottom w:val="single" w:sz="6" w:space="0" w:color="ADB9CA"/>
-              <w:right w:val="single" w:sz="6" w:space="0" w:color="ADB9CA"/>
-            </w:tcBorders>
-            <w:shd w:val="clear" w:color="auto" w:fill="E8F0FB"/>
-            <w:tcMar>
-              <w:top w:w="80" w:type="dxa"/>
-              <w:left w:w="140" w:type="dxa"/>
-              <w:bottom w:w="80" w:type="dxa"/>
-              <w:right w:w="140" w:type="dxa"/>
-            </w:tcMar>
-            <w:vAlign w:val="center"/>
-          </w:tcPr>
-          <w:p>
-            <w:r>
-              <w:rPr>
-                <w:rFonts w:ascii="Arial" w:eastAsia="Arial" w:hAnsi="Arial" w:cs="Arial"/>
-                <w:b/>
-                <w:bCs/>
-                <w:color w:val="000000"/>
-                <w:sz w:val="18"/>
-                <w:szCs w:val="18"/>
-              </w:rPr>
-              <w:t>11</w:t>
-            </w:r>
-          </w:p>
-        </w:tc>
-        <w:tc>
-          <w:tcPr>
-            <w:tcW w:w="6510" w:type="dxa"/>
-            <w:tcBorders>
-              <w:top w:val="single" w:sz="6" w:space="0" w:color="ADB9CA"/>
-              <w:left w:val="single" w:sz="6" w:space="0" w:color="ADB9CA"/>
-              <w:bottom w:val="single" w:sz="6" w:space="0" w:color="ADB9CA"/>
-              <w:right w:val="single" w:sz="6" w:space="0" w:color="ADB9CA"/>
-            </w:tcBorders>
-            <w:shd w:val="clear" w:color="auto" w:fill="E8F0FB"/>
-            <w:tcMar>
-              <w:top w:w="80" w:type="dxa"/>
-              <w:left w:w="140" w:type="dxa"/>
-              <w:bottom w:w="80" w:type="dxa"/>
-              <w:right w:w="140" w:type="dxa"/>
-            </w:tcMar>
-            <w:vAlign w:val="center"/>
-          </w:tcPr>
-          <w:p>
-            <w:r>
-              <w:rPr>
-                <w:rFonts w:ascii="Arial" w:eastAsia="Arial" w:hAnsi="Arial" w:cs="Arial"/>
-                <w:color w:val="000000"/>
-                <w:sz w:val="18"/>
-                <w:szCs w:val="18"/>
-              </w:rPr>
-              <w:t>Build Docker image and tag correctly (latest and/or commit SHA)</w:t>
-            </w:r>
-          </w:p>
-        </w:tc>
-        <w:tc>
-          <w:tcPr>
-            <w:tcW w:w="2150" w:type="dxa"/>
-            <w:tcBorders>
-              <w:top w:val="single" w:sz="6" w:space="0" w:color="ADB9CA"/>
-              <w:left w:val="single" w:sz="6" w:space="0" w:color="ADB9CA"/>
-              <w:bottom w:val="single" w:sz="6" w:space="0" w:color="ADB9CA"/>
-              <w:right w:val="single" w:sz="6" w:space="0" w:color="ADB9CA"/>
-            </w:tcBorders>
-            <w:shd w:val="clear" w:color="auto" w:fill="E8F0FB"/>
-            <w:tcMar>
-              <w:top w:w="80" w:type="dxa"/>
-              <w:left w:w="140" w:type="dxa"/>
-              <w:bottom w:w="80" w:type="dxa"/>
-              <w:right w:w="140" w:type="dxa"/>
-            </w:tcMar>
-            <w:vAlign w:val="center"/>
-          </w:tcPr>
-          <w:p>
-            <w:r>
-              <w:rPr>
-                <w:rFonts w:ascii="Arial" w:eastAsia="Arial" w:hAnsi="Arial" w:cs="Arial"/>
-                <w:color w:val="000000"/>
-                <w:sz w:val="18"/>
-                <w:szCs w:val="18"/>
-              </w:rPr>
-              <w:t>06</w:t>
-            </w:r>
-          </w:p>
-        </w:tc>
-      </w:tr>
-      <w:tr>
-        <w:tc>
-          <w:tcPr>
-            <w:tcW w:w="700" w:type="dxa"/>
-            <w:tcBorders>
-              <w:top w:val="single" w:sz="6" w:space="0" w:color="ADB9CA"/>
-              <w:left w:val="single" w:sz="6" w:space="0" w:color="ADB9CA"/>
-              <w:bottom w:val="single" w:sz="6" w:space="0" w:color="ADB9CA"/>
-              <w:right w:val="single" w:sz="6" w:space="0" w:color="ADB9CA"/>
-            </w:tcBorders>
-            <w:shd w:val="clear" w:color="auto" w:fill="FFFFFF"/>
-            <w:tcMar>
-              <w:top w:w="80" w:type="dxa"/>
-              <w:left w:w="140" w:type="dxa"/>
-              <w:bottom w:w="80" w:type="dxa"/>
-              <w:right w:w="140" w:type="dxa"/>
-            </w:tcMar>
-            <w:vAlign w:val="center"/>
-          </w:tcPr>
-          <w:p>
-            <w:r>
-              <w:rPr>
-                <w:rFonts w:ascii="Arial" w:eastAsia="Arial" w:hAnsi="Arial" w:cs="Arial"/>
-                <w:b/>
-                <w:bCs/>
-                <w:color w:val="000000"/>
-                <w:sz w:val="18"/>
-                <w:szCs w:val="18"/>
-              </w:rPr>
-              <w:t>12</w:t>
-            </w:r>
-          </w:p>
-        </w:tc>
-        <w:tc>
-          <w:tcPr>
-            <w:tcW w:w="6510" w:type="dxa"/>
-            <w:tcBorders>
-              <w:top w:val="single" w:sz="6" w:space="0" w:color="ADB9CA"/>
-              <w:left w:val="single" w:sz="6" w:space="0" w:color="ADB9CA"/>
-              <w:bottom w:val="single" w:sz="6" w:space="0" w:color="ADB9CA"/>
-              <w:right w:val="single" w:sz="6" w:space="0" w:color="ADB9CA"/>
-            </w:tcBorders>
-            <w:shd w:val="clear" w:color="auto" w:fill="FFFFFF"/>
-            <w:tcMar>
-              <w:top w:w="80" w:type="dxa"/>
-              <w:left w:w="140" w:type="dxa"/>
-              <w:bottom w:w="80" w:type="dxa"/>
-              <w:right w:w="140" w:type="dxa"/>
-            </w:tcMar>
-            <w:vAlign w:val="center"/>
-          </w:tcPr>
-          <w:p>
-            <w:r>
-              <w:rPr>
-                <w:rFonts w:ascii="Arial" w:eastAsia="Arial" w:hAnsi="Arial" w:cs="Arial"/>
-                <w:color w:val="000000"/>
-                <w:sz w:val="18"/>
-                <w:szCs w:val="18"/>
-              </w:rPr>
-              <w:t>Push image to Docker Hub successfully; workflow exits on any step failure</w:t>
-            </w:r>
-          </w:p>
-        </w:tc>
-        <w:tc>
-          <w:tcPr>
-            <w:tcW w:w="2150" w:type="dxa"/>
-            <w:tcBorders>
-              <w:top w:val="single" w:sz="6" w:space="0" w:color="ADB9CA"/>
-              <w:left w:val="single" w:sz="6" w:space="0" w:color="ADB9CA"/>
-              <w:bottom w:val="single" w:sz="6" w:space="0" w:color="ADB9CA"/>
-              <w:right w:val="single" w:sz="6" w:space="0" w:color="ADB9CA"/>
-            </w:tcBorders>
-            <w:shd w:val="clear" w:color="auto" w:fill="FFFFFF"/>
-            <w:tcMar>
-              <w:top w:w="80" w:type="dxa"/>
-              <w:left w:w="140" w:type="dxa"/>
-              <w:bottom w:w="80" w:type="dxa"/>
-              <w:right w:w="140" w:type="dxa"/>
-            </w:tcMar>
-            <w:vAlign w:val="center"/>
-          </w:tcPr>
-          <w:p>
-            <w:r>
-              <w:rPr>
-                <w:rFonts w:ascii="Arial" w:eastAsia="Arial" w:hAnsi="Arial" w:cs="Arial"/>
-                <w:color w:val="000000"/>
-                <w:sz w:val="18"/>
-                <w:szCs w:val="18"/>
-              </w:rPr>
-              <w:t>06</w:t>
-            </w:r>
-          </w:p>
-        </w:tc>
-      </w:tr>
-      <w:tr>
-        <w:tc>
-          <w:tcPr>
-            <w:tcW w:w="700" w:type="dxa"/>
-            <w:tcBorders>
-              <w:top w:val="single" w:sz="6" w:space="0" w:color="ADB9CA"/>
-              <w:left w:val="single" w:sz="6" w:space="0" w:color="ADB9CA"/>
-              <w:bottom w:val="single" w:sz="6" w:space="0" w:color="ADB9CA"/>
-              <w:right w:val="single" w:sz="6" w:space="0" w:color="ADB9CA"/>
-            </w:tcBorders>
-            <w:shd w:val="clear" w:color="auto" w:fill="2E75B6"/>
-            <w:tcMar>
-              <w:top w:w="80" w:type="dxa"/>
-              <w:left w:w="140" w:type="dxa"/>
-              <w:bottom w:w="80" w:type="dxa"/>
-              <w:right w:w="140" w:type="dxa"/>
-            </w:tcMar>
-            <w:vAlign w:val="center"/>
-          </w:tcPr>
-          <w:p/>
-        </w:tc>
-        <w:tc>
-          <w:tcPr>
-            <w:tcW w:w="6510" w:type="dxa"/>
-            <w:tcBorders>
-              <w:top w:val="single" w:sz="6" w:space="0" w:color="ADB9CA"/>
-              <w:left w:val="single" w:sz="6" w:space="0" w:color="ADB9CA"/>
-              <w:bottom w:val="single" w:sz="6" w:space="0" w:color="ADB9CA"/>
-              <w:right w:val="single" w:sz="6" w:space="0" w:color="ADB9CA"/>
-            </w:tcBorders>
-            <w:shd w:val="clear" w:color="auto" w:fill="2E75B6"/>
-            <w:tcMar>
-              <w:top w:w="80" w:type="dxa"/>
-              <w:left w:w="140" w:type="dxa"/>
-              <w:bottom w:w="80" w:type="dxa"/>
-              <w:right w:w="140" w:type="dxa"/>
-            </w:tcMar>
-            <w:vAlign w:val="center"/>
-          </w:tcPr>
-          <w:p>
-            <w:r>
-              <w:rPr>
-                <w:rFonts w:ascii="Arial" w:eastAsia="Arial" w:hAnsi="Arial" w:cs="Arial"/>
-                <w:b/>
-                <w:bCs/>
-                <w:color w:val="FFFFFF"/>
-                <w:sz w:val="18"/>
-                <w:szCs w:val="18"/>
-              </w:rPr>
-              <w:t>CD Pipeline – Automated Deployment to Render (</w:t>
-            </w:r>
-            <w:proofErr w:type="spellStart"/>
-            <w:r>
-              <w:rPr>
-                <w:rFonts w:ascii="Arial" w:eastAsia="Arial" w:hAnsi="Arial" w:cs="Arial"/>
-                <w:b/>
-                <w:bCs/>
-                <w:color w:val="FFFFFF"/>
-                <w:sz w:val="18"/>
-                <w:szCs w:val="18"/>
-              </w:rPr>
-              <w:t>cd.yml</w:t>
-            </w:r>
-            <w:proofErr w:type="spellEnd"/>
-            <w:r>
-              <w:rPr>
-                <w:rFonts w:ascii="Arial" w:eastAsia="Arial" w:hAnsi="Arial" w:cs="Arial"/>
-                <w:b/>
-                <w:bCs/>
-                <w:color w:val="FFFFFF"/>
-                <w:sz w:val="18"/>
-                <w:szCs w:val="18"/>
-              </w:rPr>
-              <w:t>)</w:t>
-            </w:r>
-          </w:p>
-        </w:tc>
-        <w:tc>
-          <w:tcPr>
-            <w:tcW w:w="2150" w:type="dxa"/>
-            <w:tcBorders>
-              <w:top w:val="single" w:sz="6" w:space="0" w:color="ADB9CA"/>
-              <w:left w:val="single" w:sz="6" w:space="0" w:color="ADB9CA"/>
-              <w:bottom w:val="single" w:sz="6" w:space="0" w:color="ADB9CA"/>
-              <w:right w:val="single" w:sz="6" w:space="0" w:color="ADB9CA"/>
-            </w:tcBorders>
-            <w:shd w:val="clear" w:color="auto" w:fill="2E75B6"/>
-            <w:tcMar>
-              <w:top w:w="80" w:type="dxa"/>
-              <w:left w:w="140" w:type="dxa"/>
-              <w:bottom w:w="80" w:type="dxa"/>
-              <w:right w:w="140" w:type="dxa"/>
-            </w:tcMar>
-            <w:vAlign w:val="center"/>
-          </w:tcPr>
-          <w:p>
-            <w:r>
-              <w:rPr>
-                <w:rFonts w:ascii="Arial" w:eastAsia="Arial" w:hAnsi="Arial" w:cs="Arial"/>
-                <w:b/>
-                <w:bCs/>
-                <w:color w:val="FFFFFF"/>
-                <w:sz w:val="18"/>
-                <w:szCs w:val="18"/>
-              </w:rPr>
-              <w:t>20 Marks</w:t>
-            </w:r>
-          </w:p>
-        </w:tc>
-      </w:tr>
-      <w:tr>
-        <w:tc>
-          <w:tcPr>
-            <w:tcW w:w="700" w:type="dxa"/>
-            <w:tcBorders>
-              <w:top w:val="single" w:sz="6" w:space="0" w:color="ADB9CA"/>
-              <w:left w:val="single" w:sz="6" w:space="0" w:color="ADB9CA"/>
-              <w:bottom w:val="single" w:sz="6" w:space="0" w:color="ADB9CA"/>
-              <w:right w:val="single" w:sz="6" w:space="0" w:color="ADB9CA"/>
-            </w:tcBorders>
-            <w:shd w:val="clear" w:color="auto" w:fill="E8F0FB"/>
-            <w:tcMar>
-              <w:top w:w="80" w:type="dxa"/>
-              <w:left w:w="140" w:type="dxa"/>
-              <w:bottom w:w="80" w:type="dxa"/>
-              <w:right w:w="140" w:type="dxa"/>
-            </w:tcMar>
-            <w:vAlign w:val="center"/>
-          </w:tcPr>
-          <w:p>
-            <w:r>
-              <w:rPr>
-                <w:rFonts w:ascii="Arial" w:eastAsia="Arial" w:hAnsi="Arial" w:cs="Arial"/>
-                <w:b/>
-                <w:bCs/>
-                <w:color w:val="000000"/>
-                <w:sz w:val="18"/>
-                <w:szCs w:val="18"/>
-              </w:rPr>
-              <w:t>13</w:t>
-            </w:r>
-          </w:p>
-        </w:tc>
-        <w:tc>
-          <w:tcPr>
-            <w:tcW w:w="6510" w:type="dxa"/>
-            <w:tcBorders>
-              <w:top w:val="single" w:sz="6" w:space="0" w:color="ADB9CA"/>
-              <w:left w:val="single" w:sz="6" w:space="0" w:color="ADB9CA"/>
-              <w:bottom w:val="single" w:sz="6" w:space="0" w:color="ADB9CA"/>
-              <w:right w:val="single" w:sz="6" w:space="0" w:color="ADB9CA"/>
-            </w:tcBorders>
-            <w:shd w:val="clear" w:color="auto" w:fill="E8F0FB"/>
-            <w:tcMar>
-              <w:top w:w="80" w:type="dxa"/>
-              <w:left w:w="140" w:type="dxa"/>
-              <w:bottom w:w="80" w:type="dxa"/>
-              <w:right w:w="140" w:type="dxa"/>
-            </w:tcMar>
-            <w:vAlign w:val="center"/>
-          </w:tcPr>
-          <w:p>
-            <w:r>
-              <w:rPr>
-                <w:rFonts w:ascii="Arial" w:eastAsia="Arial" w:hAnsi="Arial" w:cs="Arial"/>
-                <w:color w:val="000000"/>
-                <w:sz w:val="18"/>
-                <w:szCs w:val="18"/>
-              </w:rPr>
-              <w:t>CD workflow file created at .</w:t>
-            </w:r>
-            <w:proofErr w:type="spellStart"/>
-            <w:r>
-              <w:rPr>
-                <w:rFonts w:ascii="Arial" w:eastAsia="Arial" w:hAnsi="Arial" w:cs="Arial"/>
-                <w:color w:val="000000"/>
-                <w:sz w:val="18"/>
-                <w:szCs w:val="18"/>
-              </w:rPr>
-              <w:t>github</w:t>
-            </w:r>
-            <w:proofErr w:type="spellEnd"/>
-            <w:r>
-              <w:rPr>
-                <w:rFonts w:ascii="Arial" w:eastAsia="Arial" w:hAnsi="Arial" w:cs="Arial"/>
-                <w:color w:val="000000"/>
-                <w:sz w:val="18"/>
-                <w:szCs w:val="18"/>
-              </w:rPr>
-              <w:t>/workflows/</w:t>
-            </w:r>
-            <w:proofErr w:type="spellStart"/>
-            <w:r>
-              <w:rPr>
-                <w:rFonts w:ascii="Arial" w:eastAsia="Arial" w:hAnsi="Arial" w:cs="Arial"/>
-                <w:color w:val="000000"/>
-                <w:sz w:val="18"/>
-                <w:szCs w:val="18"/>
-              </w:rPr>
-              <w:t>cd.yml</w:t>
-            </w:r>
-            <w:proofErr w:type="spellEnd"/>
-            <w:r>
-              <w:rPr>
-                <w:rFonts w:ascii="Arial" w:eastAsia="Arial" w:hAnsi="Arial" w:cs="Arial"/>
-                <w:color w:val="000000"/>
-                <w:sz w:val="18"/>
-                <w:szCs w:val="18"/>
-              </w:rPr>
-              <w:t xml:space="preserve"> with correct push trigger on </w:t>
+              <w:t xml:space="preserve">CD workflow file created at .github/workflows/cd.yml with correct push trigger on </w:t>
             </w:r>
             <w:r>
               <w:rPr>
@@ -9470,15 +8439,7 @@
           <w:rFonts w:ascii="Arial" w:eastAsia="Arial" w:hAnsi="Arial" w:cs="Arial"/>
           <w:color w:val="000000"/>
         </w:rPr>
-        <w:t xml:space="preserve">Screenshot 2: Each member's CI workflow run triggered by their individual </w:t>
-      </w:r>
-      <w:proofErr w:type="gramStart"/>
-      <w:r>
-        <w:rPr>
-          <w:rFonts w:ascii="Arial" w:eastAsia="Arial" w:hAnsi="Arial" w:cs="Arial"/>
-          <w:color w:val="000000"/>
-        </w:rPr>
-        <w:t xml:space="preserve">PR </w:t>
+        <w:t xml:space="preserve">Screenshot 2: Each member's CI workflow run triggered by their individual PR </w:t>
       </w:r>
       <w:r>
         <w:rPr>
@@ -9487,7 +8448,6 @@
         </w:rPr>
         <w:t>,</w:t>
       </w:r>
-      <w:proofErr w:type="gramEnd"/>
       <w:r>
         <w:rPr>
           <w:rFonts w:ascii="Arial" w:eastAsia="Arial" w:hAnsi="Arial" w:cs="Arial"/>
@@ -9534,15 +8494,7 @@
           <w:rFonts w:ascii="Arial" w:eastAsia="Arial" w:hAnsi="Arial" w:cs="Arial"/>
           <w:color w:val="000000"/>
         </w:rPr>
-        <w:t>“develop</w:t>
-      </w:r>
-      <w:proofErr w:type="gramStart"/>
-      <w:r>
-        <w:rPr>
-          <w:rFonts w:ascii="Arial" w:eastAsia="Arial" w:hAnsi="Arial" w:cs="Arial"/>
-          <w:color w:val="000000"/>
-        </w:rPr>
-        <w:t>”</w:t>
+        <w:t>“develop”</w:t>
       </w:r>
       <w:r>
         <w:rPr>
@@ -9558,7 +8510,6 @@
         </w:rPr>
         <w:t>,</w:t>
       </w:r>
-      <w:proofErr w:type="gramEnd"/>
       <w:r>
         <w:rPr>
           <w:rFonts w:ascii="Arial" w:eastAsia="Arial" w:hAnsi="Arial" w:cs="Arial"/>
@@ -9581,23 +8532,7 @@
           <w:rFonts w:ascii="Arial" w:eastAsia="Arial" w:hAnsi="Arial" w:cs="Arial"/>
           <w:color w:val="000000"/>
         </w:rPr>
-        <w:t xml:space="preserve">Screenshot 5: Live </w:t>
-      </w:r>
-      <w:proofErr w:type="spellStart"/>
-      <w:r>
-        <w:rPr>
-          <w:rFonts w:ascii="Arial" w:eastAsia="Arial" w:hAnsi="Arial" w:cs="Arial"/>
-          <w:color w:val="000000"/>
-        </w:rPr>
-        <w:t>TaskFlow</w:t>
-      </w:r>
-      <w:proofErr w:type="spellEnd"/>
-      <w:r>
-        <w:rPr>
-          <w:rFonts w:ascii="Arial" w:eastAsia="Arial" w:hAnsi="Arial" w:cs="Arial"/>
-          <w:color w:val="000000"/>
-        </w:rPr>
-        <w:t xml:space="preserve"> application on Render showing all five pages are accessible.</w:t>
+        <w:t>Screenshot 5: Live TaskFlow application on Render showing all five pages are accessible.</w:t>
       </w:r>
     </w:p>
     <w:p>
@@ -9834,6 +8769,9 @@
           </w:tcPr>
           <w:p>
             <w:r>
+              <w:rPr>
+                <w:noProof/>
+              </w:rPr>
               <w:drawing>
                 <wp:anchor distT="0" distB="0" distL="114300" distR="114300" simplePos="0" relativeHeight="251658240" behindDoc="0" locked="0" layoutInCell="1" allowOverlap="1" wp14:anchorId="1F331120" wp14:editId="5B3042DA">
                   <wp:simplePos x="0" y="0"/>
@@ -10095,31 +9033,7 @@
                 <w:sz w:val="18"/>
                 <w:szCs w:val="18"/>
               </w:rPr>
-              <w:t xml:space="preserve">Live </w:t>
-            </w:r>
-            <w:proofErr w:type="spellStart"/>
-            <w:r>
-              <w:rPr>
-                <w:rFonts w:ascii="Arial" w:eastAsia="Arial" w:hAnsi="Arial" w:cs="Arial"/>
-                <w:b/>
-                <w:bCs/>
-                <w:color w:val="000000"/>
-                <w:sz w:val="18"/>
-                <w:szCs w:val="18"/>
-              </w:rPr>
-              <w:t>TaskFlow</w:t>
-            </w:r>
-            <w:proofErr w:type="spellEnd"/>
-            <w:r>
-              <w:rPr>
-                <w:rFonts w:ascii="Arial" w:eastAsia="Arial" w:hAnsi="Arial" w:cs="Arial"/>
-                <w:b/>
-                <w:bCs/>
-                <w:color w:val="000000"/>
-                <w:sz w:val="18"/>
-                <w:szCs w:val="18"/>
-              </w:rPr>
-              <w:t xml:space="preserve"> on Render – All 5 Pages Accessible</w:t>
+              <w:t>Live TaskFlow on Render – All 5 Pages Accessible</w:t>
             </w:r>
           </w:p>
         </w:tc>
@@ -10253,27 +9167,7 @@
           <w:bCs/>
           <w:color w:val="000000"/>
         </w:rPr>
-        <w:t xml:space="preserve">Member </w:t>
-      </w:r>
-      <w:proofErr w:type="gramStart"/>
-      <w:r>
-        <w:rPr>
-          <w:rFonts w:ascii="Arial" w:eastAsia="Arial" w:hAnsi="Arial" w:cs="Arial"/>
-          <w:b/>
-          <w:bCs/>
-          <w:color w:val="000000"/>
-        </w:rPr>
-        <w:t>1  (</w:t>
-      </w:r>
-      <w:proofErr w:type="gramEnd"/>
-      <w:r>
-        <w:rPr>
-          <w:rFonts w:ascii="Arial" w:eastAsia="Arial" w:hAnsi="Arial" w:cs="Arial"/>
-          <w:b/>
-          <w:bCs/>
-          <w:color w:val="000000"/>
-        </w:rPr>
-        <w:t>Name: _______________________________________________)</w:t>
+        <w:t>Member 1  (Name: _______________________________________________)</w:t>
       </w:r>
     </w:p>
     <w:tbl>
@@ -10380,27 +9274,7 @@
           <w:bCs/>
           <w:color w:val="000000"/>
         </w:rPr>
-        <w:t xml:space="preserve">Member </w:t>
-      </w:r>
-      <w:proofErr w:type="gramStart"/>
-      <w:r>
-        <w:rPr>
-          <w:rFonts w:ascii="Arial" w:eastAsia="Arial" w:hAnsi="Arial" w:cs="Arial"/>
-          <w:b/>
-          <w:bCs/>
-          <w:color w:val="000000"/>
-        </w:rPr>
-        <w:t>2  (</w:t>
-      </w:r>
-      <w:proofErr w:type="gramEnd"/>
-      <w:r>
-        <w:rPr>
-          <w:rFonts w:ascii="Arial" w:eastAsia="Arial" w:hAnsi="Arial" w:cs="Arial"/>
-          <w:b/>
-          <w:bCs/>
-          <w:color w:val="000000"/>
-        </w:rPr>
-        <w:t>Name: _______________________________________________)</w:t>
+        <w:t>Member 2  (Name: _______________________________________________)</w:t>
       </w:r>
     </w:p>
     <w:tbl>
@@ -10507,27 +9381,7 @@
           <w:bCs/>
           <w:color w:val="000000"/>
         </w:rPr>
-        <w:t xml:space="preserve">Member </w:t>
-      </w:r>
-      <w:proofErr w:type="gramStart"/>
-      <w:r>
-        <w:rPr>
-          <w:rFonts w:ascii="Arial" w:eastAsia="Arial" w:hAnsi="Arial" w:cs="Arial"/>
-          <w:b/>
-          <w:bCs/>
-          <w:color w:val="000000"/>
-        </w:rPr>
-        <w:t>3  (</w:t>
-      </w:r>
-      <w:proofErr w:type="gramEnd"/>
-      <w:r>
-        <w:rPr>
-          <w:rFonts w:ascii="Arial" w:eastAsia="Arial" w:hAnsi="Arial" w:cs="Arial"/>
-          <w:b/>
-          <w:bCs/>
-          <w:color w:val="000000"/>
-        </w:rPr>
-        <w:t>Name: _______________________________________________)</w:t>
+        <w:t>Member 3  (Name: _______________________________________________)</w:t>
       </w:r>
     </w:p>
     <w:tbl>
@@ -10634,27 +9488,7 @@
           <w:bCs/>
           <w:color w:val="000000"/>
         </w:rPr>
-        <w:t xml:space="preserve">Member </w:t>
-      </w:r>
-      <w:proofErr w:type="gramStart"/>
-      <w:r>
-        <w:rPr>
-          <w:rFonts w:ascii="Arial" w:eastAsia="Arial" w:hAnsi="Arial" w:cs="Arial"/>
-          <w:b/>
-          <w:bCs/>
-          <w:color w:val="000000"/>
-        </w:rPr>
-        <w:t>4  (</w:t>
-      </w:r>
-      <w:proofErr w:type="gramEnd"/>
-      <w:r>
-        <w:rPr>
-          <w:rFonts w:ascii="Arial" w:eastAsia="Arial" w:hAnsi="Arial" w:cs="Arial"/>
-          <w:b/>
-          <w:bCs/>
-          <w:color w:val="000000"/>
-        </w:rPr>
-        <w:t>Name: _______________________________________________)</w:t>
+        <w:t>Member 4  (Name: _______________________________________________)</w:t>
       </w:r>
     </w:p>
     <w:tbl>
@@ -10761,27 +9595,7 @@
           <w:bCs/>
           <w:color w:val="000000"/>
         </w:rPr>
-        <w:t xml:space="preserve">Member </w:t>
-      </w:r>
-      <w:proofErr w:type="gramStart"/>
-      <w:r>
-        <w:rPr>
-          <w:rFonts w:ascii="Arial" w:eastAsia="Arial" w:hAnsi="Arial" w:cs="Arial"/>
-          <w:b/>
-          <w:bCs/>
-          <w:color w:val="000000"/>
-        </w:rPr>
-        <w:t>5  (</w:t>
-      </w:r>
-      <w:proofErr w:type="gramEnd"/>
-      <w:r>
-        <w:rPr>
-          <w:rFonts w:ascii="Arial" w:eastAsia="Arial" w:hAnsi="Arial" w:cs="Arial"/>
-          <w:b/>
-          <w:bCs/>
-          <w:color w:val="000000"/>
-        </w:rPr>
-        <w:t>Name: _______________________________________________)</w:t>
+        <w:t>Member 5  (Name: _______________________________________________)</w:t>
       </w:r>
     </w:p>
     <w:tbl>
@@ -10941,17 +9755,7 @@
         <w:sz w:val="16"/>
         <w:szCs w:val="16"/>
       </w:rPr>
-      <w:t xml:space="preserve">Assignment 04 – CI/CD Pipeline </w:t>
-    </w:r>
-    <w:proofErr w:type="gramStart"/>
-    <w:r>
-      <w:rPr>
-        <w:rFonts w:ascii="Arial" w:eastAsia="Arial" w:hAnsi="Arial" w:cs="Arial"/>
-        <w:color w:val="555555"/>
-        <w:sz w:val="16"/>
-        <w:szCs w:val="16"/>
-      </w:rPr>
-      <w:t xml:space="preserve">Integration  </w:t>
+      <w:t xml:space="preserve">Assignment 04 – CI/CD Pipeline Integration  </w:t>
     </w:r>
     <w:r>
       <w:rPr>
@@ -10961,15 +9765,6 @@
         <w:szCs w:val="16"/>
       </w:rPr>
       <w:tab/>
-    </w:r>
-    <w:proofErr w:type="gramEnd"/>
-    <w:r>
-      <w:rPr>
-        <w:rFonts w:ascii="Arial" w:eastAsia="Arial" w:hAnsi="Arial" w:cs="Arial"/>
-        <w:color w:val="555555"/>
-        <w:sz w:val="16"/>
-        <w:szCs w:val="16"/>
-      </w:rPr>
       <w:t xml:space="preserve"> Page </w:t>
     </w:r>
     <w:r>
@@ -11080,19 +9875,7 @@
         <w:sz w:val="18"/>
         <w:szCs w:val="18"/>
       </w:rPr>
-      <w:t xml:space="preserve">University of Central Punjab – Faculty of Information </w:t>
-    </w:r>
-    <w:proofErr w:type="gramStart"/>
-    <w:r>
-      <w:rPr>
-        <w:rFonts w:ascii="Arial" w:eastAsia="Arial" w:hAnsi="Arial" w:cs="Arial"/>
-        <w:b/>
-        <w:bCs/>
-        <w:color w:val="1F3864"/>
-        <w:sz w:val="18"/>
-        <w:szCs w:val="18"/>
-      </w:rPr>
-      <w:t>Technology</w:t>
+      <w:t>University of Central Punjab – Faculty of Information Technology</w:t>
     </w:r>
     <w:r>
       <w:rPr>
@@ -11101,17 +9884,7 @@
         <w:sz w:val="18"/>
         <w:szCs w:val="18"/>
       </w:rPr>
-      <w:t xml:space="preserve">  |</w:t>
-    </w:r>
-    <w:proofErr w:type="gramEnd"/>
-    <w:r>
-      <w:rPr>
-        <w:rFonts w:ascii="Arial" w:eastAsia="Arial" w:hAnsi="Arial" w:cs="Arial"/>
-        <w:color w:val="ADB9CA"/>
-        <w:sz w:val="18"/>
-        <w:szCs w:val="18"/>
-      </w:rPr>
-      <w:t xml:space="preserve">  </w:t>
+      <w:t xml:space="preserve">  |  </w:t>
     </w:r>
     <w:r>
       <w:rPr>

</xml_diff>

<commit_message>
Added all Screenshots and complete the requirements
</commit_message>
<xml_diff>
--- a/Assignment_04_Spring2026.docx
+++ b/Assignment_04_Spring2026.docx
@@ -1716,9 +1716,26 @@
         <w:spacing w:before="60" w:after="40"/>
         <w:jc w:val="both"/>
       </w:pPr>
-      <w:r>
-        <w:t>https://github.com/A-D-H-I-56/TaskFlow.git</w:t>
-      </w:r>
+      <w:hyperlink r:id="rId7" w:history="1">
+        <w:r>
+          <w:rPr>
+            <w:rStyle w:val="Hyperlink"/>
+          </w:rPr>
+          <w:t>https://github.com/A-D-H-I-56/TaskFlo</w:t>
+        </w:r>
+        <w:r>
+          <w:rPr>
+            <w:rStyle w:val="Hyperlink"/>
+          </w:rPr>
+          <w:t>w</w:t>
+        </w:r>
+        <w:r>
+          <w:rPr>
+            <w:rStyle w:val="Hyperlink"/>
+          </w:rPr>
+          <w:t>.git</w:t>
+        </w:r>
+      </w:hyperlink>
     </w:p>
     <w:p>
       <w:pPr>
@@ -1740,9 +1757,26 @@
         <w:spacing w:before="60" w:after="120"/>
         <w:jc w:val="both"/>
       </w:pPr>
-      <w:r>
-        <w:t>https://taskflow-cicd-v01.onrender.com/</w:t>
-      </w:r>
+      <w:hyperlink r:id="rId8" w:history="1">
+        <w:r>
+          <w:rPr>
+            <w:rStyle w:val="Hyperlink"/>
+          </w:rPr>
+          <w:t>https://taskflow-cicd-v01.onrender</w:t>
+        </w:r>
+        <w:r>
+          <w:rPr>
+            <w:rStyle w:val="Hyperlink"/>
+          </w:rPr>
+          <w:t>.</w:t>
+        </w:r>
+        <w:r>
+          <w:rPr>
+            <w:rStyle w:val="Hyperlink"/>
+          </w:rPr>
+          <w:t>com/</w:t>
+        </w:r>
+      </w:hyperlink>
     </w:p>
     <w:p>
       <w:pPr>
@@ -7824,7 +7858,7 @@
     </w:p>
     <w:tbl>
       <w:tblPr>
-        <w:tblW w:w="9360" w:type="dxa"/>
+        <w:tblW w:w="9921" w:type="dxa"/>
         <w:tblBorders>
           <w:top w:val="single" w:sz="4" w:space="0" w:color="auto"/>
           <w:left w:val="single" w:sz="4" w:space="0" w:color="auto"/>
@@ -7840,13 +7874,13 @@
         <w:tblLook w:val="04A0" w:firstRow="1" w:lastRow="0" w:firstColumn="1" w:lastColumn="0" w:noHBand="0" w:noVBand="1"/>
       </w:tblPr>
       <w:tblGrid>
-        <w:gridCol w:w="2930"/>
-        <w:gridCol w:w="6430"/>
+        <w:gridCol w:w="1530"/>
+        <w:gridCol w:w="8534"/>
       </w:tblGrid>
       <w:tr>
         <w:tc>
           <w:tcPr>
-            <w:tcW w:w="3200" w:type="dxa"/>
+            <w:tcW w:w="2872" w:type="dxa"/>
             <w:tcBorders>
               <w:top w:val="single" w:sz="6" w:space="0" w:color="ADB9CA"/>
               <w:left w:val="single" w:sz="6" w:space="0" w:color="ADB9CA"/>
@@ -7878,7 +7912,7 @@
         </w:tc>
         <w:tc>
           <w:tcPr>
-            <w:tcW w:w="6160" w:type="dxa"/>
+            <w:tcW w:w="7049" w:type="dxa"/>
             <w:tcBorders>
               <w:top w:val="single" w:sz="6" w:space="0" w:color="ADB9CA"/>
               <w:left w:val="single" w:sz="6" w:space="0" w:color="ADB9CA"/>
@@ -7912,7 +7946,7 @@
       <w:tr>
         <w:tc>
           <w:tcPr>
-            <w:tcW w:w="3200" w:type="dxa"/>
+            <w:tcW w:w="2872" w:type="dxa"/>
             <w:tcBorders>
               <w:top w:val="single" w:sz="6" w:space="0" w:color="ADB9CA"/>
               <w:left w:val="single" w:sz="6" w:space="0" w:color="ADB9CA"/>
@@ -7945,7 +7979,7 @@
         </w:tc>
         <w:tc>
           <w:tcPr>
-            <w:tcW w:w="6160" w:type="dxa"/>
+            <w:tcW w:w="7049" w:type="dxa"/>
             <w:tcBorders>
               <w:top w:val="single" w:sz="6" w:space="0" w:color="ADB9CA"/>
               <w:left w:val="single" w:sz="6" w:space="0" w:color="ADB9CA"/>
@@ -7992,7 +8026,7 @@
                           </pic:cNvPicPr>
                         </pic:nvPicPr>
                         <pic:blipFill>
-                          <a:blip r:embed="rId7" cstate="print">
+                          <a:blip r:embed="rId9" cstate="print">
                             <a:extLst>
                               <a:ext uri="{28A0092B-C50C-407E-A947-70E740481C1C}">
                                 <a14:useLocalDpi xmlns:a14="http://schemas.microsoft.com/office/drawing/2010/main" val="0"/>
@@ -8024,7 +8058,7 @@
       <w:tr>
         <w:tc>
           <w:tcPr>
-            <w:tcW w:w="3200" w:type="dxa"/>
+            <w:tcW w:w="2872" w:type="dxa"/>
             <w:tcBorders>
               <w:top w:val="single" w:sz="6" w:space="0" w:color="ADB9CA"/>
               <w:left w:val="single" w:sz="6" w:space="0" w:color="ADB9CA"/>
@@ -8050,13 +8084,14 @@
                 <w:sz w:val="18"/>
                 <w:szCs w:val="18"/>
               </w:rPr>
+              <w:lastRenderedPageBreak/>
               <w:t>CI Workflow Runs – Triggered by each member's PR (all steps green)</w:t>
             </w:r>
           </w:p>
         </w:tc>
         <w:tc>
           <w:tcPr>
-            <w:tcW w:w="6160" w:type="dxa"/>
+            <w:tcW w:w="7049" w:type="dxa"/>
             <w:tcBorders>
               <w:top w:val="single" w:sz="6" w:space="0" w:color="ADB9CA"/>
               <w:left w:val="single" w:sz="6" w:space="0" w:color="ADB9CA"/>
@@ -8072,13 +8107,71 @@
             </w:tcMar>
             <w:vAlign w:val="center"/>
           </w:tcPr>
-          <w:p/>
+          <w:p>
+            <w:r>
+              <w:drawing>
+                <wp:anchor distT="0" distB="0" distL="114300" distR="114300" simplePos="0" relativeHeight="251663360" behindDoc="0" locked="0" layoutInCell="1" allowOverlap="1" wp14:anchorId="6422B326" wp14:editId="21C4F091">
+                  <wp:simplePos x="0" y="0"/>
+                  <wp:positionH relativeFrom="column">
+                    <wp:posOffset>-70485</wp:posOffset>
+                  </wp:positionH>
+                  <wp:positionV relativeFrom="paragraph">
+                    <wp:posOffset>-7084060</wp:posOffset>
+                  </wp:positionV>
+                  <wp:extent cx="5381625" cy="7213600"/>
+                  <wp:effectExtent l="0" t="0" r="9525" b="6350"/>
+                  <wp:wrapSquare wrapText="bothSides"/>
+                  <wp:docPr id="5" name="Picture 5"/>
+                  <wp:cNvGraphicFramePr>
+                    <a:graphicFrameLocks xmlns:a="http://schemas.openxmlformats.org/drawingml/2006/main" noChangeAspect="1"/>
+                  </wp:cNvGraphicFramePr>
+                  <a:graphic xmlns:a="http://schemas.openxmlformats.org/drawingml/2006/main">
+                    <a:graphicData uri="http://schemas.openxmlformats.org/drawingml/2006/picture">
+                      <pic:pic xmlns:pic="http://schemas.openxmlformats.org/drawingml/2006/picture">
+                        <pic:nvPicPr>
+                          <pic:cNvPr id="1" name=""/>
+                          <pic:cNvPicPr/>
+                        </pic:nvPicPr>
+                        <pic:blipFill>
+                          <a:blip r:embed="rId10" cstate="print">
+                            <a:extLst>
+                              <a:ext uri="{28A0092B-C50C-407E-A947-70E740481C1C}">
+                                <a14:useLocalDpi xmlns:a14="http://schemas.microsoft.com/office/drawing/2010/main" val="0"/>
+                              </a:ext>
+                            </a:extLst>
+                          </a:blip>
+                          <a:stretch>
+                            <a:fillRect/>
+                          </a:stretch>
+                        </pic:blipFill>
+                        <pic:spPr>
+                          <a:xfrm>
+                            <a:off x="0" y="0"/>
+                            <a:ext cx="5381625" cy="7213600"/>
+                          </a:xfrm>
+                          <a:prstGeom prst="rect">
+                            <a:avLst/>
+                          </a:prstGeom>
+                        </pic:spPr>
+                      </pic:pic>
+                    </a:graphicData>
+                  </a:graphic>
+                  <wp14:sizeRelH relativeFrom="margin">
+                    <wp14:pctWidth>0</wp14:pctWidth>
+                  </wp14:sizeRelH>
+                  <wp14:sizeRelV relativeFrom="margin">
+                    <wp14:pctHeight>0</wp14:pctHeight>
+                  </wp14:sizeRelV>
+                </wp:anchor>
+              </w:drawing>
+            </w:r>
+          </w:p>
         </w:tc>
       </w:tr>
       <w:tr>
         <w:tc>
           <w:tcPr>
-            <w:tcW w:w="3200" w:type="dxa"/>
+            <w:tcW w:w="2872" w:type="dxa"/>
             <w:tcBorders>
               <w:top w:val="single" w:sz="6" w:space="0" w:color="ADB9CA"/>
               <w:left w:val="single" w:sz="6" w:space="0" w:color="ADB9CA"/>
@@ -8104,13 +8197,14 @@
                 <w:sz w:val="18"/>
                 <w:szCs w:val="18"/>
               </w:rPr>
+              <w:lastRenderedPageBreak/>
               <w:t>Docker Hub – Pushed Image with Tags</w:t>
             </w:r>
           </w:p>
         </w:tc>
         <w:tc>
           <w:tcPr>
-            <w:tcW w:w="6160" w:type="dxa"/>
+            <w:tcW w:w="7049" w:type="dxa"/>
             <w:tcBorders>
               <w:top w:val="single" w:sz="6" w:space="0" w:color="ADB9CA"/>
               <w:left w:val="single" w:sz="6" w:space="0" w:color="ADB9CA"/>
@@ -8126,13 +8220,71 @@
             </w:tcMar>
             <w:vAlign w:val="center"/>
           </w:tcPr>
-          <w:p/>
+          <w:p>
+            <w:r>
+              <w:drawing>
+                <wp:anchor distT="0" distB="0" distL="114300" distR="114300" simplePos="0" relativeHeight="251662336" behindDoc="0" locked="0" layoutInCell="1" allowOverlap="1" wp14:anchorId="59E2A1CC" wp14:editId="01B065B4">
+                  <wp:simplePos x="0" y="0"/>
+                  <wp:positionH relativeFrom="column">
+                    <wp:posOffset>60325</wp:posOffset>
+                  </wp:positionH>
+                  <wp:positionV relativeFrom="paragraph">
+                    <wp:posOffset>-3456940</wp:posOffset>
+                  </wp:positionV>
+                  <wp:extent cx="5414645" cy="3443605"/>
+                  <wp:effectExtent l="0" t="0" r="0" b="4445"/>
+                  <wp:wrapSquare wrapText="bothSides"/>
+                  <wp:docPr id="4" name="Picture 4"/>
+                  <wp:cNvGraphicFramePr>
+                    <a:graphicFrameLocks xmlns:a="http://schemas.openxmlformats.org/drawingml/2006/main" noChangeAspect="1"/>
+                  </wp:cNvGraphicFramePr>
+                  <a:graphic xmlns:a="http://schemas.openxmlformats.org/drawingml/2006/main">
+                    <a:graphicData uri="http://schemas.openxmlformats.org/drawingml/2006/picture">
+                      <pic:pic xmlns:pic="http://schemas.openxmlformats.org/drawingml/2006/picture">
+                        <pic:nvPicPr>
+                          <pic:cNvPr id="1" name=""/>
+                          <pic:cNvPicPr/>
+                        </pic:nvPicPr>
+                        <pic:blipFill>
+                          <a:blip r:embed="rId11">
+                            <a:extLst>
+                              <a:ext uri="{28A0092B-C50C-407E-A947-70E740481C1C}">
+                                <a14:useLocalDpi xmlns:a14="http://schemas.microsoft.com/office/drawing/2010/main" val="0"/>
+                              </a:ext>
+                            </a:extLst>
+                          </a:blip>
+                          <a:stretch>
+                            <a:fillRect/>
+                          </a:stretch>
+                        </pic:blipFill>
+                        <pic:spPr>
+                          <a:xfrm>
+                            <a:off x="0" y="0"/>
+                            <a:ext cx="5414645" cy="3443605"/>
+                          </a:xfrm>
+                          <a:prstGeom prst="rect">
+                            <a:avLst/>
+                          </a:prstGeom>
+                        </pic:spPr>
+                      </pic:pic>
+                    </a:graphicData>
+                  </a:graphic>
+                  <wp14:sizeRelH relativeFrom="margin">
+                    <wp14:pctWidth>0</wp14:pctWidth>
+                  </wp14:sizeRelH>
+                  <wp14:sizeRelV relativeFrom="margin">
+                    <wp14:pctHeight>0</wp14:pctHeight>
+                  </wp14:sizeRelV>
+                </wp:anchor>
+              </w:drawing>
+            </w:r>
+          </w:p>
         </w:tc>
       </w:tr>
       <w:tr>
         <w:tc>
           <w:tcPr>
-            <w:tcW w:w="3200" w:type="dxa"/>
+            <w:tcW w:w="2872" w:type="dxa"/>
             <w:tcBorders>
               <w:top w:val="single" w:sz="6" w:space="0" w:color="ADB9CA"/>
               <w:left w:val="single" w:sz="6" w:space="0" w:color="ADB9CA"/>
@@ -8158,13 +8310,14 @@
                 <w:sz w:val="18"/>
                 <w:szCs w:val="18"/>
               </w:rPr>
+              <w:lastRenderedPageBreak/>
               <w:t>CD Workflow Run – Triggered by Push to “develop”</w:t>
             </w:r>
           </w:p>
         </w:tc>
         <w:tc>
           <w:tcPr>
-            <w:tcW w:w="6160" w:type="dxa"/>
+            <w:tcW w:w="7049" w:type="dxa"/>
             <w:tcBorders>
               <w:top w:val="single" w:sz="6" w:space="0" w:color="ADB9CA"/>
               <w:left w:val="single" w:sz="6" w:space="0" w:color="ADB9CA"/>
@@ -8180,13 +8333,74 @@
             </w:tcMar>
             <w:vAlign w:val="center"/>
           </w:tcPr>
-          <w:p/>
+          <w:p>
+            <w:r>
+              <w:drawing>
+                <wp:anchor distT="0" distB="0" distL="114300" distR="114300" simplePos="0" relativeHeight="251664384" behindDoc="0" locked="0" layoutInCell="1" allowOverlap="1" wp14:anchorId="7920AC32" wp14:editId="70199DBB">
+                  <wp:simplePos x="0" y="0"/>
+                  <wp:positionH relativeFrom="column">
+                    <wp:posOffset>-27305</wp:posOffset>
+                  </wp:positionH>
+                  <wp:positionV relativeFrom="paragraph">
+                    <wp:posOffset>-6685915</wp:posOffset>
+                  </wp:positionV>
+                  <wp:extent cx="5272405" cy="6657340"/>
+                  <wp:effectExtent l="0" t="0" r="4445" b="0"/>
+                  <wp:wrapSquare wrapText="bothSides"/>
+                  <wp:docPr id="6" name="Picture 6"/>
+                  <wp:cNvGraphicFramePr>
+                    <a:graphicFrameLocks xmlns:a="http://schemas.openxmlformats.org/drawingml/2006/main" noChangeAspect="1"/>
+                  </wp:cNvGraphicFramePr>
+                  <a:graphic xmlns:a="http://schemas.openxmlformats.org/drawingml/2006/main">
+                    <a:graphicData uri="http://schemas.openxmlformats.org/drawingml/2006/picture">
+                      <pic:pic xmlns:pic="http://schemas.openxmlformats.org/drawingml/2006/picture">
+                        <pic:nvPicPr>
+                          <pic:cNvPr id="1" name=""/>
+                          <pic:cNvPicPr/>
+                        </pic:nvPicPr>
+                        <pic:blipFill>
+                          <a:blip r:embed="rId12" cstate="print">
+                            <a:extLst>
+                              <a:ext uri="{28A0092B-C50C-407E-A947-70E740481C1C}">
+                                <a14:useLocalDpi xmlns:a14="http://schemas.microsoft.com/office/drawing/2010/main" val="0"/>
+                              </a:ext>
+                            </a:extLst>
+                          </a:blip>
+                          <a:stretch>
+                            <a:fillRect/>
+                          </a:stretch>
+                        </pic:blipFill>
+                        <pic:spPr>
+                          <a:xfrm>
+                            <a:off x="0" y="0"/>
+                            <a:ext cx="5272405" cy="6657340"/>
+                          </a:xfrm>
+                          <a:prstGeom prst="rect">
+                            <a:avLst/>
+                          </a:prstGeom>
+                        </pic:spPr>
+                      </pic:pic>
+                    </a:graphicData>
+                  </a:graphic>
+                  <wp14:sizeRelH relativeFrom="margin">
+                    <wp14:pctWidth>0</wp14:pctWidth>
+                  </wp14:sizeRelH>
+                  <wp14:sizeRelV relativeFrom="margin">
+                    <wp14:pctHeight>0</wp14:pctHeight>
+                  </wp14:sizeRelV>
+                </wp:anchor>
+              </w:drawing>
+            </w:r>
+          </w:p>
         </w:tc>
       </w:tr>
       <w:tr>
-        <w:tc>
-          <w:tcPr>
-            <w:tcW w:w="3200" w:type="dxa"/>
+        <w:trPr>
+          <w:trHeight w:val="11146"/>
+        </w:trPr>
+        <w:tc>
+          <w:tcPr>
+            <w:tcW w:w="2872" w:type="dxa"/>
             <w:tcBorders>
               <w:top w:val="single" w:sz="6" w:space="0" w:color="ADB9CA"/>
               <w:left w:val="single" w:sz="6" w:space="0" w:color="ADB9CA"/>
@@ -8212,13 +8426,14 @@
                 <w:sz w:val="18"/>
                 <w:szCs w:val="18"/>
               </w:rPr>
+              <w:lastRenderedPageBreak/>
               <w:t>Live TaskFlow on Render – All 5 Pages Accessible</w:t>
             </w:r>
           </w:p>
         </w:tc>
         <w:tc>
           <w:tcPr>
-            <w:tcW w:w="6160" w:type="dxa"/>
+            <w:tcW w:w="7049" w:type="dxa"/>
             <w:tcBorders>
               <w:top w:val="single" w:sz="6" w:space="0" w:color="ADB9CA"/>
               <w:left w:val="single" w:sz="6" w:space="0" w:color="ADB9CA"/>
@@ -8234,13 +8449,258 @@
             </w:tcMar>
             <w:vAlign w:val="center"/>
           </w:tcPr>
+          <w:p/>
+          <w:p>
+            <w:r>
+              <w:drawing>
+                <wp:anchor distT="0" distB="0" distL="114300" distR="114300" simplePos="0" relativeHeight="251667456" behindDoc="0" locked="0" layoutInCell="1" allowOverlap="1" wp14:anchorId="30700D20" wp14:editId="55B45792">
+                  <wp:simplePos x="0" y="0"/>
+                  <wp:positionH relativeFrom="column">
+                    <wp:posOffset>-53340</wp:posOffset>
+                  </wp:positionH>
+                  <wp:positionV relativeFrom="paragraph">
+                    <wp:posOffset>2947035</wp:posOffset>
+                  </wp:positionV>
+                  <wp:extent cx="5379085" cy="3383915"/>
+                  <wp:effectExtent l="0" t="0" r="0" b="6985"/>
+                  <wp:wrapTopAndBottom/>
+                  <wp:docPr id="8" name="Picture 8"/>
+                  <wp:cNvGraphicFramePr>
+                    <a:graphicFrameLocks xmlns:a="http://schemas.openxmlformats.org/drawingml/2006/main" noChangeAspect="1"/>
+                  </wp:cNvGraphicFramePr>
+                  <a:graphic xmlns:a="http://schemas.openxmlformats.org/drawingml/2006/main">
+                    <a:graphicData uri="http://schemas.openxmlformats.org/drawingml/2006/picture">
+                      <pic:pic xmlns:pic="http://schemas.openxmlformats.org/drawingml/2006/picture">
+                        <pic:nvPicPr>
+                          <pic:cNvPr id="1" name=""/>
+                          <pic:cNvPicPr/>
+                        </pic:nvPicPr>
+                        <pic:blipFill>
+                          <a:blip r:embed="rId13">
+                            <a:extLst>
+                              <a:ext uri="{28A0092B-C50C-407E-A947-70E740481C1C}">
+                                <a14:useLocalDpi xmlns:a14="http://schemas.microsoft.com/office/drawing/2010/main" val="0"/>
+                              </a:ext>
+                            </a:extLst>
+                          </a:blip>
+                          <a:stretch>
+                            <a:fillRect/>
+                          </a:stretch>
+                        </pic:blipFill>
+                        <pic:spPr>
+                          <a:xfrm>
+                            <a:off x="0" y="0"/>
+                            <a:ext cx="5379085" cy="3383915"/>
+                          </a:xfrm>
+                          <a:prstGeom prst="rect">
+                            <a:avLst/>
+                          </a:prstGeom>
+                        </pic:spPr>
+                      </pic:pic>
+                    </a:graphicData>
+                  </a:graphic>
+                  <wp14:sizeRelH relativeFrom="margin">
+                    <wp14:pctWidth>0</wp14:pctWidth>
+                  </wp14:sizeRelH>
+                  <wp14:sizeRelV relativeFrom="margin">
+                    <wp14:pctHeight>0</wp14:pctHeight>
+                  </wp14:sizeRelV>
+                </wp:anchor>
+              </w:drawing>
+            </w:r>
+            <w:r>
+              <w:drawing>
+                <wp:anchor distT="0" distB="0" distL="114300" distR="114300" simplePos="0" relativeHeight="251665408" behindDoc="0" locked="0" layoutInCell="1" allowOverlap="1" wp14:anchorId="383781E7" wp14:editId="10251A28">
+                  <wp:simplePos x="0" y="0"/>
+                  <wp:positionH relativeFrom="column">
+                    <wp:posOffset>29210</wp:posOffset>
+                  </wp:positionH>
+                  <wp:positionV relativeFrom="paragraph">
+                    <wp:posOffset>0</wp:posOffset>
+                  </wp:positionV>
+                  <wp:extent cx="5296535" cy="2791460"/>
+                  <wp:effectExtent l="0" t="0" r="0" b="8890"/>
+                  <wp:wrapTopAndBottom/>
+                  <wp:docPr id="7" name="Picture 7"/>
+                  <wp:cNvGraphicFramePr>
+                    <a:graphicFrameLocks xmlns:a="http://schemas.openxmlformats.org/drawingml/2006/main" noChangeAspect="1"/>
+                  </wp:cNvGraphicFramePr>
+                  <a:graphic xmlns:a="http://schemas.openxmlformats.org/drawingml/2006/main">
+                    <a:graphicData uri="http://schemas.openxmlformats.org/drawingml/2006/picture">
+                      <pic:pic xmlns:pic="http://schemas.openxmlformats.org/drawingml/2006/picture">
+                        <pic:nvPicPr>
+                          <pic:cNvPr id="1" name=""/>
+                          <pic:cNvPicPr/>
+                        </pic:nvPicPr>
+                        <pic:blipFill>
+                          <a:blip r:embed="rId14" cstate="print">
+                            <a:extLst>
+                              <a:ext uri="{28A0092B-C50C-407E-A947-70E740481C1C}">
+                                <a14:useLocalDpi xmlns:a14="http://schemas.microsoft.com/office/drawing/2010/main" val="0"/>
+                              </a:ext>
+                            </a:extLst>
+                          </a:blip>
+                          <a:stretch>
+                            <a:fillRect/>
+                          </a:stretch>
+                        </pic:blipFill>
+                        <pic:spPr>
+                          <a:xfrm>
+                            <a:off x="0" y="0"/>
+                            <a:ext cx="5296535" cy="2791460"/>
+                          </a:xfrm>
+                          <a:prstGeom prst="rect">
+                            <a:avLst/>
+                          </a:prstGeom>
+                        </pic:spPr>
+                      </pic:pic>
+                    </a:graphicData>
+                  </a:graphic>
+                  <wp14:sizeRelH relativeFrom="margin">
+                    <wp14:pctWidth>0</wp14:pctWidth>
+                  </wp14:sizeRelH>
+                  <wp14:sizeRelV relativeFrom="margin">
+                    <wp14:pctHeight>0</wp14:pctHeight>
+                  </wp14:sizeRelV>
+                </wp:anchor>
+              </w:drawing>
+            </w:r>
+          </w:p>
+          <w:p/>
+          <w:p>
+            <w:r>
+              <w:lastRenderedPageBreak/>
+              <w:drawing>
+                <wp:anchor distT="0" distB="0" distL="114300" distR="114300" simplePos="0" relativeHeight="251670528" behindDoc="0" locked="0" layoutInCell="1" allowOverlap="1" wp14:anchorId="45BBD93E" wp14:editId="7D033662">
+                  <wp:simplePos x="0" y="0"/>
+                  <wp:positionH relativeFrom="column">
+                    <wp:posOffset>0</wp:posOffset>
+                  </wp:positionH>
+                  <wp:positionV relativeFrom="paragraph">
+                    <wp:posOffset>144145</wp:posOffset>
+                  </wp:positionV>
+                  <wp:extent cx="5171440" cy="2726055"/>
+                  <wp:effectExtent l="0" t="0" r="0" b="0"/>
+                  <wp:wrapTopAndBottom/>
+                  <wp:docPr id="10" name="Picture 10"/>
+                  <wp:cNvGraphicFramePr>
+                    <a:graphicFrameLocks xmlns:a="http://schemas.openxmlformats.org/drawingml/2006/main" noChangeAspect="1"/>
+                  </wp:cNvGraphicFramePr>
+                  <a:graphic xmlns:a="http://schemas.openxmlformats.org/drawingml/2006/main">
+                    <a:graphicData uri="http://schemas.openxmlformats.org/drawingml/2006/picture">
+                      <pic:pic xmlns:pic="http://schemas.openxmlformats.org/drawingml/2006/picture">
+                        <pic:nvPicPr>
+                          <pic:cNvPr id="1" name=""/>
+                          <pic:cNvPicPr/>
+                        </pic:nvPicPr>
+                        <pic:blipFill>
+                          <a:blip r:embed="rId15" cstate="print">
+                            <a:extLst>
+                              <a:ext uri="{28A0092B-C50C-407E-A947-70E740481C1C}">
+                                <a14:useLocalDpi xmlns:a14="http://schemas.microsoft.com/office/drawing/2010/main" val="0"/>
+                              </a:ext>
+                            </a:extLst>
+                          </a:blip>
+                          <a:stretch>
+                            <a:fillRect/>
+                          </a:stretch>
+                        </pic:blipFill>
+                        <pic:spPr>
+                          <a:xfrm>
+                            <a:off x="0" y="0"/>
+                            <a:ext cx="5171440" cy="2726055"/>
+                          </a:xfrm>
+                          <a:prstGeom prst="rect">
+                            <a:avLst/>
+                          </a:prstGeom>
+                        </pic:spPr>
+                      </pic:pic>
+                    </a:graphicData>
+                  </a:graphic>
+                  <wp14:sizeRelH relativeFrom="margin">
+                    <wp14:pctWidth>0</wp14:pctWidth>
+                  </wp14:sizeRelH>
+                  <wp14:sizeRelV relativeFrom="margin">
+                    <wp14:pctHeight>0</wp14:pctHeight>
+                  </wp14:sizeRelV>
+                </wp:anchor>
+              </w:drawing>
+            </w:r>
+          </w:p>
+          <w:p/>
+          <w:p>
+            <w:r>
+              <w:drawing>
+                <wp:anchor distT="0" distB="0" distL="114300" distR="114300" simplePos="0" relativeHeight="251671552" behindDoc="0" locked="0" layoutInCell="1" allowOverlap="1" wp14:anchorId="78B5A033" wp14:editId="59AAF707">
+                  <wp:simplePos x="0" y="0"/>
+                  <wp:positionH relativeFrom="column">
+                    <wp:posOffset>-8255</wp:posOffset>
+                  </wp:positionH>
+                  <wp:positionV relativeFrom="paragraph">
+                    <wp:posOffset>176530</wp:posOffset>
+                  </wp:positionV>
+                  <wp:extent cx="5229225" cy="2755900"/>
+                  <wp:effectExtent l="0" t="0" r="9525" b="6350"/>
+                  <wp:wrapTopAndBottom/>
+                  <wp:docPr id="11" name="Picture 11"/>
+                  <wp:cNvGraphicFramePr>
+                    <a:graphicFrameLocks xmlns:a="http://schemas.openxmlformats.org/drawingml/2006/main" noChangeAspect="1"/>
+                  </wp:cNvGraphicFramePr>
+                  <a:graphic xmlns:a="http://schemas.openxmlformats.org/drawingml/2006/main">
+                    <a:graphicData uri="http://schemas.openxmlformats.org/drawingml/2006/picture">
+                      <pic:pic xmlns:pic="http://schemas.openxmlformats.org/drawingml/2006/picture">
+                        <pic:nvPicPr>
+                          <pic:cNvPr id="1" name=""/>
+                          <pic:cNvPicPr/>
+                        </pic:nvPicPr>
+                        <pic:blipFill>
+                          <a:blip r:embed="rId16" cstate="print">
+                            <a:extLst>
+                              <a:ext uri="{28A0092B-C50C-407E-A947-70E740481C1C}">
+                                <a14:useLocalDpi xmlns:a14="http://schemas.microsoft.com/office/drawing/2010/main" val="0"/>
+                              </a:ext>
+                            </a:extLst>
+                          </a:blip>
+                          <a:stretch>
+                            <a:fillRect/>
+                          </a:stretch>
+                        </pic:blipFill>
+                        <pic:spPr>
+                          <a:xfrm>
+                            <a:off x="0" y="0"/>
+                            <a:ext cx="5229225" cy="2755900"/>
+                          </a:xfrm>
+                          <a:prstGeom prst="rect">
+                            <a:avLst/>
+                          </a:prstGeom>
+                        </pic:spPr>
+                      </pic:pic>
+                    </a:graphicData>
+                  </a:graphic>
+                  <wp14:sizeRelH relativeFrom="margin">
+                    <wp14:pctWidth>0</wp14:pctWidth>
+                  </wp14:sizeRelH>
+                  <wp14:sizeRelV relativeFrom="margin">
+                    <wp14:pctHeight>0</wp14:pctHeight>
+                  </wp14:sizeRelV>
+                </wp:anchor>
+              </w:drawing>
+            </w:r>
+          </w:p>
+          <w:p/>
+          <w:p/>
+          <w:p/>
+          <w:p/>
+          <w:p/>
+          <w:p/>
+          <w:p/>
           <w:p/>
         </w:tc>
       </w:tr>
       <w:tr>
         <w:tc>
           <w:tcPr>
-            <w:tcW w:w="3200" w:type="dxa"/>
+            <w:tcW w:w="2872" w:type="dxa"/>
             <w:tcBorders>
               <w:top w:val="single" w:sz="6" w:space="0" w:color="ADB9CA"/>
               <w:left w:val="single" w:sz="6" w:space="0" w:color="ADB9CA"/>
@@ -8266,13 +8726,14 @@
                 <w:sz w:val="18"/>
                 <w:szCs w:val="18"/>
               </w:rPr>
+              <w:lastRenderedPageBreak/>
               <w:t>Assignment 04 .docx Visible in GitHub Repo</w:t>
             </w:r>
           </w:p>
         </w:tc>
         <w:tc>
           <w:tcPr>
-            <w:tcW w:w="6160" w:type="dxa"/>
+            <w:tcW w:w="7049" w:type="dxa"/>
             <w:tcBorders>
               <w:top w:val="single" w:sz="6" w:space="0" w:color="ADB9CA"/>
               <w:left w:val="single" w:sz="6" w:space="0" w:color="ADB9CA"/>
@@ -8288,7 +8749,65 @@
             </w:tcMar>
             <w:vAlign w:val="center"/>
           </w:tcPr>
-          <w:p/>
+          <w:p>
+            <w:r>
+              <w:drawing>
+                <wp:anchor distT="0" distB="0" distL="114300" distR="114300" simplePos="0" relativeHeight="251668480" behindDoc="0" locked="0" layoutInCell="1" allowOverlap="1" wp14:anchorId="23545706" wp14:editId="226A0300">
+                  <wp:simplePos x="0" y="0"/>
+                  <wp:positionH relativeFrom="column">
+                    <wp:posOffset>-77470</wp:posOffset>
+                  </wp:positionH>
+                  <wp:positionV relativeFrom="paragraph">
+                    <wp:posOffset>-2593975</wp:posOffset>
+                  </wp:positionV>
+                  <wp:extent cx="5363845" cy="2827020"/>
+                  <wp:effectExtent l="0" t="0" r="8255" b="0"/>
+                  <wp:wrapTopAndBottom/>
+                  <wp:docPr id="9" name="Picture 9"/>
+                  <wp:cNvGraphicFramePr>
+                    <a:graphicFrameLocks xmlns:a="http://schemas.openxmlformats.org/drawingml/2006/main" noChangeAspect="1"/>
+                  </wp:cNvGraphicFramePr>
+                  <a:graphic xmlns:a="http://schemas.openxmlformats.org/drawingml/2006/main">
+                    <a:graphicData uri="http://schemas.openxmlformats.org/drawingml/2006/picture">
+                      <pic:pic xmlns:pic="http://schemas.openxmlformats.org/drawingml/2006/picture">
+                        <pic:nvPicPr>
+                          <pic:cNvPr id="1" name=""/>
+                          <pic:cNvPicPr/>
+                        </pic:nvPicPr>
+                        <pic:blipFill>
+                          <a:blip r:embed="rId17" cstate="print">
+                            <a:extLst>
+                              <a:ext uri="{28A0092B-C50C-407E-A947-70E740481C1C}">
+                                <a14:useLocalDpi xmlns:a14="http://schemas.microsoft.com/office/drawing/2010/main" val="0"/>
+                              </a:ext>
+                            </a:extLst>
+                          </a:blip>
+                          <a:stretch>
+                            <a:fillRect/>
+                          </a:stretch>
+                        </pic:blipFill>
+                        <pic:spPr>
+                          <a:xfrm>
+                            <a:off x="0" y="0"/>
+                            <a:ext cx="5363845" cy="2827020"/>
+                          </a:xfrm>
+                          <a:prstGeom prst="rect">
+                            <a:avLst/>
+                          </a:prstGeom>
+                        </pic:spPr>
+                      </pic:pic>
+                    </a:graphicData>
+                  </a:graphic>
+                  <wp14:sizeRelH relativeFrom="margin">
+                    <wp14:pctWidth>0</wp14:pctWidth>
+                  </wp14:sizeRelH>
+                  <wp14:sizeRelV relativeFrom="margin">
+                    <wp14:pctHeight>0</wp14:pctHeight>
+                  </wp14:sizeRelV>
+                </wp:anchor>
+              </w:drawing>
+            </w:r>
+          </w:p>
         </w:tc>
       </w:tr>
     </w:tbl>
@@ -8346,7 +8865,25 @@
           <w:bCs/>
           <w:color w:val="000000"/>
         </w:rPr>
-        <w:t>Member 1  (Name: _______________________________________________)</w:t>
+        <w:t xml:space="preserve">Member 1  </w:t>
+      </w:r>
+      <w:r>
+        <w:rPr>
+          <w:rFonts w:ascii="Arial" w:eastAsia="Arial" w:hAnsi="Arial" w:cs="Arial"/>
+          <w:b/>
+          <w:bCs/>
+          <w:color w:val="000000"/>
+        </w:rPr>
+        <w:t>Name:</w:t>
+      </w:r>
+      <w:r>
+        <w:rPr>
+          <w:rFonts w:ascii="Arial" w:eastAsia="Arial" w:hAnsi="Arial" w:cs="Arial"/>
+          <w:b/>
+          <w:bCs/>
+          <w:color w:val="000000"/>
+        </w:rPr>
+        <w:t xml:space="preserve"> Adnan Alam</w:t>
       </w:r>
     </w:p>
     <w:tbl>
@@ -8388,51 +8925,11 @@
             </w:tcMar>
             <w:vAlign w:val="center"/>
           </w:tcPr>
-          <w:p/>
-        </w:tc>
-      </w:tr>
-      <w:tr>
-        <w:tc>
-          <w:tcPr>
-            <w:tcW w:w="9360" w:type="dxa"/>
-            <w:tcBorders>
-              <w:top w:val="single" w:sz="6" w:space="0" w:color="ADB9CA"/>
-              <w:left w:val="single" w:sz="6" w:space="0" w:color="ADB9CA"/>
-              <w:bottom w:val="single" w:sz="6" w:space="0" w:color="ADB9CA"/>
-              <w:right w:val="single" w:sz="6" w:space="0" w:color="ADB9CA"/>
-            </w:tcBorders>
-            <w:shd w:val="clear" w:color="auto" w:fill="FFFFFF"/>
-            <w:tcMar>
-              <w:top w:w="80" w:type="dxa"/>
-              <w:left w:w="140" w:type="dxa"/>
-              <w:bottom w:w="80" w:type="dxa"/>
-              <w:right w:w="140" w:type="dxa"/>
-            </w:tcMar>
-            <w:vAlign w:val="center"/>
-          </w:tcPr>
-          <w:p/>
-        </w:tc>
-      </w:tr>
-      <w:tr>
-        <w:tc>
-          <w:tcPr>
-            <w:tcW w:w="9360" w:type="dxa"/>
-            <w:tcBorders>
-              <w:top w:val="single" w:sz="6" w:space="0" w:color="ADB9CA"/>
-              <w:left w:val="single" w:sz="6" w:space="0" w:color="ADB9CA"/>
-              <w:bottom w:val="single" w:sz="6" w:space="0" w:color="ADB9CA"/>
-              <w:right w:val="single" w:sz="6" w:space="0" w:color="ADB9CA"/>
-            </w:tcBorders>
-            <w:shd w:val="clear" w:color="auto" w:fill="FFFFFF"/>
-            <w:tcMar>
-              <w:top w:w="80" w:type="dxa"/>
-              <w:left w:w="140" w:type="dxa"/>
-              <w:bottom w:w="80" w:type="dxa"/>
-              <w:right w:w="140" w:type="dxa"/>
-            </w:tcMar>
-            <w:vAlign w:val="center"/>
-          </w:tcPr>
-          <w:p/>
+          <w:p>
+            <w:r>
+              <w:t>As the Team Lead, I learned how to set up automated CI/CD pipelines using GitHub Actions, configure repository-level and environment-level secrets, and containerize the static web application using Nginx. The most challenging part of the assignment was coordinating the integration of all five pages from different team members and debugging errors that occurred during deployment, such as syntax errors and truncated HTML files. We resolved these integration challenges by enforcing branch protection rules, executing local tests, and performing thorough code reviews on every pull request before merging them into develop.</w:t>
+            </w:r>
+          </w:p>
         </w:tc>
       </w:tr>
     </w:tbl>
@@ -8497,11 +8994,7 @@
           </w:tcPr>
           <w:p>
             <w:r>
-              <w:t xml:space="preserve">Through this assignment, I learned how to handle form validation in HTML, style visual states like checked radio inputs using absolute positioning in CSS, and manipulate the DOM using local storage to capture and </w:t>
-            </w:r>
-            <w:r>
-              <w:lastRenderedPageBreak/>
-              <w:t>persist user data. The most challenging part was styling the custom priority selector labels so that they visually updated their border and glow colors according to the checked state. I resolved this by working with the Team Lead to implement CSS peer selectors (:checked + .priority-label) linked directly to hidden radio inputs.</w:t>
+              <w:t>Through this assignment, I learned how to handle form validation in HTML, style visual states like checked radio inputs using absolute positioning in CSS, and manipulate the DOM using local storage to capture and persist user data. The most challenging part was styling the custom priority selector labels so that they visually updated their border and glow colors according to the checked state. I resolved this by working with the Team Lead to implement CSS peer selectors (:checked + .priority-label) linked directly to hidden radio inputs.</w:t>
             </w:r>
           </w:p>
         </w:tc>
@@ -8643,6 +9136,7 @@
           </w:tcPr>
           <w:p>
             <w:r>
+              <w:lastRenderedPageBreak/>
               <w:t xml:space="preserve"> I learned how to dynamically retrieve URL parameters (URLSearchParams) in Javascript to identify a specific task, fetch its properties from local storage, and modify active records (such as deleting items or changing status). The most challenging part was ensuring that deleting a task correctly redirected the user back to the list page with the updated state, without causing empty reference errors. I resolved this by adding verification check blocks and utilizing window.location.href to guide the redirect state safely.</w:t>
             </w:r>
           </w:p>
@@ -8766,12 +9260,12 @@
       </w:pPr>
     </w:p>
     <w:sectPr>
-      <w:headerReference w:type="even" r:id="rId8"/>
-      <w:headerReference w:type="default" r:id="rId9"/>
-      <w:footerReference w:type="even" r:id="rId10"/>
-      <w:footerReference w:type="default" r:id="rId11"/>
-      <w:headerReference w:type="first" r:id="rId12"/>
-      <w:footerReference w:type="first" r:id="rId13"/>
+      <w:headerReference w:type="even" r:id="rId18"/>
+      <w:headerReference w:type="default" r:id="rId19"/>
+      <w:footerReference w:type="even" r:id="rId20"/>
+      <w:footerReference w:type="default" r:id="rId21"/>
+      <w:headerReference w:type="first" r:id="rId22"/>
+      <w:footerReference w:type="first" r:id="rId23"/>
       <w:pgSz w:w="12240" w:h="15840"/>
       <w:pgMar w:top="1080" w:right="1080" w:bottom="1080" w:left="1080" w:header="708" w:footer="708" w:gutter="0"/>
       <w:cols w:space="720"/>
@@ -9899,6 +10393,30 @@
     <w:uiPriority w:val="99"/>
     <w:qFormat/>
   </w:style>
+  <w:style w:type="character" w:styleId="UnresolvedMention">
+    <w:name w:val="Unresolved Mention"/>
+    <w:basedOn w:val="DefaultParagraphFont"/>
+    <w:uiPriority w:val="99"/>
+    <w:semiHidden/>
+    <w:unhideWhenUsed/>
+    <w:rsid w:val="00E30DBA"/>
+    <w:rPr>
+      <w:color w:val="605E5C"/>
+      <w:shd w:val="clear" w:color="auto" w:fill="E1DFDD"/>
+    </w:rPr>
+  </w:style>
+  <w:style w:type="character" w:styleId="FollowedHyperlink">
+    <w:name w:val="FollowedHyperlink"/>
+    <w:basedOn w:val="DefaultParagraphFont"/>
+    <w:uiPriority w:val="99"/>
+    <w:semiHidden/>
+    <w:unhideWhenUsed/>
+    <w:rsid w:val="00E30DBA"/>
+    <w:rPr>
+      <w:color w:val="954F72" w:themeColor="followedHyperlink"/>
+      <w:u w:val="single"/>
+    </w:rPr>
+  </w:style>
 </w:styles>
 </file>
 

</xml_diff>